<commit_message>
uploaded signing_paragraph_content.docx to be included in forms that need to be signed, updating answer_content and dismiss_content
</commit_message>
<xml_diff>
--- a/docassemble/AKA2JBranding/data/templates/answer_content.docx
+++ b/docassemble/AKA2JBranding/data/templates/answer_content.docx
@@ -74,11 +74,7 @@
         <w:t xml:space="preserve">Give a copy of the forms to {{ other_party_in_case }}. See </w:t>
       </w:r>
       <w:r>
-        <w:t xml:space="preserve">{{ </w:t>
-      </w:r>
-      <w:proofErr w:type="spellStart"/>
-      <w:r>
-        <w:t>truefiling_serve</w:t>
+        <w:t>{{ truefiling_serve</w:t>
       </w:r>
       <w:r>
         <w:t>_step</w:t>
@@ -86,7 +82,6 @@
       <w:r>
         <w:t>.subject</w:t>
       </w:r>
-      <w:proofErr w:type="spellEnd"/>
       <w:r>
         <w:t xml:space="preserve"> }}.</w:t>
       </w:r>
@@ -96,13 +91,13 @@
         <w:pStyle w:val="Body"/>
       </w:pPr>
       <w:r>
-        <w:t>{</w:t>
-      </w:r>
-      <w:r>
-        <w:t>{ signing_paragraph }</w:t>
-      </w:r>
-      <w:r>
-        <w:t>}</w:t>
+        <w:t>{{p (include_docx_template("docassemble.AKA2JBranding:</w:t>
+      </w:r>
+      <w:r>
+        <w:t>signing_paragraph_content.docx</w:t>
+      </w:r>
+      <w:r>
+        <w:t xml:space="preserve"> ")) }}</w:t>
       </w:r>
     </w:p>
     <w:p>
@@ -168,16 +163,11 @@
         <w:t>Motion to Dismiss</w:t>
       </w:r>
       <w:r>
-        <w:t xml:space="preserve"> forms that ask the court to dismiss your case. Read  {{ </w:t>
-      </w:r>
-      <w:proofErr w:type="spellStart"/>
-      <w:r>
-        <w:t>dismiss_</w:t>
+        <w:t xml:space="preserve"> forms that ask the court to dismiss your case. Read  {{ dismiss_</w:t>
       </w:r>
       <w:r>
         <w:t>step.subject</w:t>
       </w:r>
-      <w:proofErr w:type="spellEnd"/>
       <w:r>
         <w:t xml:space="preserve"> }}: File a motion to dismiss your Alaska case.</w:t>
       </w:r>
@@ -269,6 +259,18 @@
       <w:r>
         <w:t>]</w:t>
       </w:r>
+      <w:r>
+        <w:br/>
+      </w:r>
+      <w:hyperlink r:id="rId6" w:history="1">
+        <w:r>
+          <w:rPr>
+            <w:rStyle w:val="Hyperlink"/>
+            <w:spacing w:val="0"/>
+          </w:rPr>
+          <w:t>ak-courts.info/dr450</w:t>
+        </w:r>
+      </w:hyperlink>
     </w:p>
     <w:p>
       <w:pPr>
@@ -317,7 +319,6 @@
     <w:p>
       <w:pPr>
         <w:pStyle w:val="Body"/>
-        <w:jc w:val="both"/>
       </w:pPr>
       <w:r>
         <w:rPr>
@@ -331,7 +332,7 @@
       <w:r>
         <w:t>[</w:t>
       </w:r>
-      <w:hyperlink r:id="rId6" w:history="1">
+      <w:hyperlink r:id="rId7" w:history="1">
         <w:r>
           <w:rPr>
             <w:rStyle w:val="Hyperlink"/>
@@ -350,6 +351,18 @@
       <w:r>
         <w:t>]</w:t>
       </w:r>
+      <w:r>
+        <w:br/>
+      </w:r>
+      <w:hyperlink r:id="rId8" w:history="1">
+        <w:r>
+          <w:rPr>
+            <w:rStyle w:val="Hyperlink"/>
+            <w:spacing w:val="0"/>
+          </w:rPr>
+          <w:t>ak-courts.info/dr832</w:t>
+        </w:r>
+      </w:hyperlink>
     </w:p>
     <w:p>
       <w:pPr>
@@ -359,6 +372,7 @@
         <w:rPr>
           <w:color w:val="92D050"/>
         </w:rPr>
+        <w:lastRenderedPageBreak/>
         <w:t>{%p elif case_type == 'legal separation' %}</w:t>
       </w:r>
     </w:p>
@@ -375,7 +389,7 @@
       <w:r>
         <w:t xml:space="preserve"> </w:t>
       </w:r>
-      <w:hyperlink r:id="rId7" w:history="1">
+      <w:hyperlink r:id="rId9" w:history="1">
         <w:r>
           <w:rPr>
             <w:rStyle w:val="Hyperlink"/>
@@ -387,7 +401,7 @@
       <w:r>
         <w:t xml:space="preserve"> | </w:t>
       </w:r>
-      <w:hyperlink r:id="rId8" w:history="1">
+      <w:hyperlink r:id="rId10" w:history="1">
         <w:r>
           <w:rPr>
             <w:rStyle w:val="Hyperlink"/>
@@ -413,7 +427,6 @@
         <w:pStyle w:val="Body"/>
       </w:pPr>
       <w:r>
-        <w:lastRenderedPageBreak/>
         <w:t>{%p if not minor_children and wife_is_pregnant in ('husband', 'not husband') %}</w:t>
       </w:r>
     </w:p>
@@ -474,7 +487,7 @@
       <w:r>
         <w:t>[</w:t>
       </w:r>
-      <w:hyperlink r:id="rId9" w:history="1">
+      <w:hyperlink r:id="rId11" w:history="1">
         <w:r>
           <w:rPr>
             <w:rStyle w:val="Hyperlink"/>
@@ -493,6 +506,18 @@
       <w:r>
         <w:t>]</w:t>
       </w:r>
+      <w:r>
+        <w:br/>
+      </w:r>
+      <w:hyperlink r:id="rId12" w:history="1">
+        <w:r>
+          <w:rPr>
+            <w:rStyle w:val="Hyperlink"/>
+            <w:spacing w:val="0"/>
+          </w:rPr>
+          <w:t>ak-courts.info/dr837</w:t>
+        </w:r>
+      </w:hyperlink>
     </w:p>
     <w:p>
       <w:pPr>
@@ -516,9 +541,12 @@
         <w:t>Answer &amp; Counterclaim to Legal Separation Without Children, SHC-095</w:t>
       </w:r>
       <w:r>
-        <w:t xml:space="preserve"> </w:t>
-      </w:r>
-      <w:hyperlink r:id="rId10" w:history="1">
+        <w:rPr>
+          <w:b/>
+        </w:rPr>
+        <w:br/>
+      </w:r>
+      <w:hyperlink r:id="rId13" w:history="1">
         <w:r>
           <w:rPr>
             <w:rStyle w:val="Hyperlink"/>
@@ -528,9 +556,25 @@
         </w:r>
       </w:hyperlink>
       <w:r>
-        <w:t xml:space="preserve"> | </w:t>
-      </w:r>
-      <w:hyperlink r:id="rId11" w:history="1">
+        <w:rPr>
+          <w:rStyle w:val="Hyperlink"/>
+          <w:spacing w:val="0"/>
+        </w:rPr>
+        <w:br/>
+      </w:r>
+      <w:hyperlink r:id="rId14" w:history="1">
+        <w:r>
+          <w:rPr>
+            <w:rStyle w:val="Hyperlink"/>
+            <w:spacing w:val="0"/>
+          </w:rPr>
+          <w:t>courts.alaska.gov/shc/family/docs/shc-095.doc</w:t>
+        </w:r>
+      </w:hyperlink>
+      <w:r>
+        <w:br/>
+      </w:r>
+      <w:hyperlink r:id="rId15" w:history="1">
         <w:r>
           <w:rPr>
             <w:rStyle w:val="Hyperlink"/>
@@ -539,6 +583,22 @@
           <w:t>PDF</w:t>
         </w:r>
       </w:hyperlink>
+      <w:r>
+        <w:rPr>
+          <w:rStyle w:val="Hyperlink"/>
+          <w:spacing w:val="0"/>
+        </w:rPr>
+        <w:br/>
+      </w:r>
+      <w:hyperlink r:id="rId16" w:history="1">
+        <w:r>
+          <w:rPr>
+            <w:rStyle w:val="Hyperlink"/>
+            <w:spacing w:val="0"/>
+          </w:rPr>
+          <w:t>courts.alaska.gov/shc/family/docs/shc-095n.pdf</w:t>
+        </w:r>
+      </w:hyperlink>
     </w:p>
     <w:p>
       <w:pPr>
@@ -703,6 +763,7 @@
         <w:rPr>
           <w:color w:val="FF0000"/>
         </w:rPr>
+        <w:lastRenderedPageBreak/>
         <w:t>{%p if (user_need == 'answer custody' and (type_of_response.all_true('ak custody case', exclusive=True) or type_of_response.all_true('ak custody case', 'improper service', exclusive=True))) or (user_need == 'answer divorce' and (type_of_response.all_true('ak divorce case', exclusive=True) or type_of_response.all_true('ak divorce case', 'improper service', exclusive=True))) %}</w:t>
       </w:r>
     </w:p>
@@ -714,7 +775,6 @@
         <w:rPr>
           <w:color w:val="FFC000"/>
         </w:rPr>
-        <w:lastRenderedPageBreak/>
         <w:t>{%p if (case_type == 'custody' or case_type == 'divorce' or (case_type == 'legal separation' and want_legal_separation == 'yes')) and response_to_complaint == 'agree' %}</w:t>
       </w:r>
     </w:p>
@@ -850,18 +910,13 @@
       <w:pPr>
         <w:pStyle w:val="Body"/>
       </w:pPr>
-    </w:p>
-    <w:p>
-      <w:pPr>
-        <w:pStyle w:val="Body"/>
-      </w:pPr>
       <w:r>
         <w:t>If you are unsure if an affirmat</w:t>
       </w:r>
       <w:r>
         <w:t xml:space="preserve">ive defense applies to you, </w:t>
       </w:r>
-      <w:hyperlink r:id="rId12" w:history="1">
+      <w:hyperlink r:id="rId17" w:history="1">
         <w:r>
           <w:rPr>
             <w:rStyle w:val="Hyperlink"/>
@@ -907,6 +962,7 @@
         <w:pStyle w:val="Body"/>
       </w:pPr>
       <w:r>
+        <w:lastRenderedPageBreak/>
         <w:t>If you think Alaska is not the "home state," you can ask the court to dismiss your case:</w:t>
       </w:r>
     </w:p>
@@ -942,7 +998,6 @@
         <w:rPr>
           <w:color w:val="FFC000"/>
         </w:rPr>
-        <w:lastRenderedPageBreak/>
         <w:t>{%p if user_need == 'answer custody' or (user_need == 'answer divorce' and minor_children) or (user_need == 'answer divorce' and not minor_children and wife_is_pregnant in ('husband', 'not husband')) %}</w:t>
       </w:r>
     </w:p>
@@ -1192,6 +1247,7 @@
         <w:ind w:left="540"/>
       </w:pPr>
       <w:r>
+        <w:lastRenderedPageBreak/>
         <w:t>You can add here that you were not served correctly.</w:t>
       </w:r>
     </w:p>
@@ -1222,7 +1278,6 @@
         <w:pStyle w:val="Body"/>
       </w:pPr>
       <w:r>
-        <w:lastRenderedPageBreak/>
         <w:t>If yo</w:t>
       </w:r>
       <w:r>
@@ -1465,6 +1520,7 @@
         <w:rPr>
           <w:color w:val="FF0000"/>
         </w:rPr>
+        <w:lastRenderedPageBreak/>
         <w:t>{%p if type_of_response['case in 2 states'] and stage_of_other_case == 'still going' %}</w:t>
       </w:r>
     </w:p>
@@ -1484,7 +1540,6 @@
         <w:pStyle w:val="Body"/>
       </w:pPr>
       <w:r>
-        <w:lastRenderedPageBreak/>
         <w:t>If you think the Alaska court should hear the case, use section 5 to tell the judge there are 2 cases and why you think the case should move forward in Alaska.</w:t>
       </w:r>
     </w:p>
@@ -1690,6 +1745,7 @@
         <w:rPr>
           <w:color w:val="FF0000"/>
         </w:rPr>
+        <w:lastRenderedPageBreak/>
         <w:t>{%p if type_of_response['case in 2 states'] and stage_of_other_case == 'still going' %}</w:t>
       </w:r>
     </w:p>
@@ -1709,7 +1765,6 @@
         <w:rPr>
           <w:color w:val="FF0000"/>
         </w:rPr>
-        <w:lastRenderedPageBreak/>
         <w:t>{%p endif %}</w:t>
       </w:r>
     </w:p>
@@ -1778,335 +1833,6 @@
           <w:b/>
         </w:rPr>
         <w:t>TF-706 Motion (Request) and Affidavit</w:t>
-      </w:r>
-      <w:r>
-        <w:t xml:space="preserve"> [</w:t>
-      </w:r>
-      <w:hyperlink r:id="rId13" w:history="1">
-        <w:r>
-          <w:rPr>
-            <w:rStyle w:val="Hyperlink"/>
-            <w:spacing w:val="0"/>
-          </w:rPr>
-          <w:t>Fill-In</w:t>
-        </w:r>
-        <w:r>
-          <w:rPr>
-            <w:rStyle w:val="Hyperlink"/>
-            <w:spacing w:val="0"/>
-          </w:rPr>
-          <w:t xml:space="preserve"> PDF</w:t>
-        </w:r>
-      </w:hyperlink>
-      <w:r>
-        <w:t>].</w:t>
-      </w:r>
-    </w:p>
-    <w:p>
-      <w:pPr>
-        <w:pStyle w:val="Body"/>
-        <w:numPr>
-          <w:ilvl w:val="0"/>
-          <w:numId w:val="11"/>
-        </w:numPr>
-        <w:ind w:left="900"/>
-      </w:pPr>
-      <w:r>
-        <w:t>Fill-In</w:t>
-      </w:r>
-      <w:r>
-        <w:t xml:space="preserve"> the title, "accepting a late Answer". And</w:t>
-      </w:r>
-    </w:p>
-    <w:p>
-      <w:pPr>
-        <w:pStyle w:val="Body"/>
-        <w:numPr>
-          <w:ilvl w:val="0"/>
-          <w:numId w:val="11"/>
-        </w:numPr>
-        <w:ind w:left="900"/>
-      </w:pPr>
-      <w:r>
-        <w:t>File it with your Answer.</w:t>
-      </w:r>
-    </w:p>
-    <w:p>
-      <w:pPr>
-        <w:pStyle w:val="Body"/>
-      </w:pPr>
-      <w:r>
-        <w:rPr>
-          <w:color w:val="FFC000"/>
-        </w:rPr>
-        <w:t>{%p endif %}</w:t>
-      </w:r>
-    </w:p>
-    <w:p>
-      <w:pPr>
-        <w:pStyle w:val="Body"/>
-      </w:pPr>
-      <w:r>
-        <w:rPr>
-          <w:color w:val="FFC000"/>
-        </w:rPr>
-        <w:t>{%p if stage_of_default == 'hearing scheduled' %}</w:t>
-      </w:r>
-    </w:p>
-    <w:p>
-      <w:pPr>
-        <w:pStyle w:val="Body"/>
-      </w:pPr>
-      <w:r>
-        <w:t xml:space="preserve">Because the clerk signed the entry of default, you have to ask the judge to accept your Answer even though it is late. Fill out a </w:t>
-      </w:r>
-      <w:r>
-        <w:rPr>
-          <w:b/>
-        </w:rPr>
-        <w:t>Motion, Affidavit, and Order to Set Aside Entry of Default and Accept Late Filed Answer, CIV-</w:t>
-      </w:r>
-      <w:r>
-        <w:rPr>
-          <w:b/>
-        </w:rPr>
-        <w:t>858</w:t>
-      </w:r>
-      <w:r>
-        <w:t xml:space="preserve"> [</w:t>
-      </w:r>
-      <w:hyperlink r:id="rId14" w:history="1">
-        <w:r>
-          <w:rPr>
-            <w:rStyle w:val="Hyperlink"/>
-            <w:spacing w:val="0"/>
-          </w:rPr>
-          <w:t>Fill-In</w:t>
-        </w:r>
-        <w:r>
-          <w:rPr>
-            <w:rStyle w:val="Hyperlink"/>
-            <w:spacing w:val="0"/>
-          </w:rPr>
-          <w:t xml:space="preserve"> PDF</w:t>
-        </w:r>
-      </w:hyperlink>
-      <w:r>
-        <w:t>].</w:t>
-      </w:r>
-    </w:p>
-    <w:p>
-      <w:pPr>
-        <w:pStyle w:val="Body"/>
-        <w:numPr>
-          <w:ilvl w:val="0"/>
-          <w:numId w:val="11"/>
-        </w:numPr>
-        <w:ind w:left="540"/>
-      </w:pPr>
-      <w:r>
-        <w:t>Explain why you did not reply in 20 days.</w:t>
-      </w:r>
-    </w:p>
-    <w:p>
-      <w:pPr>
-        <w:pStyle w:val="Body"/>
-        <w:numPr>
-          <w:ilvl w:val="0"/>
-          <w:numId w:val="11"/>
-        </w:numPr>
-        <w:ind w:left="540"/>
-      </w:pPr>
-      <w:r>
-        <w:t>File it with your Answer.</w:t>
-      </w:r>
-    </w:p>
-    <w:p>
-      <w:pPr>
-        <w:pStyle w:val="Body"/>
-      </w:pPr>
-      <w:r>
-        <w:rPr>
-          <w:color w:val="FFC000"/>
-        </w:rPr>
-        <w:t>{%p endif %}</w:t>
-      </w:r>
-    </w:p>
-    <w:p>
-      <w:pPr>
-        <w:pStyle w:val="Body"/>
-      </w:pPr>
-      <w:r>
-        <w:rPr>
-          <w:color w:val="FF0000"/>
-        </w:rPr>
-        <w:t>{%p endif %}</w:t>
-      </w:r>
-    </w:p>
-    <w:p>
-      <w:pPr>
-        <w:pStyle w:val="Body"/>
-      </w:pPr>
-      <w:r>
-        <w:t>If there is anything else you want the judge to order, you can write it here.</w:t>
-      </w:r>
-    </w:p>
-    <w:p>
-      <w:pPr>
-        <w:pStyle w:val="Body"/>
-      </w:pPr>
-      <w:r>
-        <w:rPr>
-          <w:color w:val="FF0000"/>
-        </w:rPr>
-        <w:t>{%p if type_of_response['wrong state'] and ((user_need == 'answer custody' and not jurisdiction) or user_need == 'answer divorce') %}</w:t>
-      </w:r>
-    </w:p>
-    <w:p>
-      <w:pPr>
-        <w:pStyle w:val="Body"/>
-      </w:pPr>
-      <w:r>
-        <w:t>If you have any questions about whether Alaska is the correct place for your case or you want to ask the court to dismiss your case, you may want to [</w:t>
-      </w:r>
-      <w:hyperlink r:id="rId15" w:history="1">
-        <w:r>
-          <w:rPr>
-            <w:rStyle w:val="Hyperlink"/>
-            <w:spacing w:val="0"/>
-          </w:rPr>
-          <w:t>talk to a lawyer</w:t>
-        </w:r>
-      </w:hyperlink>
-      <w:r>
-        <w:t>](https://courts.alaska.gov/shc/shclawyer.htm)</w:t>
-      </w:r>
-    </w:p>
-    <w:p>
-      <w:pPr>
-        <w:pStyle w:val="Body"/>
-      </w:pPr>
-      <w:r>
-        <w:rPr>
-          <w:color w:val="FF0000"/>
-        </w:rPr>
-        <w:t>{%p endif %}</w:t>
-      </w:r>
-    </w:p>
-    <w:p>
-      <w:pPr>
-        <w:pStyle w:val="Body"/>
-      </w:pPr>
-      <w:r>
-        <w:rPr>
-          <w:b/>
-        </w:rPr>
-        <w:t>Information Sheet, DR-314</w:t>
-      </w:r>
-      <w:r>
-        <w:t xml:space="preserve"> [</w:t>
-      </w:r>
-      <w:hyperlink r:id="rId16" w:history="1">
-        <w:r>
-          <w:rPr>
-            <w:rStyle w:val="Hyperlink"/>
-            <w:spacing w:val="0"/>
-          </w:rPr>
-          <w:t>Fill-In</w:t>
-        </w:r>
-        <w:r>
-          <w:rPr>
-            <w:rStyle w:val="Hyperlink"/>
-            <w:spacing w:val="0"/>
-          </w:rPr>
-          <w:t xml:space="preserve"> PDF</w:t>
-        </w:r>
-      </w:hyperlink>
-      <w:r>
-        <w:t>]</w:t>
-      </w:r>
-      <w:r>
-        <w:br/>
-      </w:r>
-      <w:hyperlink r:id="rId17" w:history="1">
-        <w:r>
-          <w:rPr>
-            <w:rStyle w:val="Hyperlink"/>
-            <w:spacing w:val="0"/>
-          </w:rPr>
-          <w:t>ak-courts.info/dr314</w:t>
-        </w:r>
-      </w:hyperlink>
-    </w:p>
-    <w:p>
-      <w:pPr>
-        <w:pStyle w:val="Body"/>
-        <w:numPr>
-          <w:ilvl w:val="0"/>
-          <w:numId w:val="11"/>
-        </w:numPr>
-        <w:ind w:left="540"/>
-      </w:pPr>
-      <w:r>
-        <w:t xml:space="preserve">If {{ other_party_in_case }} filed an </w:t>
-      </w:r>
-      <w:r>
-        <w:rPr>
-          <w:b/>
-        </w:rPr>
-        <w:t>Information Sheet</w:t>
-      </w:r>
-      <w:r>
-        <w:t>, check the first box.</w:t>
-      </w:r>
-    </w:p>
-    <w:p>
-      <w:pPr>
-        <w:pStyle w:val="Body"/>
-        <w:numPr>
-          <w:ilvl w:val="0"/>
-          <w:numId w:val="11"/>
-        </w:numPr>
-        <w:ind w:left="540"/>
-      </w:pPr>
-      <w:r>
-        <w:t>If they did not file this form, answer 1 through 3.</w:t>
-      </w:r>
-    </w:p>
-    <w:p>
-      <w:pPr>
-        <w:pStyle w:val="Body"/>
-        <w:numPr>
-          <w:ilvl w:val="0"/>
-          <w:numId w:val="11"/>
-        </w:numPr>
-        <w:ind w:left="540"/>
-      </w:pPr>
-      <w:r>
-        <w:t>Sign, and date the form.</w:t>
-      </w:r>
-    </w:p>
-    <w:p>
-      <w:pPr>
-        <w:pStyle w:val="Body"/>
-      </w:pPr>
-      <w:r>
-        <w:rPr>
-          <w:color w:val="FF0000"/>
-        </w:rPr>
-        <w:t>{%p if user_need == 'answer custody' or (user_need == 'answer divorce' and (minor_children or (not minor_children and wife_is_pregnant in ('husband', 'not husband')))) %}</w:t>
-      </w:r>
-    </w:p>
-    <w:p>
-      <w:pPr>
-        <w:pStyle w:val="Body"/>
-      </w:pPr>
-      <w:r>
-        <w:rPr>
-          <w:b/>
-        </w:rPr>
-        <w:lastRenderedPageBreak/>
-        <w:t>Child Custody Jurisdiction Affidavit, DR-150</w:t>
       </w:r>
       <w:r>
         <w:t xml:space="preserve"> [</w:t>
@@ -2139,9 +1865,41 @@
             <w:rStyle w:val="Hyperlink"/>
             <w:spacing w:val="0"/>
           </w:rPr>
-          <w:t>ak-courts.info/dr150</w:t>
+          <w:t>ak-courts.info/tf706</w:t>
         </w:r>
       </w:hyperlink>
+      <w:r>
+        <w:t>.</w:t>
+      </w:r>
+    </w:p>
+    <w:p>
+      <w:pPr>
+        <w:pStyle w:val="Body"/>
+        <w:numPr>
+          <w:ilvl w:val="0"/>
+          <w:numId w:val="11"/>
+        </w:numPr>
+        <w:ind w:left="900"/>
+      </w:pPr>
+      <w:r>
+        <w:t>Fill-In</w:t>
+      </w:r>
+      <w:r>
+        <w:t xml:space="preserve"> the title, "accepting a late Answer". And</w:t>
+      </w:r>
+    </w:p>
+    <w:p>
+      <w:pPr>
+        <w:pStyle w:val="Body"/>
+        <w:numPr>
+          <w:ilvl w:val="0"/>
+          <w:numId w:val="11"/>
+        </w:numPr>
+        <w:ind w:left="900"/>
+      </w:pPr>
+      <w:r>
+        <w:t>File it with your Answer.</w:t>
+      </w:r>
     </w:p>
     <w:p>
       <w:pPr>
@@ -2151,15 +1909,7 @@
         <w:rPr>
           <w:color w:val="FFC000"/>
         </w:rPr>
-        <w:t>{%p if type_of_response['case in 2 states'] and stage_of_other_case == 'still going' %}</w:t>
-      </w:r>
-    </w:p>
-    <w:p>
-      <w:pPr>
-        <w:pStyle w:val="Body"/>
-      </w:pPr>
-      <w:r>
-        <w:t>In paragraph 3 on page 3, tell the judge about the other case.</w:t>
+        <w:t>{%p endif %}</w:t>
       </w:r>
     </w:p>
     <w:p>
@@ -2170,18 +1920,21 @@
         <w:rPr>
           <w:color w:val="FFC000"/>
         </w:rPr>
-        <w:t>{%p endif %}</w:t>
-      </w:r>
-    </w:p>
-    <w:p>
-      <w:pPr>
-        <w:pStyle w:val="Body"/>
-      </w:pPr>
+        <w:t>{%p if stage_of_default == 'hearing scheduled' %}</w:t>
+      </w:r>
+    </w:p>
+    <w:p>
+      <w:pPr>
+        <w:pStyle w:val="Body"/>
+      </w:pPr>
+      <w:r>
+        <w:t xml:space="preserve">Because the clerk signed the entry of default, you have to ask the judge to accept your Answer even though it is late. Fill out a </w:t>
+      </w:r>
       <w:r>
         <w:rPr>
           <w:b/>
         </w:rPr>
-        <w:t>Child Support Guidelines Affidavit, DR-305</w:t>
+        <w:t>Motion, Affidavit, and Order to Set Aside Entry of Default and Accept Late Filed Answer, CIV-858</w:t>
       </w:r>
       <w:r>
         <w:t xml:space="preserve"> [</w:t>
@@ -2214,16 +1967,86 @@
             <w:rStyle w:val="Hyperlink"/>
             <w:spacing w:val="0"/>
           </w:rPr>
-          <w:t>ak-courts.info/dr305</w:t>
+          <w:t>ak-courts.info/tf858</w:t>
         </w:r>
       </w:hyperlink>
-    </w:p>
-    <w:p>
-      <w:pPr>
-        <w:pStyle w:val="Body"/>
-      </w:pPr>
-      <w:r>
-        <w:t xml:space="preserve">See </w:t>
+      <w:r>
+        <w:t>.</w:t>
+      </w:r>
+    </w:p>
+    <w:p>
+      <w:pPr>
+        <w:pStyle w:val="Body"/>
+        <w:numPr>
+          <w:ilvl w:val="0"/>
+          <w:numId w:val="11"/>
+        </w:numPr>
+        <w:ind w:left="540"/>
+      </w:pPr>
+      <w:r>
+        <w:t>Explain why you did not reply in 20 days.</w:t>
+      </w:r>
+    </w:p>
+    <w:p>
+      <w:pPr>
+        <w:pStyle w:val="Body"/>
+        <w:numPr>
+          <w:ilvl w:val="0"/>
+          <w:numId w:val="11"/>
+        </w:numPr>
+        <w:ind w:left="540"/>
+      </w:pPr>
+      <w:r>
+        <w:t>File it with your Answer.</w:t>
+      </w:r>
+    </w:p>
+    <w:p>
+      <w:pPr>
+        <w:pStyle w:val="Body"/>
+      </w:pPr>
+      <w:r>
+        <w:rPr>
+          <w:color w:val="FFC000"/>
+        </w:rPr>
+        <w:t>{%p endif %}</w:t>
+      </w:r>
+    </w:p>
+    <w:p>
+      <w:pPr>
+        <w:pStyle w:val="Body"/>
+      </w:pPr>
+      <w:r>
+        <w:rPr>
+          <w:color w:val="FF0000"/>
+        </w:rPr>
+        <w:t>{%p endif %}</w:t>
+      </w:r>
+    </w:p>
+    <w:p>
+      <w:pPr>
+        <w:pStyle w:val="Body"/>
+      </w:pPr>
+      <w:r>
+        <w:t>If there is anything else you want the judge to order, you can write it here.</w:t>
+      </w:r>
+    </w:p>
+    <w:p>
+      <w:pPr>
+        <w:pStyle w:val="Body"/>
+      </w:pPr>
+      <w:r>
+        <w:rPr>
+          <w:color w:val="FF0000"/>
+        </w:rPr>
+        <w:t>{%p if type_of_response['wrong state'] and ((user_need == 'answer custody' and not jurisdiction) or user_need == 'answer divorce') %}</w:t>
+      </w:r>
+    </w:p>
+    <w:p>
+      <w:pPr>
+        <w:pStyle w:val="Body"/>
+      </w:pPr>
+      <w:r>
+        <w:t xml:space="preserve">If you have any questions about whether Alaska is the correct place for your case or you want to ask the court to dismiss your case, you may want to </w:t>
       </w:r>
       <w:hyperlink r:id="rId22" w:history="1">
         <w:r>
@@ -2231,174 +2054,14 @@
             <w:rStyle w:val="Hyperlink"/>
             <w:spacing w:val="0"/>
           </w:rPr>
-          <w:t>How to Fill out the Child Support Guidelines Affidavit</w:t>
+          <w:t>talk to a lawyer</w:t>
         </w:r>
       </w:hyperlink>
       <w:r>
-        <w:t xml:space="preserve"> </w:t>
-      </w:r>
-      <w:r>
-        <w:t>to help you fill in this form.</w:t>
-      </w:r>
-    </w:p>
-    <w:p>
-      <w:pPr>
-        <w:pStyle w:val="Body"/>
-        <w:numPr>
-          <w:ilvl w:val="0"/>
-          <w:numId w:val="11"/>
-        </w:numPr>
-        <w:ind w:left="540"/>
-      </w:pPr>
-      <w:r>
-        <w:t xml:space="preserve">Attach your most recent tax return and pay stubs to the </w:t>
-      </w:r>
-      <w:r>
-        <w:rPr>
-          <w:b/>
-        </w:rPr>
-        <w:t>Child Support Guidelines Affidavit</w:t>
-      </w:r>
-      <w:r>
-        <w:t>.</w:t>
-      </w:r>
-    </w:p>
-    <w:p>
-      <w:pPr>
-        <w:pStyle w:val="Body"/>
-      </w:pPr>
-      <w:r>
-        <w:rPr>
-          <w:color w:val="FF0000"/>
-        </w:rPr>
-        <w:t>{%p endif %}</w:t>
-      </w:r>
-    </w:p>
-    <w:p>
-      <w:pPr>
-        <w:pStyle w:val="Body"/>
-      </w:pPr>
-      <w:r>
-        <w:rPr>
-          <w:color w:val="FF0000"/>
-        </w:rPr>
-        <w:t>{%p if (user_need == 'answer custody' and (type_of_response.all_true('ak custody case', exclusive=True) or type_of_response.all_true('ak custody case', 'improper service', exclusive=True))) or (user_need == 'answer divorce' and (type_of_response.all_true('ak divorce case', exclusive=True) or type_of_response.all_true('ak divorce case', 'improper service', exclusive=True))) %}</w:t>
-      </w:r>
-    </w:p>
-    <w:p>
-      <w:pPr>
-        <w:pStyle w:val="Body"/>
-      </w:pPr>
-      <w:r>
-        <w:rPr>
-          <w:color w:val="FFC000"/>
-        </w:rPr>
-        <w:t>{%p if (case_type in ('custody', 'divorce') or (case_type == 'legal separation' and want_legal_separation == 'yes')) %}</w:t>
-      </w:r>
-    </w:p>
-    <w:p>
-      <w:pPr>
-        <w:pStyle w:val="Body"/>
-      </w:pPr>
-      <w:r>
-        <w:rPr>
-          <w:color w:val="92D050"/>
-        </w:rPr>
-        <w:t>{%p if response_to_complaint in ('agree', 'some') %}</w:t>
-      </w:r>
-    </w:p>
-    <w:p>
-      <w:pPr>
-        <w:pStyle w:val="Heading3"/>
-      </w:pPr>
-      <w:r>
-        <w:t>Forms to use if you and {{ other_party_in_case }} write out your agreement</w:t>
-      </w:r>
-    </w:p>
-    <w:p>
-      <w:pPr>
-        <w:pStyle w:val="Body"/>
-      </w:pPr>
-      <w:r>
-        <w:lastRenderedPageBreak/>
-        <w:t>If you want to work with {{ other_party_in_case }} to write out the agreement and both sign it, use:</w:t>
-      </w:r>
-    </w:p>
-    <w:p>
-      <w:pPr>
-        <w:pStyle w:val="Body"/>
-      </w:pPr>
-      <w:r>
-        <w:rPr>
-          <w:color w:val="92D050"/>
-        </w:rPr>
-        <w:t xml:space="preserve">{%p elif response_to_complaint == 'none' and </w:t>
-      </w:r>
-      <w:proofErr w:type="spellStart"/>
-      <w:r>
-        <w:rPr>
-          <w:color w:val="92D050"/>
-        </w:rPr>
-        <w:t>want_help_to_agree</w:t>
-      </w:r>
-      <w:proofErr w:type="spellEnd"/>
-      <w:r>
-        <w:rPr>
-          <w:color w:val="92D050"/>
-        </w:rPr>
-        <w:t xml:space="preserve"> %}</w:t>
-      </w:r>
-    </w:p>
-    <w:p>
-      <w:pPr>
-        <w:pStyle w:val="Heading3"/>
-      </w:pPr>
-      <w:r>
-        <w:t>Forms to use if you reach an agreement</w:t>
-      </w:r>
-    </w:p>
-    <w:p>
-      <w:pPr>
-        <w:pStyle w:val="Body"/>
-      </w:pPr>
-      <w:r>
-        <w:rPr>
-          <w:color w:val="92D050"/>
-        </w:rPr>
-        <w:t>{%p endif %}</w:t>
-      </w:r>
-    </w:p>
-    <w:p>
-      <w:pPr>
-        <w:pStyle w:val="Body"/>
-      </w:pPr>
-      <w:r>
-        <w:rPr>
-          <w:color w:val="92D050"/>
-        </w:rPr>
-        <w:t>{%p if user_need == 'answer custody' or (user_need == 'answer divorce' and (minor_children or (not minor_children and wife_is_pregnant in (</w:t>
-      </w:r>
-      <w:r>
-        <w:rPr>
-          <w:color w:val="92D050"/>
-        </w:rPr>
-        <w:t>'husband', 'not husband')))) %}</w:t>
-      </w:r>
-    </w:p>
-    <w:p>
-      <w:pPr>
-        <w:pStyle w:val="Body"/>
-      </w:pPr>
-      <w:r>
-        <w:rPr>
-          <w:b/>
-        </w:rPr>
-        <w:t>Parenting Plan Agreement &amp; Order, SHC-1128</w:t>
-      </w:r>
-      <w:r>
-        <w:t xml:space="preserve"> </w:t>
-      </w:r>
-      <w:r>
+        <w:rPr>
+          <w:rStyle w:val="Hyperlink"/>
+          <w:spacing w:val="0"/>
+        </w:rPr>
         <w:br/>
       </w:r>
       <w:hyperlink r:id="rId23" w:history="1">
@@ -2407,168 +2070,38 @@
             <w:rStyle w:val="Hyperlink"/>
             <w:spacing w:val="0"/>
           </w:rPr>
-          <w:t>Word</w:t>
+          <w:t>ak-courts.info/findlawyer</w:t>
         </w:r>
       </w:hyperlink>
       <w:r>
-        <w:t xml:space="preserve"> </w:t>
-      </w:r>
-      <w:r>
-        <w:br/>
-      </w:r>
-      <w:r>
-        <w:t xml:space="preserve"> </w:t>
+        <w:t>.</w:t>
+      </w:r>
+    </w:p>
+    <w:p>
+      <w:pPr>
+        <w:pStyle w:val="Body"/>
+      </w:pPr>
+      <w:r>
+        <w:rPr>
+          <w:color w:val="FF0000"/>
+        </w:rPr>
+        <w:t>{%p endif %}</w:t>
+      </w:r>
+    </w:p>
+    <w:p>
+      <w:pPr>
+        <w:pStyle w:val="Body"/>
+      </w:pPr>
+      <w:r>
+        <w:rPr>
+          <w:b/>
+        </w:rPr>
+        <w:t>Information Sheet, DR-314</w:t>
+      </w:r>
+      <w:r>
+        <w:t xml:space="preserve"> [</w:t>
       </w:r>
       <w:hyperlink r:id="rId24" w:history="1">
-        <w:r>
-          <w:rPr>
-            <w:rStyle w:val="Hyperlink"/>
-            <w:spacing w:val="0"/>
-          </w:rPr>
-          <w:t>PDF</w:t>
-        </w:r>
-      </w:hyperlink>
-    </w:p>
-    <w:p>
-      <w:pPr>
-        <w:pStyle w:val="Body"/>
-      </w:pPr>
-      <w:r>
-        <w:t xml:space="preserve">Do </w:t>
-      </w:r>
-      <w:r>
-        <w:rPr>
-          <w:b/>
-        </w:rPr>
-        <w:t>not</w:t>
-      </w:r>
-      <w:r>
-        <w:t xml:space="preserve"> sign the Order section.</w:t>
-      </w:r>
-    </w:p>
-    <w:p>
-      <w:pPr>
-        <w:pStyle w:val="Body"/>
-      </w:pPr>
-      <w:r>
-        <w:rPr>
-          <w:color w:val="92D050"/>
-        </w:rPr>
-        <w:t>{%p endif %}</w:t>
-      </w:r>
-    </w:p>
-    <w:p>
-      <w:pPr>
-        <w:pStyle w:val="Body"/>
-      </w:pPr>
-      <w:r>
-        <w:rPr>
-          <w:b/>
-        </w:rPr>
-        <w:t>Request to Put Agreement on the Record, DR-264</w:t>
-      </w:r>
-      <w:r>
-        <w:rPr>
-          <w:bCs/>
-        </w:rPr>
-        <w:t xml:space="preserve"> </w:t>
-      </w:r>
-      <w:r>
-        <w:rPr>
-          <w:bCs/>
-        </w:rPr>
-        <w:t>[</w:t>
-      </w:r>
-      <w:hyperlink r:id="rId25" w:history="1">
-        <w:r>
-          <w:rPr>
-            <w:rStyle w:val="Hyperlink"/>
-            <w:bCs/>
-            <w:spacing w:val="0"/>
-          </w:rPr>
-          <w:t>Fill-In PDF</w:t>
-        </w:r>
-      </w:hyperlink>
-      <w:r>
-        <w:rPr>
-          <w:bCs/>
-        </w:rPr>
-        <w:t>]</w:t>
-      </w:r>
-      <w:r>
-        <w:t xml:space="preserve"> </w:t>
-      </w:r>
-      <w:r>
-        <w:br/>
-      </w:r>
-      <w:hyperlink r:id="rId26" w:history="1">
-        <w:r>
-          <w:rPr>
-            <w:rStyle w:val="Hyperlink"/>
-            <w:spacing w:val="0"/>
-          </w:rPr>
-          <w:t>ak-courts.info/dr264</w:t>
-        </w:r>
-      </w:hyperlink>
-    </w:p>
-    <w:p>
-      <w:pPr>
-        <w:pStyle w:val="Body"/>
-      </w:pPr>
-      <w:r>
-        <w:rPr>
-          <w:color w:val="FFC000"/>
-        </w:rPr>
-        <w:t>{%p endif %}</w:t>
-      </w:r>
-    </w:p>
-    <w:p>
-      <w:pPr>
-        <w:pStyle w:val="Body"/>
-      </w:pPr>
-      <w:r>
-        <w:rPr>
-          <w:color w:val="FF0000"/>
-        </w:rPr>
-        <w:t>{%p endif %}</w:t>
-      </w:r>
-    </w:p>
-    <w:p>
-      <w:pPr>
-        <w:pStyle w:val="Heading3"/>
-      </w:pPr>
-      <w:r>
-        <w:t>Links in this step</w:t>
-      </w:r>
-    </w:p>
-    <w:p>
-      <w:pPr>
-        <w:pStyle w:val="Body"/>
-        <w:rPr>
-          <w:color w:val="FF0000"/>
-        </w:rPr>
-      </w:pPr>
-      <w:r>
-        <w:rPr>
-          <w:color w:val="FF0000"/>
-        </w:rPr>
-        <w:t>{%p if user_need == 'answer custody' %}</w:t>
-      </w:r>
-    </w:p>
-    <w:p>
-      <w:pPr>
-        <w:pStyle w:val="Body"/>
-      </w:pPr>
-      <w:r>
-        <w:rPr>
-          <w:b/>
-        </w:rPr>
-        <w:t>ANSWER AND COUNTERCLAIM TO COMPLAINT FOR CUSTODY OF MINOR CHILDREN, DR-450</w:t>
-      </w:r>
-      <w:r>
-        <w:t xml:space="preserve"> [</w:t>
-      </w:r>
-      <w:hyperlink r:id="rId27" w:history="1">
         <w:r>
           <w:rPr>
             <w:rStyle w:val="Hyperlink"/>
@@ -2590,89 +2123,74 @@
       <w:r>
         <w:br/>
       </w:r>
-      <w:hyperlink r:id="rId28" w:history="1">
+      <w:hyperlink r:id="rId25" w:history="1">
         <w:r>
           <w:rPr>
             <w:rStyle w:val="Hyperlink"/>
             <w:spacing w:val="0"/>
           </w:rPr>
-          <w:t>ak-courts.info/dr450</w:t>
+          <w:t>ak-courts.info/dr314</w:t>
         </w:r>
       </w:hyperlink>
     </w:p>
     <w:p>
       <w:pPr>
         <w:pStyle w:val="Body"/>
+        <w:numPr>
+          <w:ilvl w:val="0"/>
+          <w:numId w:val="11"/>
+        </w:numPr>
+        <w:ind w:left="540"/>
+      </w:pPr>
+      <w:r>
+        <w:lastRenderedPageBreak/>
+        <w:t xml:space="preserve">If {{ other_party_in_case }} filed an </w:t>
+      </w:r>
+      <w:r>
+        <w:rPr>
+          <w:b/>
+        </w:rPr>
+        <w:t>Information Sheet</w:t>
+      </w:r>
+      <w:r>
+        <w:t>, check the first box.</w:t>
+      </w:r>
+    </w:p>
+    <w:p>
+      <w:pPr>
+        <w:pStyle w:val="Body"/>
+        <w:numPr>
+          <w:ilvl w:val="0"/>
+          <w:numId w:val="11"/>
+        </w:numPr>
+        <w:ind w:left="540"/>
+      </w:pPr>
+      <w:r>
+        <w:t>If they did not file this form, answer 1 through 3.</w:t>
+      </w:r>
+    </w:p>
+    <w:p>
+      <w:pPr>
+        <w:pStyle w:val="Body"/>
+        <w:numPr>
+          <w:ilvl w:val="0"/>
+          <w:numId w:val="11"/>
+        </w:numPr>
+        <w:ind w:left="540"/>
+      </w:pPr>
+      <w:r>
+        <w:t>Sign, and date the form.</w:t>
+      </w:r>
+    </w:p>
+    <w:p>
+      <w:pPr>
+        <w:pStyle w:val="Body"/>
+      </w:pPr>
+      <w:r>
         <w:rPr>
           <w:color w:val="FF0000"/>
         </w:rPr>
-      </w:pPr>
-      <w:r>
-        <w:rPr>
-          <w:color w:val="FF0000"/>
-        </w:rPr>
-        <w:t>{%p endif %}</w:t>
-      </w:r>
-    </w:p>
-    <w:p>
-      <w:pPr>
-        <w:pStyle w:val="Body"/>
-        <w:rPr>
-          <w:color w:val="FF0000"/>
-        </w:rPr>
-      </w:pPr>
-      <w:r>
-        <w:rPr>
-          <w:color w:val="FF0000"/>
-        </w:rPr>
-        <w:t>{%p if u</w:t>
-      </w:r>
-      <w:r>
-        <w:rPr>
-          <w:color w:val="FF0000"/>
-        </w:rPr>
-        <w:t>ser_need == 'answer divorce</w:t>
-      </w:r>
-      <w:r>
-        <w:rPr>
-          <w:color w:val="FF0000"/>
-        </w:rPr>
-        <w:t>'</w:t>
-      </w:r>
-      <w:r>
-        <w:rPr>
-          <w:color w:val="FF0000"/>
-        </w:rPr>
-        <w:t xml:space="preserve"> %}</w:t>
-      </w:r>
-    </w:p>
-    <w:p>
-      <w:pPr>
-        <w:pStyle w:val="Body"/>
-        <w:rPr>
-          <w:color w:val="FFC000"/>
-        </w:rPr>
-      </w:pPr>
-      <w:r>
-        <w:rPr>
-          <w:color w:val="FFC000"/>
-        </w:rPr>
-        <w:lastRenderedPageBreak/>
-        <w:t>{%p if minor_children or (not minor_children and wife_is_pregnant in ('husband', 'not husband')) %}</w:t>
-      </w:r>
-    </w:p>
-    <w:p>
-      <w:pPr>
-        <w:pStyle w:val="Body"/>
-        <w:rPr>
-          <w:color w:val="92D050"/>
-        </w:rPr>
-      </w:pPr>
-      <w:r>
-        <w:rPr>
-          <w:color w:val="92D050"/>
-        </w:rPr>
-        <w:t>{%p if case_type == 'divorce' %}</w:t>
+        <w:t>{%p if user_need == 'answer custody' or (user_need == 'answer divorce' and (minor_children or (not minor_children and wife_is_pregnant in ('husband', 'not husband')))) %}</w:t>
       </w:r>
     </w:p>
     <w:p>
@@ -2683,12 +2201,12 @@
         <w:rPr>
           <w:b/>
         </w:rPr>
-        <w:t>ANSWER AND COUNTERCLAIM TO COMPLAINT FOR DIVORCE WITH CHILDREN, DR-832</w:t>
+        <w:t>Child Custody Jurisdiction Affidavit, DR-150</w:t>
       </w:r>
       <w:r>
         <w:t xml:space="preserve"> [</w:t>
       </w:r>
-      <w:hyperlink r:id="rId29" w:history="1">
+      <w:hyperlink r:id="rId26" w:history="1">
         <w:r>
           <w:rPr>
             <w:rStyle w:val="Hyperlink"/>
@@ -2705,38 +2223,49 @@
         </w:r>
       </w:hyperlink>
       <w:r>
-        <w:rPr>
-          <w:rStyle w:val="Hyperlink"/>
-          <w:color w:val="auto"/>
-          <w:spacing w:val="0"/>
-        </w:rPr>
         <w:t>]</w:t>
       </w:r>
       <w:r>
         <w:br/>
       </w:r>
-      <w:hyperlink r:id="rId30" w:history="1">
+      <w:hyperlink r:id="rId27" w:history="1">
         <w:r>
           <w:rPr>
             <w:rStyle w:val="Hyperlink"/>
             <w:spacing w:val="0"/>
           </w:rPr>
-          <w:t>ak-courts.info/dr832</w:t>
+          <w:t>ak-courts.info/dr150</w:t>
         </w:r>
       </w:hyperlink>
     </w:p>
     <w:p>
       <w:pPr>
         <w:pStyle w:val="Body"/>
-        <w:rPr>
-          <w:color w:val="92D050"/>
-        </w:rPr>
-      </w:pPr>
-      <w:r>
-        <w:rPr>
-          <w:color w:val="92D050"/>
-        </w:rPr>
-        <w:t>{%p elif case_type == 'legal separation' %}</w:t>
+      </w:pPr>
+      <w:r>
+        <w:rPr>
+          <w:color w:val="FFC000"/>
+        </w:rPr>
+        <w:t>{%p if type_of_response['case in 2 states'] and stage_of_other_case == 'still going' %}</w:t>
+      </w:r>
+    </w:p>
+    <w:p>
+      <w:pPr>
+        <w:pStyle w:val="Body"/>
+      </w:pPr>
+      <w:r>
+        <w:t>In paragraph 3 on page 3, tell the judge about the other case.</w:t>
+      </w:r>
+    </w:p>
+    <w:p>
+      <w:pPr>
+        <w:pStyle w:val="Body"/>
+      </w:pPr>
+      <w:r>
+        <w:rPr>
+          <w:color w:val="FFC000"/>
+        </w:rPr>
+        <w:t>{%p endif %}</w:t>
       </w:r>
     </w:p>
     <w:p>
@@ -2747,113 +2276,12 @@
         <w:rPr>
           <w:b/>
         </w:rPr>
-        <w:t>Answer &amp; Counterclaim to Legal Separation With Children, SHC-094</w:t>
-      </w:r>
-      <w:r>
-        <w:br/>
-      </w:r>
-      <w:hyperlink r:id="rId31" w:history="1">
-        <w:r>
-          <w:rPr>
-            <w:rStyle w:val="Hyperlink"/>
-            <w:spacing w:val="0"/>
-          </w:rPr>
-          <w:t>Word</w:t>
-        </w:r>
-      </w:hyperlink>
-      <w:r>
-        <w:br/>
-      </w:r>
-      <w:hyperlink r:id="rId32" w:history="1">
-        <w:r>
-          <w:rPr>
-            <w:rStyle w:val="Hyperlink"/>
-            <w:spacing w:val="0"/>
-          </w:rPr>
-          <w:t>courts.alaska.gov/shc/family/docs/shc-094.doc</w:t>
-        </w:r>
-      </w:hyperlink>
-      <w:r>
-        <w:br/>
-      </w:r>
-      <w:hyperlink r:id="rId33" w:history="1">
-        <w:r>
-          <w:rPr>
-            <w:rStyle w:val="Hyperlink"/>
-            <w:spacing w:val="0"/>
-          </w:rPr>
-          <w:t>PDF</w:t>
-        </w:r>
-      </w:hyperlink>
-      <w:r>
-        <w:br/>
-      </w:r>
-      <w:hyperlink r:id="rId34" w:history="1">
-        <w:r>
-          <w:rPr>
-            <w:rStyle w:val="Hyperlink"/>
-            <w:spacing w:val="0"/>
-          </w:rPr>
-          <w:t>courts.alaska.gov/shc/family/docs/shc-094n.pdf</w:t>
-        </w:r>
-      </w:hyperlink>
-    </w:p>
-    <w:p>
-      <w:pPr>
-        <w:pStyle w:val="Body"/>
-        <w:rPr>
-          <w:color w:val="92D050"/>
-        </w:rPr>
-      </w:pPr>
-      <w:r>
-        <w:rPr>
-          <w:color w:val="92D050"/>
-        </w:rPr>
-        <w:t>{%p endif %}</w:t>
-      </w:r>
-    </w:p>
-    <w:p>
-      <w:pPr>
-        <w:pStyle w:val="Body"/>
-        <w:rPr>
-          <w:color w:val="FFC000"/>
-        </w:rPr>
-      </w:pPr>
-      <w:r>
-        <w:rPr>
-          <w:color w:val="FFC000"/>
-        </w:rPr>
-        <w:t>{%p elif not minor_children and wife_is_pregnant == 'not pregnant' %}</w:t>
-      </w:r>
-    </w:p>
-    <w:p>
-      <w:pPr>
-        <w:pStyle w:val="Body"/>
-        <w:rPr>
-          <w:color w:val="92D050"/>
-        </w:rPr>
-      </w:pPr>
-      <w:r>
-        <w:rPr>
-          <w:color w:val="92D050"/>
-        </w:rPr>
-        <w:t>{%p if case_type == 'divorce' %}</w:t>
-      </w:r>
-    </w:p>
-    <w:p>
-      <w:pPr>
-        <w:pStyle w:val="Body"/>
-      </w:pPr>
-      <w:r>
-        <w:rPr>
-          <w:b/>
-        </w:rPr>
-        <w:t>ANSWER AND COUNTERCLAIM TO COMPLAINT FOR DIVORCE WITHOUT CHILDREN, DR-837</w:t>
+        <w:t>Child Support Guidelines Affidavit, DR-305</w:t>
       </w:r>
       <w:r>
         <w:t xml:space="preserve"> [</w:t>
       </w:r>
-      <w:hyperlink r:id="rId35" w:history="1">
+      <w:hyperlink r:id="rId28" w:history="1">
         <w:r>
           <w:rPr>
             <w:rStyle w:val="Hyperlink"/>
@@ -2875,28 +2303,182 @@
       <w:r>
         <w:br/>
       </w:r>
-      <w:hyperlink r:id="rId36" w:history="1">
+      <w:hyperlink r:id="rId29" w:history="1">
         <w:r>
           <w:rPr>
             <w:rStyle w:val="Hyperlink"/>
             <w:spacing w:val="0"/>
           </w:rPr>
-          <w:t>ak-courts.info/dr837</w:t>
+          <w:t>ak-courts.info/dr305</w:t>
         </w:r>
       </w:hyperlink>
     </w:p>
     <w:p>
       <w:pPr>
         <w:pStyle w:val="Body"/>
+      </w:pPr>
+      <w:r>
+        <w:t xml:space="preserve">See </w:t>
+      </w:r>
+      <w:hyperlink r:id="rId30" w:history="1">
+        <w:r>
+          <w:rPr>
+            <w:rStyle w:val="Hyperlink"/>
+            <w:spacing w:val="0"/>
+          </w:rPr>
+          <w:t>How to Fill out the Child Support Guidelines Affidavit</w:t>
+        </w:r>
+      </w:hyperlink>
+      <w:r>
+        <w:t xml:space="preserve"> </w:t>
+      </w:r>
+      <w:r>
+        <w:t>to help you fill in this form</w:t>
+      </w:r>
+      <w:r>
+        <w:br/>
+      </w:r>
+      <w:hyperlink r:id="rId31" w:history="1">
+        <w:r>
+          <w:rPr>
+            <w:rStyle w:val="Hyperlink"/>
+            <w:spacing w:val="0"/>
+          </w:rPr>
+          <w:t>ak-courts.info/dr305howto</w:t>
+        </w:r>
+      </w:hyperlink>
+      <w:r>
+        <w:t>.</w:t>
+      </w:r>
+    </w:p>
+    <w:p>
+      <w:pPr>
+        <w:pStyle w:val="Body"/>
+        <w:numPr>
+          <w:ilvl w:val="0"/>
+          <w:numId w:val="11"/>
+        </w:numPr>
+        <w:ind w:left="540"/>
+      </w:pPr>
+      <w:r>
+        <w:t xml:space="preserve">Attach your most recent tax return and pay stubs to the </w:t>
+      </w:r>
+      <w:r>
+        <w:rPr>
+          <w:b/>
+        </w:rPr>
+        <w:t>Child Support Guidelines Affidavit</w:t>
+      </w:r>
+      <w:r>
+        <w:t>.</w:t>
+      </w:r>
+    </w:p>
+    <w:p>
+      <w:pPr>
+        <w:pStyle w:val="Body"/>
+      </w:pPr>
+      <w:r>
+        <w:rPr>
+          <w:color w:val="FF0000"/>
+        </w:rPr>
+        <w:t>{%p endif %}</w:t>
+      </w:r>
+    </w:p>
+    <w:p>
+      <w:pPr>
+        <w:pStyle w:val="Body"/>
+      </w:pPr>
+      <w:r>
+        <w:rPr>
+          <w:color w:val="FF0000"/>
+        </w:rPr>
+        <w:t>{%p if (user_need == 'answer custody' and (type_of_response.all_true('ak custody case', exclusive=True) or type_of_response.all_true('ak custody case', 'improper service', exclusive=True))) or (user_need == 'answer divorce' and (type_of_response.all_true('ak divorce case', exclusive=True) or type_of_response.all_true('ak divorce case', 'improper service', exclusive=True))) %}</w:t>
+      </w:r>
+    </w:p>
+    <w:p>
+      <w:pPr>
+        <w:pStyle w:val="Body"/>
+      </w:pPr>
+      <w:r>
+        <w:rPr>
+          <w:color w:val="FFC000"/>
+        </w:rPr>
+        <w:t>{%p if (case_type in ('custody', 'divorce') or (case_type == 'legal separation' and want_legal_separation == 'yes')) %}</w:t>
+      </w:r>
+    </w:p>
+    <w:p>
+      <w:pPr>
+        <w:pStyle w:val="Body"/>
+      </w:pPr>
+      <w:r>
         <w:rPr>
           <w:color w:val="92D050"/>
         </w:rPr>
+        <w:t>{%p if response_to_complaint in ('agree', 'some') %}</w:t>
+      </w:r>
+    </w:p>
+    <w:p>
+      <w:pPr>
+        <w:pStyle w:val="Heading3"/>
+      </w:pPr>
+      <w:r>
+        <w:t>Forms to use if you and {{ other_party_in_case }} write out your agreement</w:t>
+      </w:r>
+    </w:p>
+    <w:p>
+      <w:pPr>
+        <w:pStyle w:val="Body"/>
+      </w:pPr>
+      <w:r>
+        <w:t>If you want to work with {{ other_party_in_case }} to write out the agreement and both sign it, use:</w:t>
+      </w:r>
+    </w:p>
+    <w:p>
+      <w:pPr>
+        <w:pStyle w:val="Body"/>
       </w:pPr>
       <w:r>
         <w:rPr>
           <w:color w:val="92D050"/>
         </w:rPr>
-        <w:t>{%p elif case_type == 'legal separation' %}</w:t>
+        <w:t>{%p elif response_to_complaint == 'none' and want_help_to_agree %}</w:t>
+      </w:r>
+    </w:p>
+    <w:p>
+      <w:pPr>
+        <w:pStyle w:val="Heading3"/>
+      </w:pPr>
+      <w:r>
+        <w:t>Forms to use if you reach an agreement</w:t>
+      </w:r>
+    </w:p>
+    <w:p>
+      <w:pPr>
+        <w:pStyle w:val="Body"/>
+      </w:pPr>
+      <w:r>
+        <w:rPr>
+          <w:color w:val="92D050"/>
+        </w:rPr>
+        <w:t>{%p endif %}</w:t>
+      </w:r>
+    </w:p>
+    <w:p>
+      <w:pPr>
+        <w:pStyle w:val="Body"/>
+      </w:pPr>
+      <w:r>
+        <w:rPr>
+          <w:color w:val="92D050"/>
+        </w:rPr>
+        <w:lastRenderedPageBreak/>
+        <w:t>{%p if user_need == 'answer custody' or (user_need == 'answer divorce' and (minor_children or (not minor_children and wife_is_pregnant in (</w:t>
+      </w:r>
+      <w:r>
+        <w:rPr>
+          <w:color w:val="92D050"/>
+        </w:rPr>
+        <w:t>'husband', 'not husband')))) %}</w:t>
       </w:r>
     </w:p>
     <w:p>
@@ -2907,7 +2489,7 @@
         <w:rPr>
           <w:b/>
         </w:rPr>
-        <w:t>Answer &amp; Counterclaim to Legal Separation Without Children, SHC-095</w:t>
+        <w:t>Parenting Plan Agreement &amp; Order, SHC-1128</w:t>
       </w:r>
       <w:r>
         <w:t xml:space="preserve"> </w:t>
@@ -2915,7 +2497,7 @@
       <w:r>
         <w:br/>
       </w:r>
-      <w:hyperlink r:id="rId37" w:history="1">
+      <w:hyperlink r:id="rId32" w:history="1">
         <w:r>
           <w:rPr>
             <w:rStyle w:val="Hyperlink"/>
@@ -2930,19 +2512,19 @@
       <w:r>
         <w:br/>
       </w:r>
-      <w:hyperlink r:id="rId38" w:history="1">
+      <w:hyperlink r:id="rId33" w:history="1">
         <w:r>
           <w:rPr>
             <w:rStyle w:val="Hyperlink"/>
             <w:spacing w:val="0"/>
           </w:rPr>
-          <w:t>courts.alaska.gov/shc/family/docs/shc-095.doc</w:t>
+          <w:t>courts.alaska.gov/shc/family/docs/shc-1128.doc</w:t>
         </w:r>
       </w:hyperlink>
       <w:r>
         <w:br/>
       </w:r>
-      <w:hyperlink r:id="rId39" w:history="1">
+      <w:hyperlink r:id="rId34" w:history="1">
         <w:r>
           <w:rPr>
             <w:rStyle w:val="Hyperlink"/>
@@ -2952,15 +2534,19 @@
         </w:r>
       </w:hyperlink>
       <w:r>
+        <w:rPr>
+          <w:rStyle w:val="Hyperlink"/>
+          <w:spacing w:val="0"/>
+        </w:rPr>
         <w:br/>
       </w:r>
-      <w:hyperlink r:id="rId40" w:history="1">
+      <w:hyperlink r:id="rId35" w:history="1">
         <w:r>
           <w:rPr>
             <w:rStyle w:val="Hyperlink"/>
             <w:spacing w:val="0"/>
           </w:rPr>
-          <w:t>courts.alaska.gov/shc/family/docs/shc-095n.pdf</w:t>
+          <w:t>courts.alaska.gov/shc/family/docs/shc-1128n.pdf</w:t>
         </w:r>
       </w:hyperlink>
     </w:p>
@@ -2969,6 +2555,23 @@
         <w:pStyle w:val="Body"/>
       </w:pPr>
       <w:r>
+        <w:t xml:space="preserve">Do </w:t>
+      </w:r>
+      <w:r>
+        <w:rPr>
+          <w:b/>
+        </w:rPr>
+        <w:t>not</w:t>
+      </w:r>
+      <w:r>
+        <w:t xml:space="preserve"> sign the Order section.</w:t>
+      </w:r>
+    </w:p>
+    <w:p>
+      <w:pPr>
+        <w:pStyle w:val="Body"/>
+      </w:pPr>
+      <w:r>
         <w:rPr>
           <w:color w:val="92D050"/>
         </w:rPr>
@@ -2981,6 +2584,54 @@
       </w:pPr>
       <w:r>
         <w:rPr>
+          <w:b/>
+        </w:rPr>
+        <w:t>Request to Put Agreement on the Record, DR-264</w:t>
+      </w:r>
+      <w:r>
+        <w:rPr>
+          <w:bCs/>
+        </w:rPr>
+        <w:t xml:space="preserve"> [</w:t>
+      </w:r>
+      <w:hyperlink r:id="rId36" w:history="1">
+        <w:r>
+          <w:rPr>
+            <w:rStyle w:val="Hyperlink"/>
+            <w:bCs/>
+            <w:spacing w:val="0"/>
+          </w:rPr>
+          <w:t>Fill-In PDF</w:t>
+        </w:r>
+      </w:hyperlink>
+      <w:r>
+        <w:rPr>
+          <w:bCs/>
+        </w:rPr>
+        <w:t>]</w:t>
+      </w:r>
+      <w:r>
+        <w:t xml:space="preserve"> </w:t>
+      </w:r>
+      <w:r>
+        <w:br/>
+      </w:r>
+      <w:hyperlink r:id="rId37" w:history="1">
+        <w:r>
+          <w:rPr>
+            <w:rStyle w:val="Hyperlink"/>
+            <w:spacing w:val="0"/>
+          </w:rPr>
+          <w:t>ak-courts.info/dr264</w:t>
+        </w:r>
+      </w:hyperlink>
+    </w:p>
+    <w:p>
+      <w:pPr>
+        <w:pStyle w:val="Body"/>
+      </w:pPr>
+      <w:r>
+        <w:rPr>
           <w:color w:val="FFC000"/>
         </w:rPr>
         <w:t>{%p endif %}</w:t>
@@ -2989,62 +2640,50 @@
     <w:p>
       <w:pPr>
         <w:pStyle w:val="Body"/>
+      </w:pPr>
+      <w:r>
         <w:rPr>
           <w:color w:val="FF0000"/>
         </w:rPr>
-      </w:pPr>
-      <w:r>
+        <w:t>{%p endif %}</w:t>
+      </w:r>
+    </w:p>
+    <w:p>
+      <w:pPr>
+        <w:pStyle w:val="Heading3"/>
+      </w:pPr>
+      <w:r>
+        <w:t>Links in this step</w:t>
+      </w:r>
+    </w:p>
+    <w:p>
+      <w:pPr>
+        <w:pStyle w:val="Body"/>
         <w:rPr>
           <w:color w:val="FF0000"/>
         </w:rPr>
-        <w:t>{%p endif %}</w:t>
-      </w:r>
-    </w:p>
-    <w:p>
-      <w:pPr>
-        <w:pStyle w:val="Body"/>
+      </w:pPr>
+      <w:r>
         <w:rPr>
           <w:color w:val="FF0000"/>
         </w:rPr>
-      </w:pPr>
-      <w:r>
-        <w:rPr>
-          <w:color w:val="FF0000"/>
-        </w:rPr>
-        <w:t>{%p if type_of_response['default'] and stage_of_default in ('application filed', 'hearing scheduled') %}</w:t>
-      </w:r>
-    </w:p>
-    <w:p>
-      <w:pPr>
-        <w:pStyle w:val="Body"/>
-        <w:rPr>
-          <w:color w:val="FFC000"/>
-        </w:rPr>
-      </w:pPr>
-      <w:r>
-        <w:rPr>
-          <w:color w:val="FFC000"/>
-        </w:rPr>
-        <w:t>{%p if stage_of_default == 'application filed' and proper_service %}</w:t>
-      </w:r>
-    </w:p>
-    <w:p>
-      <w:pPr>
-        <w:pStyle w:val="Body"/>
-      </w:pPr>
-      <w:r>
-        <w:t xml:space="preserve">Fill out a </w:t>
-      </w:r>
+        <w:t>{%p if user_need == 'answer custody' %}</w:t>
+      </w:r>
+    </w:p>
+    <w:p>
+      <w:pPr>
+        <w:pStyle w:val="Body"/>
+      </w:pPr>
       <w:r>
         <w:rPr>
           <w:b/>
         </w:rPr>
-        <w:t>TF-706 Motion (Request) and Affidavit</w:t>
+        <w:t>ANSWER AND COUNTERCLAIM TO COMPLAINT FOR CUSTODY OF MINOR CHILDREN, DR-450</w:t>
       </w:r>
       <w:r>
         <w:t xml:space="preserve"> [</w:t>
       </w:r>
-      <w:hyperlink r:id="rId41" w:history="1">
+      <w:hyperlink r:id="rId38" w:history="1">
         <w:r>
           <w:rPr>
             <w:rStyle w:val="Hyperlink"/>
@@ -3066,36 +2705,88 @@
       <w:r>
         <w:br/>
       </w:r>
-      <w:hyperlink r:id="rId42" w:history="1">
+      <w:hyperlink r:id="rId39" w:history="1">
         <w:r>
           <w:rPr>
             <w:rStyle w:val="Hyperlink"/>
             <w:spacing w:val="0"/>
           </w:rPr>
-          <w:t>ak-courts.info/tf706</w:t>
+          <w:t>ak-courts.info/dr450</w:t>
         </w:r>
       </w:hyperlink>
     </w:p>
     <w:p>
       <w:pPr>
         <w:pStyle w:val="Body"/>
-      </w:pPr>
-      <w:r>
+        <w:rPr>
+          <w:color w:val="FF0000"/>
+        </w:rPr>
+      </w:pPr>
+      <w:r>
+        <w:rPr>
+          <w:color w:val="FF0000"/>
+        </w:rPr>
+        <w:t>{%p endif %}</w:t>
+      </w:r>
+    </w:p>
+    <w:p>
+      <w:pPr>
+        <w:pStyle w:val="Body"/>
+        <w:rPr>
+          <w:color w:val="FF0000"/>
+        </w:rPr>
+      </w:pPr>
+      <w:r>
+        <w:rPr>
+          <w:color w:val="FF0000"/>
+        </w:rPr>
+        <w:t>{%p if u</w:t>
+      </w:r>
+      <w:r>
+        <w:rPr>
+          <w:color w:val="FF0000"/>
+        </w:rPr>
+        <w:t>ser_need == 'answer divorce</w:t>
+      </w:r>
+      <w:r>
+        <w:rPr>
+          <w:color w:val="FF0000"/>
+        </w:rPr>
+        <w:t>'</w:t>
+      </w:r>
+      <w:r>
+        <w:rPr>
+          <w:color w:val="FF0000"/>
+        </w:rPr>
+        <w:t xml:space="preserve"> %}</w:t>
+      </w:r>
+    </w:p>
+    <w:p>
+      <w:pPr>
+        <w:pStyle w:val="Body"/>
         <w:rPr>
           <w:color w:val="FFC000"/>
         </w:rPr>
-        <w:t xml:space="preserve"> {%p endif %}</w:t>
-      </w:r>
-    </w:p>
-    <w:p>
-      <w:pPr>
-        <w:pStyle w:val="Body"/>
       </w:pPr>
       <w:r>
         <w:rPr>
           <w:color w:val="FFC000"/>
         </w:rPr>
-        <w:t>{%p if stage_of_default == 'hearing scheduled' %}</w:t>
+        <w:t>{%p if minor_children or (not minor_children and wife_is_pregnant in ('husband', 'not husband')) %}</w:t>
+      </w:r>
+    </w:p>
+    <w:p>
+      <w:pPr>
+        <w:pStyle w:val="Body"/>
+        <w:rPr>
+          <w:color w:val="92D050"/>
+        </w:rPr>
+      </w:pPr>
+      <w:r>
+        <w:rPr>
+          <w:color w:val="92D050"/>
+        </w:rPr>
+        <w:t>{%p if case_type == 'divorce' %}</w:t>
       </w:r>
     </w:p>
     <w:p>
@@ -3106,13 +2797,12 @@
         <w:rPr>
           <w:b/>
         </w:rPr>
-        <w:lastRenderedPageBreak/>
-        <w:t>Motion, Affidavit, and Order to Set Aside Entry of Default and Accept Late Filed Answer, CIV-858</w:t>
+        <w:t>ANSWER AND COUNTERCLAIM TO COMPLAINT FOR DIVORCE WITH CHILDREN, DR-832</w:t>
       </w:r>
       <w:r>
         <w:t xml:space="preserve"> [</w:t>
       </w:r>
-      <w:hyperlink r:id="rId43" w:history="1">
+      <w:hyperlink r:id="rId40" w:history="1">
         <w:r>
           <w:rPr>
             <w:rStyle w:val="Hyperlink"/>
@@ -3129,12 +2819,436 @@
         </w:r>
       </w:hyperlink>
       <w:r>
+        <w:rPr>
+          <w:rStyle w:val="Hyperlink"/>
+          <w:color w:val="auto"/>
+          <w:spacing w:val="0"/>
+        </w:rPr>
         <w:t>]</w:t>
       </w:r>
       <w:r>
         <w:br/>
       </w:r>
+      <w:hyperlink r:id="rId41" w:history="1">
+        <w:r>
+          <w:rPr>
+            <w:rStyle w:val="Hyperlink"/>
+            <w:spacing w:val="0"/>
+          </w:rPr>
+          <w:t>ak-courts.info/dr832</w:t>
+        </w:r>
+      </w:hyperlink>
+    </w:p>
+    <w:p>
+      <w:pPr>
+        <w:pStyle w:val="Body"/>
+        <w:rPr>
+          <w:color w:val="92D050"/>
+        </w:rPr>
+      </w:pPr>
+      <w:r>
+        <w:rPr>
+          <w:color w:val="92D050"/>
+        </w:rPr>
+        <w:t>{%p elif case_type == 'legal separation' %}</w:t>
+      </w:r>
+    </w:p>
+    <w:p>
+      <w:pPr>
+        <w:pStyle w:val="Body"/>
+      </w:pPr>
+      <w:r>
+        <w:rPr>
+          <w:b/>
+        </w:rPr>
+        <w:t>Answer &amp; Counterclaim to Legal Separation With Children, SHC-094</w:t>
+      </w:r>
+      <w:r>
+        <w:br/>
+      </w:r>
+      <w:hyperlink r:id="rId42" w:history="1">
+        <w:r>
+          <w:rPr>
+            <w:rStyle w:val="Hyperlink"/>
+            <w:spacing w:val="0"/>
+          </w:rPr>
+          <w:t>Word</w:t>
+        </w:r>
+      </w:hyperlink>
+      <w:r>
+        <w:br/>
+      </w:r>
+      <w:hyperlink r:id="rId43" w:history="1">
+        <w:r>
+          <w:rPr>
+            <w:rStyle w:val="Hyperlink"/>
+            <w:spacing w:val="0"/>
+          </w:rPr>
+          <w:t>courts.alaska.gov/shc/family/docs/shc-094.doc</w:t>
+        </w:r>
+      </w:hyperlink>
+      <w:r>
+        <w:br/>
+      </w:r>
       <w:hyperlink r:id="rId44" w:history="1">
+        <w:r>
+          <w:rPr>
+            <w:rStyle w:val="Hyperlink"/>
+            <w:spacing w:val="0"/>
+          </w:rPr>
+          <w:t>PDF</w:t>
+        </w:r>
+      </w:hyperlink>
+      <w:r>
+        <w:br/>
+      </w:r>
+      <w:hyperlink r:id="rId45" w:history="1">
+        <w:r>
+          <w:rPr>
+            <w:rStyle w:val="Hyperlink"/>
+            <w:spacing w:val="0"/>
+          </w:rPr>
+          <w:t>courts.alaska.gov/shc/family/docs/shc-094n.pdf</w:t>
+        </w:r>
+      </w:hyperlink>
+    </w:p>
+    <w:p>
+      <w:pPr>
+        <w:pStyle w:val="Body"/>
+        <w:rPr>
+          <w:color w:val="92D050"/>
+        </w:rPr>
+      </w:pPr>
+      <w:r>
+        <w:rPr>
+          <w:color w:val="92D050"/>
+        </w:rPr>
+        <w:t>{%p endif %}</w:t>
+      </w:r>
+    </w:p>
+    <w:p>
+      <w:pPr>
+        <w:pStyle w:val="Body"/>
+        <w:rPr>
+          <w:color w:val="FFC000"/>
+        </w:rPr>
+      </w:pPr>
+      <w:r>
+        <w:rPr>
+          <w:color w:val="FFC000"/>
+        </w:rPr>
+        <w:lastRenderedPageBreak/>
+        <w:t>{%p elif not minor_children and wife_is_pregnant == 'not pregnant' %}</w:t>
+      </w:r>
+    </w:p>
+    <w:p>
+      <w:pPr>
+        <w:pStyle w:val="Body"/>
+        <w:rPr>
+          <w:color w:val="92D050"/>
+        </w:rPr>
+      </w:pPr>
+      <w:r>
+        <w:rPr>
+          <w:color w:val="92D050"/>
+        </w:rPr>
+        <w:t>{%p if case_type == 'divorce' %}</w:t>
+      </w:r>
+    </w:p>
+    <w:p>
+      <w:pPr>
+        <w:pStyle w:val="Body"/>
+      </w:pPr>
+      <w:r>
+        <w:rPr>
+          <w:b/>
+        </w:rPr>
+        <w:t>ANSWER AND COUNTERCLAIM TO COMPLAINT FOR DIVORCE WITHOUT CHILDREN, DR-837</w:t>
+      </w:r>
+      <w:r>
+        <w:t xml:space="preserve"> [</w:t>
+      </w:r>
+      <w:hyperlink r:id="rId46" w:history="1">
+        <w:r>
+          <w:rPr>
+            <w:rStyle w:val="Hyperlink"/>
+            <w:spacing w:val="0"/>
+          </w:rPr>
+          <w:t>Fill-In</w:t>
+        </w:r>
+        <w:r>
+          <w:rPr>
+            <w:rStyle w:val="Hyperlink"/>
+            <w:spacing w:val="0"/>
+          </w:rPr>
+          <w:t xml:space="preserve"> PDF</w:t>
+        </w:r>
+      </w:hyperlink>
+      <w:r>
+        <w:t>]</w:t>
+      </w:r>
+      <w:r>
+        <w:br/>
+      </w:r>
+      <w:hyperlink r:id="rId47" w:history="1">
+        <w:r>
+          <w:rPr>
+            <w:rStyle w:val="Hyperlink"/>
+            <w:spacing w:val="0"/>
+          </w:rPr>
+          <w:t>ak-courts.info/dr837</w:t>
+        </w:r>
+      </w:hyperlink>
+    </w:p>
+    <w:p>
+      <w:pPr>
+        <w:pStyle w:val="Body"/>
+        <w:rPr>
+          <w:color w:val="92D050"/>
+        </w:rPr>
+      </w:pPr>
+      <w:r>
+        <w:rPr>
+          <w:color w:val="92D050"/>
+        </w:rPr>
+        <w:t>{%p elif case_type == 'legal separation' %}</w:t>
+      </w:r>
+    </w:p>
+    <w:p>
+      <w:pPr>
+        <w:pStyle w:val="Body"/>
+      </w:pPr>
+      <w:r>
+        <w:rPr>
+          <w:b/>
+        </w:rPr>
+        <w:t>Answer &amp; Counterclaim to Legal Separation Without Children, SHC-095</w:t>
+      </w:r>
+      <w:r>
+        <w:t xml:space="preserve"> </w:t>
+      </w:r>
+      <w:r>
+        <w:br/>
+      </w:r>
+      <w:hyperlink r:id="rId48" w:history="1">
+        <w:r>
+          <w:rPr>
+            <w:rStyle w:val="Hyperlink"/>
+            <w:spacing w:val="0"/>
+          </w:rPr>
+          <w:t>Word</w:t>
+        </w:r>
+      </w:hyperlink>
+      <w:r>
+        <w:t xml:space="preserve"> </w:t>
+      </w:r>
+      <w:r>
+        <w:br/>
+      </w:r>
+      <w:hyperlink r:id="rId49" w:history="1">
+        <w:r>
+          <w:rPr>
+            <w:rStyle w:val="Hyperlink"/>
+            <w:spacing w:val="0"/>
+          </w:rPr>
+          <w:t>courts.alaska.gov/shc/family/docs/shc-095.doc</w:t>
+        </w:r>
+      </w:hyperlink>
+      <w:r>
+        <w:br/>
+      </w:r>
+      <w:hyperlink r:id="rId50" w:history="1">
+        <w:r>
+          <w:rPr>
+            <w:rStyle w:val="Hyperlink"/>
+            <w:spacing w:val="0"/>
+          </w:rPr>
+          <w:t>PDF</w:t>
+        </w:r>
+      </w:hyperlink>
+      <w:r>
+        <w:br/>
+      </w:r>
+      <w:hyperlink r:id="rId51" w:history="1">
+        <w:r>
+          <w:rPr>
+            <w:rStyle w:val="Hyperlink"/>
+            <w:spacing w:val="0"/>
+          </w:rPr>
+          <w:t>courts.alaska.gov/shc/family/docs/shc-095n.pdf</w:t>
+        </w:r>
+      </w:hyperlink>
+    </w:p>
+    <w:p>
+      <w:pPr>
+        <w:pStyle w:val="Body"/>
+      </w:pPr>
+      <w:r>
+        <w:rPr>
+          <w:color w:val="92D050"/>
+        </w:rPr>
+        <w:t>{%p endif %}</w:t>
+      </w:r>
+    </w:p>
+    <w:p>
+      <w:pPr>
+        <w:pStyle w:val="Body"/>
+      </w:pPr>
+      <w:r>
+        <w:rPr>
+          <w:color w:val="FFC000"/>
+        </w:rPr>
+        <w:t>{%p endif %}</w:t>
+      </w:r>
+    </w:p>
+    <w:p>
+      <w:pPr>
+        <w:pStyle w:val="Body"/>
+        <w:rPr>
+          <w:color w:val="FF0000"/>
+        </w:rPr>
+      </w:pPr>
+      <w:r>
+        <w:rPr>
+          <w:color w:val="FF0000"/>
+        </w:rPr>
+        <w:t>{%p endif %}</w:t>
+      </w:r>
+    </w:p>
+    <w:p>
+      <w:pPr>
+        <w:pStyle w:val="Body"/>
+        <w:rPr>
+          <w:color w:val="FF0000"/>
+        </w:rPr>
+      </w:pPr>
+      <w:r>
+        <w:rPr>
+          <w:color w:val="FF0000"/>
+        </w:rPr>
+        <w:t>{%p if type_of_response['default'] and stage_of_default in ('application filed', 'hearing scheduled') %}</w:t>
+      </w:r>
+    </w:p>
+    <w:p>
+      <w:pPr>
+        <w:pStyle w:val="Body"/>
+        <w:rPr>
+          <w:color w:val="FFC000"/>
+        </w:rPr>
+      </w:pPr>
+      <w:r>
+        <w:rPr>
+          <w:color w:val="FFC000"/>
+        </w:rPr>
+        <w:t>{%p if stage_of_default == 'application filed' and proper_service %}</w:t>
+      </w:r>
+    </w:p>
+    <w:p>
+      <w:pPr>
+        <w:pStyle w:val="Body"/>
+      </w:pPr>
+      <w:r>
+        <w:t xml:space="preserve">Fill out a </w:t>
+      </w:r>
+      <w:r>
+        <w:rPr>
+          <w:b/>
+        </w:rPr>
+        <w:t>TF-706 Motion (Request) and Affidavit</w:t>
+      </w:r>
+      <w:r>
+        <w:t xml:space="preserve"> [</w:t>
+      </w:r>
+      <w:hyperlink r:id="rId52" w:history="1">
+        <w:r>
+          <w:rPr>
+            <w:rStyle w:val="Hyperlink"/>
+            <w:spacing w:val="0"/>
+          </w:rPr>
+          <w:t>Fill-In</w:t>
+        </w:r>
+        <w:r>
+          <w:rPr>
+            <w:rStyle w:val="Hyperlink"/>
+            <w:spacing w:val="0"/>
+          </w:rPr>
+          <w:t xml:space="preserve"> PDF</w:t>
+        </w:r>
+      </w:hyperlink>
+      <w:r>
+        <w:t>]</w:t>
+      </w:r>
+      <w:r>
+        <w:br/>
+      </w:r>
+      <w:hyperlink r:id="rId53" w:history="1">
+        <w:r>
+          <w:rPr>
+            <w:rStyle w:val="Hyperlink"/>
+            <w:spacing w:val="0"/>
+          </w:rPr>
+          <w:t>ak-courts.info/tf706</w:t>
+        </w:r>
+      </w:hyperlink>
+    </w:p>
+    <w:p>
+      <w:pPr>
+        <w:pStyle w:val="Body"/>
+      </w:pPr>
+      <w:r>
+        <w:rPr>
+          <w:color w:val="FFC000"/>
+        </w:rPr>
+        <w:t xml:space="preserve"> {%p endif %}</w:t>
+      </w:r>
+    </w:p>
+    <w:p>
+      <w:pPr>
+        <w:pStyle w:val="Body"/>
+      </w:pPr>
+      <w:r>
+        <w:rPr>
+          <w:color w:val="FFC000"/>
+        </w:rPr>
+        <w:t>{%p if stage_of_default == 'hearing scheduled' %}</w:t>
+      </w:r>
+    </w:p>
+    <w:p>
+      <w:pPr>
+        <w:pStyle w:val="Body"/>
+      </w:pPr>
+      <w:r>
+        <w:rPr>
+          <w:b/>
+        </w:rPr>
+        <w:t>Motion, Affidavit, and Order to Set Aside Entry of Default and Accept Late Filed Answer, CIV-858</w:t>
+      </w:r>
+      <w:r>
+        <w:t xml:space="preserve"> [</w:t>
+      </w:r>
+      <w:hyperlink r:id="rId54" w:history="1">
+        <w:r>
+          <w:rPr>
+            <w:rStyle w:val="Hyperlink"/>
+            <w:spacing w:val="0"/>
+          </w:rPr>
+          <w:t>Fill-In</w:t>
+        </w:r>
+        <w:r>
+          <w:rPr>
+            <w:rStyle w:val="Hyperlink"/>
+            <w:spacing w:val="0"/>
+          </w:rPr>
+          <w:t xml:space="preserve"> PDF</w:t>
+        </w:r>
+      </w:hyperlink>
+      <w:r>
+        <w:t>]</w:t>
+      </w:r>
+      <w:r>
+        <w:br/>
+      </w:r>
+      <w:hyperlink r:id="rId55" w:history="1">
         <w:r>
           <w:rPr>
             <w:rStyle w:val="Hyperlink"/>
@@ -3184,7 +3298,7 @@
       <w:pPr>
         <w:pStyle w:val="Body"/>
       </w:pPr>
-      <w:hyperlink r:id="rId45" w:history="1">
+      <w:hyperlink r:id="rId56" w:history="1">
         <w:r>
           <w:rPr>
             <w:rStyle w:val="Hyperlink"/>
@@ -3196,23 +3310,14 @@
       <w:r>
         <w:br/>
       </w:r>
-      <w:hyperlink r:id="rId46" w:history="1">
+      <w:hyperlink r:id="rId57" w:history="1">
         <w:r>
           <w:rPr>
             <w:rStyle w:val="Hyperlink"/>
             <w:spacing w:val="0"/>
           </w:rPr>
-          <w:t>ak-courts.info/</w:t>
+          <w:t>ak-courts.info/findlawyer</w:t>
         </w:r>
-        <w:proofErr w:type="spellStart"/>
-        <w:r>
-          <w:rPr>
-            <w:rStyle w:val="Hyperlink"/>
-            <w:spacing w:val="0"/>
-          </w:rPr>
-          <w:t>findlawyer</w:t>
-        </w:r>
-        <w:proofErr w:type="spellEnd"/>
       </w:hyperlink>
     </w:p>
     <w:p>
@@ -5112,6 +5217,7 @@
   <w:style w:type="character" w:default="1" w:styleId="DefaultParagraphFont">
     <w:name w:val="Default Paragraph Font"/>
     <w:uiPriority w:val="1"/>
+    <w:semiHidden/>
     <w:unhideWhenUsed/>
   </w:style>
   <w:style w:type="table" w:default="1" w:styleId="TableNormal">

</xml_diff>

<commit_message>
reverted answer and dismiss steps to have signing paragraph content in them rather than including docx
</commit_message>
<xml_diff>
--- a/docassemble/AKA2JBranding/data/templates/answer_content.docx
+++ b/docassemble/AKA2JBranding/data/templates/answer_content.docx
@@ -74,7 +74,11 @@
         <w:t xml:space="preserve">Give a copy of the forms to {{ other_party_in_case }}. See </w:t>
       </w:r>
       <w:r>
-        <w:t>{{ truefiling_serve</w:t>
+        <w:t xml:space="preserve">{{ </w:t>
+      </w:r>
+      <w:proofErr w:type="spellStart"/>
+      <w:r>
+        <w:t>truefiling_serve</w:t>
       </w:r>
       <w:r>
         <w:t>_step</w:t>
@@ -82,22 +86,550 @@
       <w:r>
         <w:t>.subject</w:t>
       </w:r>
+      <w:proofErr w:type="spellEnd"/>
       <w:r>
         <w:t xml:space="preserve"> }}.</w:t>
       </w:r>
     </w:p>
     <w:p>
       <w:pPr>
-        <w:pStyle w:val="Body"/>
-      </w:pPr>
-      <w:r>
-        <w:t>{{p (include_docx_template("docassemble.AKA2JBranding:</w:t>
-      </w:r>
-      <w:r>
-        <w:t>signing_paragraph_content.docx</w:t>
-      </w:r>
-      <w:r>
-        <w:t xml:space="preserve"> ")) }}</w:t>
+        <w:pStyle w:val="Example"/>
+        <w:rPr>
+          <w:color w:val="auto"/>
+        </w:rPr>
+      </w:pPr>
+      <w:r>
+        <w:t>Important - signing your documents</w:t>
+      </w:r>
+    </w:p>
+    <w:p>
+      <w:pPr>
+        <w:rPr>
+          <w:rFonts w:ascii="Helvetica" w:eastAsiaTheme="minorHAnsi" w:hAnsi="Helvetica" w:cs="Helvetica"/>
+          <w:sz w:val="24"/>
+          <w:szCs w:val="24"/>
+        </w:rPr>
+      </w:pPr>
+      <w:r>
+        <w:rPr>
+          <w:rFonts w:ascii="Helvetica" w:eastAsiaTheme="minorHAnsi" w:hAnsi="Helvetica" w:cs="Helvetica"/>
+          <w:color w:val="FF0000"/>
+          <w:sz w:val="24"/>
+          <w:szCs w:val="24"/>
+        </w:rPr>
+        <w:t>{%p</w:t>
+      </w:r>
+      <w:r>
+        <w:rPr>
+          <w:rFonts w:ascii="Helvetica" w:eastAsiaTheme="minorHAnsi" w:hAnsi="Helvetica" w:cs="Helvetica"/>
+          <w:color w:val="FF0000"/>
+          <w:sz w:val="24"/>
+          <w:szCs w:val="24"/>
+        </w:rPr>
+        <w:t xml:space="preserve"> if </w:t>
+      </w:r>
+      <w:proofErr w:type="spellStart"/>
+      <w:r>
+        <w:rPr>
+          <w:rFonts w:ascii="Helvetica" w:eastAsiaTheme="minorHAnsi" w:hAnsi="Helvetica" w:cs="Helvetica"/>
+          <w:color w:val="FF0000"/>
+          <w:sz w:val="24"/>
+          <w:szCs w:val="24"/>
+        </w:rPr>
+        <w:t>filling_manner</w:t>
+      </w:r>
+      <w:proofErr w:type="spellEnd"/>
+      <w:r>
+        <w:rPr>
+          <w:rFonts w:ascii="Helvetica" w:eastAsiaTheme="minorHAnsi" w:hAnsi="Helvetica" w:cs="Helvetica"/>
+          <w:color w:val="FF0000"/>
+          <w:sz w:val="24"/>
+          <w:szCs w:val="24"/>
+        </w:rPr>
+        <w:t xml:space="preserve"> in('electronically', '</w:t>
+      </w:r>
+      <w:proofErr w:type="spellStart"/>
+      <w:r>
+        <w:rPr>
+          <w:rFonts w:ascii="Helvetica" w:eastAsiaTheme="minorHAnsi" w:hAnsi="Helvetica" w:cs="Helvetica"/>
+          <w:color w:val="FF0000"/>
+          <w:sz w:val="24"/>
+          <w:szCs w:val="24"/>
+        </w:rPr>
+        <w:t>dunno</w:t>
+      </w:r>
+      <w:proofErr w:type="spellEnd"/>
+      <w:r>
+        <w:rPr>
+          <w:rFonts w:ascii="Helvetica" w:eastAsiaTheme="minorHAnsi" w:hAnsi="Helvetica" w:cs="Helvetica"/>
+          <w:color w:val="FF0000"/>
+          <w:sz w:val="24"/>
+          <w:szCs w:val="24"/>
+        </w:rPr>
+        <w:t xml:space="preserve">') and </w:t>
+      </w:r>
+      <w:proofErr w:type="spellStart"/>
+      <w:r>
+        <w:rPr>
+          <w:rFonts w:ascii="Helvetica" w:eastAsiaTheme="minorHAnsi" w:hAnsi="Helvetica" w:cs="Helvetica"/>
+          <w:color w:val="FF0000"/>
+          <w:sz w:val="24"/>
+          <w:szCs w:val="24"/>
+        </w:rPr>
+        <w:t>filing_method</w:t>
+      </w:r>
+      <w:proofErr w:type="spellEnd"/>
+      <w:r>
+        <w:rPr>
+          <w:rFonts w:ascii="Helvetica" w:eastAsiaTheme="minorHAnsi" w:hAnsi="Helvetica" w:cs="Helvetica"/>
+          <w:color w:val="FF0000"/>
+          <w:sz w:val="24"/>
+          <w:szCs w:val="24"/>
+        </w:rPr>
+        <w:t xml:space="preserve"> in('</w:t>
+      </w:r>
+      <w:proofErr w:type="spellStart"/>
+      <w:r>
+        <w:rPr>
+          <w:rFonts w:ascii="Helvetica" w:eastAsiaTheme="minorHAnsi" w:hAnsi="Helvetica" w:cs="Helvetica"/>
+          <w:color w:val="FF0000"/>
+          <w:sz w:val="24"/>
+          <w:szCs w:val="24"/>
+        </w:rPr>
+        <w:t>efiling</w:t>
+      </w:r>
+      <w:proofErr w:type="spellEnd"/>
+      <w:r>
+        <w:rPr>
+          <w:rFonts w:ascii="Helvetica" w:eastAsiaTheme="minorHAnsi" w:hAnsi="Helvetica" w:cs="Helvetica"/>
+          <w:color w:val="FF0000"/>
+          <w:sz w:val="24"/>
+          <w:szCs w:val="24"/>
+        </w:rPr>
+        <w:t>', '</w:t>
+      </w:r>
+      <w:proofErr w:type="spellStart"/>
+      <w:r>
+        <w:rPr>
+          <w:rFonts w:ascii="Helvetica" w:eastAsiaTheme="minorHAnsi" w:hAnsi="Helvetica" w:cs="Helvetica"/>
+          <w:color w:val="FF0000"/>
+          <w:sz w:val="24"/>
+          <w:szCs w:val="24"/>
+        </w:rPr>
+        <w:t>dunno</w:t>
+      </w:r>
+      <w:proofErr w:type="spellEnd"/>
+      <w:r>
+        <w:rPr>
+          <w:rFonts w:ascii="Helvetica" w:eastAsiaTheme="minorHAnsi" w:hAnsi="Helvetica" w:cs="Helvetica"/>
+          <w:color w:val="FF0000"/>
+          <w:sz w:val="24"/>
+          <w:szCs w:val="24"/>
+        </w:rPr>
+        <w:t>')</w:t>
+      </w:r>
+      <w:r>
+        <w:rPr>
+          <w:rFonts w:ascii="Helvetica" w:eastAsiaTheme="minorHAnsi" w:hAnsi="Helvetica" w:cs="Helvetica"/>
+          <w:color w:val="FF0000"/>
+          <w:sz w:val="24"/>
+          <w:szCs w:val="24"/>
+        </w:rPr>
+        <w:t xml:space="preserve"> %}</w:t>
+      </w:r>
+    </w:p>
+    <w:p>
+      <w:pPr>
+        <w:pStyle w:val="Exampleparagraph"/>
+      </w:pPr>
+      <w:r>
+        <w:t>If you fill out your forms on a computer and file them with TrueFiling, you can sign your forms electronically.  Type “/s/ your name” on the signature line. For example, Zoe Lee’s signature would be "/s/ Zoe Lee."</w:t>
+      </w:r>
+    </w:p>
+    <w:p>
+      <w:pPr>
+        <w:rPr>
+          <w:rFonts w:ascii="Helvetica" w:eastAsiaTheme="minorHAnsi" w:hAnsi="Helvetica" w:cs="Helvetica"/>
+          <w:sz w:val="24"/>
+          <w:szCs w:val="24"/>
+        </w:rPr>
+      </w:pPr>
+      <w:r>
+        <w:rPr>
+          <w:rFonts w:ascii="Helvetica" w:eastAsiaTheme="minorHAnsi" w:hAnsi="Helvetica" w:cs="Helvetica"/>
+          <w:color w:val="FFC000"/>
+          <w:sz w:val="24"/>
+          <w:szCs w:val="24"/>
+        </w:rPr>
+        <w:t>{%p</w:t>
+      </w:r>
+      <w:r>
+        <w:rPr>
+          <w:rFonts w:ascii="Helvetica" w:eastAsiaTheme="minorHAnsi" w:hAnsi="Helvetica" w:cs="Helvetica"/>
+          <w:color w:val="FFC000"/>
+          <w:sz w:val="24"/>
+          <w:szCs w:val="24"/>
+        </w:rPr>
+        <w:t xml:space="preserve"> if </w:t>
+      </w:r>
+      <w:proofErr w:type="spellStart"/>
+      <w:r>
+        <w:rPr>
+          <w:rFonts w:ascii="Helvetica" w:eastAsiaTheme="minorHAnsi" w:hAnsi="Helvetica" w:cs="Helvetica"/>
+          <w:color w:val="FFC000"/>
+          <w:sz w:val="24"/>
+          <w:szCs w:val="24"/>
+        </w:rPr>
+        <w:t>filing_method</w:t>
+      </w:r>
+      <w:proofErr w:type="spellEnd"/>
+      <w:r>
+        <w:rPr>
+          <w:rFonts w:ascii="Helvetica" w:eastAsiaTheme="minorHAnsi" w:hAnsi="Helvetica" w:cs="Helvetica"/>
+          <w:color w:val="FFC000"/>
+          <w:sz w:val="24"/>
+          <w:szCs w:val="24"/>
+        </w:rPr>
+        <w:t xml:space="preserve"> == '</w:t>
+      </w:r>
+      <w:proofErr w:type="spellStart"/>
+      <w:r>
+        <w:rPr>
+          <w:rFonts w:ascii="Helvetica" w:eastAsiaTheme="minorHAnsi" w:hAnsi="Helvetica" w:cs="Helvetica"/>
+          <w:color w:val="FFC000"/>
+          <w:sz w:val="24"/>
+          <w:szCs w:val="24"/>
+        </w:rPr>
+        <w:t>efiling</w:t>
+      </w:r>
+      <w:proofErr w:type="spellEnd"/>
+      <w:r>
+        <w:rPr>
+          <w:rFonts w:ascii="Helvetica" w:eastAsiaTheme="minorHAnsi" w:hAnsi="Helvetica" w:cs="Helvetica"/>
+          <w:color w:val="FFC000"/>
+          <w:sz w:val="24"/>
+          <w:szCs w:val="24"/>
+        </w:rPr>
+        <w:t xml:space="preserve">' and </w:t>
+      </w:r>
+      <w:proofErr w:type="spellStart"/>
+      <w:r>
+        <w:rPr>
+          <w:rFonts w:ascii="Helvetica" w:eastAsiaTheme="minorHAnsi" w:hAnsi="Helvetica" w:cs="Helvetica"/>
+          <w:color w:val="FFC000"/>
+          <w:sz w:val="24"/>
+          <w:szCs w:val="24"/>
+        </w:rPr>
+        <w:t>filling_manner</w:t>
+      </w:r>
+      <w:proofErr w:type="spellEnd"/>
+      <w:r>
+        <w:rPr>
+          <w:rFonts w:ascii="Helvetica" w:eastAsiaTheme="minorHAnsi" w:hAnsi="Helvetica" w:cs="Helvetica"/>
+          <w:color w:val="FFC000"/>
+          <w:sz w:val="24"/>
+          <w:szCs w:val="24"/>
+        </w:rPr>
+        <w:t xml:space="preserve"> == 'electronically'</w:t>
+      </w:r>
+      <w:r>
+        <w:rPr>
+          <w:rFonts w:ascii="Helvetica" w:eastAsiaTheme="minorHAnsi" w:hAnsi="Helvetica" w:cs="Helvetica"/>
+          <w:color w:val="FFC000"/>
+          <w:sz w:val="24"/>
+          <w:szCs w:val="24"/>
+        </w:rPr>
+        <w:t xml:space="preserve"> %}</w:t>
+      </w:r>
+    </w:p>
+    <w:p>
+      <w:pPr>
+        <w:pStyle w:val="ExampleorImportantblock"/>
+      </w:pPr>
+      <w:r>
+        <w:t xml:space="preserve">If the form needs to be notarized, fill out and file </w:t>
+      </w:r>
+      <w:r>
+        <w:rPr>
+          <w:b/>
+          <w:bCs/>
+        </w:rPr>
+        <w:t>Self-Certification (No Notary Available), TF-835</w:t>
+      </w:r>
+      <w:r>
+        <w:t xml:space="preserve"> [</w:t>
+      </w:r>
+      <w:hyperlink r:id="rId5" w:history="1">
+        <w:r>
+          <w:rPr>
+            <w:rStyle w:val="Hyperlink"/>
+            <w:spacing w:val="0"/>
+          </w:rPr>
+          <w:t>Fill in PDF</w:t>
+        </w:r>
+      </w:hyperlink>
+      <w:r>
+        <w:t>]</w:t>
+      </w:r>
+      <w:r>
+        <w:br/>
+      </w:r>
+      <w:hyperlink r:id="rId6" w:history="1">
+        <w:r>
+          <w:rPr>
+            <w:rStyle w:val="Hyperlink"/>
+            <w:spacing w:val="0"/>
+          </w:rPr>
+          <w:t>ak-courts.info/tf835</w:t>
+        </w:r>
+      </w:hyperlink>
+      <w:r>
+        <w:t>.</w:t>
+      </w:r>
+    </w:p>
+    <w:p>
+      <w:pPr>
+        <w:rPr>
+          <w:rFonts w:ascii="Helvetica" w:eastAsiaTheme="minorHAnsi" w:hAnsi="Helvetica" w:cs="Helvetica"/>
+          <w:sz w:val="24"/>
+          <w:szCs w:val="24"/>
+        </w:rPr>
+      </w:pPr>
+      <w:r>
+        <w:rPr>
+          <w:rFonts w:ascii="Helvetica" w:eastAsiaTheme="minorHAnsi" w:hAnsi="Helvetica" w:cs="Helvetica"/>
+          <w:color w:val="FFC000"/>
+          <w:sz w:val="24"/>
+          <w:szCs w:val="24"/>
+        </w:rPr>
+        <w:t>{%p</w:t>
+      </w:r>
+      <w:r>
+        <w:rPr>
+          <w:rFonts w:ascii="Helvetica" w:eastAsiaTheme="minorHAnsi" w:hAnsi="Helvetica" w:cs="Helvetica"/>
+          <w:color w:val="FFC000"/>
+          <w:sz w:val="24"/>
+          <w:szCs w:val="24"/>
+        </w:rPr>
+        <w:t xml:space="preserve"> endi</w:t>
+      </w:r>
+      <w:r>
+        <w:rPr>
+          <w:rFonts w:ascii="Helvetica" w:eastAsiaTheme="minorHAnsi" w:hAnsi="Helvetica" w:cs="Helvetica"/>
+          <w:color w:val="FFC000"/>
+          <w:sz w:val="24"/>
+          <w:szCs w:val="24"/>
+        </w:rPr>
+        <w:t>f %}</w:t>
+      </w:r>
+    </w:p>
+    <w:p>
+      <w:pPr>
+        <w:rPr>
+          <w:rFonts w:ascii="Helvetica" w:eastAsiaTheme="minorHAnsi" w:hAnsi="Helvetica" w:cs="Helvetica"/>
+          <w:sz w:val="24"/>
+          <w:szCs w:val="24"/>
+        </w:rPr>
+      </w:pPr>
+      <w:r>
+        <w:rPr>
+          <w:rFonts w:ascii="Helvetica" w:eastAsiaTheme="minorHAnsi" w:hAnsi="Helvetica" w:cs="Helvetica"/>
+          <w:color w:val="FF0000"/>
+          <w:sz w:val="24"/>
+          <w:szCs w:val="24"/>
+        </w:rPr>
+        <w:t>{%p</w:t>
+      </w:r>
+      <w:r>
+        <w:rPr>
+          <w:rFonts w:ascii="Helvetica" w:eastAsiaTheme="minorHAnsi" w:hAnsi="Helvetica" w:cs="Helvetica"/>
+          <w:color w:val="FF0000"/>
+          <w:sz w:val="24"/>
+          <w:szCs w:val="24"/>
+        </w:rPr>
+        <w:t xml:space="preserve"> endi</w:t>
+      </w:r>
+      <w:r>
+        <w:rPr>
+          <w:rFonts w:ascii="Helvetica" w:eastAsiaTheme="minorHAnsi" w:hAnsi="Helvetica" w:cs="Helvetica"/>
+          <w:color w:val="FF0000"/>
+          <w:sz w:val="24"/>
+          <w:szCs w:val="24"/>
+        </w:rPr>
+        <w:t>f %}</w:t>
+      </w:r>
+    </w:p>
+    <w:p>
+      <w:pPr>
+        <w:rPr>
+          <w:rFonts w:ascii="Helvetica" w:eastAsiaTheme="minorHAnsi" w:hAnsi="Helvetica" w:cs="Helvetica"/>
+          <w:sz w:val="24"/>
+          <w:szCs w:val="24"/>
+        </w:rPr>
+      </w:pPr>
+      <w:r>
+        <w:rPr>
+          <w:rFonts w:ascii="Helvetica" w:eastAsiaTheme="minorHAnsi" w:hAnsi="Helvetica" w:cs="Helvetica"/>
+          <w:color w:val="FF0000"/>
+          <w:sz w:val="24"/>
+          <w:szCs w:val="24"/>
+        </w:rPr>
+        <w:t>{%p</w:t>
+      </w:r>
+      <w:r>
+        <w:rPr>
+          <w:rFonts w:ascii="Helvetica" w:eastAsiaTheme="minorHAnsi" w:hAnsi="Helvetica" w:cs="Helvetica"/>
+          <w:color w:val="FF0000"/>
+          <w:sz w:val="24"/>
+          <w:szCs w:val="24"/>
+        </w:rPr>
+        <w:t xml:space="preserve"> if </w:t>
+      </w:r>
+      <w:proofErr w:type="spellStart"/>
+      <w:r>
+        <w:rPr>
+          <w:rFonts w:ascii="Helvetica" w:eastAsiaTheme="minorHAnsi" w:hAnsi="Helvetica" w:cs="Helvetica"/>
+          <w:color w:val="FF0000"/>
+          <w:sz w:val="24"/>
+          <w:szCs w:val="24"/>
+        </w:rPr>
+        <w:t>filling_manner</w:t>
+      </w:r>
+      <w:proofErr w:type="spellEnd"/>
+      <w:r>
+        <w:rPr>
+          <w:rFonts w:ascii="Helvetica" w:eastAsiaTheme="minorHAnsi" w:hAnsi="Helvetica" w:cs="Helvetica"/>
+          <w:color w:val="FF0000"/>
+          <w:sz w:val="24"/>
+          <w:szCs w:val="24"/>
+        </w:rPr>
+        <w:t xml:space="preserve"> in('paper', '</w:t>
+      </w:r>
+      <w:proofErr w:type="spellStart"/>
+      <w:r>
+        <w:rPr>
+          <w:rFonts w:ascii="Helvetica" w:eastAsiaTheme="minorHAnsi" w:hAnsi="Helvetica" w:cs="Helvetica"/>
+          <w:color w:val="FF0000"/>
+          <w:sz w:val="24"/>
+          <w:szCs w:val="24"/>
+        </w:rPr>
+        <w:t>dunno</w:t>
+      </w:r>
+      <w:proofErr w:type="spellEnd"/>
+      <w:r>
+        <w:rPr>
+          <w:rFonts w:ascii="Helvetica" w:eastAsiaTheme="minorHAnsi" w:hAnsi="Helvetica" w:cs="Helvetica"/>
+          <w:color w:val="FF0000"/>
+          <w:sz w:val="24"/>
+          <w:szCs w:val="24"/>
+        </w:rPr>
+        <w:t xml:space="preserve">') or </w:t>
+      </w:r>
+      <w:proofErr w:type="spellStart"/>
+      <w:r>
+        <w:rPr>
+          <w:rFonts w:ascii="Helvetica" w:eastAsiaTheme="minorHAnsi" w:hAnsi="Helvetica" w:cs="Helvetica"/>
+          <w:color w:val="FF0000"/>
+          <w:sz w:val="24"/>
+          <w:szCs w:val="24"/>
+        </w:rPr>
+        <w:t>filing_method</w:t>
+      </w:r>
+      <w:proofErr w:type="spellEnd"/>
+      <w:r>
+        <w:rPr>
+          <w:rFonts w:ascii="Helvetica" w:eastAsiaTheme="minorHAnsi" w:hAnsi="Helvetica" w:cs="Helvetica"/>
+          <w:color w:val="FF0000"/>
+          <w:sz w:val="24"/>
+          <w:szCs w:val="24"/>
+        </w:rPr>
+        <w:t xml:space="preserve"> in ('mail or in person', '</w:t>
+      </w:r>
+      <w:proofErr w:type="spellStart"/>
+      <w:r>
+        <w:rPr>
+          <w:rFonts w:ascii="Helvetica" w:eastAsiaTheme="minorHAnsi" w:hAnsi="Helvetica" w:cs="Helvetica"/>
+          <w:color w:val="FF0000"/>
+          <w:sz w:val="24"/>
+          <w:szCs w:val="24"/>
+        </w:rPr>
+        <w:t>dunno</w:t>
+      </w:r>
+      <w:proofErr w:type="spellEnd"/>
+      <w:r>
+        <w:rPr>
+          <w:rFonts w:ascii="Helvetica" w:eastAsiaTheme="minorHAnsi" w:hAnsi="Helvetica" w:cs="Helvetica"/>
+          <w:color w:val="FF0000"/>
+          <w:sz w:val="24"/>
+          <w:szCs w:val="24"/>
+        </w:rPr>
+        <w:t>'</w:t>
+      </w:r>
+      <w:r>
+        <w:rPr>
+          <w:rFonts w:ascii="Helvetica" w:eastAsiaTheme="minorHAnsi" w:hAnsi="Helvetica" w:cs="Helvetica"/>
+          <w:color w:val="FF0000"/>
+          <w:sz w:val="24"/>
+          <w:szCs w:val="24"/>
+        </w:rPr>
+        <w:t>) %}</w:t>
+      </w:r>
+    </w:p>
+    <w:p>
+      <w:pPr>
+        <w:pStyle w:val="ExampleorImportantblock"/>
+      </w:pPr>
+      <w:r>
+        <w:t xml:space="preserve">If you fill out paper copies of the forms, or do not file them with TrueFiling, read </w:t>
+      </w:r>
+      <w:r>
+        <w:t>{</w:t>
+      </w:r>
+      <w:r>
+        <w:t xml:space="preserve">{ </w:t>
+      </w:r>
+      <w:proofErr w:type="spellStart"/>
+      <w:r>
+        <w:t>sign_step.subject</w:t>
+      </w:r>
+      <w:proofErr w:type="spellEnd"/>
+      <w:r>
+        <w:t xml:space="preserve"> </w:t>
+      </w:r>
+      <w:r>
+        <w:t>}</w:t>
+      </w:r>
+      <w:r>
+        <w:t>} before you sign any document.</w:t>
+      </w:r>
+    </w:p>
+    <w:p>
+      <w:r>
+        <w:rPr>
+          <w:rFonts w:ascii="Helvetica" w:eastAsiaTheme="minorHAnsi" w:hAnsi="Helvetica" w:cs="Helvetica"/>
+          <w:color w:val="FF0000"/>
+          <w:sz w:val="24"/>
+          <w:szCs w:val="24"/>
+        </w:rPr>
+        <w:t>{%p</w:t>
+      </w:r>
+      <w:r>
+        <w:rPr>
+          <w:rFonts w:ascii="Helvetica" w:eastAsiaTheme="minorHAnsi" w:hAnsi="Helvetica" w:cs="Helvetica"/>
+          <w:color w:val="FF0000"/>
+          <w:sz w:val="24"/>
+          <w:szCs w:val="24"/>
+        </w:rPr>
+        <w:t xml:space="preserve"> endif</w:t>
+      </w:r>
+      <w:r>
+        <w:rPr>
+          <w:rFonts w:ascii="Helvetica" w:eastAsiaTheme="minorHAnsi" w:hAnsi="Helvetica" w:cs="Helvetica"/>
+          <w:color w:val="FF0000"/>
+          <w:sz w:val="24"/>
+          <w:szCs w:val="24"/>
+        </w:rPr>
+        <w:t xml:space="preserve"> %}</w:t>
       </w:r>
     </w:p>
     <w:p>
@@ -154,6 +686,7 @@
         <w:ind w:left="540"/>
       </w:pPr>
       <w:r>
+        <w:lastRenderedPageBreak/>
         <w:t xml:space="preserve">Fill out the </w:t>
       </w:r>
       <w:r>
@@ -163,11 +696,16 @@
         <w:t>Motion to Dismiss</w:t>
       </w:r>
       <w:r>
-        <w:t xml:space="preserve"> forms that ask the court to dismiss your case. Read  {{ dismiss_</w:t>
+        <w:t xml:space="preserve"> forms that ask the court to dismiss your case. Read  {{ </w:t>
+      </w:r>
+      <w:proofErr w:type="spellStart"/>
+      <w:r>
+        <w:t>dismiss_</w:t>
       </w:r>
       <w:r>
         <w:t>step.subject</w:t>
       </w:r>
+      <w:proofErr w:type="spellEnd"/>
       <w:r>
         <w:t xml:space="preserve"> }}: File a motion to dismiss your Alaska case.</w:t>
       </w:r>
@@ -240,7 +778,7 @@
       <w:r>
         <w:t>[</w:t>
       </w:r>
-      <w:hyperlink r:id="rId5" w:history="1">
+      <w:hyperlink r:id="rId7" w:history="1">
         <w:r>
           <w:rPr>
             <w:rStyle w:val="Hyperlink"/>
@@ -262,7 +800,7 @@
       <w:r>
         <w:br/>
       </w:r>
-      <w:hyperlink r:id="rId6" w:history="1">
+      <w:hyperlink r:id="rId8" w:history="1">
         <w:r>
           <w:rPr>
             <w:rStyle w:val="Hyperlink"/>
@@ -332,7 +870,7 @@
       <w:r>
         <w:t>[</w:t>
       </w:r>
-      <w:hyperlink r:id="rId7" w:history="1">
+      <w:hyperlink r:id="rId9" w:history="1">
         <w:r>
           <w:rPr>
             <w:rStyle w:val="Hyperlink"/>
@@ -354,7 +892,7 @@
       <w:r>
         <w:br/>
       </w:r>
-      <w:hyperlink r:id="rId8" w:history="1">
+      <w:hyperlink r:id="rId10" w:history="1">
         <w:r>
           <w:rPr>
             <w:rStyle w:val="Hyperlink"/>
@@ -372,7 +910,6 @@
         <w:rPr>
           <w:color w:val="92D050"/>
         </w:rPr>
-        <w:lastRenderedPageBreak/>
         <w:t>{%p elif case_type == 'legal separation' %}</w:t>
       </w:r>
     </w:p>
@@ -389,7 +926,7 @@
       <w:r>
         <w:t xml:space="preserve"> </w:t>
       </w:r>
-      <w:hyperlink r:id="rId9" w:history="1">
+      <w:hyperlink r:id="rId11" w:history="1">
         <w:r>
           <w:rPr>
             <w:rStyle w:val="Hyperlink"/>
@@ -401,7 +938,7 @@
       <w:r>
         <w:t xml:space="preserve"> | </w:t>
       </w:r>
-      <w:hyperlink r:id="rId10" w:history="1">
+      <w:hyperlink r:id="rId12" w:history="1">
         <w:r>
           <w:rPr>
             <w:rStyle w:val="Hyperlink"/>
@@ -487,7 +1024,7 @@
       <w:r>
         <w:t>[</w:t>
       </w:r>
-      <w:hyperlink r:id="rId11" w:history="1">
+      <w:hyperlink r:id="rId13" w:history="1">
         <w:r>
           <w:rPr>
             <w:rStyle w:val="Hyperlink"/>
@@ -509,7 +1046,7 @@
       <w:r>
         <w:br/>
       </w:r>
-      <w:hyperlink r:id="rId12" w:history="1">
+      <w:hyperlink r:id="rId14" w:history="1">
         <w:r>
           <w:rPr>
             <w:rStyle w:val="Hyperlink"/>
@@ -546,7 +1083,7 @@
         </w:rPr>
         <w:br/>
       </w:r>
-      <w:hyperlink r:id="rId13" w:history="1">
+      <w:hyperlink r:id="rId15" w:history="1">
         <w:r>
           <w:rPr>
             <w:rStyle w:val="Hyperlink"/>
@@ -562,19 +1099,35 @@
         </w:rPr>
         <w:br/>
       </w:r>
-      <w:hyperlink r:id="rId14" w:history="1">
-        <w:r>
-          <w:rPr>
-            <w:rStyle w:val="Hyperlink"/>
-            <w:spacing w:val="0"/>
-          </w:rPr>
-          <w:t>courts.alaska.gov/shc/family/docs/shc-095.doc</w:t>
+      <w:hyperlink r:id="rId16" w:history="1">
+        <w:r>
+          <w:rPr>
+            <w:rStyle w:val="Hyperlink"/>
+            <w:spacing w:val="0"/>
+          </w:rPr>
+          <w:t>courts.alaska.gov/</w:t>
+        </w:r>
+        <w:proofErr w:type="spellStart"/>
+        <w:r>
+          <w:rPr>
+            <w:rStyle w:val="Hyperlink"/>
+            <w:spacing w:val="0"/>
+          </w:rPr>
+          <w:t>shc</w:t>
+        </w:r>
+        <w:proofErr w:type="spellEnd"/>
+        <w:r>
+          <w:rPr>
+            <w:rStyle w:val="Hyperlink"/>
+            <w:spacing w:val="0"/>
+          </w:rPr>
+          <w:t>/family/docs/shc-095.doc</w:t>
         </w:r>
       </w:hyperlink>
       <w:r>
         <w:br/>
       </w:r>
-      <w:hyperlink r:id="rId15" w:history="1">
+      <w:hyperlink r:id="rId17" w:history="1">
         <w:r>
           <w:rPr>
             <w:rStyle w:val="Hyperlink"/>
@@ -590,13 +1143,29 @@
         </w:rPr>
         <w:br/>
       </w:r>
-      <w:hyperlink r:id="rId16" w:history="1">
-        <w:r>
-          <w:rPr>
-            <w:rStyle w:val="Hyperlink"/>
-            <w:spacing w:val="0"/>
-          </w:rPr>
-          <w:t>courts.alaska.gov/shc/family/docs/shc-095n.pdf</w:t>
+      <w:hyperlink r:id="rId18" w:history="1">
+        <w:r>
+          <w:rPr>
+            <w:rStyle w:val="Hyperlink"/>
+            <w:spacing w:val="0"/>
+          </w:rPr>
+          <w:t>courts.alaska.gov/</w:t>
+        </w:r>
+        <w:proofErr w:type="spellStart"/>
+        <w:r>
+          <w:rPr>
+            <w:rStyle w:val="Hyperlink"/>
+            <w:spacing w:val="0"/>
+          </w:rPr>
+          <w:t>shc</w:t>
+        </w:r>
+        <w:proofErr w:type="spellEnd"/>
+        <w:r>
+          <w:rPr>
+            <w:rStyle w:val="Hyperlink"/>
+            <w:spacing w:val="0"/>
+          </w:rPr>
+          <w:t>/family/docs/shc-095n.pdf</w:t>
         </w:r>
       </w:hyperlink>
     </w:p>
@@ -763,7 +1332,6 @@
         <w:rPr>
           <w:color w:val="FF0000"/>
         </w:rPr>
-        <w:lastRenderedPageBreak/>
         <w:t>{%p if (user_need == 'answer custody' and (type_of_response.all_true('ak custody case', exclusive=True) or type_of_response.all_true('ak custody case', 'improper service', exclusive=True))) or (user_need == 'answer divorce' and (type_of_response.all_true('ak divorce case', exclusive=True) or type_of_response.all_true('ak divorce case', 'improper service', exclusive=True))) %}</w:t>
       </w:r>
     </w:p>
@@ -823,6 +1391,7 @@
         <w:rPr>
           <w:color w:val="FFC000"/>
         </w:rPr>
+        <w:lastRenderedPageBreak/>
         <w:t>{%p else %}</w:t>
       </w:r>
     </w:p>
@@ -916,7 +1485,7 @@
       <w:r>
         <w:t xml:space="preserve">ive defense applies to you, </w:t>
       </w:r>
-      <w:hyperlink r:id="rId17" w:history="1">
+      <w:hyperlink r:id="rId19" w:history="1">
         <w:r>
           <w:rPr>
             <w:rStyle w:val="Hyperlink"/>
@@ -962,7 +1531,6 @@
         <w:pStyle w:val="Body"/>
       </w:pPr>
       <w:r>
-        <w:lastRenderedPageBreak/>
         <w:t>If you think Alaska is not the "home state," you can ask the court to dismiss your case:</w:t>
       </w:r>
     </w:p>
@@ -1059,7 +1627,11 @@
         <w:ind w:left="540"/>
       </w:pPr>
       <w:r>
-        <w:t>Check the {{ 'boxes that say' if minor_children else '' }}{{ 'boxes that say' if not minor_children and wife_is_pregnant in ('husband', 'not husband') else '' }}{{ 'box that says' if not minor_children and wife_is_pregnant == 'not pregnant' else '' }} you attached a Motion to Dismiss.</w:t>
+        <w:t xml:space="preserve">Check the {{ 'boxes that say' if minor_children else '' }}{{ 'boxes that say' if not minor_children and wife_is_pregnant in ('husband', 'not husband') else '' }}{{ 'box </w:t>
+      </w:r>
+      <w:r>
+        <w:lastRenderedPageBreak/>
+        <w:t>that says' if not minor_children and wife_is_pregnant == 'not pregnant' else '' }} you attached a Motion to Dismiss.</w:t>
       </w:r>
     </w:p>
     <w:p>
@@ -1247,7 +1819,6 @@
         <w:ind w:left="540"/>
       </w:pPr>
       <w:r>
-        <w:lastRenderedPageBreak/>
         <w:t>You can add here that you were not served correctly.</w:t>
       </w:r>
     </w:p>
@@ -1379,6 +1950,7 @@
         <w:rPr>
           <w:color w:val="FFC000"/>
         </w:rPr>
+        <w:lastRenderedPageBreak/>
         <w:t>{%p if user_need == 'answer custody' and not jurisdiction %}</w:t>
       </w:r>
     </w:p>
@@ -1520,92 +2092,92 @@
         <w:rPr>
           <w:color w:val="FF0000"/>
         </w:rPr>
+        <w:t>{%p if type_of_response['case in 2 states'] and stage_of_other_case == 'still going' %}</w:t>
+      </w:r>
+    </w:p>
+    <w:p>
+      <w:pPr>
+        <w:pStyle w:val="Body"/>
+      </w:pPr>
+      <w:r>
+        <w:rPr>
+          <w:color w:val="FFC000"/>
+        </w:rPr>
+        <w:t>{%p if (user_need == 'answer custody' and jurisdiction) or user_need == 'answer divorce' %}</w:t>
+      </w:r>
+    </w:p>
+    <w:p>
+      <w:pPr>
+        <w:pStyle w:val="Body"/>
+      </w:pPr>
+      <w:r>
+        <w:t>If you think the Alaska court should hear the case, use section 5 to tell the judge there are 2 cases and why you think the case should move forward in Alaska.</w:t>
+      </w:r>
+    </w:p>
+    <w:p>
+      <w:pPr>
+        <w:pStyle w:val="Body"/>
+      </w:pPr>
+      <w:r>
+        <w:rPr>
+          <w:color w:val="92D050"/>
+        </w:rPr>
+        <w:t>{%p if user_need == 'answer custody' or (user_need == 'answer divorce' and minor_children) %}</w:t>
+      </w:r>
+    </w:p>
+    <w:p>
+      <w:pPr>
+        <w:pStyle w:val="Body"/>
+      </w:pPr>
+      <w:r>
+        <w:t>Include where the children have lived the last 6 months.</w:t>
+      </w:r>
+    </w:p>
+    <w:p>
+      <w:pPr>
+        <w:pStyle w:val="Body"/>
+      </w:pPr>
+      <w:r>
+        <w:rPr>
+          <w:color w:val="92D050"/>
+        </w:rPr>
+        <w:t>{%p endif %}</w:t>
+      </w:r>
+    </w:p>
+    <w:p>
+      <w:pPr>
+        <w:pStyle w:val="Body"/>
+      </w:pPr>
+      <w:r>
+        <w:rPr>
+          <w:color w:val="FFC000"/>
+        </w:rPr>
+        <w:t>{%p elif (user_need == 'answer custody' and not jurisdiction) or (user_need == 'answer divorce' and minor_children) %}</w:t>
+      </w:r>
+    </w:p>
+    <w:p>
+      <w:pPr>
+        <w:pStyle w:val="Body"/>
+      </w:pPr>
+      <w:r>
+        <w:t>{{ 'Explain' if user_need == '</w:t>
+      </w:r>
+      <w:r>
+        <w:t xml:space="preserve">answer </w:t>
+      </w:r>
+      <w:r>
+        <w:t>custody' else 'Or, explain' }} why you think the Alaska court should hear the case even though your children have not lived in Alaska 6 months.</w:t>
+      </w:r>
+    </w:p>
+    <w:p>
+      <w:pPr>
+        <w:pStyle w:val="Body"/>
+      </w:pPr>
+      <w:r>
+        <w:rPr>
+          <w:color w:val="FFC000"/>
+        </w:rPr>
         <w:lastRenderedPageBreak/>
-        <w:t>{%p if type_of_response['case in 2 states'] and stage_of_other_case == 'still going' %}</w:t>
-      </w:r>
-    </w:p>
-    <w:p>
-      <w:pPr>
-        <w:pStyle w:val="Body"/>
-      </w:pPr>
-      <w:r>
-        <w:rPr>
-          <w:color w:val="FFC000"/>
-        </w:rPr>
-        <w:t>{%p if (user_need == 'answer custody' and jurisdiction) or user_need == 'answer divorce' %}</w:t>
-      </w:r>
-    </w:p>
-    <w:p>
-      <w:pPr>
-        <w:pStyle w:val="Body"/>
-      </w:pPr>
-      <w:r>
-        <w:t>If you think the Alaska court should hear the case, use section 5 to tell the judge there are 2 cases and why you think the case should move forward in Alaska.</w:t>
-      </w:r>
-    </w:p>
-    <w:p>
-      <w:pPr>
-        <w:pStyle w:val="Body"/>
-      </w:pPr>
-      <w:r>
-        <w:rPr>
-          <w:color w:val="92D050"/>
-        </w:rPr>
-        <w:t>{%p if user_need == 'answer custody' or (user_need == 'answer divorce' and minor_children) %}</w:t>
-      </w:r>
-    </w:p>
-    <w:p>
-      <w:pPr>
-        <w:pStyle w:val="Body"/>
-      </w:pPr>
-      <w:r>
-        <w:t>Include where the children have lived the last 6 months.</w:t>
-      </w:r>
-    </w:p>
-    <w:p>
-      <w:pPr>
-        <w:pStyle w:val="Body"/>
-      </w:pPr>
-      <w:r>
-        <w:rPr>
-          <w:color w:val="92D050"/>
-        </w:rPr>
-        <w:t>{%p endif %}</w:t>
-      </w:r>
-    </w:p>
-    <w:p>
-      <w:pPr>
-        <w:pStyle w:val="Body"/>
-      </w:pPr>
-      <w:r>
-        <w:rPr>
-          <w:color w:val="FFC000"/>
-        </w:rPr>
-        <w:t>{%p elif (user_need == 'answer custody' and not jurisdiction) or (user_need == 'answer divorce' and minor_children) %}</w:t>
-      </w:r>
-    </w:p>
-    <w:p>
-      <w:pPr>
-        <w:pStyle w:val="Body"/>
-      </w:pPr>
-      <w:r>
-        <w:t>{{ 'Explain' if user_need == '</w:t>
-      </w:r>
-      <w:r>
-        <w:t xml:space="preserve">answer </w:t>
-      </w:r>
-      <w:r>
-        <w:t>custody' else 'Or, explain' }} why you think the Alaska court should hear the case even though your children have not lived in Alaska 6 months.</w:t>
-      </w:r>
-    </w:p>
-    <w:p>
-      <w:pPr>
-        <w:pStyle w:val="Body"/>
-      </w:pPr>
-      <w:r>
-        <w:rPr>
-          <w:color w:val="FFC000"/>
-        </w:rPr>
         <w:t>{%p endif %}</w:t>
       </w:r>
     </w:p>
@@ -1745,7 +2317,6 @@
         <w:rPr>
           <w:color w:val="FF0000"/>
         </w:rPr>
-        <w:lastRenderedPageBreak/>
         <w:t>{%p if type_of_response['case in 2 states'] and stage_of_other_case == 'still going' %}</w:t>
       </w:r>
     </w:p>
@@ -1837,7 +2408,7 @@
       <w:r>
         <w:t xml:space="preserve"> [</w:t>
       </w:r>
-      <w:hyperlink r:id="rId18" w:history="1">
+      <w:hyperlink r:id="rId20" w:history="1">
         <w:r>
           <w:rPr>
             <w:rStyle w:val="Hyperlink"/>
@@ -1859,7 +2430,7 @@
       <w:r>
         <w:br/>
       </w:r>
-      <w:hyperlink r:id="rId19" w:history="1">
+      <w:hyperlink r:id="rId21" w:history="1">
         <w:r>
           <w:rPr>
             <w:rStyle w:val="Hyperlink"/>
@@ -1920,6 +2491,7 @@
         <w:rPr>
           <w:color w:val="FFC000"/>
         </w:rPr>
+        <w:lastRenderedPageBreak/>
         <w:t>{%p if stage_of_default == 'hearing scheduled' %}</w:t>
       </w:r>
     </w:p>
@@ -1939,7 +2511,7 @@
       <w:r>
         <w:t xml:space="preserve"> [</w:t>
       </w:r>
-      <w:hyperlink r:id="rId20" w:history="1">
+      <w:hyperlink r:id="rId22" w:history="1">
         <w:r>
           <w:rPr>
             <w:rStyle w:val="Hyperlink"/>
@@ -1961,7 +2533,7 @@
       <w:r>
         <w:br/>
       </w:r>
-      <w:hyperlink r:id="rId21" w:history="1">
+      <w:hyperlink r:id="rId23" w:history="1">
         <w:r>
           <w:rPr>
             <w:rStyle w:val="Hyperlink"/>
@@ -2048,7 +2620,7 @@
       <w:r>
         <w:t xml:space="preserve">If you have any questions about whether Alaska is the correct place for your case or you want to ask the court to dismiss your case, you may want to </w:t>
       </w:r>
-      <w:hyperlink r:id="rId22" w:history="1">
+      <w:hyperlink r:id="rId24" w:history="1">
         <w:r>
           <w:rPr>
             <w:rStyle w:val="Hyperlink"/>
@@ -2064,14 +2636,23 @@
         </w:rPr>
         <w:br/>
       </w:r>
-      <w:hyperlink r:id="rId23" w:history="1">
-        <w:r>
-          <w:rPr>
-            <w:rStyle w:val="Hyperlink"/>
-            <w:spacing w:val="0"/>
-          </w:rPr>
-          <w:t>ak-courts.info/findlawyer</w:t>
-        </w:r>
+      <w:hyperlink r:id="rId25" w:history="1">
+        <w:r>
+          <w:rPr>
+            <w:rStyle w:val="Hyperlink"/>
+            <w:spacing w:val="0"/>
+          </w:rPr>
+          <w:t>ak-courts.info/</w:t>
+        </w:r>
+        <w:proofErr w:type="spellStart"/>
+        <w:r>
+          <w:rPr>
+            <w:rStyle w:val="Hyperlink"/>
+            <w:spacing w:val="0"/>
+          </w:rPr>
+          <w:t>findlawyer</w:t>
+        </w:r>
+        <w:proofErr w:type="spellEnd"/>
       </w:hyperlink>
       <w:r>
         <w:t>.</w:t>
@@ -2101,7 +2682,7 @@
       <w:r>
         <w:t xml:space="preserve"> [</w:t>
       </w:r>
-      <w:hyperlink r:id="rId24" w:history="1">
+      <w:hyperlink r:id="rId26" w:history="1">
         <w:r>
           <w:rPr>
             <w:rStyle w:val="Hyperlink"/>
@@ -2123,7 +2704,7 @@
       <w:r>
         <w:br/>
       </w:r>
-      <w:hyperlink r:id="rId25" w:history="1">
+      <w:hyperlink r:id="rId27" w:history="1">
         <w:r>
           <w:rPr>
             <w:rStyle w:val="Hyperlink"/>
@@ -2143,7 +2724,6 @@
         <w:ind w:left="540"/>
       </w:pPr>
       <w:r>
-        <w:lastRenderedPageBreak/>
         <w:t xml:space="preserve">If {{ other_party_in_case }} filed an </w:t>
       </w:r>
       <w:r>
@@ -2206,7 +2786,7 @@
       <w:r>
         <w:t xml:space="preserve"> [</w:t>
       </w:r>
-      <w:hyperlink r:id="rId26" w:history="1">
+      <w:hyperlink r:id="rId28" w:history="1">
         <w:r>
           <w:rPr>
             <w:rStyle w:val="Hyperlink"/>
@@ -2228,7 +2808,7 @@
       <w:r>
         <w:br/>
       </w:r>
-      <w:hyperlink r:id="rId27" w:history="1">
+      <w:hyperlink r:id="rId29" w:history="1">
         <w:r>
           <w:rPr>
             <w:rStyle w:val="Hyperlink"/>
@@ -2281,7 +2861,7 @@
       <w:r>
         <w:t xml:space="preserve"> [</w:t>
       </w:r>
-      <w:hyperlink r:id="rId28" w:history="1">
+      <w:hyperlink r:id="rId30" w:history="1">
         <w:r>
           <w:rPr>
             <w:rStyle w:val="Hyperlink"/>
@@ -2303,7 +2883,7 @@
       <w:r>
         <w:br/>
       </w:r>
-      <w:hyperlink r:id="rId29" w:history="1">
+      <w:hyperlink r:id="rId31" w:history="1">
         <w:r>
           <w:rPr>
             <w:rStyle w:val="Hyperlink"/>
@@ -2320,7 +2900,7 @@
       <w:r>
         <w:t xml:space="preserve">See </w:t>
       </w:r>
-      <w:hyperlink r:id="rId30" w:history="1">
+      <w:hyperlink r:id="rId32" w:history="1">
         <w:r>
           <w:rPr>
             <w:rStyle w:val="Hyperlink"/>
@@ -2338,7 +2918,7 @@
       <w:r>
         <w:br/>
       </w:r>
-      <w:hyperlink r:id="rId31" w:history="1">
+      <w:hyperlink r:id="rId33" w:history="1">
         <w:r>
           <w:rPr>
             <w:rStyle w:val="Hyperlink"/>
@@ -2361,6 +2941,7 @@
         <w:ind w:left="540"/>
       </w:pPr>
       <w:r>
+        <w:lastRenderedPageBreak/>
         <w:t xml:space="preserve">Attach your most recent tax return and pay stubs to the </w:t>
       </w:r>
       <w:r>
@@ -2441,7 +3022,21 @@
         <w:rPr>
           <w:color w:val="92D050"/>
         </w:rPr>
-        <w:t>{%p elif response_to_complaint == 'none' and want_help_to_agree %}</w:t>
+        <w:t xml:space="preserve">{%p elif response_to_complaint == 'none' and </w:t>
+      </w:r>
+      <w:proofErr w:type="spellStart"/>
+      <w:r>
+        <w:rPr>
+          <w:color w:val="92D050"/>
+        </w:rPr>
+        <w:t>want_help_to_agree</w:t>
+      </w:r>
+      <w:proofErr w:type="spellEnd"/>
+      <w:r>
+        <w:rPr>
+          <w:color w:val="92D050"/>
+        </w:rPr>
+        <w:t xml:space="preserve"> %}</w:t>
       </w:r>
     </w:p>
     <w:p>
@@ -2471,7 +3066,6 @@
         <w:rPr>
           <w:color w:val="92D050"/>
         </w:rPr>
-        <w:lastRenderedPageBreak/>
         <w:t>{%p if user_need == 'answer custody' or (user_need == 'answer divorce' and (minor_children or (not minor_children and wife_is_pregnant in (</w:t>
       </w:r>
       <w:r>
@@ -2497,7 +3091,7 @@
       <w:r>
         <w:br/>
       </w:r>
-      <w:hyperlink r:id="rId32" w:history="1">
+      <w:hyperlink r:id="rId34" w:history="1">
         <w:r>
           <w:rPr>
             <w:rStyle w:val="Hyperlink"/>
@@ -2512,19 +3106,35 @@
       <w:r>
         <w:br/>
       </w:r>
-      <w:hyperlink r:id="rId33" w:history="1">
-        <w:r>
-          <w:rPr>
-            <w:rStyle w:val="Hyperlink"/>
-            <w:spacing w:val="0"/>
-          </w:rPr>
-          <w:t>courts.alaska.gov/shc/family/docs/shc-1128.doc</w:t>
+      <w:hyperlink r:id="rId35" w:history="1">
+        <w:r>
+          <w:rPr>
+            <w:rStyle w:val="Hyperlink"/>
+            <w:spacing w:val="0"/>
+          </w:rPr>
+          <w:t>courts.alaska.gov/</w:t>
+        </w:r>
+        <w:proofErr w:type="spellStart"/>
+        <w:r>
+          <w:rPr>
+            <w:rStyle w:val="Hyperlink"/>
+            <w:spacing w:val="0"/>
+          </w:rPr>
+          <w:t>shc</w:t>
+        </w:r>
+        <w:proofErr w:type="spellEnd"/>
+        <w:r>
+          <w:rPr>
+            <w:rStyle w:val="Hyperlink"/>
+            <w:spacing w:val="0"/>
+          </w:rPr>
+          <w:t>/family/docs/shc-1128.doc</w:t>
         </w:r>
       </w:hyperlink>
       <w:r>
         <w:br/>
       </w:r>
-      <w:hyperlink r:id="rId34" w:history="1">
+      <w:hyperlink r:id="rId36" w:history="1">
         <w:r>
           <w:rPr>
             <w:rStyle w:val="Hyperlink"/>
@@ -2540,13 +3150,29 @@
         </w:rPr>
         <w:br/>
       </w:r>
-      <w:hyperlink r:id="rId35" w:history="1">
-        <w:r>
-          <w:rPr>
-            <w:rStyle w:val="Hyperlink"/>
-            <w:spacing w:val="0"/>
-          </w:rPr>
-          <w:t>courts.alaska.gov/shc/family/docs/shc-1128n.pdf</w:t>
+      <w:hyperlink r:id="rId37" w:history="1">
+        <w:r>
+          <w:rPr>
+            <w:rStyle w:val="Hyperlink"/>
+            <w:spacing w:val="0"/>
+          </w:rPr>
+          <w:t>courts.alaska.gov/</w:t>
+        </w:r>
+        <w:proofErr w:type="spellStart"/>
+        <w:r>
+          <w:rPr>
+            <w:rStyle w:val="Hyperlink"/>
+            <w:spacing w:val="0"/>
+          </w:rPr>
+          <w:t>shc</w:t>
+        </w:r>
+        <w:proofErr w:type="spellEnd"/>
+        <w:r>
+          <w:rPr>
+            <w:rStyle w:val="Hyperlink"/>
+            <w:spacing w:val="0"/>
+          </w:rPr>
+          <w:t>/family/docs/shc-1128n.pdf</w:t>
         </w:r>
       </w:hyperlink>
     </w:p>
@@ -2594,7 +3220,7 @@
         </w:rPr>
         <w:t xml:space="preserve"> [</w:t>
       </w:r>
-      <w:hyperlink r:id="rId36" w:history="1">
+      <w:hyperlink r:id="rId38" w:history="1">
         <w:r>
           <w:rPr>
             <w:rStyle w:val="Hyperlink"/>
@@ -2616,7 +3242,7 @@
       <w:r>
         <w:br/>
       </w:r>
-      <w:hyperlink r:id="rId37" w:history="1">
+      <w:hyperlink r:id="rId39" w:history="1">
         <w:r>
           <w:rPr>
             <w:rStyle w:val="Hyperlink"/>
@@ -2667,6 +3293,7 @@
         <w:rPr>
           <w:color w:val="FF0000"/>
         </w:rPr>
+        <w:lastRenderedPageBreak/>
         <w:t>{%p if user_need == 'answer custody' %}</w:t>
       </w:r>
     </w:p>
@@ -2683,7 +3310,7 @@
       <w:r>
         <w:t xml:space="preserve"> [</w:t>
       </w:r>
-      <w:hyperlink r:id="rId38" w:history="1">
+      <w:hyperlink r:id="rId40" w:history="1">
         <w:r>
           <w:rPr>
             <w:rStyle w:val="Hyperlink"/>
@@ -2705,7 +3332,7 @@
       <w:r>
         <w:br/>
       </w:r>
-      <w:hyperlink r:id="rId39" w:history="1">
+      <w:hyperlink r:id="rId41" w:history="1">
         <w:r>
           <w:rPr>
             <w:rStyle w:val="Hyperlink"/>
@@ -2802,7 +3429,7 @@
       <w:r>
         <w:t xml:space="preserve"> [</w:t>
       </w:r>
-      <w:hyperlink r:id="rId40" w:history="1">
+      <w:hyperlink r:id="rId42" w:history="1">
         <w:r>
           <w:rPr>
             <w:rStyle w:val="Hyperlink"/>
@@ -2829,7 +3456,7 @@
       <w:r>
         <w:br/>
       </w:r>
-      <w:hyperlink r:id="rId41" w:history="1">
+      <w:hyperlink r:id="rId43" w:history="1">
         <w:r>
           <w:rPr>
             <w:rStyle w:val="Hyperlink"/>
@@ -2866,7 +3493,7 @@
       <w:r>
         <w:br/>
       </w:r>
-      <w:hyperlink r:id="rId42" w:history="1">
+      <w:hyperlink r:id="rId44" w:history="1">
         <w:r>
           <w:rPr>
             <w:rStyle w:val="Hyperlink"/>
@@ -2878,19 +3505,35 @@
       <w:r>
         <w:br/>
       </w:r>
-      <w:hyperlink r:id="rId43" w:history="1">
-        <w:r>
-          <w:rPr>
-            <w:rStyle w:val="Hyperlink"/>
-            <w:spacing w:val="0"/>
-          </w:rPr>
-          <w:t>courts.alaska.gov/shc/family/docs/shc-094.doc</w:t>
+      <w:hyperlink r:id="rId45" w:history="1">
+        <w:r>
+          <w:rPr>
+            <w:rStyle w:val="Hyperlink"/>
+            <w:spacing w:val="0"/>
+          </w:rPr>
+          <w:t>courts.alaska.gov/</w:t>
+        </w:r>
+        <w:proofErr w:type="spellStart"/>
+        <w:r>
+          <w:rPr>
+            <w:rStyle w:val="Hyperlink"/>
+            <w:spacing w:val="0"/>
+          </w:rPr>
+          <w:t>shc</w:t>
+        </w:r>
+        <w:proofErr w:type="spellEnd"/>
+        <w:r>
+          <w:rPr>
+            <w:rStyle w:val="Hyperlink"/>
+            <w:spacing w:val="0"/>
+          </w:rPr>
+          <w:t>/family/docs/shc-094.doc</w:t>
         </w:r>
       </w:hyperlink>
       <w:r>
         <w:br/>
       </w:r>
-      <w:hyperlink r:id="rId44" w:history="1">
+      <w:hyperlink r:id="rId46" w:history="1">
         <w:r>
           <w:rPr>
             <w:rStyle w:val="Hyperlink"/>
@@ -2902,13 +3545,29 @@
       <w:r>
         <w:br/>
       </w:r>
-      <w:hyperlink r:id="rId45" w:history="1">
-        <w:r>
-          <w:rPr>
-            <w:rStyle w:val="Hyperlink"/>
-            <w:spacing w:val="0"/>
-          </w:rPr>
-          <w:t>courts.alaska.gov/shc/family/docs/shc-094n.pdf</w:t>
+      <w:hyperlink r:id="rId47" w:history="1">
+        <w:r>
+          <w:rPr>
+            <w:rStyle w:val="Hyperlink"/>
+            <w:spacing w:val="0"/>
+          </w:rPr>
+          <w:t>courts.alaska.gov/</w:t>
+        </w:r>
+        <w:proofErr w:type="spellStart"/>
+        <w:r>
+          <w:rPr>
+            <w:rStyle w:val="Hyperlink"/>
+            <w:spacing w:val="0"/>
+          </w:rPr>
+          <w:t>shc</w:t>
+        </w:r>
+        <w:proofErr w:type="spellEnd"/>
+        <w:r>
+          <w:rPr>
+            <w:rStyle w:val="Hyperlink"/>
+            <w:spacing w:val="0"/>
+          </w:rPr>
+          <w:t>/family/docs/shc-094n.pdf</w:t>
         </w:r>
       </w:hyperlink>
     </w:p>
@@ -2937,38 +3596,261 @@
         <w:rPr>
           <w:color w:val="FFC000"/>
         </w:rPr>
+        <w:t>{%p elif not minor_children and wife_is_pregnant == 'not pregnant' %}</w:t>
+      </w:r>
+    </w:p>
+    <w:p>
+      <w:pPr>
+        <w:pStyle w:val="Body"/>
+        <w:rPr>
+          <w:color w:val="92D050"/>
+        </w:rPr>
+      </w:pPr>
+      <w:r>
+        <w:rPr>
+          <w:color w:val="92D050"/>
+        </w:rPr>
+        <w:t>{%p if case_type == 'divorce' %}</w:t>
+      </w:r>
+    </w:p>
+    <w:p>
+      <w:pPr>
+        <w:pStyle w:val="Body"/>
+      </w:pPr>
+      <w:r>
+        <w:rPr>
+          <w:b/>
+        </w:rPr>
+        <w:t>ANSWER AND COUNTERCLAIM TO COMPLAINT FOR DIVORCE WITHOUT CHILDREN, DR-837</w:t>
+      </w:r>
+      <w:r>
+        <w:t xml:space="preserve"> [</w:t>
+      </w:r>
+      <w:hyperlink r:id="rId48" w:history="1">
+        <w:r>
+          <w:rPr>
+            <w:rStyle w:val="Hyperlink"/>
+            <w:spacing w:val="0"/>
+          </w:rPr>
+          <w:t>Fill-In</w:t>
+        </w:r>
+        <w:r>
+          <w:rPr>
+            <w:rStyle w:val="Hyperlink"/>
+            <w:spacing w:val="0"/>
+          </w:rPr>
+          <w:t xml:space="preserve"> PDF</w:t>
+        </w:r>
+      </w:hyperlink>
+      <w:r>
+        <w:t>]</w:t>
+      </w:r>
+      <w:r>
+        <w:br/>
+      </w:r>
+      <w:hyperlink r:id="rId49" w:history="1">
+        <w:r>
+          <w:rPr>
+            <w:rStyle w:val="Hyperlink"/>
+            <w:spacing w:val="0"/>
+          </w:rPr>
+          <w:t>ak-courts.info/dr837</w:t>
+        </w:r>
+      </w:hyperlink>
+    </w:p>
+    <w:p>
+      <w:pPr>
+        <w:pStyle w:val="Body"/>
+        <w:rPr>
+          <w:color w:val="92D050"/>
+        </w:rPr>
+      </w:pPr>
+      <w:r>
+        <w:rPr>
+          <w:color w:val="92D050"/>
+        </w:rPr>
+        <w:t>{%p elif case_type == 'legal separation' %}</w:t>
+      </w:r>
+    </w:p>
+    <w:p>
+      <w:pPr>
+        <w:pStyle w:val="Body"/>
+      </w:pPr>
+      <w:r>
+        <w:rPr>
+          <w:b/>
+        </w:rPr>
+        <w:t>Answer &amp; Counterclaim to Legal Separation Without Children, SHC-095</w:t>
+      </w:r>
+      <w:r>
+        <w:t xml:space="preserve"> </w:t>
+      </w:r>
+      <w:r>
+        <w:br/>
+      </w:r>
+      <w:hyperlink r:id="rId50" w:history="1">
+        <w:r>
+          <w:rPr>
+            <w:rStyle w:val="Hyperlink"/>
+            <w:spacing w:val="0"/>
+          </w:rPr>
+          <w:t>Word</w:t>
+        </w:r>
+      </w:hyperlink>
+      <w:r>
+        <w:t xml:space="preserve"> </w:t>
+      </w:r>
+      <w:r>
+        <w:br/>
+      </w:r>
+      <w:hyperlink r:id="rId51" w:history="1">
+        <w:r>
+          <w:rPr>
+            <w:rStyle w:val="Hyperlink"/>
+            <w:spacing w:val="0"/>
+          </w:rPr>
+          <w:t>courts.alaska.gov/</w:t>
+        </w:r>
+        <w:proofErr w:type="spellStart"/>
+        <w:r>
+          <w:rPr>
+            <w:rStyle w:val="Hyperlink"/>
+            <w:spacing w:val="0"/>
+          </w:rPr>
+          <w:t>shc</w:t>
+        </w:r>
+        <w:proofErr w:type="spellEnd"/>
+        <w:r>
+          <w:rPr>
+            <w:rStyle w:val="Hyperlink"/>
+            <w:spacing w:val="0"/>
+          </w:rPr>
+          <w:t>/family/docs/shc-095.doc</w:t>
+        </w:r>
+      </w:hyperlink>
+      <w:r>
+        <w:br/>
+      </w:r>
+      <w:hyperlink r:id="rId52" w:history="1">
+        <w:r>
+          <w:rPr>
+            <w:rStyle w:val="Hyperlink"/>
+            <w:spacing w:val="0"/>
+          </w:rPr>
+          <w:t>PDF</w:t>
+        </w:r>
+      </w:hyperlink>
+      <w:r>
+        <w:br/>
+      </w:r>
+      <w:hyperlink r:id="rId53" w:history="1">
+        <w:r>
+          <w:rPr>
+            <w:rStyle w:val="Hyperlink"/>
+            <w:spacing w:val="0"/>
+          </w:rPr>
+          <w:t>courts.alaska.gov/</w:t>
+        </w:r>
+        <w:proofErr w:type="spellStart"/>
+        <w:r>
+          <w:rPr>
+            <w:rStyle w:val="Hyperlink"/>
+            <w:spacing w:val="0"/>
+          </w:rPr>
+          <w:t>shc</w:t>
+        </w:r>
+        <w:proofErr w:type="spellEnd"/>
+        <w:r>
+          <w:rPr>
+            <w:rStyle w:val="Hyperlink"/>
+            <w:spacing w:val="0"/>
+          </w:rPr>
+          <w:t>/family/docs/shc-095n.pdf</w:t>
+        </w:r>
+      </w:hyperlink>
+    </w:p>
+    <w:p>
+      <w:pPr>
+        <w:pStyle w:val="Body"/>
+      </w:pPr>
+      <w:r>
+        <w:rPr>
+          <w:color w:val="92D050"/>
+        </w:rPr>
+        <w:t>{%p endif %}</w:t>
+      </w:r>
+    </w:p>
+    <w:p>
+      <w:pPr>
+        <w:pStyle w:val="Body"/>
+      </w:pPr>
+      <w:r>
+        <w:rPr>
+          <w:color w:val="FFC000"/>
+        </w:rPr>
+        <w:t>{%p endif %}</w:t>
+      </w:r>
+    </w:p>
+    <w:p>
+      <w:pPr>
+        <w:pStyle w:val="Body"/>
+        <w:rPr>
+          <w:color w:val="FF0000"/>
+        </w:rPr>
+      </w:pPr>
+      <w:r>
+        <w:rPr>
+          <w:color w:val="FF0000"/>
+        </w:rPr>
+        <w:t>{%p endif %}</w:t>
+      </w:r>
+    </w:p>
+    <w:p>
+      <w:pPr>
+        <w:pStyle w:val="Body"/>
+        <w:rPr>
+          <w:color w:val="FF0000"/>
+        </w:rPr>
+      </w:pPr>
+      <w:r>
+        <w:rPr>
+          <w:color w:val="FF0000"/>
+        </w:rPr>
         <w:lastRenderedPageBreak/>
-        <w:t>{%p elif not minor_children and wife_is_pregnant == 'not pregnant' %}</w:t>
-      </w:r>
-    </w:p>
-    <w:p>
-      <w:pPr>
-        <w:pStyle w:val="Body"/>
-        <w:rPr>
-          <w:color w:val="92D050"/>
-        </w:rPr>
-      </w:pPr>
-      <w:r>
-        <w:rPr>
-          <w:color w:val="92D050"/>
-        </w:rPr>
-        <w:t>{%p if case_type == 'divorce' %}</w:t>
-      </w:r>
-    </w:p>
-    <w:p>
-      <w:pPr>
-        <w:pStyle w:val="Body"/>
-      </w:pPr>
+        <w:t>{%p if type_of_response['default'] and stage_of_default in ('application filed', 'hearing scheduled') %}</w:t>
+      </w:r>
+    </w:p>
+    <w:p>
+      <w:pPr>
+        <w:pStyle w:val="Body"/>
+        <w:rPr>
+          <w:color w:val="FFC000"/>
+        </w:rPr>
+      </w:pPr>
+      <w:r>
+        <w:rPr>
+          <w:color w:val="FFC000"/>
+        </w:rPr>
+        <w:t>{%p if stage_of_default == 'application filed' and proper_service %}</w:t>
+      </w:r>
+    </w:p>
+    <w:p>
+      <w:pPr>
+        <w:pStyle w:val="Body"/>
+      </w:pPr>
+      <w:r>
+        <w:t xml:space="preserve">Fill out a </w:t>
+      </w:r>
       <w:r>
         <w:rPr>
           <w:b/>
         </w:rPr>
-        <w:t>ANSWER AND COUNTERCLAIM TO COMPLAINT FOR DIVORCE WITHOUT CHILDREN, DR-837</w:t>
+        <w:t>TF-706 Motion (Request) and Affidavit</w:t>
       </w:r>
       <w:r>
         <w:t xml:space="preserve"> [</w:t>
       </w:r>
-      <w:hyperlink r:id="rId46" w:history="1">
+      <w:hyperlink r:id="rId54" w:history="1">
         <w:r>
           <w:rPr>
             <w:rStyle w:val="Hyperlink"/>
@@ -2990,28 +3872,36 @@
       <w:r>
         <w:br/>
       </w:r>
-      <w:hyperlink r:id="rId47" w:history="1">
-        <w:r>
-          <w:rPr>
-            <w:rStyle w:val="Hyperlink"/>
-            <w:spacing w:val="0"/>
-          </w:rPr>
-          <w:t>ak-courts.info/dr837</w:t>
+      <w:hyperlink r:id="rId55" w:history="1">
+        <w:r>
+          <w:rPr>
+            <w:rStyle w:val="Hyperlink"/>
+            <w:spacing w:val="0"/>
+          </w:rPr>
+          <w:t>ak-courts.info/tf706</w:t>
         </w:r>
       </w:hyperlink>
     </w:p>
     <w:p>
       <w:pPr>
         <w:pStyle w:val="Body"/>
-        <w:rPr>
-          <w:color w:val="92D050"/>
-        </w:rPr>
-      </w:pPr>
-      <w:r>
-        <w:rPr>
-          <w:color w:val="92D050"/>
-        </w:rPr>
-        <w:t>{%p elif case_type == 'legal separation' %}</w:t>
+      </w:pPr>
+      <w:r>
+        <w:rPr>
+          <w:color w:val="FFC000"/>
+        </w:rPr>
+        <w:t xml:space="preserve"> {%p endif %}</w:t>
+      </w:r>
+    </w:p>
+    <w:p>
+      <w:pPr>
+        <w:pStyle w:val="Body"/>
+      </w:pPr>
+      <w:r>
+        <w:rPr>
+          <w:color w:val="FFC000"/>
+        </w:rPr>
+        <w:t>{%p if stage_of_default == 'hearing scheduled' %}</w:t>
       </w:r>
     </w:p>
     <w:p>
@@ -3022,302 +3912,112 @@
         <w:rPr>
           <w:b/>
         </w:rPr>
-        <w:t>Answer &amp; Counterclaim to Legal Separation Without Children, SHC-095</w:t>
-      </w:r>
-      <w:r>
-        <w:t xml:space="preserve"> </w:t>
+        <w:t>Motion, Affidavit, and Order to Set Aside Entry of Default and Accept Late Filed Answer, CIV-858</w:t>
+      </w:r>
+      <w:r>
+        <w:t xml:space="preserve"> [</w:t>
+      </w:r>
+      <w:hyperlink r:id="rId56" w:history="1">
+        <w:r>
+          <w:rPr>
+            <w:rStyle w:val="Hyperlink"/>
+            <w:spacing w:val="0"/>
+          </w:rPr>
+          <w:t>Fill-In</w:t>
+        </w:r>
+        <w:r>
+          <w:rPr>
+            <w:rStyle w:val="Hyperlink"/>
+            <w:spacing w:val="0"/>
+          </w:rPr>
+          <w:t xml:space="preserve"> PDF</w:t>
+        </w:r>
+      </w:hyperlink>
+      <w:r>
+        <w:t>]</w:t>
       </w:r>
       <w:r>
         <w:br/>
       </w:r>
-      <w:hyperlink r:id="rId48" w:history="1">
-        <w:r>
-          <w:rPr>
-            <w:rStyle w:val="Hyperlink"/>
-            <w:spacing w:val="0"/>
-          </w:rPr>
-          <w:t>Word</w:t>
+      <w:hyperlink r:id="rId57" w:history="1">
+        <w:r>
+          <w:rPr>
+            <w:rStyle w:val="Hyperlink"/>
+            <w:spacing w:val="0"/>
+          </w:rPr>
+          <w:t>ak-courts.info/tf858</w:t>
         </w:r>
       </w:hyperlink>
-      <w:r>
-        <w:t xml:space="preserve"> </w:t>
-      </w:r>
+    </w:p>
+    <w:p>
+      <w:pPr>
+        <w:pStyle w:val="Body"/>
+      </w:pPr>
+      <w:r>
+        <w:rPr>
+          <w:color w:val="FFC000"/>
+        </w:rPr>
+        <w:t>{%p endif %}</w:t>
+      </w:r>
+    </w:p>
+    <w:p>
+      <w:pPr>
+        <w:pStyle w:val="Body"/>
+        <w:rPr>
+          <w:color w:val="FF0000"/>
+        </w:rPr>
+      </w:pPr>
+      <w:r>
+        <w:rPr>
+          <w:color w:val="FF0000"/>
+        </w:rPr>
+        <w:t>{%p endif %}</w:t>
+      </w:r>
+    </w:p>
+    <w:p>
+      <w:pPr>
+        <w:pStyle w:val="Body"/>
+      </w:pPr>
+      <w:r>
+        <w:rPr>
+          <w:color w:val="FF0000"/>
+        </w:rPr>
+        <w:t>{%p if type_of_response['wrong state'] and ((user_need == 'answer custody' and not jurisdiction) or user_need == 'answer divorce') %}</w:t>
+      </w:r>
+    </w:p>
+    <w:p>
+      <w:pPr>
+        <w:pStyle w:val="Body"/>
+      </w:pPr>
+      <w:hyperlink r:id="rId58" w:history="1">
+        <w:r>
+          <w:rPr>
+            <w:rStyle w:val="Hyperlink"/>
+            <w:spacing w:val="0"/>
+          </w:rPr>
+          <w:t>talk to a lawyer</w:t>
+        </w:r>
+      </w:hyperlink>
       <w:r>
         <w:br/>
       </w:r>
-      <w:hyperlink r:id="rId49" w:history="1">
-        <w:r>
-          <w:rPr>
-            <w:rStyle w:val="Hyperlink"/>
-            <w:spacing w:val="0"/>
-          </w:rPr>
-          <w:t>courts.alaska.gov/shc/family/docs/shc-095.doc</w:t>
-        </w:r>
-      </w:hyperlink>
-      <w:r>
-        <w:br/>
-      </w:r>
-      <w:hyperlink r:id="rId50" w:history="1">
-        <w:r>
-          <w:rPr>
-            <w:rStyle w:val="Hyperlink"/>
-            <w:spacing w:val="0"/>
-          </w:rPr>
-          <w:t>PDF</w:t>
-        </w:r>
-      </w:hyperlink>
-      <w:r>
-        <w:br/>
-      </w:r>
-      <w:hyperlink r:id="rId51" w:history="1">
-        <w:r>
-          <w:rPr>
-            <w:rStyle w:val="Hyperlink"/>
-            <w:spacing w:val="0"/>
-          </w:rPr>
-          <w:t>courts.alaska.gov/shc/family/docs/shc-095n.pdf</w:t>
-        </w:r>
-      </w:hyperlink>
-    </w:p>
-    <w:p>
-      <w:pPr>
-        <w:pStyle w:val="Body"/>
-      </w:pPr>
-      <w:r>
-        <w:rPr>
-          <w:color w:val="92D050"/>
-        </w:rPr>
-        <w:t>{%p endif %}</w:t>
-      </w:r>
-    </w:p>
-    <w:p>
-      <w:pPr>
-        <w:pStyle w:val="Body"/>
-      </w:pPr>
-      <w:r>
-        <w:rPr>
-          <w:color w:val="FFC000"/>
-        </w:rPr>
-        <w:t>{%p endif %}</w:t>
-      </w:r>
-    </w:p>
-    <w:p>
-      <w:pPr>
-        <w:pStyle w:val="Body"/>
-        <w:rPr>
-          <w:color w:val="FF0000"/>
-        </w:rPr>
-      </w:pPr>
-      <w:r>
-        <w:rPr>
-          <w:color w:val="FF0000"/>
-        </w:rPr>
-        <w:t>{%p endif %}</w:t>
-      </w:r>
-    </w:p>
-    <w:p>
-      <w:pPr>
-        <w:pStyle w:val="Body"/>
-        <w:rPr>
-          <w:color w:val="FF0000"/>
-        </w:rPr>
-      </w:pPr>
-      <w:r>
-        <w:rPr>
-          <w:color w:val="FF0000"/>
-        </w:rPr>
-        <w:t>{%p if type_of_response['default'] and stage_of_default in ('application filed', 'hearing scheduled') %}</w:t>
-      </w:r>
-    </w:p>
-    <w:p>
-      <w:pPr>
-        <w:pStyle w:val="Body"/>
-        <w:rPr>
-          <w:color w:val="FFC000"/>
-        </w:rPr>
-      </w:pPr>
-      <w:r>
-        <w:rPr>
-          <w:color w:val="FFC000"/>
-        </w:rPr>
-        <w:t>{%p if stage_of_default == 'application filed' and proper_service %}</w:t>
-      </w:r>
-    </w:p>
-    <w:p>
-      <w:pPr>
-        <w:pStyle w:val="Body"/>
-      </w:pPr>
-      <w:r>
-        <w:t xml:space="preserve">Fill out a </w:t>
-      </w:r>
-      <w:r>
-        <w:rPr>
-          <w:b/>
-        </w:rPr>
-        <w:t>TF-706 Motion (Request) and Affidavit</w:t>
-      </w:r>
-      <w:r>
-        <w:t xml:space="preserve"> [</w:t>
-      </w:r>
-      <w:hyperlink r:id="rId52" w:history="1">
-        <w:r>
-          <w:rPr>
-            <w:rStyle w:val="Hyperlink"/>
-            <w:spacing w:val="0"/>
-          </w:rPr>
-          <w:t>Fill-In</w:t>
-        </w:r>
-        <w:r>
-          <w:rPr>
-            <w:rStyle w:val="Hyperlink"/>
-            <w:spacing w:val="0"/>
-          </w:rPr>
-          <w:t xml:space="preserve"> PDF</w:t>
-        </w:r>
-      </w:hyperlink>
-      <w:r>
-        <w:t>]</w:t>
-      </w:r>
-      <w:r>
-        <w:br/>
-      </w:r>
-      <w:hyperlink r:id="rId53" w:history="1">
-        <w:r>
-          <w:rPr>
-            <w:rStyle w:val="Hyperlink"/>
-            <w:spacing w:val="0"/>
-          </w:rPr>
-          <w:t>ak-courts.info/tf706</w:t>
-        </w:r>
-      </w:hyperlink>
-    </w:p>
-    <w:p>
-      <w:pPr>
-        <w:pStyle w:val="Body"/>
-      </w:pPr>
-      <w:r>
-        <w:rPr>
-          <w:color w:val="FFC000"/>
-        </w:rPr>
-        <w:t xml:space="preserve"> {%p endif %}</w:t>
-      </w:r>
-    </w:p>
-    <w:p>
-      <w:pPr>
-        <w:pStyle w:val="Body"/>
-      </w:pPr>
-      <w:r>
-        <w:rPr>
-          <w:color w:val="FFC000"/>
-        </w:rPr>
-        <w:t>{%p if stage_of_default == 'hearing scheduled' %}</w:t>
-      </w:r>
-    </w:p>
-    <w:p>
-      <w:pPr>
-        <w:pStyle w:val="Body"/>
-      </w:pPr>
-      <w:r>
-        <w:rPr>
-          <w:b/>
-        </w:rPr>
-        <w:t>Motion, Affidavit, and Order to Set Aside Entry of Default and Accept Late Filed Answer, CIV-858</w:t>
-      </w:r>
-      <w:r>
-        <w:t xml:space="preserve"> [</w:t>
-      </w:r>
-      <w:hyperlink r:id="rId54" w:history="1">
-        <w:r>
-          <w:rPr>
-            <w:rStyle w:val="Hyperlink"/>
-            <w:spacing w:val="0"/>
-          </w:rPr>
-          <w:t>Fill-In</w:t>
-        </w:r>
-        <w:r>
-          <w:rPr>
-            <w:rStyle w:val="Hyperlink"/>
-            <w:spacing w:val="0"/>
-          </w:rPr>
-          <w:t xml:space="preserve"> PDF</w:t>
-        </w:r>
-      </w:hyperlink>
-      <w:r>
-        <w:t>]</w:t>
-      </w:r>
-      <w:r>
-        <w:br/>
-      </w:r>
-      <w:hyperlink r:id="rId55" w:history="1">
-        <w:r>
-          <w:rPr>
-            <w:rStyle w:val="Hyperlink"/>
-            <w:spacing w:val="0"/>
-          </w:rPr>
-          <w:t>ak-courts.info/tf858</w:t>
-        </w:r>
-      </w:hyperlink>
-    </w:p>
-    <w:p>
-      <w:pPr>
-        <w:pStyle w:val="Body"/>
-      </w:pPr>
-      <w:r>
-        <w:rPr>
-          <w:color w:val="FFC000"/>
-        </w:rPr>
-        <w:t>{%p endif %}</w:t>
-      </w:r>
-    </w:p>
-    <w:p>
-      <w:pPr>
-        <w:pStyle w:val="Body"/>
-        <w:rPr>
-          <w:color w:val="FF0000"/>
-        </w:rPr>
-      </w:pPr>
-      <w:r>
-        <w:rPr>
-          <w:color w:val="FF0000"/>
-        </w:rPr>
-        <w:t>{%p endif %}</w:t>
-      </w:r>
-    </w:p>
-    <w:p>
-      <w:pPr>
-        <w:pStyle w:val="Body"/>
-      </w:pPr>
-      <w:r>
-        <w:rPr>
-          <w:color w:val="FF0000"/>
-        </w:rPr>
-        <w:t>{%p if type_of_response['wrong state'] and ((user_need == 'answer custody' and not jurisdiction) or user_need == 'answer divorce') %}</w:t>
-      </w:r>
-    </w:p>
-    <w:p>
-      <w:pPr>
-        <w:pStyle w:val="Body"/>
-      </w:pPr>
-      <w:hyperlink r:id="rId56" w:history="1">
-        <w:r>
-          <w:rPr>
-            <w:rStyle w:val="Hyperlink"/>
-            <w:spacing w:val="0"/>
-          </w:rPr>
-          <w:t>talk to a lawyer</w:t>
-        </w:r>
-      </w:hyperlink>
-      <w:r>
-        <w:br/>
-      </w:r>
-      <w:hyperlink r:id="rId57" w:history="1">
-        <w:r>
-          <w:rPr>
-            <w:rStyle w:val="Hyperlink"/>
-            <w:spacing w:val="0"/>
-          </w:rPr>
-          <w:t>ak-courts.info/findlawyer</w:t>
-        </w:r>
+      <w:hyperlink r:id="rId59" w:history="1">
+        <w:r>
+          <w:rPr>
+            <w:rStyle w:val="Hyperlink"/>
+            <w:spacing w:val="0"/>
+          </w:rPr>
+          <w:t>ak-courts.info/</w:t>
+        </w:r>
+        <w:proofErr w:type="spellStart"/>
+        <w:r>
+          <w:rPr>
+            <w:rStyle w:val="Hyperlink"/>
+            <w:spacing w:val="0"/>
+          </w:rPr>
+          <w:t>findlawyer</w:t>
+        </w:r>
+        <w:proofErr w:type="spellEnd"/>
       </w:hyperlink>
     </w:p>
     <w:p>

</xml_diff>

<commit_message>
replaced text for signing signing_paragraph_content with including signing_content_docx in answer_content only. surrounded by empty lines.
</commit_message>
<xml_diff>
--- a/docassemble/AKA2JBranding/data/templates/answer_content.docx
+++ b/docassemble/AKA2JBranding/data/templates/answer_content.docx
@@ -93,544 +93,27 @@
     </w:p>
     <w:p>
       <w:pPr>
-        <w:pStyle w:val="Example"/>
-        <w:rPr>
-          <w:color w:val="auto"/>
-        </w:rPr>
-      </w:pPr>
-      <w:r>
-        <w:t>Important - signing your documents</w:t>
-      </w:r>
-    </w:p>
-    <w:p>
-      <w:pPr>
-        <w:rPr>
-          <w:rFonts w:ascii="Helvetica" w:eastAsiaTheme="minorHAnsi" w:hAnsi="Helvetica" w:cs="Helvetica"/>
-          <w:sz w:val="24"/>
-          <w:szCs w:val="24"/>
-        </w:rPr>
-      </w:pPr>
-      <w:r>
-        <w:rPr>
-          <w:rFonts w:ascii="Helvetica" w:eastAsiaTheme="minorHAnsi" w:hAnsi="Helvetica" w:cs="Helvetica"/>
-          <w:color w:val="FF0000"/>
-          <w:sz w:val="24"/>
-          <w:szCs w:val="24"/>
-        </w:rPr>
-        <w:t>{%p</w:t>
-      </w:r>
-      <w:r>
-        <w:rPr>
-          <w:rFonts w:ascii="Helvetica" w:eastAsiaTheme="minorHAnsi" w:hAnsi="Helvetica" w:cs="Helvetica"/>
-          <w:color w:val="FF0000"/>
-          <w:sz w:val="24"/>
-          <w:szCs w:val="24"/>
-        </w:rPr>
-        <w:t xml:space="preserve"> if </w:t>
-      </w:r>
-      <w:proofErr w:type="spellStart"/>
-      <w:r>
-        <w:rPr>
-          <w:rFonts w:ascii="Helvetica" w:eastAsiaTheme="minorHAnsi" w:hAnsi="Helvetica" w:cs="Helvetica"/>
-          <w:color w:val="FF0000"/>
-          <w:sz w:val="24"/>
-          <w:szCs w:val="24"/>
-        </w:rPr>
-        <w:t>filling_manner</w:t>
-      </w:r>
-      <w:proofErr w:type="spellEnd"/>
-      <w:r>
-        <w:rPr>
-          <w:rFonts w:ascii="Helvetica" w:eastAsiaTheme="minorHAnsi" w:hAnsi="Helvetica" w:cs="Helvetica"/>
-          <w:color w:val="FF0000"/>
-          <w:sz w:val="24"/>
-          <w:szCs w:val="24"/>
-        </w:rPr>
-        <w:t xml:space="preserve"> in('electronically', '</w:t>
-      </w:r>
-      <w:proofErr w:type="spellStart"/>
-      <w:r>
-        <w:rPr>
-          <w:rFonts w:ascii="Helvetica" w:eastAsiaTheme="minorHAnsi" w:hAnsi="Helvetica" w:cs="Helvetica"/>
-          <w:color w:val="FF0000"/>
-          <w:sz w:val="24"/>
-          <w:szCs w:val="24"/>
-        </w:rPr>
-        <w:t>dunno</w:t>
-      </w:r>
-      <w:proofErr w:type="spellEnd"/>
-      <w:r>
-        <w:rPr>
-          <w:rFonts w:ascii="Helvetica" w:eastAsiaTheme="minorHAnsi" w:hAnsi="Helvetica" w:cs="Helvetica"/>
-          <w:color w:val="FF0000"/>
-          <w:sz w:val="24"/>
-          <w:szCs w:val="24"/>
-        </w:rPr>
-        <w:t xml:space="preserve">') and </w:t>
-      </w:r>
-      <w:proofErr w:type="spellStart"/>
-      <w:r>
-        <w:rPr>
-          <w:rFonts w:ascii="Helvetica" w:eastAsiaTheme="minorHAnsi" w:hAnsi="Helvetica" w:cs="Helvetica"/>
-          <w:color w:val="FF0000"/>
-          <w:sz w:val="24"/>
-          <w:szCs w:val="24"/>
-        </w:rPr>
-        <w:t>filing_method</w:t>
-      </w:r>
-      <w:proofErr w:type="spellEnd"/>
-      <w:r>
-        <w:rPr>
-          <w:rFonts w:ascii="Helvetica" w:eastAsiaTheme="minorHAnsi" w:hAnsi="Helvetica" w:cs="Helvetica"/>
-          <w:color w:val="FF0000"/>
-          <w:sz w:val="24"/>
-          <w:szCs w:val="24"/>
-        </w:rPr>
-        <w:t xml:space="preserve"> in('</w:t>
-      </w:r>
-      <w:proofErr w:type="spellStart"/>
-      <w:r>
-        <w:rPr>
-          <w:rFonts w:ascii="Helvetica" w:eastAsiaTheme="minorHAnsi" w:hAnsi="Helvetica" w:cs="Helvetica"/>
-          <w:color w:val="FF0000"/>
-          <w:sz w:val="24"/>
-          <w:szCs w:val="24"/>
-        </w:rPr>
-        <w:t>efiling</w:t>
-      </w:r>
-      <w:proofErr w:type="spellEnd"/>
-      <w:r>
-        <w:rPr>
-          <w:rFonts w:ascii="Helvetica" w:eastAsiaTheme="minorHAnsi" w:hAnsi="Helvetica" w:cs="Helvetica"/>
-          <w:color w:val="FF0000"/>
-          <w:sz w:val="24"/>
-          <w:szCs w:val="24"/>
-        </w:rPr>
-        <w:t>', '</w:t>
-      </w:r>
-      <w:proofErr w:type="spellStart"/>
-      <w:r>
-        <w:rPr>
-          <w:rFonts w:ascii="Helvetica" w:eastAsiaTheme="minorHAnsi" w:hAnsi="Helvetica" w:cs="Helvetica"/>
-          <w:color w:val="FF0000"/>
-          <w:sz w:val="24"/>
-          <w:szCs w:val="24"/>
-        </w:rPr>
-        <w:t>dunno</w:t>
-      </w:r>
-      <w:proofErr w:type="spellEnd"/>
-      <w:r>
-        <w:rPr>
-          <w:rFonts w:ascii="Helvetica" w:eastAsiaTheme="minorHAnsi" w:hAnsi="Helvetica" w:cs="Helvetica"/>
-          <w:color w:val="FF0000"/>
-          <w:sz w:val="24"/>
-          <w:szCs w:val="24"/>
-        </w:rPr>
-        <w:t>')</w:t>
-      </w:r>
-      <w:r>
-        <w:rPr>
-          <w:rFonts w:ascii="Helvetica" w:eastAsiaTheme="minorHAnsi" w:hAnsi="Helvetica" w:cs="Helvetica"/>
-          <w:color w:val="FF0000"/>
-          <w:sz w:val="24"/>
-          <w:szCs w:val="24"/>
-        </w:rPr>
-        <w:t xml:space="preserve"> %}</w:t>
-      </w:r>
-    </w:p>
-    <w:p>
-      <w:pPr>
-        <w:pStyle w:val="Exampleparagraph"/>
-      </w:pPr>
-      <w:r>
-        <w:t>If you fill out your forms on a computer and file them with TrueFiling, you can sign your forms electronically.  Type “/s/ your name” on the signature line. For example, Zoe Lee’s signature would be "/s/ Zoe Lee."</w:t>
-      </w:r>
-    </w:p>
-    <w:p>
-      <w:pPr>
-        <w:rPr>
-          <w:rFonts w:ascii="Helvetica" w:eastAsiaTheme="minorHAnsi" w:hAnsi="Helvetica" w:cs="Helvetica"/>
-          <w:sz w:val="24"/>
-          <w:szCs w:val="24"/>
-        </w:rPr>
-      </w:pPr>
-      <w:r>
-        <w:rPr>
-          <w:rFonts w:ascii="Helvetica" w:eastAsiaTheme="minorHAnsi" w:hAnsi="Helvetica" w:cs="Helvetica"/>
-          <w:color w:val="FFC000"/>
-          <w:sz w:val="24"/>
-          <w:szCs w:val="24"/>
-        </w:rPr>
-        <w:t>{%p</w:t>
-      </w:r>
-      <w:r>
-        <w:rPr>
-          <w:rFonts w:ascii="Helvetica" w:eastAsiaTheme="minorHAnsi" w:hAnsi="Helvetica" w:cs="Helvetica"/>
-          <w:color w:val="FFC000"/>
-          <w:sz w:val="24"/>
-          <w:szCs w:val="24"/>
-        </w:rPr>
-        <w:t xml:space="preserve"> if </w:t>
-      </w:r>
-      <w:proofErr w:type="spellStart"/>
-      <w:r>
-        <w:rPr>
-          <w:rFonts w:ascii="Helvetica" w:eastAsiaTheme="minorHAnsi" w:hAnsi="Helvetica" w:cs="Helvetica"/>
-          <w:color w:val="FFC000"/>
-          <w:sz w:val="24"/>
-          <w:szCs w:val="24"/>
-        </w:rPr>
-        <w:t>filing_method</w:t>
-      </w:r>
-      <w:proofErr w:type="spellEnd"/>
-      <w:r>
-        <w:rPr>
-          <w:rFonts w:ascii="Helvetica" w:eastAsiaTheme="minorHAnsi" w:hAnsi="Helvetica" w:cs="Helvetica"/>
-          <w:color w:val="FFC000"/>
-          <w:sz w:val="24"/>
-          <w:szCs w:val="24"/>
-        </w:rPr>
-        <w:t xml:space="preserve"> == '</w:t>
-      </w:r>
-      <w:proofErr w:type="spellStart"/>
-      <w:r>
-        <w:rPr>
-          <w:rFonts w:ascii="Helvetica" w:eastAsiaTheme="minorHAnsi" w:hAnsi="Helvetica" w:cs="Helvetica"/>
-          <w:color w:val="FFC000"/>
-          <w:sz w:val="24"/>
-          <w:szCs w:val="24"/>
-        </w:rPr>
-        <w:t>efiling</w:t>
-      </w:r>
-      <w:proofErr w:type="spellEnd"/>
-      <w:r>
-        <w:rPr>
-          <w:rFonts w:ascii="Helvetica" w:eastAsiaTheme="minorHAnsi" w:hAnsi="Helvetica" w:cs="Helvetica"/>
-          <w:color w:val="FFC000"/>
-          <w:sz w:val="24"/>
-          <w:szCs w:val="24"/>
-        </w:rPr>
-        <w:t xml:space="preserve">' and </w:t>
-      </w:r>
-      <w:proofErr w:type="spellStart"/>
-      <w:r>
-        <w:rPr>
-          <w:rFonts w:ascii="Helvetica" w:eastAsiaTheme="minorHAnsi" w:hAnsi="Helvetica" w:cs="Helvetica"/>
-          <w:color w:val="FFC000"/>
-          <w:sz w:val="24"/>
-          <w:szCs w:val="24"/>
-        </w:rPr>
-        <w:t>filling_manner</w:t>
-      </w:r>
-      <w:proofErr w:type="spellEnd"/>
-      <w:r>
-        <w:rPr>
-          <w:rFonts w:ascii="Helvetica" w:eastAsiaTheme="minorHAnsi" w:hAnsi="Helvetica" w:cs="Helvetica"/>
-          <w:color w:val="FFC000"/>
-          <w:sz w:val="24"/>
-          <w:szCs w:val="24"/>
-        </w:rPr>
-        <w:t xml:space="preserve"> == 'electronically'</w:t>
-      </w:r>
-      <w:r>
-        <w:rPr>
-          <w:rFonts w:ascii="Helvetica" w:eastAsiaTheme="minorHAnsi" w:hAnsi="Helvetica" w:cs="Helvetica"/>
-          <w:color w:val="FFC000"/>
-          <w:sz w:val="24"/>
-          <w:szCs w:val="24"/>
-        </w:rPr>
-        <w:t xml:space="preserve"> %}</w:t>
-      </w:r>
-    </w:p>
-    <w:p>
-      <w:pPr>
-        <w:pStyle w:val="ExampleorImportantblock"/>
-      </w:pPr>
-      <w:r>
-        <w:t xml:space="preserve">If the form needs to be notarized, fill out and file </w:t>
-      </w:r>
-      <w:r>
-        <w:rPr>
-          <w:b/>
-          <w:bCs/>
-        </w:rPr>
-        <w:t>Self-Certification (No Notary Available), TF-835</w:t>
-      </w:r>
-      <w:r>
-        <w:t xml:space="preserve"> [</w:t>
-      </w:r>
-      <w:hyperlink r:id="rId5" w:history="1">
-        <w:r>
-          <w:rPr>
-            <w:rStyle w:val="Hyperlink"/>
-            <w:spacing w:val="0"/>
-          </w:rPr>
-          <w:t>Fill in PDF</w:t>
-        </w:r>
-      </w:hyperlink>
-      <w:r>
-        <w:t>]</w:t>
-      </w:r>
-      <w:r>
-        <w:br/>
-      </w:r>
-      <w:hyperlink r:id="rId6" w:history="1">
-        <w:r>
-          <w:rPr>
-            <w:rStyle w:val="Hyperlink"/>
-            <w:spacing w:val="0"/>
-          </w:rPr>
-          <w:t>ak-courts.info/tf835</w:t>
-        </w:r>
-      </w:hyperlink>
-      <w:r>
-        <w:t>.</w:t>
-      </w:r>
-    </w:p>
-    <w:p>
-      <w:pPr>
-        <w:rPr>
-          <w:rFonts w:ascii="Helvetica" w:eastAsiaTheme="minorHAnsi" w:hAnsi="Helvetica" w:cs="Helvetica"/>
-          <w:sz w:val="24"/>
-          <w:szCs w:val="24"/>
-        </w:rPr>
-      </w:pPr>
-      <w:r>
-        <w:rPr>
-          <w:rFonts w:ascii="Helvetica" w:eastAsiaTheme="minorHAnsi" w:hAnsi="Helvetica" w:cs="Helvetica"/>
-          <w:color w:val="FFC000"/>
-          <w:sz w:val="24"/>
-          <w:szCs w:val="24"/>
-        </w:rPr>
-        <w:t>{%p</w:t>
-      </w:r>
-      <w:r>
-        <w:rPr>
-          <w:rFonts w:ascii="Helvetica" w:eastAsiaTheme="minorHAnsi" w:hAnsi="Helvetica" w:cs="Helvetica"/>
-          <w:color w:val="FFC000"/>
-          <w:sz w:val="24"/>
-          <w:szCs w:val="24"/>
-        </w:rPr>
-        <w:t xml:space="preserve"> endi</w:t>
-      </w:r>
-      <w:r>
-        <w:rPr>
-          <w:rFonts w:ascii="Helvetica" w:eastAsiaTheme="minorHAnsi" w:hAnsi="Helvetica" w:cs="Helvetica"/>
-          <w:color w:val="FFC000"/>
-          <w:sz w:val="24"/>
-          <w:szCs w:val="24"/>
-        </w:rPr>
-        <w:t>f %}</w:t>
-      </w:r>
-    </w:p>
-    <w:p>
-      <w:pPr>
-        <w:rPr>
-          <w:rFonts w:ascii="Helvetica" w:eastAsiaTheme="minorHAnsi" w:hAnsi="Helvetica" w:cs="Helvetica"/>
-          <w:sz w:val="24"/>
-          <w:szCs w:val="24"/>
-        </w:rPr>
-      </w:pPr>
-      <w:r>
-        <w:rPr>
-          <w:rFonts w:ascii="Helvetica" w:eastAsiaTheme="minorHAnsi" w:hAnsi="Helvetica" w:cs="Helvetica"/>
-          <w:color w:val="FF0000"/>
-          <w:sz w:val="24"/>
-          <w:szCs w:val="24"/>
-        </w:rPr>
-        <w:t>{%p</w:t>
-      </w:r>
-      <w:r>
-        <w:rPr>
-          <w:rFonts w:ascii="Helvetica" w:eastAsiaTheme="minorHAnsi" w:hAnsi="Helvetica" w:cs="Helvetica"/>
-          <w:color w:val="FF0000"/>
-          <w:sz w:val="24"/>
-          <w:szCs w:val="24"/>
-        </w:rPr>
-        <w:t xml:space="preserve"> endi</w:t>
-      </w:r>
-      <w:r>
-        <w:rPr>
-          <w:rFonts w:ascii="Helvetica" w:eastAsiaTheme="minorHAnsi" w:hAnsi="Helvetica" w:cs="Helvetica"/>
-          <w:color w:val="FF0000"/>
-          <w:sz w:val="24"/>
-          <w:szCs w:val="24"/>
-        </w:rPr>
-        <w:t>f %}</w:t>
-      </w:r>
-    </w:p>
-    <w:p>
-      <w:pPr>
-        <w:rPr>
-          <w:rFonts w:ascii="Helvetica" w:eastAsiaTheme="minorHAnsi" w:hAnsi="Helvetica" w:cs="Helvetica"/>
-          <w:sz w:val="24"/>
-          <w:szCs w:val="24"/>
-        </w:rPr>
-      </w:pPr>
-      <w:r>
-        <w:rPr>
-          <w:rFonts w:ascii="Helvetica" w:eastAsiaTheme="minorHAnsi" w:hAnsi="Helvetica" w:cs="Helvetica"/>
-          <w:color w:val="FF0000"/>
-          <w:sz w:val="24"/>
-          <w:szCs w:val="24"/>
-        </w:rPr>
-        <w:t>{%p</w:t>
-      </w:r>
-      <w:r>
-        <w:rPr>
-          <w:rFonts w:ascii="Helvetica" w:eastAsiaTheme="minorHAnsi" w:hAnsi="Helvetica" w:cs="Helvetica"/>
-          <w:color w:val="FF0000"/>
-          <w:sz w:val="24"/>
-          <w:szCs w:val="24"/>
-        </w:rPr>
-        <w:t xml:space="preserve"> if </w:t>
-      </w:r>
-      <w:proofErr w:type="spellStart"/>
-      <w:r>
-        <w:rPr>
-          <w:rFonts w:ascii="Helvetica" w:eastAsiaTheme="minorHAnsi" w:hAnsi="Helvetica" w:cs="Helvetica"/>
-          <w:color w:val="FF0000"/>
-          <w:sz w:val="24"/>
-          <w:szCs w:val="24"/>
-        </w:rPr>
-        <w:t>filling_manner</w:t>
-      </w:r>
-      <w:proofErr w:type="spellEnd"/>
-      <w:r>
-        <w:rPr>
-          <w:rFonts w:ascii="Helvetica" w:eastAsiaTheme="minorHAnsi" w:hAnsi="Helvetica" w:cs="Helvetica"/>
-          <w:color w:val="FF0000"/>
-          <w:sz w:val="24"/>
-          <w:szCs w:val="24"/>
-        </w:rPr>
-        <w:t xml:space="preserve"> in('paper', '</w:t>
-      </w:r>
-      <w:proofErr w:type="spellStart"/>
-      <w:r>
-        <w:rPr>
-          <w:rFonts w:ascii="Helvetica" w:eastAsiaTheme="minorHAnsi" w:hAnsi="Helvetica" w:cs="Helvetica"/>
-          <w:color w:val="FF0000"/>
-          <w:sz w:val="24"/>
-          <w:szCs w:val="24"/>
-        </w:rPr>
-        <w:t>dunno</w:t>
-      </w:r>
-      <w:proofErr w:type="spellEnd"/>
-      <w:r>
-        <w:rPr>
-          <w:rFonts w:ascii="Helvetica" w:eastAsiaTheme="minorHAnsi" w:hAnsi="Helvetica" w:cs="Helvetica"/>
-          <w:color w:val="FF0000"/>
-          <w:sz w:val="24"/>
-          <w:szCs w:val="24"/>
-        </w:rPr>
-        <w:t xml:space="preserve">') or </w:t>
-      </w:r>
-      <w:proofErr w:type="spellStart"/>
-      <w:r>
-        <w:rPr>
-          <w:rFonts w:ascii="Helvetica" w:eastAsiaTheme="minorHAnsi" w:hAnsi="Helvetica" w:cs="Helvetica"/>
-          <w:color w:val="FF0000"/>
-          <w:sz w:val="24"/>
-          <w:szCs w:val="24"/>
-        </w:rPr>
-        <w:t>filing_method</w:t>
-      </w:r>
-      <w:proofErr w:type="spellEnd"/>
-      <w:r>
-        <w:rPr>
-          <w:rFonts w:ascii="Helvetica" w:eastAsiaTheme="minorHAnsi" w:hAnsi="Helvetica" w:cs="Helvetica"/>
-          <w:color w:val="FF0000"/>
-          <w:sz w:val="24"/>
-          <w:szCs w:val="24"/>
-        </w:rPr>
-        <w:t xml:space="preserve"> in ('mail or in person', '</w:t>
-      </w:r>
-      <w:proofErr w:type="spellStart"/>
-      <w:r>
-        <w:rPr>
-          <w:rFonts w:ascii="Helvetica" w:eastAsiaTheme="minorHAnsi" w:hAnsi="Helvetica" w:cs="Helvetica"/>
-          <w:color w:val="FF0000"/>
-          <w:sz w:val="24"/>
-          <w:szCs w:val="24"/>
-        </w:rPr>
-        <w:t>dunno</w:t>
-      </w:r>
-      <w:proofErr w:type="spellEnd"/>
-      <w:r>
-        <w:rPr>
-          <w:rFonts w:ascii="Helvetica" w:eastAsiaTheme="minorHAnsi" w:hAnsi="Helvetica" w:cs="Helvetica"/>
-          <w:color w:val="FF0000"/>
-          <w:sz w:val="24"/>
-          <w:szCs w:val="24"/>
-        </w:rPr>
-        <w:t>'</w:t>
-      </w:r>
-      <w:r>
-        <w:rPr>
-          <w:rFonts w:ascii="Helvetica" w:eastAsiaTheme="minorHAnsi" w:hAnsi="Helvetica" w:cs="Helvetica"/>
-          <w:color w:val="FF0000"/>
-          <w:sz w:val="24"/>
-          <w:szCs w:val="24"/>
-        </w:rPr>
-        <w:t>) %}</w:t>
-      </w:r>
-    </w:p>
-    <w:p>
-      <w:pPr>
-        <w:pStyle w:val="ExampleorImportantblock"/>
-      </w:pPr>
-      <w:r>
-        <w:t xml:space="preserve">If you fill out paper copies of the forms, or do not file them with TrueFiling, read </w:t>
-      </w:r>
-      <w:r>
-        <w:t>{</w:t>
-      </w:r>
-      <w:r>
-        <w:t xml:space="preserve">{ </w:t>
-      </w:r>
-      <w:proofErr w:type="spellStart"/>
-      <w:r>
-        <w:t>sign_step.subject</w:t>
-      </w:r>
-      <w:proofErr w:type="spellEnd"/>
-      <w:r>
-        <w:t xml:space="preserve"> </w:t>
-      </w:r>
-      <w:r>
-        <w:t>}</w:t>
-      </w:r>
-      <w:r>
-        <w:t>} before you sign any document.</w:t>
-      </w:r>
-    </w:p>
-    <w:p>
-      <w:r>
-        <w:rPr>
-          <w:rFonts w:ascii="Helvetica" w:eastAsiaTheme="minorHAnsi" w:hAnsi="Helvetica" w:cs="Helvetica"/>
-          <w:color w:val="FF0000"/>
-          <w:sz w:val="24"/>
-          <w:szCs w:val="24"/>
-        </w:rPr>
-        <w:t>{%p</w:t>
-      </w:r>
-      <w:r>
-        <w:rPr>
-          <w:rFonts w:ascii="Helvetica" w:eastAsiaTheme="minorHAnsi" w:hAnsi="Helvetica" w:cs="Helvetica"/>
-          <w:color w:val="FF0000"/>
-          <w:sz w:val="24"/>
-          <w:szCs w:val="24"/>
-        </w:rPr>
-        <w:t xml:space="preserve"> endif</w:t>
-      </w:r>
-      <w:r>
-        <w:rPr>
-          <w:rFonts w:ascii="Helvetica" w:eastAsiaTheme="minorHAnsi" w:hAnsi="Helvetica" w:cs="Helvetica"/>
-          <w:color w:val="FF0000"/>
-          <w:sz w:val="24"/>
-          <w:szCs w:val="24"/>
-        </w:rPr>
-        <w:t xml:space="preserve"> %}</w:t>
-      </w:r>
+        <w:pStyle w:val="Body"/>
+      </w:pPr>
+    </w:p>
+    <w:p>
+      <w:pPr>
+        <w:pStyle w:val="Body"/>
+      </w:pPr>
+      <w:r>
+        <w:t>{{p (include_docx_template("docassemble.AKA2JBranding:</w:t>
+      </w:r>
+      <w:r>
+        <w:t>signing_paragraph</w:t>
+      </w:r>
+      <w:r>
+        <w:t>_content.docx")) }}</w:t>
+      </w:r>
+    </w:p>
+    <w:p>
+      <w:pPr>
+        <w:pStyle w:val="Body"/>
+      </w:pPr>
     </w:p>
     <w:p>
       <w:pPr>
@@ -686,7 +169,6 @@
         <w:ind w:left="540"/>
       </w:pPr>
       <w:r>
-        <w:lastRenderedPageBreak/>
         <w:t xml:space="preserve">Fill out the </w:t>
       </w:r>
       <w:r>
@@ -778,6 +260,99 @@
       <w:r>
         <w:t>[</w:t>
       </w:r>
+      <w:hyperlink r:id="rId5" w:history="1">
+        <w:r>
+          <w:rPr>
+            <w:rStyle w:val="Hyperlink"/>
+            <w:spacing w:val="0"/>
+          </w:rPr>
+          <w:t>Fill-In</w:t>
+        </w:r>
+        <w:r>
+          <w:rPr>
+            <w:rStyle w:val="Hyperlink"/>
+            <w:spacing w:val="0"/>
+          </w:rPr>
+          <w:t xml:space="preserve"> PDF</w:t>
+        </w:r>
+      </w:hyperlink>
+      <w:r>
+        <w:t>]</w:t>
+      </w:r>
+      <w:r>
+        <w:br/>
+      </w:r>
+      <w:hyperlink r:id="rId6" w:history="1">
+        <w:r>
+          <w:rPr>
+            <w:rStyle w:val="Hyperlink"/>
+            <w:spacing w:val="0"/>
+          </w:rPr>
+          <w:t>ak-courts.info/dr450</w:t>
+        </w:r>
+      </w:hyperlink>
+    </w:p>
+    <w:p>
+      <w:pPr>
+        <w:pStyle w:val="Body"/>
+      </w:pPr>
+      <w:r>
+        <w:rPr>
+          <w:color w:val="FF0000"/>
+        </w:rPr>
+        <w:t>{%p endif %}</w:t>
+      </w:r>
+    </w:p>
+    <w:p>
+      <w:pPr>
+        <w:pStyle w:val="Body"/>
+      </w:pPr>
+      <w:r>
+        <w:rPr>
+          <w:color w:val="FF0000"/>
+        </w:rPr>
+        <w:t>{%p if user_need == 'answer divorce' %}</w:t>
+      </w:r>
+    </w:p>
+    <w:p>
+      <w:pPr>
+        <w:pStyle w:val="Body"/>
+      </w:pPr>
+      <w:r>
+        <w:rPr>
+          <w:color w:val="FFC000"/>
+        </w:rPr>
+        <w:t>{%p if minor_children or (not minor_children and wife_is_pregnant in ('husband', 'not husband')) %}</w:t>
+      </w:r>
+    </w:p>
+    <w:p>
+      <w:pPr>
+        <w:pStyle w:val="Body"/>
+      </w:pPr>
+      <w:r>
+        <w:rPr>
+          <w:color w:val="92D050"/>
+        </w:rPr>
+        <w:t>{%p if case_type == 'divorce' %}</w:t>
+      </w:r>
+    </w:p>
+    <w:p>
+      <w:pPr>
+        <w:pStyle w:val="Body"/>
+      </w:pPr>
+      <w:r>
+        <w:rPr>
+          <w:b/>
+        </w:rPr>
+        <w:lastRenderedPageBreak/>
+        <w:t>ANSWER AND COUNTERCLAIM TO COMPLAINT FOR DIVORCE WITH CHILDREN, DR-832</w:t>
+      </w:r>
+      <w:r>
+        <w:t xml:space="preserve"> </w:t>
+      </w:r>
+      <w:r>
+        <w:t>[</w:t>
+      </w:r>
       <w:hyperlink r:id="rId7" w:history="1">
         <w:r>
           <w:rPr>
@@ -806,7 +381,7 @@
             <w:rStyle w:val="Hyperlink"/>
             <w:spacing w:val="0"/>
           </w:rPr>
-          <w:t>ak-courts.info/dr450</w:t>
+          <w:t>ak-courts.info/dr832</w:t>
         </w:r>
       </w:hyperlink>
     </w:p>
@@ -816,7 +391,53 @@
       </w:pPr>
       <w:r>
         <w:rPr>
-          <w:color w:val="FF0000"/>
+          <w:color w:val="92D050"/>
+        </w:rPr>
+        <w:t>{%p elif case_type == 'legal separation' %}</w:t>
+      </w:r>
+    </w:p>
+    <w:p>
+      <w:pPr>
+        <w:pStyle w:val="Body"/>
+      </w:pPr>
+      <w:r>
+        <w:rPr>
+          <w:b/>
+        </w:rPr>
+        <w:t>Answer &amp; Counterclaim to Legal Separation With Children, SHC-094</w:t>
+      </w:r>
+      <w:r>
+        <w:t xml:space="preserve"> </w:t>
+      </w:r>
+      <w:hyperlink r:id="rId9" w:history="1">
+        <w:r>
+          <w:rPr>
+            <w:rStyle w:val="Hyperlink"/>
+            <w:spacing w:val="0"/>
+          </w:rPr>
+          <w:t>Word</w:t>
+        </w:r>
+      </w:hyperlink>
+      <w:r>
+        <w:t xml:space="preserve"> | </w:t>
+      </w:r>
+      <w:hyperlink r:id="rId10" w:history="1">
+        <w:r>
+          <w:rPr>
+            <w:rStyle w:val="Hyperlink"/>
+            <w:spacing w:val="0"/>
+          </w:rPr>
+          <w:t>PDF</w:t>
+        </w:r>
+      </w:hyperlink>
+    </w:p>
+    <w:p>
+      <w:pPr>
+        <w:pStyle w:val="Body"/>
+      </w:pPr>
+      <w:r>
+        <w:rPr>
+          <w:color w:val="92D050"/>
         </w:rPr>
         <w:t>{%p endif %}</w:t>
       </w:r>
@@ -826,10 +447,26 @@
         <w:pStyle w:val="Body"/>
       </w:pPr>
       <w:r>
-        <w:rPr>
-          <w:color w:val="FF0000"/>
-        </w:rPr>
-        <w:t>{%p if user_need == 'answer divorce' %}</w:t>
+        <w:t>{%p if not minor_children and wife_is_pregnant in ('husband', 'not husband') %}</w:t>
+      </w:r>
+    </w:p>
+    <w:p>
+      <w:pPr>
+        <w:pStyle w:val="Body"/>
+      </w:pPr>
+      <w:r>
+        <w:t>You must use this form because wife is pregnant.</w:t>
+      </w:r>
+    </w:p>
+    <w:p>
+      <w:pPr>
+        <w:pStyle w:val="Body"/>
+      </w:pPr>
+      <w:r>
+        <w:rPr>
+          <w:color w:val="92D050"/>
+        </w:rPr>
+        <w:t>{%p endif %}</w:t>
       </w:r>
     </w:p>
     <w:p>
@@ -840,7 +477,7 @@
         <w:rPr>
           <w:color w:val="FFC000"/>
         </w:rPr>
-        <w:t>{%p if minor_children or (not minor_children and wife_is_pregnant in ('husband', 'not husband')) %}</w:t>
+        <w:t>{%p elif not minor_children and wife_is_pregnant == 'not pregnant' %}</w:t>
       </w:r>
     </w:p>
     <w:p>
@@ -862,7 +499,7 @@
         <w:rPr>
           <w:b/>
         </w:rPr>
-        <w:t>ANSWER AND COUNTERCLAIM TO COMPLAINT FOR DIVORCE WITH CHILDREN, DR-832</w:t>
+        <w:t>ANSWER AND COUNTERCLAIM TO COMPLAINT FOR DIVORCE WITHOUT CHILDREN, DR-837</w:t>
       </w:r>
       <w:r>
         <w:t xml:space="preserve"> </w:t>
@@ -870,7 +507,7 @@
       <w:r>
         <w:t>[</w:t>
       </w:r>
-      <w:hyperlink r:id="rId9" w:history="1">
+      <w:hyperlink r:id="rId11" w:history="1">
         <w:r>
           <w:rPr>
             <w:rStyle w:val="Hyperlink"/>
@@ -892,13 +529,13 @@
       <w:r>
         <w:br/>
       </w:r>
-      <w:hyperlink r:id="rId10" w:history="1">
-        <w:r>
-          <w:rPr>
-            <w:rStyle w:val="Hyperlink"/>
-            <w:spacing w:val="0"/>
-          </w:rPr>
-          <w:t>ak-courts.info/dr832</w:t>
+      <w:hyperlink r:id="rId12" w:history="1">
+        <w:r>
+          <w:rPr>
+            <w:rStyle w:val="Hyperlink"/>
+            <w:spacing w:val="0"/>
+          </w:rPr>
+          <w:t>ak-courts.info/dr837</w:t>
         </w:r>
       </w:hyperlink>
     </w:p>
@@ -921,169 +558,15 @@
         <w:rPr>
           <w:b/>
         </w:rPr>
-        <w:t>Answer &amp; Counterclaim to Legal Separation With Children, SHC-094</w:t>
-      </w:r>
-      <w:r>
-        <w:t xml:space="preserve"> </w:t>
-      </w:r>
-      <w:hyperlink r:id="rId11" w:history="1">
-        <w:r>
-          <w:rPr>
-            <w:rStyle w:val="Hyperlink"/>
-            <w:spacing w:val="0"/>
-          </w:rPr>
-          <w:t>Word</w:t>
-        </w:r>
-      </w:hyperlink>
-      <w:r>
-        <w:t xml:space="preserve"> | </w:t>
-      </w:r>
-      <w:hyperlink r:id="rId12" w:history="1">
-        <w:r>
-          <w:rPr>
-            <w:rStyle w:val="Hyperlink"/>
-            <w:spacing w:val="0"/>
-          </w:rPr>
-          <w:t>PDF</w:t>
-        </w:r>
-      </w:hyperlink>
-    </w:p>
-    <w:p>
-      <w:pPr>
-        <w:pStyle w:val="Body"/>
-      </w:pPr>
-      <w:r>
-        <w:rPr>
-          <w:color w:val="92D050"/>
-        </w:rPr>
-        <w:t>{%p endif %}</w:t>
-      </w:r>
-    </w:p>
-    <w:p>
-      <w:pPr>
-        <w:pStyle w:val="Body"/>
-      </w:pPr>
-      <w:r>
-        <w:t>{%p if not minor_children and wife_is_pregnant in ('husband', 'not husband') %}</w:t>
-      </w:r>
-    </w:p>
-    <w:p>
-      <w:pPr>
-        <w:pStyle w:val="Body"/>
-      </w:pPr>
-      <w:r>
-        <w:t>You must use this form because wife is pregnant.</w:t>
-      </w:r>
-    </w:p>
-    <w:p>
-      <w:pPr>
-        <w:pStyle w:val="Body"/>
-      </w:pPr>
-      <w:r>
-        <w:rPr>
-          <w:color w:val="92D050"/>
-        </w:rPr>
-        <w:t>{%p endif %}</w:t>
-      </w:r>
-    </w:p>
-    <w:p>
-      <w:pPr>
-        <w:pStyle w:val="Body"/>
-      </w:pPr>
-      <w:r>
-        <w:rPr>
-          <w:color w:val="FFC000"/>
-        </w:rPr>
-        <w:t>{%p elif not minor_children and wife_is_pregnant == 'not pregnant' %}</w:t>
-      </w:r>
-    </w:p>
-    <w:p>
-      <w:pPr>
-        <w:pStyle w:val="Body"/>
-      </w:pPr>
-      <w:r>
-        <w:rPr>
-          <w:color w:val="92D050"/>
-        </w:rPr>
-        <w:t>{%p if case_type == 'divorce' %}</w:t>
-      </w:r>
-    </w:p>
-    <w:p>
-      <w:pPr>
-        <w:pStyle w:val="Body"/>
-      </w:pPr>
+        <w:t>Answer &amp; Counterclaim to Legal Separation Without Children, SHC-095</w:t>
+      </w:r>
       <w:r>
         <w:rPr>
           <w:b/>
         </w:rPr>
-        <w:t>ANSWER AND COUNTERCLAIM TO COMPLAINT FOR DIVORCE WITHOUT CHILDREN, DR-837</w:t>
-      </w:r>
-      <w:r>
-        <w:t xml:space="preserve"> </w:t>
-      </w:r>
-      <w:r>
-        <w:t>[</w:t>
+        <w:br/>
       </w:r>
       <w:hyperlink r:id="rId13" w:history="1">
-        <w:r>
-          <w:rPr>
-            <w:rStyle w:val="Hyperlink"/>
-            <w:spacing w:val="0"/>
-          </w:rPr>
-          <w:t>Fill-In</w:t>
-        </w:r>
-        <w:r>
-          <w:rPr>
-            <w:rStyle w:val="Hyperlink"/>
-            <w:spacing w:val="0"/>
-          </w:rPr>
-          <w:t xml:space="preserve"> PDF</w:t>
-        </w:r>
-      </w:hyperlink>
-      <w:r>
-        <w:t>]</w:t>
-      </w:r>
-      <w:r>
-        <w:br/>
-      </w:r>
-      <w:hyperlink r:id="rId14" w:history="1">
-        <w:r>
-          <w:rPr>
-            <w:rStyle w:val="Hyperlink"/>
-            <w:spacing w:val="0"/>
-          </w:rPr>
-          <w:t>ak-courts.info/dr837</w:t>
-        </w:r>
-      </w:hyperlink>
-    </w:p>
-    <w:p>
-      <w:pPr>
-        <w:pStyle w:val="Body"/>
-      </w:pPr>
-      <w:r>
-        <w:rPr>
-          <w:color w:val="92D050"/>
-        </w:rPr>
-        <w:t>{%p elif case_type == 'legal separation' %}</w:t>
-      </w:r>
-    </w:p>
-    <w:p>
-      <w:pPr>
-        <w:pStyle w:val="Body"/>
-      </w:pPr>
-      <w:r>
-        <w:rPr>
-          <w:b/>
-        </w:rPr>
-        <w:t>Answer &amp; Counterclaim to Legal Separation Without Children, SHC-095</w:t>
-      </w:r>
-      <w:r>
-        <w:rPr>
-          <w:b/>
-        </w:rPr>
-        <w:br/>
-      </w:r>
-      <w:hyperlink r:id="rId15" w:history="1">
         <w:r>
           <w:rPr>
             <w:rStyle w:val="Hyperlink"/>
@@ -1099,7 +582,7 @@
         </w:rPr>
         <w:br/>
       </w:r>
-      <w:hyperlink r:id="rId16" w:history="1">
+      <w:hyperlink r:id="rId14" w:history="1">
         <w:r>
           <w:rPr>
             <w:rStyle w:val="Hyperlink"/>
@@ -1127,7 +610,7 @@
       <w:r>
         <w:br/>
       </w:r>
-      <w:hyperlink r:id="rId17" w:history="1">
+      <w:hyperlink r:id="rId15" w:history="1">
         <w:r>
           <w:rPr>
             <w:rStyle w:val="Hyperlink"/>
@@ -1143,7 +626,7 @@
         </w:rPr>
         <w:br/>
       </w:r>
-      <w:hyperlink r:id="rId18" w:history="1">
+      <w:hyperlink r:id="rId16" w:history="1">
         <w:r>
           <w:rPr>
             <w:rStyle w:val="Hyperlink"/>
@@ -1310,6 +793,7 @@
         <w:rPr>
           <w:b/>
         </w:rPr>
+        <w:lastRenderedPageBreak/>
         <w:t>A. Answer section</w:t>
       </w:r>
     </w:p>
@@ -1391,7 +875,6 @@
         <w:rPr>
           <w:color w:val="FFC000"/>
         </w:rPr>
-        <w:lastRenderedPageBreak/>
         <w:t>{%p else %}</w:t>
       </w:r>
     </w:p>
@@ -1485,7 +968,7 @@
       <w:r>
         <w:t xml:space="preserve">ive defense applies to you, </w:t>
       </w:r>
-      <w:hyperlink r:id="rId19" w:history="1">
+      <w:hyperlink r:id="rId17" w:history="1">
         <w:r>
           <w:rPr>
             <w:rStyle w:val="Hyperlink"/>
@@ -1523,6 +1006,7 @@
         <w:rPr>
           <w:color w:val="FFC000"/>
         </w:rPr>
+        <w:lastRenderedPageBreak/>
         <w:t>{%p if user_need == 'answer custody' or (user_need == 'answer divorce' and minor_children) or (user_need == 'answer divorce' and not minor_children and wife_is_pregnant in ('husband', 'not husband')) %}</w:t>
       </w:r>
     </w:p>
@@ -1627,11 +1111,7 @@
         <w:ind w:left="540"/>
       </w:pPr>
       <w:r>
-        <w:t xml:space="preserve">Check the {{ 'boxes that say' if minor_children else '' }}{{ 'boxes that say' if not minor_children and wife_is_pregnant in ('husband', 'not husband') else '' }}{{ 'box </w:t>
-      </w:r>
-      <w:r>
-        <w:lastRenderedPageBreak/>
-        <w:t>that says' if not minor_children and wife_is_pregnant == 'not pregnant' else '' }} you attached a Motion to Dismiss.</w:t>
+        <w:t>Check the {{ 'boxes that say' if minor_children else '' }}{{ 'boxes that say' if not minor_children and wife_is_pregnant in ('husband', 'not husband') else '' }}{{ 'box that says' if not minor_children and wife_is_pregnant == 'not pregnant' else '' }} you attached a Motion to Dismiss.</w:t>
       </w:r>
     </w:p>
     <w:p>
@@ -1795,6 +1275,7 @@
         <w:rPr>
           <w:color w:val="FF0000"/>
         </w:rPr>
+        <w:lastRenderedPageBreak/>
         <w:t>{%p endif %}</w:t>
       </w:r>
     </w:p>
@@ -1950,7 +1431,6 @@
         <w:rPr>
           <w:color w:val="FFC000"/>
         </w:rPr>
-        <w:lastRenderedPageBreak/>
         <w:t>{%p if user_need == 'answer custody' and not jurisdiction %}</w:t>
       </w:r>
     </w:p>
@@ -2059,6 +1539,7 @@
         <w:rPr>
           <w:color w:val="92D050"/>
         </w:rPr>
+        <w:lastRenderedPageBreak/>
         <w:t>{%p endif %}</w:t>
       </w:r>
     </w:p>
@@ -2177,7 +1658,6 @@
         <w:rPr>
           <w:color w:val="FFC000"/>
         </w:rPr>
-        <w:lastRenderedPageBreak/>
         <w:t>{%p endif %}</w:t>
       </w:r>
     </w:p>
@@ -2295,6 +1775,7 @@
         <w:ind w:left="360"/>
       </w:pPr>
       <w:r>
+        <w:lastRenderedPageBreak/>
         <w:t>You can add here that you want the court to dismiss your case.</w:t>
       </w:r>
     </w:p>
@@ -2408,7 +1889,7 @@
       <w:r>
         <w:t xml:space="preserve"> [</w:t>
       </w:r>
-      <w:hyperlink r:id="rId20" w:history="1">
+      <w:hyperlink r:id="rId18" w:history="1">
         <w:r>
           <w:rPr>
             <w:rStyle w:val="Hyperlink"/>
@@ -2430,7 +1911,7 @@
       <w:r>
         <w:br/>
       </w:r>
-      <w:hyperlink r:id="rId21" w:history="1">
+      <w:hyperlink r:id="rId19" w:history="1">
         <w:r>
           <w:rPr>
             <w:rStyle w:val="Hyperlink"/>
@@ -2491,7 +1972,6 @@
         <w:rPr>
           <w:color w:val="FFC000"/>
         </w:rPr>
-        <w:lastRenderedPageBreak/>
         <w:t>{%p if stage_of_default == 'hearing scheduled' %}</w:t>
       </w:r>
     </w:p>
@@ -2511,7 +1991,7 @@
       <w:r>
         <w:t xml:space="preserve"> [</w:t>
       </w:r>
-      <w:hyperlink r:id="rId22" w:history="1">
+      <w:hyperlink r:id="rId20" w:history="1">
         <w:r>
           <w:rPr>
             <w:rStyle w:val="Hyperlink"/>
@@ -2533,7 +2013,7 @@
       <w:r>
         <w:br/>
       </w:r>
-      <w:hyperlink r:id="rId23" w:history="1">
+      <w:hyperlink r:id="rId21" w:history="1">
         <w:r>
           <w:rPr>
             <w:rStyle w:val="Hyperlink"/>
@@ -2620,7 +2100,7 @@
       <w:r>
         <w:t xml:space="preserve">If you have any questions about whether Alaska is the correct place for your case or you want to ask the court to dismiss your case, you may want to </w:t>
       </w:r>
-      <w:hyperlink r:id="rId24" w:history="1">
+      <w:hyperlink r:id="rId22" w:history="1">
         <w:r>
           <w:rPr>
             <w:rStyle w:val="Hyperlink"/>
@@ -2636,7 +2116,7 @@
         </w:rPr>
         <w:br/>
       </w:r>
-      <w:hyperlink r:id="rId25" w:history="1">
+      <w:hyperlink r:id="rId23" w:history="1">
         <w:r>
           <w:rPr>
             <w:rStyle w:val="Hyperlink"/>
@@ -2677,12 +2157,13 @@
         <w:rPr>
           <w:b/>
         </w:rPr>
+        <w:lastRenderedPageBreak/>
         <w:t>Information Sheet, DR-314</w:t>
       </w:r>
       <w:r>
         <w:t xml:space="preserve"> [</w:t>
       </w:r>
-      <w:hyperlink r:id="rId26" w:history="1">
+      <w:hyperlink r:id="rId24" w:history="1">
         <w:r>
           <w:rPr>
             <w:rStyle w:val="Hyperlink"/>
@@ -2704,7 +2185,7 @@
       <w:r>
         <w:br/>
       </w:r>
-      <w:hyperlink r:id="rId27" w:history="1">
+      <w:hyperlink r:id="rId25" w:history="1">
         <w:r>
           <w:rPr>
             <w:rStyle w:val="Hyperlink"/>
@@ -2786,6 +2267,81 @@
       <w:r>
         <w:t xml:space="preserve"> [</w:t>
       </w:r>
+      <w:hyperlink r:id="rId26" w:history="1">
+        <w:r>
+          <w:rPr>
+            <w:rStyle w:val="Hyperlink"/>
+            <w:spacing w:val="0"/>
+          </w:rPr>
+          <w:t>Fill-In</w:t>
+        </w:r>
+        <w:r>
+          <w:rPr>
+            <w:rStyle w:val="Hyperlink"/>
+            <w:spacing w:val="0"/>
+          </w:rPr>
+          <w:t xml:space="preserve"> PDF</w:t>
+        </w:r>
+      </w:hyperlink>
+      <w:r>
+        <w:t>]</w:t>
+      </w:r>
+      <w:r>
+        <w:br/>
+      </w:r>
+      <w:hyperlink r:id="rId27" w:history="1">
+        <w:r>
+          <w:rPr>
+            <w:rStyle w:val="Hyperlink"/>
+            <w:spacing w:val="0"/>
+          </w:rPr>
+          <w:t>ak-courts.info/dr150</w:t>
+        </w:r>
+      </w:hyperlink>
+    </w:p>
+    <w:p>
+      <w:pPr>
+        <w:pStyle w:val="Body"/>
+      </w:pPr>
+      <w:r>
+        <w:rPr>
+          <w:color w:val="FFC000"/>
+        </w:rPr>
+        <w:t>{%p if type_of_response['case in 2 states'] and stage_of_other_case == 'still going' %}</w:t>
+      </w:r>
+    </w:p>
+    <w:p>
+      <w:pPr>
+        <w:pStyle w:val="Body"/>
+      </w:pPr>
+      <w:r>
+        <w:t>In paragraph 3 on page 3, tell the judge about the other case.</w:t>
+      </w:r>
+    </w:p>
+    <w:p>
+      <w:pPr>
+        <w:pStyle w:val="Body"/>
+      </w:pPr>
+      <w:r>
+        <w:rPr>
+          <w:color w:val="FFC000"/>
+        </w:rPr>
+        <w:t>{%p endif %}</w:t>
+      </w:r>
+    </w:p>
+    <w:p>
+      <w:pPr>
+        <w:pStyle w:val="Body"/>
+      </w:pPr>
+      <w:r>
+        <w:rPr>
+          <w:b/>
+        </w:rPr>
+        <w:t>Child Support Guidelines Affidavit, DR-305</w:t>
+      </w:r>
+      <w:r>
+        <w:t xml:space="preserve"> [</w:t>
+      </w:r>
       <w:hyperlink r:id="rId28" w:history="1">
         <w:r>
           <w:rPr>
@@ -2814,7 +2370,7 @@
             <w:rStyle w:val="Hyperlink"/>
             <w:spacing w:val="0"/>
           </w:rPr>
-          <w:t>ak-courts.info/dr150</w:t>
+          <w:t>ak-courts.info/dr305</w:t>
         </w:r>
       </w:hyperlink>
     </w:p>
@@ -2823,43 +2379,7 @@
         <w:pStyle w:val="Body"/>
       </w:pPr>
       <w:r>
-        <w:rPr>
-          <w:color w:val="FFC000"/>
-        </w:rPr>
-        <w:t>{%p if type_of_response['case in 2 states'] and stage_of_other_case == 'still going' %}</w:t>
-      </w:r>
-    </w:p>
-    <w:p>
-      <w:pPr>
-        <w:pStyle w:val="Body"/>
-      </w:pPr>
-      <w:r>
-        <w:t>In paragraph 3 on page 3, tell the judge about the other case.</w:t>
-      </w:r>
-    </w:p>
-    <w:p>
-      <w:pPr>
-        <w:pStyle w:val="Body"/>
-      </w:pPr>
-      <w:r>
-        <w:rPr>
-          <w:color w:val="FFC000"/>
-        </w:rPr>
-        <w:t>{%p endif %}</w:t>
-      </w:r>
-    </w:p>
-    <w:p>
-      <w:pPr>
-        <w:pStyle w:val="Body"/>
-      </w:pPr>
-      <w:r>
-        <w:rPr>
-          <w:b/>
-        </w:rPr>
-        <w:t>Child Support Guidelines Affidavit, DR-305</w:t>
-      </w:r>
-      <w:r>
-        <w:t xml:space="preserve"> [</w:t>
+        <w:t xml:space="preserve">See </w:t>
       </w:r>
       <w:hyperlink r:id="rId30" w:history="1">
         <w:r>
@@ -2867,58 +2387,19 @@
             <w:rStyle w:val="Hyperlink"/>
             <w:spacing w:val="0"/>
           </w:rPr>
-          <w:t>Fill-In</w:t>
-        </w:r>
-        <w:r>
-          <w:rPr>
-            <w:rStyle w:val="Hyperlink"/>
-            <w:spacing w:val="0"/>
-          </w:rPr>
-          <w:t xml:space="preserve"> PDF</w:t>
+          <w:t>How to Fill out the Child Support Guidelines Affidavit</w:t>
         </w:r>
       </w:hyperlink>
       <w:r>
-        <w:t>]</w:t>
+        <w:t xml:space="preserve"> </w:t>
+      </w:r>
+      <w:r>
+        <w:t>to help you fill in this form</w:t>
       </w:r>
       <w:r>
         <w:br/>
       </w:r>
       <w:hyperlink r:id="rId31" w:history="1">
-        <w:r>
-          <w:rPr>
-            <w:rStyle w:val="Hyperlink"/>
-            <w:spacing w:val="0"/>
-          </w:rPr>
-          <w:t>ak-courts.info/dr305</w:t>
-        </w:r>
-      </w:hyperlink>
-    </w:p>
-    <w:p>
-      <w:pPr>
-        <w:pStyle w:val="Body"/>
-      </w:pPr>
-      <w:r>
-        <w:t xml:space="preserve">See </w:t>
-      </w:r>
-      <w:hyperlink r:id="rId32" w:history="1">
-        <w:r>
-          <w:rPr>
-            <w:rStyle w:val="Hyperlink"/>
-            <w:spacing w:val="0"/>
-          </w:rPr>
-          <w:t>How to Fill out the Child Support Guidelines Affidavit</w:t>
-        </w:r>
-      </w:hyperlink>
-      <w:r>
-        <w:t xml:space="preserve"> </w:t>
-      </w:r>
-      <w:r>
-        <w:t>to help you fill in this form</w:t>
-      </w:r>
-      <w:r>
-        <w:br/>
-      </w:r>
-      <w:hyperlink r:id="rId33" w:history="1">
         <w:r>
           <w:rPr>
             <w:rStyle w:val="Hyperlink"/>
@@ -2941,148 +2422,148 @@
         <w:ind w:left="540"/>
       </w:pPr>
       <w:r>
+        <w:t xml:space="preserve">Attach your most recent tax return and pay stubs to the </w:t>
+      </w:r>
+      <w:r>
+        <w:rPr>
+          <w:b/>
+        </w:rPr>
+        <w:t>Child Support Guidelines Affidavit</w:t>
+      </w:r>
+      <w:r>
+        <w:t>.</w:t>
+      </w:r>
+    </w:p>
+    <w:p>
+      <w:pPr>
+        <w:pStyle w:val="Body"/>
+      </w:pPr>
+      <w:r>
+        <w:rPr>
+          <w:color w:val="FF0000"/>
+        </w:rPr>
+        <w:t>{%p endif %}</w:t>
+      </w:r>
+    </w:p>
+    <w:p>
+      <w:pPr>
+        <w:pStyle w:val="Body"/>
+      </w:pPr>
+      <w:r>
+        <w:rPr>
+          <w:color w:val="FF0000"/>
+        </w:rPr>
+        <w:t>{%p if (user_need == 'answer custody' and (type_of_response.all_true('ak custody case', exclusive=True) or type_of_response.all_true('ak custody case', 'improper service', exclusive=True))) or (user_need == 'answer divorce' and (type_of_response.all_true('ak divorce case', exclusive=True) or type_of_response.all_true('ak divorce case', 'improper service', exclusive=True))) %}</w:t>
+      </w:r>
+    </w:p>
+    <w:p>
+      <w:pPr>
+        <w:pStyle w:val="Body"/>
+      </w:pPr>
+      <w:r>
+        <w:rPr>
+          <w:color w:val="FFC000"/>
+        </w:rPr>
+        <w:t>{%p if (case_type in ('custody', 'divorce') or (case_type == 'legal separation' and want_legal_separation == 'yes')) %}</w:t>
+      </w:r>
+    </w:p>
+    <w:p>
+      <w:pPr>
+        <w:pStyle w:val="Body"/>
+      </w:pPr>
+      <w:r>
+        <w:rPr>
+          <w:color w:val="92D050"/>
+        </w:rPr>
+        <w:t>{%p if response_to_complaint in ('agree', 'some') %}</w:t>
+      </w:r>
+    </w:p>
+    <w:p>
+      <w:pPr>
+        <w:pStyle w:val="Heading3"/>
+      </w:pPr>
+      <w:r>
+        <w:t>Forms to use if you and {{ other_party_in_case }} write out your agreement</w:t>
+      </w:r>
+    </w:p>
+    <w:p>
+      <w:pPr>
+        <w:pStyle w:val="Body"/>
+      </w:pPr>
+      <w:r>
+        <w:t>If you want to work with {{ other_party_in_case }} to write out the agreement and both sign it, use:</w:t>
+      </w:r>
+    </w:p>
+    <w:p>
+      <w:pPr>
+        <w:pStyle w:val="Body"/>
+      </w:pPr>
+      <w:r>
+        <w:rPr>
+          <w:color w:val="92D050"/>
+        </w:rPr>
+        <w:t xml:space="preserve">{%p elif response_to_complaint == 'none' and </w:t>
+      </w:r>
+      <w:proofErr w:type="spellStart"/>
+      <w:r>
+        <w:rPr>
+          <w:color w:val="92D050"/>
+        </w:rPr>
+        <w:t>want_help_to_agree</w:t>
+      </w:r>
+      <w:proofErr w:type="spellEnd"/>
+      <w:r>
+        <w:rPr>
+          <w:color w:val="92D050"/>
+        </w:rPr>
+        <w:t xml:space="preserve"> %}</w:t>
+      </w:r>
+    </w:p>
+    <w:p>
+      <w:pPr>
+        <w:pStyle w:val="Heading3"/>
+      </w:pPr>
+      <w:r>
         <w:lastRenderedPageBreak/>
-        <w:t xml:space="preserve">Attach your most recent tax return and pay stubs to the </w:t>
-      </w:r>
+        <w:t>Forms to use if you reach an agreement</w:t>
+      </w:r>
+    </w:p>
+    <w:p>
+      <w:pPr>
+        <w:pStyle w:val="Body"/>
+      </w:pPr>
+      <w:r>
+        <w:rPr>
+          <w:color w:val="92D050"/>
+        </w:rPr>
+        <w:t>{%p endif %}</w:t>
+      </w:r>
+    </w:p>
+    <w:p>
+      <w:pPr>
+        <w:pStyle w:val="Body"/>
+      </w:pPr>
+      <w:r>
+        <w:rPr>
+          <w:color w:val="92D050"/>
+        </w:rPr>
+        <w:t>{%p if user_need == 'answer custody' or (user_need == 'answer divorce' and (minor_children or (not minor_children and wife_is_pregnant in (</w:t>
+      </w:r>
+      <w:r>
+        <w:rPr>
+          <w:color w:val="92D050"/>
+        </w:rPr>
+        <w:t>'husband', 'not husband')))) %}</w:t>
+      </w:r>
+    </w:p>
+    <w:p>
+      <w:pPr>
+        <w:pStyle w:val="Body"/>
+      </w:pPr>
       <w:r>
         <w:rPr>
           <w:b/>
         </w:rPr>
-        <w:t>Child Support Guidelines Affidavit</w:t>
-      </w:r>
-      <w:r>
-        <w:t>.</w:t>
-      </w:r>
-    </w:p>
-    <w:p>
-      <w:pPr>
-        <w:pStyle w:val="Body"/>
-      </w:pPr>
-      <w:r>
-        <w:rPr>
-          <w:color w:val="FF0000"/>
-        </w:rPr>
-        <w:t>{%p endif %}</w:t>
-      </w:r>
-    </w:p>
-    <w:p>
-      <w:pPr>
-        <w:pStyle w:val="Body"/>
-      </w:pPr>
-      <w:r>
-        <w:rPr>
-          <w:color w:val="FF0000"/>
-        </w:rPr>
-        <w:t>{%p if (user_need == 'answer custody' and (type_of_response.all_true('ak custody case', exclusive=True) or type_of_response.all_true('ak custody case', 'improper service', exclusive=True))) or (user_need == 'answer divorce' and (type_of_response.all_true('ak divorce case', exclusive=True) or type_of_response.all_true('ak divorce case', 'improper service', exclusive=True))) %}</w:t>
-      </w:r>
-    </w:p>
-    <w:p>
-      <w:pPr>
-        <w:pStyle w:val="Body"/>
-      </w:pPr>
-      <w:r>
-        <w:rPr>
-          <w:color w:val="FFC000"/>
-        </w:rPr>
-        <w:t>{%p if (case_type in ('custody', 'divorce') or (case_type == 'legal separation' and want_legal_separation == 'yes')) %}</w:t>
-      </w:r>
-    </w:p>
-    <w:p>
-      <w:pPr>
-        <w:pStyle w:val="Body"/>
-      </w:pPr>
-      <w:r>
-        <w:rPr>
-          <w:color w:val="92D050"/>
-        </w:rPr>
-        <w:t>{%p if response_to_complaint in ('agree', 'some') %}</w:t>
-      </w:r>
-    </w:p>
-    <w:p>
-      <w:pPr>
-        <w:pStyle w:val="Heading3"/>
-      </w:pPr>
-      <w:r>
-        <w:t>Forms to use if you and {{ other_party_in_case }} write out your agreement</w:t>
-      </w:r>
-    </w:p>
-    <w:p>
-      <w:pPr>
-        <w:pStyle w:val="Body"/>
-      </w:pPr>
-      <w:r>
-        <w:t>If you want to work with {{ other_party_in_case }} to write out the agreement and both sign it, use:</w:t>
-      </w:r>
-    </w:p>
-    <w:p>
-      <w:pPr>
-        <w:pStyle w:val="Body"/>
-      </w:pPr>
-      <w:r>
-        <w:rPr>
-          <w:color w:val="92D050"/>
-        </w:rPr>
-        <w:t xml:space="preserve">{%p elif response_to_complaint == 'none' and </w:t>
-      </w:r>
-      <w:proofErr w:type="spellStart"/>
-      <w:r>
-        <w:rPr>
-          <w:color w:val="92D050"/>
-        </w:rPr>
-        <w:t>want_help_to_agree</w:t>
-      </w:r>
-      <w:proofErr w:type="spellEnd"/>
-      <w:r>
-        <w:rPr>
-          <w:color w:val="92D050"/>
-        </w:rPr>
-        <w:t xml:space="preserve"> %}</w:t>
-      </w:r>
-    </w:p>
-    <w:p>
-      <w:pPr>
-        <w:pStyle w:val="Heading3"/>
-      </w:pPr>
-      <w:r>
-        <w:t>Forms to use if you reach an agreement</w:t>
-      </w:r>
-    </w:p>
-    <w:p>
-      <w:pPr>
-        <w:pStyle w:val="Body"/>
-      </w:pPr>
-      <w:r>
-        <w:rPr>
-          <w:color w:val="92D050"/>
-        </w:rPr>
-        <w:t>{%p endif %}</w:t>
-      </w:r>
-    </w:p>
-    <w:p>
-      <w:pPr>
-        <w:pStyle w:val="Body"/>
-      </w:pPr>
-      <w:r>
-        <w:rPr>
-          <w:color w:val="92D050"/>
-        </w:rPr>
-        <w:t>{%p if user_need == 'answer custody' or (user_need == 'answer divorce' and (minor_children or (not minor_children and wife_is_pregnant in (</w:t>
-      </w:r>
-      <w:r>
-        <w:rPr>
-          <w:color w:val="92D050"/>
-        </w:rPr>
-        <w:t>'husband', 'not husband')))) %}</w:t>
-      </w:r>
-    </w:p>
-    <w:p>
-      <w:pPr>
-        <w:pStyle w:val="Body"/>
-      </w:pPr>
-      <w:r>
-        <w:rPr>
-          <w:b/>
-        </w:rPr>
         <w:t>Parenting Plan Agreement &amp; Order, SHC-1128</w:t>
       </w:r>
       <w:r>
@@ -3091,50 +2572,50 @@
       <w:r>
         <w:br/>
       </w:r>
+      <w:hyperlink r:id="rId32" w:history="1">
+        <w:r>
+          <w:rPr>
+            <w:rStyle w:val="Hyperlink"/>
+            <w:spacing w:val="0"/>
+          </w:rPr>
+          <w:t>Word</w:t>
+        </w:r>
+      </w:hyperlink>
+      <w:r>
+        <w:t xml:space="preserve"> </w:t>
+      </w:r>
+      <w:r>
+        <w:br/>
+      </w:r>
+      <w:hyperlink r:id="rId33" w:history="1">
+        <w:r>
+          <w:rPr>
+            <w:rStyle w:val="Hyperlink"/>
+            <w:spacing w:val="0"/>
+          </w:rPr>
+          <w:t>courts.alaska.gov/</w:t>
+        </w:r>
+        <w:proofErr w:type="spellStart"/>
+        <w:r>
+          <w:rPr>
+            <w:rStyle w:val="Hyperlink"/>
+            <w:spacing w:val="0"/>
+          </w:rPr>
+          <w:t>shc</w:t>
+        </w:r>
+        <w:proofErr w:type="spellEnd"/>
+        <w:r>
+          <w:rPr>
+            <w:rStyle w:val="Hyperlink"/>
+            <w:spacing w:val="0"/>
+          </w:rPr>
+          <w:t>/family/docs/shc-1128.doc</w:t>
+        </w:r>
+      </w:hyperlink>
+      <w:r>
+        <w:br/>
+      </w:r>
       <w:hyperlink r:id="rId34" w:history="1">
-        <w:r>
-          <w:rPr>
-            <w:rStyle w:val="Hyperlink"/>
-            <w:spacing w:val="0"/>
-          </w:rPr>
-          <w:t>Word</w:t>
-        </w:r>
-      </w:hyperlink>
-      <w:r>
-        <w:t xml:space="preserve"> </w:t>
-      </w:r>
-      <w:r>
-        <w:br/>
-      </w:r>
-      <w:hyperlink r:id="rId35" w:history="1">
-        <w:r>
-          <w:rPr>
-            <w:rStyle w:val="Hyperlink"/>
-            <w:spacing w:val="0"/>
-          </w:rPr>
-          <w:t>courts.alaska.gov/</w:t>
-        </w:r>
-        <w:proofErr w:type="spellStart"/>
-        <w:r>
-          <w:rPr>
-            <w:rStyle w:val="Hyperlink"/>
-            <w:spacing w:val="0"/>
-          </w:rPr>
-          <w:t>shc</w:t>
-        </w:r>
-        <w:proofErr w:type="spellEnd"/>
-        <w:r>
-          <w:rPr>
-            <w:rStyle w:val="Hyperlink"/>
-            <w:spacing w:val="0"/>
-          </w:rPr>
-          <w:t>/family/docs/shc-1128.doc</w:t>
-        </w:r>
-      </w:hyperlink>
-      <w:r>
-        <w:br/>
-      </w:r>
-      <w:hyperlink r:id="rId36" w:history="1">
         <w:r>
           <w:rPr>
             <w:rStyle w:val="Hyperlink"/>
@@ -3150,29 +2631,105 @@
         </w:rPr>
         <w:br/>
       </w:r>
+      <w:hyperlink r:id="rId35" w:history="1">
+        <w:r>
+          <w:rPr>
+            <w:rStyle w:val="Hyperlink"/>
+            <w:spacing w:val="0"/>
+          </w:rPr>
+          <w:t>courts.alaska.gov/</w:t>
+        </w:r>
+        <w:proofErr w:type="spellStart"/>
+        <w:r>
+          <w:rPr>
+            <w:rStyle w:val="Hyperlink"/>
+            <w:spacing w:val="0"/>
+          </w:rPr>
+          <w:t>shc</w:t>
+        </w:r>
+        <w:proofErr w:type="spellEnd"/>
+        <w:r>
+          <w:rPr>
+            <w:rStyle w:val="Hyperlink"/>
+            <w:spacing w:val="0"/>
+          </w:rPr>
+          <w:t>/family/docs/shc-1128n.pdf</w:t>
+        </w:r>
+      </w:hyperlink>
+    </w:p>
+    <w:p>
+      <w:pPr>
+        <w:pStyle w:val="Body"/>
+      </w:pPr>
+      <w:r>
+        <w:t xml:space="preserve">Do </w:t>
+      </w:r>
+      <w:r>
+        <w:rPr>
+          <w:b/>
+        </w:rPr>
+        <w:t>not</w:t>
+      </w:r>
+      <w:r>
+        <w:t xml:space="preserve"> sign the Order section.</w:t>
+      </w:r>
+    </w:p>
+    <w:p>
+      <w:pPr>
+        <w:pStyle w:val="Body"/>
+      </w:pPr>
+      <w:r>
+        <w:rPr>
+          <w:color w:val="92D050"/>
+        </w:rPr>
+        <w:t>{%p endif %}</w:t>
+      </w:r>
+    </w:p>
+    <w:p>
+      <w:pPr>
+        <w:pStyle w:val="Body"/>
+      </w:pPr>
+      <w:r>
+        <w:rPr>
+          <w:b/>
+        </w:rPr>
+        <w:t>Request to Put Agreement on the Record, DR-264</w:t>
+      </w:r>
+      <w:r>
+        <w:rPr>
+          <w:bCs/>
+        </w:rPr>
+        <w:t xml:space="preserve"> [</w:t>
+      </w:r>
+      <w:hyperlink r:id="rId36" w:history="1">
+        <w:r>
+          <w:rPr>
+            <w:rStyle w:val="Hyperlink"/>
+            <w:bCs/>
+            <w:spacing w:val="0"/>
+          </w:rPr>
+          <w:t>Fill-In PDF</w:t>
+        </w:r>
+      </w:hyperlink>
+      <w:r>
+        <w:rPr>
+          <w:bCs/>
+        </w:rPr>
+        <w:t>]</w:t>
+      </w:r>
+      <w:r>
+        <w:t xml:space="preserve"> </w:t>
+      </w:r>
+      <w:r>
+        <w:br/>
+      </w:r>
       <w:hyperlink r:id="rId37" w:history="1">
         <w:r>
           <w:rPr>
             <w:rStyle w:val="Hyperlink"/>
             <w:spacing w:val="0"/>
           </w:rPr>
-          <w:t>courts.alaska.gov/</w:t>
-        </w:r>
-        <w:proofErr w:type="spellStart"/>
-        <w:r>
-          <w:rPr>
-            <w:rStyle w:val="Hyperlink"/>
-            <w:spacing w:val="0"/>
-          </w:rPr>
-          <w:t>shc</w:t>
-        </w:r>
-        <w:proofErr w:type="spellEnd"/>
-        <w:r>
-          <w:rPr>
-            <w:rStyle w:val="Hyperlink"/>
-            <w:spacing w:val="0"/>
-          </w:rPr>
-          <w:t>/family/docs/shc-1128n.pdf</w:t>
+          <w:t>ak-courts.info/dr264</w:t>
         </w:r>
       </w:hyperlink>
     </w:p>
@@ -3181,27 +2738,162 @@
         <w:pStyle w:val="Body"/>
       </w:pPr>
       <w:r>
-        <w:t xml:space="preserve">Do </w:t>
-      </w:r>
+        <w:rPr>
+          <w:color w:val="FFC000"/>
+        </w:rPr>
+        <w:t>{%p endif %}</w:t>
+      </w:r>
+    </w:p>
+    <w:p>
+      <w:pPr>
+        <w:pStyle w:val="Body"/>
+      </w:pPr>
+      <w:r>
+        <w:rPr>
+          <w:color w:val="FF0000"/>
+        </w:rPr>
+        <w:t>{%p endif %}</w:t>
+      </w:r>
+    </w:p>
+    <w:p>
+      <w:pPr>
+        <w:pStyle w:val="Heading3"/>
+      </w:pPr>
+      <w:r>
+        <w:t>Links in this step</w:t>
+      </w:r>
+    </w:p>
+    <w:p>
+      <w:pPr>
+        <w:pStyle w:val="Body"/>
+        <w:rPr>
+          <w:color w:val="FF0000"/>
+        </w:rPr>
+      </w:pPr>
+      <w:r>
+        <w:rPr>
+          <w:color w:val="FF0000"/>
+        </w:rPr>
+        <w:t>{%p if user_need == 'answer custody' %}</w:t>
+      </w:r>
+    </w:p>
+    <w:p>
+      <w:pPr>
+        <w:pStyle w:val="Body"/>
+      </w:pPr>
       <w:r>
         <w:rPr>
           <w:b/>
         </w:rPr>
-        <w:t>not</w:t>
-      </w:r>
-      <w:r>
-        <w:t xml:space="preserve"> sign the Order section.</w:t>
-      </w:r>
-    </w:p>
-    <w:p>
-      <w:pPr>
-        <w:pStyle w:val="Body"/>
-      </w:pPr>
-      <w:r>
+        <w:t>ANSWER AND COUNTERCLAIM TO COMPLAINT FOR CUSTODY OF MINOR CHILDREN, DR-450</w:t>
+      </w:r>
+      <w:r>
+        <w:t xml:space="preserve"> [</w:t>
+      </w:r>
+      <w:hyperlink r:id="rId38" w:history="1">
+        <w:r>
+          <w:rPr>
+            <w:rStyle w:val="Hyperlink"/>
+            <w:spacing w:val="0"/>
+          </w:rPr>
+          <w:t>Fill-In</w:t>
+        </w:r>
+        <w:r>
+          <w:rPr>
+            <w:rStyle w:val="Hyperlink"/>
+            <w:spacing w:val="0"/>
+          </w:rPr>
+          <w:t xml:space="preserve"> PDF</w:t>
+        </w:r>
+      </w:hyperlink>
+      <w:r>
+        <w:t>]</w:t>
+      </w:r>
+      <w:r>
+        <w:br/>
+      </w:r>
+      <w:hyperlink r:id="rId39" w:history="1">
+        <w:r>
+          <w:rPr>
+            <w:rStyle w:val="Hyperlink"/>
+            <w:spacing w:val="0"/>
+          </w:rPr>
+          <w:t>ak-courts.info/dr450</w:t>
+        </w:r>
+      </w:hyperlink>
+    </w:p>
+    <w:p>
+      <w:pPr>
+        <w:pStyle w:val="Body"/>
+        <w:rPr>
+          <w:color w:val="FF0000"/>
+        </w:rPr>
+      </w:pPr>
+      <w:r>
+        <w:rPr>
+          <w:color w:val="FF0000"/>
+        </w:rPr>
+        <w:t>{%p endif %}</w:t>
+      </w:r>
+    </w:p>
+    <w:p>
+      <w:pPr>
+        <w:pStyle w:val="Body"/>
+        <w:rPr>
+          <w:color w:val="FF0000"/>
+        </w:rPr>
+      </w:pPr>
+      <w:r>
+        <w:rPr>
+          <w:color w:val="FF0000"/>
+        </w:rPr>
+        <w:t>{%p if u</w:t>
+      </w:r>
+      <w:r>
+        <w:rPr>
+          <w:color w:val="FF0000"/>
+        </w:rPr>
+        <w:t>ser_need == 'answer divorce</w:t>
+      </w:r>
+      <w:r>
+        <w:rPr>
+          <w:color w:val="FF0000"/>
+        </w:rPr>
+        <w:t>'</w:t>
+      </w:r>
+      <w:r>
+        <w:rPr>
+          <w:color w:val="FF0000"/>
+        </w:rPr>
+        <w:t xml:space="preserve"> %}</w:t>
+      </w:r>
+    </w:p>
+    <w:p>
+      <w:pPr>
+        <w:pStyle w:val="Body"/>
+        <w:rPr>
+          <w:color w:val="FFC000"/>
+        </w:rPr>
+      </w:pPr>
+      <w:r>
+        <w:rPr>
+          <w:color w:val="FFC000"/>
+        </w:rPr>
+        <w:t>{%p if minor_children or (not minor_children and wife_is_pregnant in ('husband', 'not husband')) %}</w:t>
+      </w:r>
+    </w:p>
+    <w:p>
+      <w:pPr>
+        <w:pStyle w:val="Body"/>
         <w:rPr>
           <w:color w:val="92D050"/>
         </w:rPr>
-        <w:t>{%p endif %}</w:t>
+      </w:pPr>
+      <w:r>
+        <w:rPr>
+          <w:color w:val="92D050"/>
+        </w:rPr>
+        <w:t>{%p if case_type == 'divorce' %}</w:t>
       </w:r>
     </w:p>
     <w:p>
@@ -3212,224 +2904,12 @@
         <w:rPr>
           <w:b/>
         </w:rPr>
-        <w:t>Request to Put Agreement on the Record, DR-264</w:t>
-      </w:r>
-      <w:r>
-        <w:rPr>
-          <w:bCs/>
-        </w:rPr>
+        <w:t>ANSWER AND COUNTERCLAIM TO COMPLAINT FOR DIVORCE WITH CHILDREN, DR-832</w:t>
+      </w:r>
+      <w:r>
         <w:t xml:space="preserve"> [</w:t>
       </w:r>
-      <w:hyperlink r:id="rId38" w:history="1">
-        <w:r>
-          <w:rPr>
-            <w:rStyle w:val="Hyperlink"/>
-            <w:bCs/>
-            <w:spacing w:val="0"/>
-          </w:rPr>
-          <w:t>Fill-In PDF</w:t>
-        </w:r>
-      </w:hyperlink>
-      <w:r>
-        <w:rPr>
-          <w:bCs/>
-        </w:rPr>
-        <w:t>]</w:t>
-      </w:r>
-      <w:r>
-        <w:t xml:space="preserve"> </w:t>
-      </w:r>
-      <w:r>
-        <w:br/>
-      </w:r>
-      <w:hyperlink r:id="rId39" w:history="1">
-        <w:r>
-          <w:rPr>
-            <w:rStyle w:val="Hyperlink"/>
-            <w:spacing w:val="0"/>
-          </w:rPr>
-          <w:t>ak-courts.info/dr264</w:t>
-        </w:r>
-      </w:hyperlink>
-    </w:p>
-    <w:p>
-      <w:pPr>
-        <w:pStyle w:val="Body"/>
-      </w:pPr>
-      <w:r>
-        <w:rPr>
-          <w:color w:val="FFC000"/>
-        </w:rPr>
-        <w:t>{%p endif %}</w:t>
-      </w:r>
-    </w:p>
-    <w:p>
-      <w:pPr>
-        <w:pStyle w:val="Body"/>
-      </w:pPr>
-      <w:r>
-        <w:rPr>
-          <w:color w:val="FF0000"/>
-        </w:rPr>
-        <w:t>{%p endif %}</w:t>
-      </w:r>
-    </w:p>
-    <w:p>
-      <w:pPr>
-        <w:pStyle w:val="Heading3"/>
-      </w:pPr>
-      <w:r>
-        <w:t>Links in this step</w:t>
-      </w:r>
-    </w:p>
-    <w:p>
-      <w:pPr>
-        <w:pStyle w:val="Body"/>
-        <w:rPr>
-          <w:color w:val="FF0000"/>
-        </w:rPr>
-      </w:pPr>
-      <w:r>
-        <w:rPr>
-          <w:color w:val="FF0000"/>
-        </w:rPr>
-        <w:lastRenderedPageBreak/>
-        <w:t>{%p if user_need == 'answer custody' %}</w:t>
-      </w:r>
-    </w:p>
-    <w:p>
-      <w:pPr>
-        <w:pStyle w:val="Body"/>
-      </w:pPr>
-      <w:r>
-        <w:rPr>
-          <w:b/>
-        </w:rPr>
-        <w:t>ANSWER AND COUNTERCLAIM TO COMPLAINT FOR CUSTODY OF MINOR CHILDREN, DR-450</w:t>
-      </w:r>
-      <w:r>
-        <w:t xml:space="preserve"> [</w:t>
-      </w:r>
       <w:hyperlink r:id="rId40" w:history="1">
-        <w:r>
-          <w:rPr>
-            <w:rStyle w:val="Hyperlink"/>
-            <w:spacing w:val="0"/>
-          </w:rPr>
-          <w:t>Fill-In</w:t>
-        </w:r>
-        <w:r>
-          <w:rPr>
-            <w:rStyle w:val="Hyperlink"/>
-            <w:spacing w:val="0"/>
-          </w:rPr>
-          <w:t xml:space="preserve"> PDF</w:t>
-        </w:r>
-      </w:hyperlink>
-      <w:r>
-        <w:t>]</w:t>
-      </w:r>
-      <w:r>
-        <w:br/>
-      </w:r>
-      <w:hyperlink r:id="rId41" w:history="1">
-        <w:r>
-          <w:rPr>
-            <w:rStyle w:val="Hyperlink"/>
-            <w:spacing w:val="0"/>
-          </w:rPr>
-          <w:t>ak-courts.info/dr450</w:t>
-        </w:r>
-      </w:hyperlink>
-    </w:p>
-    <w:p>
-      <w:pPr>
-        <w:pStyle w:val="Body"/>
-        <w:rPr>
-          <w:color w:val="FF0000"/>
-        </w:rPr>
-      </w:pPr>
-      <w:r>
-        <w:rPr>
-          <w:color w:val="FF0000"/>
-        </w:rPr>
-        <w:t>{%p endif %}</w:t>
-      </w:r>
-    </w:p>
-    <w:p>
-      <w:pPr>
-        <w:pStyle w:val="Body"/>
-        <w:rPr>
-          <w:color w:val="FF0000"/>
-        </w:rPr>
-      </w:pPr>
-      <w:r>
-        <w:rPr>
-          <w:color w:val="FF0000"/>
-        </w:rPr>
-        <w:t>{%p if u</w:t>
-      </w:r>
-      <w:r>
-        <w:rPr>
-          <w:color w:val="FF0000"/>
-        </w:rPr>
-        <w:t>ser_need == 'answer divorce</w:t>
-      </w:r>
-      <w:r>
-        <w:rPr>
-          <w:color w:val="FF0000"/>
-        </w:rPr>
-        <w:t>'</w:t>
-      </w:r>
-      <w:r>
-        <w:rPr>
-          <w:color w:val="FF0000"/>
-        </w:rPr>
-        <w:t xml:space="preserve"> %}</w:t>
-      </w:r>
-    </w:p>
-    <w:p>
-      <w:pPr>
-        <w:pStyle w:val="Body"/>
-        <w:rPr>
-          <w:color w:val="FFC000"/>
-        </w:rPr>
-      </w:pPr>
-      <w:r>
-        <w:rPr>
-          <w:color w:val="FFC000"/>
-        </w:rPr>
-        <w:t>{%p if minor_children or (not minor_children and wife_is_pregnant in ('husband', 'not husband')) %}</w:t>
-      </w:r>
-    </w:p>
-    <w:p>
-      <w:pPr>
-        <w:pStyle w:val="Body"/>
-        <w:rPr>
-          <w:color w:val="92D050"/>
-        </w:rPr>
-      </w:pPr>
-      <w:r>
-        <w:rPr>
-          <w:color w:val="92D050"/>
-        </w:rPr>
-        <w:t>{%p if case_type == 'divorce' %}</w:t>
-      </w:r>
-    </w:p>
-    <w:p>
-      <w:pPr>
-        <w:pStyle w:val="Body"/>
-      </w:pPr>
-      <w:r>
-        <w:rPr>
-          <w:b/>
-        </w:rPr>
-        <w:t>ANSWER AND COUNTERCLAIM TO COMPLAINT FOR DIVORCE WITH CHILDREN, DR-832</w:t>
-      </w:r>
-      <w:r>
-        <w:t xml:space="preserve"> [</w:t>
-      </w:r>
-      <w:hyperlink r:id="rId42" w:history="1">
         <w:r>
           <w:rPr>
             <w:rStyle w:val="Hyperlink"/>
@@ -3456,15 +2936,120 @@
       <w:r>
         <w:br/>
       </w:r>
+      <w:hyperlink r:id="rId41" w:history="1">
+        <w:r>
+          <w:rPr>
+            <w:rStyle w:val="Hyperlink"/>
+            <w:spacing w:val="0"/>
+          </w:rPr>
+          <w:t>ak-courts.info/dr832</w:t>
+        </w:r>
+      </w:hyperlink>
+    </w:p>
+    <w:p>
+      <w:pPr>
+        <w:pStyle w:val="Body"/>
+        <w:rPr>
+          <w:color w:val="92D050"/>
+        </w:rPr>
+      </w:pPr>
+      <w:r>
+        <w:rPr>
+          <w:color w:val="92D050"/>
+        </w:rPr>
+        <w:t>{%p elif case_type == 'legal separation' %}</w:t>
+      </w:r>
+    </w:p>
+    <w:p>
+      <w:pPr>
+        <w:pStyle w:val="Body"/>
+      </w:pPr>
+      <w:r>
+        <w:rPr>
+          <w:b/>
+        </w:rPr>
+        <w:t>Answer &amp; Counterclaim to Legal Separation With Children, SHC-094</w:t>
+      </w:r>
+      <w:r>
+        <w:br/>
+      </w:r>
+      <w:hyperlink r:id="rId42" w:history="1">
+        <w:r>
+          <w:rPr>
+            <w:rStyle w:val="Hyperlink"/>
+            <w:spacing w:val="0"/>
+          </w:rPr>
+          <w:t>Word</w:t>
+        </w:r>
+      </w:hyperlink>
+      <w:r>
+        <w:br/>
+      </w:r>
       <w:hyperlink r:id="rId43" w:history="1">
         <w:r>
           <w:rPr>
             <w:rStyle w:val="Hyperlink"/>
             <w:spacing w:val="0"/>
           </w:rPr>
-          <w:t>ak-courts.info/dr832</w:t>
+          <w:t>courts.alaska.gov/</w:t>
+        </w:r>
+        <w:proofErr w:type="spellStart"/>
+        <w:r>
+          <w:rPr>
+            <w:rStyle w:val="Hyperlink"/>
+            <w:spacing w:val="0"/>
+          </w:rPr>
+          <w:t>shc</w:t>
+        </w:r>
+        <w:proofErr w:type="spellEnd"/>
+        <w:r>
+          <w:rPr>
+            <w:rStyle w:val="Hyperlink"/>
+            <w:spacing w:val="0"/>
+          </w:rPr>
+          <w:t>/family/docs/shc-094.doc</w:t>
         </w:r>
       </w:hyperlink>
+      <w:r>
+        <w:br/>
+      </w:r>
+      <w:hyperlink r:id="rId44" w:history="1">
+        <w:r>
+          <w:rPr>
+            <w:rStyle w:val="Hyperlink"/>
+            <w:spacing w:val="0"/>
+          </w:rPr>
+          <w:t>PDF</w:t>
+        </w:r>
+      </w:hyperlink>
+      <w:r>
+        <w:br/>
+      </w:r>
+      <w:hyperlink r:id="rId45" w:history="1">
+        <w:r>
+          <w:rPr>
+            <w:rStyle w:val="Hyperlink"/>
+            <w:spacing w:val="0"/>
+          </w:rPr>
+          <w:t>courts.alaska.gov/</w:t>
+        </w:r>
+        <w:proofErr w:type="spellStart"/>
+        <w:r>
+          <w:rPr>
+            <w:rStyle w:val="Hyperlink"/>
+            <w:spacing w:val="0"/>
+          </w:rPr>
+          <w:t>shc</w:t>
+        </w:r>
+        <w:proofErr w:type="spellEnd"/>
+        <w:r>
+          <w:rPr>
+            <w:rStyle w:val="Hyperlink"/>
+            <w:spacing w:val="0"/>
+          </w:rPr>
+          <w:t>/family/docs/shc-094n.pdf</w:t>
+        </w:r>
+      </w:hyperlink>
     </w:p>
     <w:p>
       <w:pPr>
@@ -3477,6 +3062,93 @@
         <w:rPr>
           <w:color w:val="92D050"/>
         </w:rPr>
+        <w:t>{%p endif %}</w:t>
+      </w:r>
+    </w:p>
+    <w:p>
+      <w:pPr>
+        <w:pStyle w:val="Body"/>
+        <w:rPr>
+          <w:color w:val="FFC000"/>
+        </w:rPr>
+      </w:pPr>
+      <w:r>
+        <w:rPr>
+          <w:color w:val="FFC000"/>
+        </w:rPr>
+        <w:t>{%p elif not minor_children and wife_is_pregnant == 'not pregnant' %}</w:t>
+      </w:r>
+    </w:p>
+    <w:p>
+      <w:pPr>
+        <w:pStyle w:val="Body"/>
+        <w:rPr>
+          <w:color w:val="92D050"/>
+        </w:rPr>
+      </w:pPr>
+      <w:r>
+        <w:rPr>
+          <w:color w:val="92D050"/>
+        </w:rPr>
+        <w:t>{%p if case_type == 'divorce' %}</w:t>
+      </w:r>
+    </w:p>
+    <w:p>
+      <w:pPr>
+        <w:pStyle w:val="Body"/>
+      </w:pPr>
+      <w:r>
+        <w:rPr>
+          <w:b/>
+        </w:rPr>
+        <w:t>ANSWER AND COUNTERCLAIM TO COMPLAINT FOR DIVORCE WITHOUT CHILDREN, DR-837</w:t>
+      </w:r>
+      <w:r>
+        <w:t xml:space="preserve"> [</w:t>
+      </w:r>
+      <w:hyperlink r:id="rId46" w:history="1">
+        <w:r>
+          <w:rPr>
+            <w:rStyle w:val="Hyperlink"/>
+            <w:spacing w:val="0"/>
+          </w:rPr>
+          <w:t>Fill-In</w:t>
+        </w:r>
+        <w:r>
+          <w:rPr>
+            <w:rStyle w:val="Hyperlink"/>
+            <w:spacing w:val="0"/>
+          </w:rPr>
+          <w:t xml:space="preserve"> PDF</w:t>
+        </w:r>
+      </w:hyperlink>
+      <w:r>
+        <w:t>]</w:t>
+      </w:r>
+      <w:r>
+        <w:br/>
+      </w:r>
+      <w:hyperlink r:id="rId47" w:history="1">
+        <w:r>
+          <w:rPr>
+            <w:rStyle w:val="Hyperlink"/>
+            <w:spacing w:val="0"/>
+          </w:rPr>
+          <w:t>ak-courts.info/dr837</w:t>
+        </w:r>
+      </w:hyperlink>
+    </w:p>
+    <w:p>
+      <w:pPr>
+        <w:pStyle w:val="Body"/>
+        <w:rPr>
+          <w:color w:val="92D050"/>
+        </w:rPr>
+      </w:pPr>
+      <w:r>
+        <w:rPr>
+          <w:color w:val="92D050"/>
+        </w:rPr>
         <w:t>{%p elif case_type == 'legal separation' %}</w:t>
       </w:r>
     </w:p>
@@ -3488,12 +3160,15 @@
         <w:rPr>
           <w:b/>
         </w:rPr>
-        <w:t>Answer &amp; Counterclaim to Legal Separation With Children, SHC-094</w:t>
+        <w:t>Answer &amp; Counterclaim to Legal Separation Without Children, SHC-095</w:t>
+      </w:r>
+      <w:r>
+        <w:t xml:space="preserve"> </w:t>
       </w:r>
       <w:r>
         <w:br/>
       </w:r>
-      <w:hyperlink r:id="rId44" w:history="1">
+      <w:hyperlink r:id="rId48" w:history="1">
         <w:r>
           <w:rPr>
             <w:rStyle w:val="Hyperlink"/>
@@ -3503,9 +3178,12 @@
         </w:r>
       </w:hyperlink>
       <w:r>
+        <w:t xml:space="preserve"> </w:t>
+      </w:r>
+      <w:r>
         <w:br/>
       </w:r>
-      <w:hyperlink r:id="rId45" w:history="1">
+      <w:hyperlink r:id="rId49" w:history="1">
         <w:r>
           <w:rPr>
             <w:rStyle w:val="Hyperlink"/>
@@ -3527,13 +3205,13 @@
             <w:rStyle w:val="Hyperlink"/>
             <w:spacing w:val="0"/>
           </w:rPr>
-          <w:t>/family/docs/shc-094.doc</w:t>
+          <w:t>/family/docs/shc-095.doc</w:t>
         </w:r>
       </w:hyperlink>
       <w:r>
         <w:br/>
       </w:r>
-      <w:hyperlink r:id="rId46" w:history="1">
+      <w:hyperlink r:id="rId50" w:history="1">
         <w:r>
           <w:rPr>
             <w:rStyle w:val="Hyperlink"/>
@@ -3545,7 +3223,7 @@
       <w:r>
         <w:br/>
       </w:r>
-      <w:hyperlink r:id="rId47" w:history="1">
+      <w:hyperlink r:id="rId51" w:history="1">
         <w:r>
           <w:rPr>
             <w:rStyle w:val="Hyperlink"/>
@@ -3567,66 +3245,91 @@
             <w:rStyle w:val="Hyperlink"/>
             <w:spacing w:val="0"/>
           </w:rPr>
-          <w:t>/family/docs/shc-094n.pdf</w:t>
+          <w:t>/family/docs/shc-095n.pdf</w:t>
         </w:r>
       </w:hyperlink>
     </w:p>
     <w:p>
       <w:pPr>
         <w:pStyle w:val="Body"/>
+      </w:pPr>
+      <w:r>
         <w:rPr>
           <w:color w:val="92D050"/>
         </w:rPr>
-      </w:pPr>
-      <w:r>
-        <w:rPr>
-          <w:color w:val="92D050"/>
-        </w:rPr>
         <w:t>{%p endif %}</w:t>
       </w:r>
     </w:p>
     <w:p>
       <w:pPr>
         <w:pStyle w:val="Body"/>
+      </w:pPr>
+      <w:r>
         <w:rPr>
           <w:color w:val="FFC000"/>
         </w:rPr>
-      </w:pPr>
-      <w:r>
+        <w:t>{%p endif %}</w:t>
+      </w:r>
+    </w:p>
+    <w:p>
+      <w:pPr>
+        <w:pStyle w:val="Body"/>
+        <w:rPr>
+          <w:color w:val="FF0000"/>
+        </w:rPr>
+      </w:pPr>
+      <w:r>
+        <w:rPr>
+          <w:color w:val="FF0000"/>
+        </w:rPr>
+        <w:t>{%p endif %}</w:t>
+      </w:r>
+    </w:p>
+    <w:p>
+      <w:pPr>
+        <w:pStyle w:val="Body"/>
+        <w:rPr>
+          <w:color w:val="FF0000"/>
+        </w:rPr>
+      </w:pPr>
+      <w:r>
+        <w:rPr>
+          <w:color w:val="FF0000"/>
+        </w:rPr>
+        <w:t>{%p if type_of_response['default'] and stage_of_default in ('application filed', 'hearing scheduled') %}</w:t>
+      </w:r>
+    </w:p>
+    <w:p>
+      <w:pPr>
+        <w:pStyle w:val="Body"/>
         <w:rPr>
           <w:color w:val="FFC000"/>
         </w:rPr>
-        <w:t>{%p elif not minor_children and wife_is_pregnant == 'not pregnant' %}</w:t>
-      </w:r>
-    </w:p>
-    <w:p>
-      <w:pPr>
-        <w:pStyle w:val="Body"/>
-        <w:rPr>
-          <w:color w:val="92D050"/>
-        </w:rPr>
-      </w:pPr>
-      <w:r>
-        <w:rPr>
-          <w:color w:val="92D050"/>
-        </w:rPr>
-        <w:t>{%p if case_type == 'divorce' %}</w:t>
-      </w:r>
-    </w:p>
-    <w:p>
-      <w:pPr>
-        <w:pStyle w:val="Body"/>
-      </w:pPr>
+      </w:pPr>
+      <w:r>
+        <w:rPr>
+          <w:color w:val="FFC000"/>
+        </w:rPr>
+        <w:t>{%p if stage_of_default == 'application filed' and proper_service %}</w:t>
+      </w:r>
+    </w:p>
+    <w:p>
+      <w:pPr>
+        <w:pStyle w:val="Body"/>
+      </w:pPr>
+      <w:r>
+        <w:t xml:space="preserve">Fill out a </w:t>
+      </w:r>
       <w:r>
         <w:rPr>
           <w:b/>
         </w:rPr>
-        <w:t>ANSWER AND COUNTERCLAIM TO COMPLAINT FOR DIVORCE WITHOUT CHILDREN, DR-837</w:t>
+        <w:t>TF-706 Motion (Request) and Affidavit</w:t>
       </w:r>
       <w:r>
         <w:t xml:space="preserve"> [</w:t>
       </w:r>
-      <w:hyperlink r:id="rId48" w:history="1">
+      <w:hyperlink r:id="rId52" w:history="1">
         <w:r>
           <w:rPr>
             <w:rStyle w:val="Hyperlink"/>
@@ -3648,28 +3351,36 @@
       <w:r>
         <w:br/>
       </w:r>
-      <w:hyperlink r:id="rId49" w:history="1">
-        <w:r>
-          <w:rPr>
-            <w:rStyle w:val="Hyperlink"/>
-            <w:spacing w:val="0"/>
-          </w:rPr>
-          <w:t>ak-courts.info/dr837</w:t>
+      <w:hyperlink r:id="rId53" w:history="1">
+        <w:r>
+          <w:rPr>
+            <w:rStyle w:val="Hyperlink"/>
+            <w:spacing w:val="0"/>
+          </w:rPr>
+          <w:t>ak-courts.info/tf706</w:t>
         </w:r>
       </w:hyperlink>
     </w:p>
     <w:p>
       <w:pPr>
         <w:pStyle w:val="Body"/>
-        <w:rPr>
-          <w:color w:val="92D050"/>
-        </w:rPr>
-      </w:pPr>
-      <w:r>
-        <w:rPr>
-          <w:color w:val="92D050"/>
-        </w:rPr>
-        <w:t>{%p elif case_type == 'legal separation' %}</w:t>
+      </w:pPr>
+      <w:r>
+        <w:rPr>
+          <w:color w:val="FFC000"/>
+        </w:rPr>
+        <w:t xml:space="preserve"> {%p endif %}</w:t>
+      </w:r>
+    </w:p>
+    <w:p>
+      <w:pPr>
+        <w:pStyle w:val="Body"/>
+      </w:pPr>
+      <w:r>
+        <w:rPr>
+          <w:color w:val="FFC000"/>
+        </w:rPr>
+        <w:t>{%p if stage_of_default == 'hearing scheduled' %}</w:t>
       </w:r>
     </w:p>
     <w:p>
@@ -3680,328 +3391,96 @@
         <w:rPr>
           <w:b/>
         </w:rPr>
-        <w:t>Answer &amp; Counterclaim to Legal Separation Without Children, SHC-095</w:t>
-      </w:r>
-      <w:r>
-        <w:t xml:space="preserve"> </w:t>
+        <w:t>Motion, Affidavit, and Order to Set Aside Entry of Default and Accept Late Filed Answer, CIV-858</w:t>
+      </w:r>
+      <w:r>
+        <w:t xml:space="preserve"> [</w:t>
+      </w:r>
+      <w:hyperlink r:id="rId54" w:history="1">
+        <w:r>
+          <w:rPr>
+            <w:rStyle w:val="Hyperlink"/>
+            <w:spacing w:val="0"/>
+          </w:rPr>
+          <w:t>Fill-In</w:t>
+        </w:r>
+        <w:r>
+          <w:rPr>
+            <w:rStyle w:val="Hyperlink"/>
+            <w:spacing w:val="0"/>
+          </w:rPr>
+          <w:t xml:space="preserve"> PDF</w:t>
+        </w:r>
+      </w:hyperlink>
+      <w:r>
+        <w:t>]</w:t>
       </w:r>
       <w:r>
         <w:br/>
       </w:r>
-      <w:hyperlink r:id="rId50" w:history="1">
-        <w:r>
-          <w:rPr>
-            <w:rStyle w:val="Hyperlink"/>
-            <w:spacing w:val="0"/>
-          </w:rPr>
-          <w:t>Word</w:t>
+      <w:hyperlink r:id="rId55" w:history="1">
+        <w:r>
+          <w:rPr>
+            <w:rStyle w:val="Hyperlink"/>
+            <w:spacing w:val="0"/>
+          </w:rPr>
+          <w:t>ak-courts.info/tf858</w:t>
         </w:r>
       </w:hyperlink>
-      <w:r>
-        <w:t xml:space="preserve"> </w:t>
-      </w:r>
+    </w:p>
+    <w:p>
+      <w:pPr>
+        <w:pStyle w:val="Body"/>
+      </w:pPr>
+      <w:r>
+        <w:rPr>
+          <w:color w:val="FFC000"/>
+        </w:rPr>
+        <w:t>{%p endif %}</w:t>
+      </w:r>
+    </w:p>
+    <w:p>
+      <w:pPr>
+        <w:pStyle w:val="Body"/>
+        <w:rPr>
+          <w:color w:val="FF0000"/>
+        </w:rPr>
+      </w:pPr>
+      <w:r>
+        <w:rPr>
+          <w:color w:val="FF0000"/>
+        </w:rPr>
+        <w:t>{%p endif %}</w:t>
+      </w:r>
+    </w:p>
+    <w:p>
+      <w:pPr>
+        <w:pStyle w:val="Body"/>
+      </w:pPr>
+      <w:r>
+        <w:rPr>
+          <w:color w:val="FF0000"/>
+        </w:rPr>
+        <w:t>{%p if type_of_response['wrong state'] and ((user_need == 'answer custody' and not jurisdiction) or user_need == 'answer divorce') %}</w:t>
+      </w:r>
+    </w:p>
+    <w:p>
+      <w:pPr>
+        <w:pStyle w:val="Body"/>
+      </w:pPr>
+      <w:hyperlink r:id="rId56" w:history="1">
+        <w:r>
+          <w:rPr>
+            <w:rStyle w:val="Hyperlink"/>
+            <w:spacing w:val="0"/>
+          </w:rPr>
+          <w:t>talk to a lawyer</w:t>
+        </w:r>
+      </w:hyperlink>
       <w:r>
         <w:br/>
       </w:r>
-      <w:hyperlink r:id="rId51" w:history="1">
-        <w:r>
-          <w:rPr>
-            <w:rStyle w:val="Hyperlink"/>
-            <w:spacing w:val="0"/>
-          </w:rPr>
-          <w:t>courts.alaska.gov/</w:t>
-        </w:r>
-        <w:proofErr w:type="spellStart"/>
-        <w:r>
-          <w:rPr>
-            <w:rStyle w:val="Hyperlink"/>
-            <w:spacing w:val="0"/>
-          </w:rPr>
-          <w:t>shc</w:t>
-        </w:r>
-        <w:proofErr w:type="spellEnd"/>
-        <w:r>
-          <w:rPr>
-            <w:rStyle w:val="Hyperlink"/>
-            <w:spacing w:val="0"/>
-          </w:rPr>
-          <w:t>/family/docs/shc-095.doc</w:t>
-        </w:r>
-      </w:hyperlink>
-      <w:r>
-        <w:br/>
-      </w:r>
-      <w:hyperlink r:id="rId52" w:history="1">
-        <w:r>
-          <w:rPr>
-            <w:rStyle w:val="Hyperlink"/>
-            <w:spacing w:val="0"/>
-          </w:rPr>
-          <w:t>PDF</w:t>
-        </w:r>
-      </w:hyperlink>
-      <w:r>
-        <w:br/>
-      </w:r>
-      <w:hyperlink r:id="rId53" w:history="1">
-        <w:r>
-          <w:rPr>
-            <w:rStyle w:val="Hyperlink"/>
-            <w:spacing w:val="0"/>
-          </w:rPr>
-          <w:t>courts.alaska.gov/</w:t>
-        </w:r>
-        <w:proofErr w:type="spellStart"/>
-        <w:r>
-          <w:rPr>
-            <w:rStyle w:val="Hyperlink"/>
-            <w:spacing w:val="0"/>
-          </w:rPr>
-          <w:t>shc</w:t>
-        </w:r>
-        <w:proofErr w:type="spellEnd"/>
-        <w:r>
-          <w:rPr>
-            <w:rStyle w:val="Hyperlink"/>
-            <w:spacing w:val="0"/>
-          </w:rPr>
-          <w:t>/family/docs/shc-095n.pdf</w:t>
-        </w:r>
-      </w:hyperlink>
-    </w:p>
-    <w:p>
-      <w:pPr>
-        <w:pStyle w:val="Body"/>
-      </w:pPr>
-      <w:r>
-        <w:rPr>
-          <w:color w:val="92D050"/>
-        </w:rPr>
-        <w:t>{%p endif %}</w:t>
-      </w:r>
-    </w:p>
-    <w:p>
-      <w:pPr>
-        <w:pStyle w:val="Body"/>
-      </w:pPr>
-      <w:r>
-        <w:rPr>
-          <w:color w:val="FFC000"/>
-        </w:rPr>
-        <w:t>{%p endif %}</w:t>
-      </w:r>
-    </w:p>
-    <w:p>
-      <w:pPr>
-        <w:pStyle w:val="Body"/>
-        <w:rPr>
-          <w:color w:val="FF0000"/>
-        </w:rPr>
-      </w:pPr>
-      <w:r>
-        <w:rPr>
-          <w:color w:val="FF0000"/>
-        </w:rPr>
-        <w:t>{%p endif %}</w:t>
-      </w:r>
-    </w:p>
-    <w:p>
-      <w:pPr>
-        <w:pStyle w:val="Body"/>
-        <w:rPr>
-          <w:color w:val="FF0000"/>
-        </w:rPr>
-      </w:pPr>
-      <w:r>
-        <w:rPr>
-          <w:color w:val="FF0000"/>
-        </w:rPr>
-        <w:lastRenderedPageBreak/>
-        <w:t>{%p if type_of_response['default'] and stage_of_default in ('application filed', 'hearing scheduled') %}</w:t>
-      </w:r>
-    </w:p>
-    <w:p>
-      <w:pPr>
-        <w:pStyle w:val="Body"/>
-        <w:rPr>
-          <w:color w:val="FFC000"/>
-        </w:rPr>
-      </w:pPr>
-      <w:r>
-        <w:rPr>
-          <w:color w:val="FFC000"/>
-        </w:rPr>
-        <w:t>{%p if stage_of_default == 'application filed' and proper_service %}</w:t>
-      </w:r>
-    </w:p>
-    <w:p>
-      <w:pPr>
-        <w:pStyle w:val="Body"/>
-      </w:pPr>
-      <w:r>
-        <w:t xml:space="preserve">Fill out a </w:t>
-      </w:r>
-      <w:r>
-        <w:rPr>
-          <w:b/>
-        </w:rPr>
-        <w:t>TF-706 Motion (Request) and Affidavit</w:t>
-      </w:r>
-      <w:r>
-        <w:t xml:space="preserve"> [</w:t>
-      </w:r>
-      <w:hyperlink r:id="rId54" w:history="1">
-        <w:r>
-          <w:rPr>
-            <w:rStyle w:val="Hyperlink"/>
-            <w:spacing w:val="0"/>
-          </w:rPr>
-          <w:t>Fill-In</w:t>
-        </w:r>
-        <w:r>
-          <w:rPr>
-            <w:rStyle w:val="Hyperlink"/>
-            <w:spacing w:val="0"/>
-          </w:rPr>
-          <w:t xml:space="preserve"> PDF</w:t>
-        </w:r>
-      </w:hyperlink>
-      <w:r>
-        <w:t>]</w:t>
-      </w:r>
-      <w:r>
-        <w:br/>
-      </w:r>
-      <w:hyperlink r:id="rId55" w:history="1">
-        <w:r>
-          <w:rPr>
-            <w:rStyle w:val="Hyperlink"/>
-            <w:spacing w:val="0"/>
-          </w:rPr>
-          <w:t>ak-courts.info/tf706</w:t>
-        </w:r>
-      </w:hyperlink>
-    </w:p>
-    <w:p>
-      <w:pPr>
-        <w:pStyle w:val="Body"/>
-      </w:pPr>
-      <w:r>
-        <w:rPr>
-          <w:color w:val="FFC000"/>
-        </w:rPr>
-        <w:t xml:space="preserve"> {%p endif %}</w:t>
-      </w:r>
-    </w:p>
-    <w:p>
-      <w:pPr>
-        <w:pStyle w:val="Body"/>
-      </w:pPr>
-      <w:r>
-        <w:rPr>
-          <w:color w:val="FFC000"/>
-        </w:rPr>
-        <w:t>{%p if stage_of_default == 'hearing scheduled' %}</w:t>
-      </w:r>
-    </w:p>
-    <w:p>
-      <w:pPr>
-        <w:pStyle w:val="Body"/>
-      </w:pPr>
-      <w:r>
-        <w:rPr>
-          <w:b/>
-        </w:rPr>
-        <w:t>Motion, Affidavit, and Order to Set Aside Entry of Default and Accept Late Filed Answer, CIV-858</w:t>
-      </w:r>
-      <w:r>
-        <w:t xml:space="preserve"> [</w:t>
-      </w:r>
-      <w:hyperlink r:id="rId56" w:history="1">
-        <w:r>
-          <w:rPr>
-            <w:rStyle w:val="Hyperlink"/>
-            <w:spacing w:val="0"/>
-          </w:rPr>
-          <w:t>Fill-In</w:t>
-        </w:r>
-        <w:r>
-          <w:rPr>
-            <w:rStyle w:val="Hyperlink"/>
-            <w:spacing w:val="0"/>
-          </w:rPr>
-          <w:t xml:space="preserve"> PDF</w:t>
-        </w:r>
-      </w:hyperlink>
-      <w:r>
-        <w:t>]</w:t>
-      </w:r>
-      <w:r>
-        <w:br/>
-      </w:r>
       <w:hyperlink r:id="rId57" w:history="1">
-        <w:r>
-          <w:rPr>
-            <w:rStyle w:val="Hyperlink"/>
-            <w:spacing w:val="0"/>
-          </w:rPr>
-          <w:t>ak-courts.info/tf858</w:t>
-        </w:r>
-      </w:hyperlink>
-    </w:p>
-    <w:p>
-      <w:pPr>
-        <w:pStyle w:val="Body"/>
-      </w:pPr>
-      <w:r>
-        <w:rPr>
-          <w:color w:val="FFC000"/>
-        </w:rPr>
-        <w:t>{%p endif %}</w:t>
-      </w:r>
-    </w:p>
-    <w:p>
-      <w:pPr>
-        <w:pStyle w:val="Body"/>
-        <w:rPr>
-          <w:color w:val="FF0000"/>
-        </w:rPr>
-      </w:pPr>
-      <w:r>
-        <w:rPr>
-          <w:color w:val="FF0000"/>
-        </w:rPr>
-        <w:t>{%p endif %}</w:t>
-      </w:r>
-    </w:p>
-    <w:p>
-      <w:pPr>
-        <w:pStyle w:val="Body"/>
-      </w:pPr>
-      <w:r>
-        <w:rPr>
-          <w:color w:val="FF0000"/>
-        </w:rPr>
-        <w:t>{%p if type_of_response['wrong state'] and ((user_need == 'answer custody' and not jurisdiction) or user_need == 'answer divorce') %}</w:t>
-      </w:r>
-    </w:p>
-    <w:p>
-      <w:pPr>
-        <w:pStyle w:val="Body"/>
-      </w:pPr>
-      <w:hyperlink r:id="rId58" w:history="1">
-        <w:r>
-          <w:rPr>
-            <w:rStyle w:val="Hyperlink"/>
-            <w:spacing w:val="0"/>
-          </w:rPr>
-          <w:t>talk to a lawyer</w:t>
-        </w:r>
-      </w:hyperlink>
-      <w:r>
-        <w:br/>
-      </w:r>
-      <w:hyperlink r:id="rId59" w:history="1">
         <w:r>
           <w:rPr>
             <w:rStyle w:val="Hyperlink"/>
@@ -4028,6 +3507,7 @@
         <w:rPr>
           <w:color w:val="FF0000"/>
         </w:rPr>
+        <w:lastRenderedPageBreak/>
         <w:t>{%p endif %}</w:t>
       </w:r>
     </w:p>

</xml_diff>

<commit_message>
messing with signing paragraph content docxes being included in fill out forms steps docxes which are then included in interview docx templates.
</commit_message>
<xml_diff>
--- a/docassemble/AKA2JBranding/data/templates/answer_content.docx
+++ b/docassemble/AKA2JBranding/data/templates/answer_content.docx
@@ -94,26 +94,11 @@
     <w:p>
       <w:pPr>
         <w:pStyle w:val="Body"/>
-      </w:pPr>
-    </w:p>
-    <w:p>
-      <w:pPr>
-        <w:pStyle w:val="Body"/>
-      </w:pPr>
-      <w:r>
-        <w:t>{{p (include_docx_template("docassemble.AKA2JBranding:</w:t>
-      </w:r>
-      <w:r>
-        <w:t>signing_paragraph</w:t>
-      </w:r>
-      <w:r>
-        <w:t>_content.docx")) }}</w:t>
-      </w:r>
-    </w:p>
-    <w:p>
-      <w:pPr>
-        <w:pStyle w:val="Body"/>
-      </w:pPr>
+        <w:spacing w:before="280" w:after="280"/>
+      </w:pPr>
+      <w:r>
+        <w:t>{{p (include_docx_template("docassemble.AKA2JBranding:signing_paragraph_content.docx")) }}</w:t>
+      </w:r>
     </w:p>
     <w:p>
       <w:pPr>

</xml_diff>

<commit_message>
back to pasting contents of signing paragraph content docx into answer and dismiss content docxes
</commit_message>
<xml_diff>
--- a/docassemble/AKA2JBranding/data/templates/answer_content.docx
+++ b/docassemble/AKA2JBranding/data/templates/answer_content.docx
@@ -93,11 +93,172 @@
     </w:p>
     <w:p>
       <w:pPr>
-        <w:pStyle w:val="Body"/>
-        <w:spacing w:before="280" w:after="280"/>
-      </w:pPr>
-      <w:r>
-        <w:t>{{p (include_docx_template("docassemble.AKA2JBranding:signing_paragraph_content.docx")) }}</w:t>
+        <w:pStyle w:val="Example"/>
+        <w:rPr>
+          <w:color w:val="auto"/>
+        </w:rPr>
+      </w:pPr>
+      <w:r>
+        <w:t>Important - signing your documents</w:t>
+      </w:r>
+    </w:p>
+    <w:p>
+      <w:pPr>
+        <w:rPr>
+          <w:rFonts w:ascii="Helvetica" w:eastAsiaTheme="minorHAnsi" w:hAnsi="Helvetica" w:cs="Helvetica"/>
+          <w:sz w:val="24"/>
+          <w:szCs w:val="24"/>
+        </w:rPr>
+      </w:pPr>
+      <w:r>
+        <w:rPr>
+          <w:rFonts w:ascii="Helvetica" w:eastAsiaTheme="minorHAnsi" w:hAnsi="Helvetica" w:cs="Helvetica"/>
+          <w:color w:val="FF0000"/>
+          <w:sz w:val="24"/>
+          <w:szCs w:val="24"/>
+        </w:rPr>
+        <w:t>{%p if filling_manner in('electronically', 'dunno') and filing_method in('efiling', 'dunno') %}</w:t>
+      </w:r>
+    </w:p>
+    <w:p>
+      <w:pPr>
+        <w:pStyle w:val="Exampleparagraph"/>
+      </w:pPr>
+      <w:r>
+        <w:t>If you fill out your forms on a computer and file them with TrueFiling, you can sign your forms electronically.  Type “/s/ your name” on the signature line. For example, Zoe Lee’s signature would be "/s/ Zoe Lee."</w:t>
+      </w:r>
+    </w:p>
+    <w:p>
+      <w:pPr>
+        <w:rPr>
+          <w:rFonts w:ascii="Helvetica" w:eastAsiaTheme="minorHAnsi" w:hAnsi="Helvetica" w:cs="Helvetica"/>
+          <w:sz w:val="24"/>
+          <w:szCs w:val="24"/>
+        </w:rPr>
+      </w:pPr>
+      <w:r>
+        <w:rPr>
+          <w:rFonts w:ascii="Helvetica" w:eastAsiaTheme="minorHAnsi" w:hAnsi="Helvetica" w:cs="Helvetica"/>
+          <w:color w:val="FFC000"/>
+          <w:sz w:val="24"/>
+          <w:szCs w:val="24"/>
+        </w:rPr>
+        <w:t>{%p if filling_manner == 'electronically' and filing_method == 'efiling' %}</w:t>
+      </w:r>
+    </w:p>
+    <w:p>
+      <w:pPr>
+        <w:pStyle w:val="ExampleorImportantblock"/>
+      </w:pPr>
+      <w:r>
+        <w:t xml:space="preserve">If the form needs to be notarized, fill out and file </w:t>
+      </w:r>
+      <w:r>
+        <w:rPr>
+          <w:b/>
+          <w:bCs/>
+        </w:rPr>
+        <w:t>Self-Certification (No Notary Available), TF-835</w:t>
+      </w:r>
+      <w:r>
+        <w:t xml:space="preserve"> [</w:t>
+      </w:r>
+      <w:hyperlink r:id="rId5" w:history="1">
+        <w:r>
+          <w:rPr>
+            <w:rStyle w:val="Hyperlink"/>
+            <w:spacing w:val="0"/>
+          </w:rPr>
+          <w:t>Fill in PDF</w:t>
+        </w:r>
+      </w:hyperlink>
+      <w:r>
+        <w:t>]</w:t>
+      </w:r>
+      <w:r>
+        <w:br/>
+      </w:r>
+      <w:hyperlink r:id="rId6" w:history="1">
+        <w:r>
+          <w:rPr>
+            <w:rStyle w:val="Hyperlink"/>
+            <w:spacing w:val="0"/>
+          </w:rPr>
+          <w:t>ak-courts.info/tf835</w:t>
+        </w:r>
+      </w:hyperlink>
+      <w:r>
+        <w:t>.</w:t>
+      </w:r>
+    </w:p>
+    <w:p>
+      <w:pPr>
+        <w:rPr>
+          <w:rFonts w:ascii="Helvetica" w:eastAsiaTheme="minorHAnsi" w:hAnsi="Helvetica" w:cs="Helvetica"/>
+          <w:sz w:val="24"/>
+          <w:szCs w:val="24"/>
+        </w:rPr>
+      </w:pPr>
+      <w:r>
+        <w:rPr>
+          <w:rFonts w:ascii="Helvetica" w:eastAsiaTheme="minorHAnsi" w:hAnsi="Helvetica" w:cs="Helvetica"/>
+          <w:color w:val="FFC000"/>
+          <w:sz w:val="24"/>
+          <w:szCs w:val="24"/>
+        </w:rPr>
+        <w:t>{%p endif %}</w:t>
+      </w:r>
+    </w:p>
+    <w:p>
+      <w:pPr>
+        <w:rPr>
+          <w:rFonts w:ascii="Helvetica" w:eastAsiaTheme="minorHAnsi" w:hAnsi="Helvetica" w:cs="Helvetica"/>
+          <w:sz w:val="24"/>
+          <w:szCs w:val="24"/>
+        </w:rPr>
+      </w:pPr>
+      <w:r>
+        <w:rPr>
+          <w:rFonts w:ascii="Helvetica" w:eastAsiaTheme="minorHAnsi" w:hAnsi="Helvetica" w:cs="Helvetica"/>
+          <w:color w:val="FF0000"/>
+          <w:sz w:val="24"/>
+          <w:szCs w:val="24"/>
+        </w:rPr>
+        <w:t>{%p endif %}</w:t>
+      </w:r>
+    </w:p>
+    <w:p>
+      <w:pPr>
+        <w:rPr>
+          <w:rFonts w:ascii="Helvetica" w:eastAsiaTheme="minorHAnsi" w:hAnsi="Helvetica" w:cs="Helvetica"/>
+          <w:sz w:val="24"/>
+          <w:szCs w:val="24"/>
+        </w:rPr>
+      </w:pPr>
+      <w:r>
+        <w:rPr>
+          <w:rFonts w:ascii="Helvetica" w:eastAsiaTheme="minorHAnsi" w:hAnsi="Helvetica" w:cs="Helvetica"/>
+          <w:color w:val="FF0000"/>
+          <w:sz w:val="24"/>
+          <w:szCs w:val="24"/>
+        </w:rPr>
+        <w:t>{%p if filling_manner in('paper', 'dunno') or filing_method in ('mail or in person', 'dunno') %}</w:t>
+      </w:r>
+    </w:p>
+    <w:p>
+      <w:r>
+        <w:t>If you fill out paper copies of the forms, or do not file them with TrueFiling, read the step “Sign if you use paper forms or do not use TrueFiling”</w:t>
+      </w:r>
+    </w:p>
+    <w:p>
+      <w:r>
+        <w:rPr>
+          <w:rFonts w:ascii="Helvetica" w:eastAsiaTheme="minorHAnsi" w:hAnsi="Helvetica" w:cs="Helvetica"/>
+          <w:color w:val="FF0000"/>
+          <w:sz w:val="24"/>
+          <w:szCs w:val="24"/>
+        </w:rPr>
+        <w:t>{%p endif %}</w:t>
       </w:r>
     </w:p>
     <w:p>
@@ -154,6 +315,7 @@
         <w:ind w:left="540"/>
       </w:pPr>
       <w:r>
+        <w:lastRenderedPageBreak/>
         <w:t xml:space="preserve">Fill out the </w:t>
       </w:r>
       <w:r>
@@ -245,7 +407,7 @@
       <w:r>
         <w:t>[</w:t>
       </w:r>
-      <w:hyperlink r:id="rId5" w:history="1">
+      <w:hyperlink r:id="rId7" w:history="1">
         <w:r>
           <w:rPr>
             <w:rStyle w:val="Hyperlink"/>
@@ -267,7 +429,7 @@
       <w:r>
         <w:br/>
       </w:r>
-      <w:hyperlink r:id="rId6" w:history="1">
+      <w:hyperlink r:id="rId8" w:history="1">
         <w:r>
           <w:rPr>
             <w:rStyle w:val="Hyperlink"/>
@@ -329,7 +491,6 @@
         <w:rPr>
           <w:b/>
         </w:rPr>
-        <w:lastRenderedPageBreak/>
         <w:t>ANSWER AND COUNTERCLAIM TO COMPLAINT FOR DIVORCE WITH CHILDREN, DR-832</w:t>
       </w:r>
       <w:r>
@@ -338,7 +499,7 @@
       <w:r>
         <w:t>[</w:t>
       </w:r>
-      <w:hyperlink r:id="rId7" w:history="1">
+      <w:hyperlink r:id="rId9" w:history="1">
         <w:r>
           <w:rPr>
             <w:rStyle w:val="Hyperlink"/>
@@ -360,7 +521,7 @@
       <w:r>
         <w:br/>
       </w:r>
-      <w:hyperlink r:id="rId8" w:history="1">
+      <w:hyperlink r:id="rId10" w:history="1">
         <w:r>
           <w:rPr>
             <w:rStyle w:val="Hyperlink"/>
@@ -394,7 +555,7 @@
       <w:r>
         <w:t xml:space="preserve"> </w:t>
       </w:r>
-      <w:hyperlink r:id="rId9" w:history="1">
+      <w:hyperlink r:id="rId11" w:history="1">
         <w:r>
           <w:rPr>
             <w:rStyle w:val="Hyperlink"/>
@@ -406,7 +567,7 @@
       <w:r>
         <w:t xml:space="preserve"> | </w:t>
       </w:r>
-      <w:hyperlink r:id="rId10" w:history="1">
+      <w:hyperlink r:id="rId12" w:history="1">
         <w:r>
           <w:rPr>
             <w:rStyle w:val="Hyperlink"/>
@@ -492,7 +653,7 @@
       <w:r>
         <w:t>[</w:t>
       </w:r>
-      <w:hyperlink r:id="rId11" w:history="1">
+      <w:hyperlink r:id="rId13" w:history="1">
         <w:r>
           <w:rPr>
             <w:rStyle w:val="Hyperlink"/>
@@ -514,7 +675,7 @@
       <w:r>
         <w:br/>
       </w:r>
-      <w:hyperlink r:id="rId12" w:history="1">
+      <w:hyperlink r:id="rId14" w:history="1">
         <w:r>
           <w:rPr>
             <w:rStyle w:val="Hyperlink"/>
@@ -551,7 +712,7 @@
         </w:rPr>
         <w:br/>
       </w:r>
-      <w:hyperlink r:id="rId13" w:history="1">
+      <w:hyperlink r:id="rId15" w:history="1">
         <w:r>
           <w:rPr>
             <w:rStyle w:val="Hyperlink"/>
@@ -567,7 +728,7 @@
         </w:rPr>
         <w:br/>
       </w:r>
-      <w:hyperlink r:id="rId14" w:history="1">
+      <w:hyperlink r:id="rId16" w:history="1">
         <w:r>
           <w:rPr>
             <w:rStyle w:val="Hyperlink"/>
@@ -595,7 +756,7 @@
       <w:r>
         <w:br/>
       </w:r>
-      <w:hyperlink r:id="rId15" w:history="1">
+      <w:hyperlink r:id="rId17" w:history="1">
         <w:r>
           <w:rPr>
             <w:rStyle w:val="Hyperlink"/>
@@ -611,7 +772,7 @@
         </w:rPr>
         <w:br/>
       </w:r>
-      <w:hyperlink r:id="rId16" w:history="1">
+      <w:hyperlink r:id="rId18" w:history="1">
         <w:r>
           <w:rPr>
             <w:rStyle w:val="Hyperlink"/>
@@ -778,7 +939,6 @@
         <w:rPr>
           <w:b/>
         </w:rPr>
-        <w:lastRenderedPageBreak/>
         <w:t>A. Answer section</w:t>
       </w:r>
     </w:p>
@@ -860,6 +1020,7 @@
         <w:rPr>
           <w:color w:val="FFC000"/>
         </w:rPr>
+        <w:lastRenderedPageBreak/>
         <w:t>{%p else %}</w:t>
       </w:r>
     </w:p>
@@ -953,7 +1114,7 @@
       <w:r>
         <w:t xml:space="preserve">ive defense applies to you, </w:t>
       </w:r>
-      <w:hyperlink r:id="rId17" w:history="1">
+      <w:hyperlink r:id="rId19" w:history="1">
         <w:r>
           <w:rPr>
             <w:rStyle w:val="Hyperlink"/>
@@ -991,7 +1152,6 @@
         <w:rPr>
           <w:color w:val="FFC000"/>
         </w:rPr>
-        <w:lastRenderedPageBreak/>
         <w:t>{%p if user_need == 'answer custody' or (user_need == 'answer divorce' and minor_children) or (user_need == 'answer divorce' and not minor_children and wife_is_pregnant in ('husband', 'not husband')) %}</w:t>
       </w:r>
     </w:p>
@@ -1096,7 +1256,11 @@
         <w:ind w:left="540"/>
       </w:pPr>
       <w:r>
-        <w:t>Check the {{ 'boxes that say' if minor_children else '' }}{{ 'boxes that say' if not minor_children and wife_is_pregnant in ('husband', 'not husband') else '' }}{{ 'box that says' if not minor_children and wife_is_pregnant == 'not pregnant' else '' }} you attached a Motion to Dismiss.</w:t>
+        <w:t xml:space="preserve">Check the {{ 'boxes that say' if minor_children else '' }}{{ 'boxes that say' if not minor_children and wife_is_pregnant in ('husband', 'not husband') else '' }}{{ 'box </w:t>
+      </w:r>
+      <w:r>
+        <w:lastRenderedPageBreak/>
+        <w:t>that says' if not minor_children and wife_is_pregnant == 'not pregnant' else '' }} you attached a Motion to Dismiss.</w:t>
       </w:r>
     </w:p>
     <w:p>
@@ -1260,7 +1424,6 @@
         <w:rPr>
           <w:color w:val="FF0000"/>
         </w:rPr>
-        <w:lastRenderedPageBreak/>
         <w:t>{%p endif %}</w:t>
       </w:r>
     </w:p>
@@ -1416,6 +1579,7 @@
         <w:rPr>
           <w:color w:val="FFC000"/>
         </w:rPr>
+        <w:lastRenderedPageBreak/>
         <w:t>{%p if user_need == 'answer custody' and not jurisdiction %}</w:t>
       </w:r>
     </w:p>
@@ -1524,125 +1688,125 @@
         <w:rPr>
           <w:color w:val="92D050"/>
         </w:rPr>
+        <w:t>{%p endif %}</w:t>
+      </w:r>
+    </w:p>
+    <w:p>
+      <w:pPr>
+        <w:pStyle w:val="Body"/>
+      </w:pPr>
+      <w:r>
+        <w:rPr>
+          <w:color w:val="FFC000"/>
+        </w:rPr>
+        <w:t>{%p endif %}</w:t>
+      </w:r>
+    </w:p>
+    <w:p>
+      <w:pPr>
+        <w:pStyle w:val="Body"/>
+      </w:pPr>
+      <w:r>
+        <w:rPr>
+          <w:color w:val="FF0000"/>
+        </w:rPr>
+        <w:t>{%p endif %}</w:t>
+      </w:r>
+    </w:p>
+    <w:p>
+      <w:pPr>
+        <w:pStyle w:val="Body"/>
+      </w:pPr>
+      <w:r>
+        <w:rPr>
+          <w:color w:val="FF0000"/>
+        </w:rPr>
+        <w:t>{%p if type_of_response['case in 2 states'] and stage_of_other_case == 'still going' %}</w:t>
+      </w:r>
+    </w:p>
+    <w:p>
+      <w:pPr>
+        <w:pStyle w:val="Body"/>
+      </w:pPr>
+      <w:r>
+        <w:rPr>
+          <w:color w:val="FFC000"/>
+        </w:rPr>
+        <w:t>{%p if (user_need == 'answer custody' and jurisdiction) or user_need == 'answer divorce' %}</w:t>
+      </w:r>
+    </w:p>
+    <w:p>
+      <w:pPr>
+        <w:pStyle w:val="Body"/>
+      </w:pPr>
+      <w:r>
+        <w:t>If you think the Alaska court should hear the case, use section 5 to tell the judge there are 2 cases and why you think the case should move forward in Alaska.</w:t>
+      </w:r>
+    </w:p>
+    <w:p>
+      <w:pPr>
+        <w:pStyle w:val="Body"/>
+      </w:pPr>
+      <w:r>
+        <w:rPr>
+          <w:color w:val="92D050"/>
+        </w:rPr>
+        <w:t>{%p if user_need == 'answer custody' or (user_need == 'answer divorce' and minor_children) %}</w:t>
+      </w:r>
+    </w:p>
+    <w:p>
+      <w:pPr>
+        <w:pStyle w:val="Body"/>
+      </w:pPr>
+      <w:r>
+        <w:t>Include where the children have lived the last 6 months.</w:t>
+      </w:r>
+    </w:p>
+    <w:p>
+      <w:pPr>
+        <w:pStyle w:val="Body"/>
+      </w:pPr>
+      <w:r>
+        <w:rPr>
+          <w:color w:val="92D050"/>
+        </w:rPr>
+        <w:t>{%p endif %}</w:t>
+      </w:r>
+    </w:p>
+    <w:p>
+      <w:pPr>
+        <w:pStyle w:val="Body"/>
+      </w:pPr>
+      <w:r>
+        <w:rPr>
+          <w:color w:val="FFC000"/>
+        </w:rPr>
+        <w:t>{%p elif (user_need == 'answer custody' and not jurisdiction) or (user_need == 'answer divorce' and minor_children) %}</w:t>
+      </w:r>
+    </w:p>
+    <w:p>
+      <w:pPr>
+        <w:pStyle w:val="Body"/>
+      </w:pPr>
+      <w:r>
+        <w:t>{{ 'Explain' if user_need == '</w:t>
+      </w:r>
+      <w:r>
+        <w:t xml:space="preserve">answer </w:t>
+      </w:r>
+      <w:r>
+        <w:t>custody' else 'Or, explain' }} why you think the Alaska court should hear the case even though your children have not lived in Alaska 6 months.</w:t>
+      </w:r>
+    </w:p>
+    <w:p>
+      <w:pPr>
+        <w:pStyle w:val="Body"/>
+      </w:pPr>
+      <w:r>
+        <w:rPr>
+          <w:color w:val="FFC000"/>
+        </w:rPr>
         <w:lastRenderedPageBreak/>
-        <w:t>{%p endif %}</w:t>
-      </w:r>
-    </w:p>
-    <w:p>
-      <w:pPr>
-        <w:pStyle w:val="Body"/>
-      </w:pPr>
-      <w:r>
-        <w:rPr>
-          <w:color w:val="FFC000"/>
-        </w:rPr>
-        <w:t>{%p endif %}</w:t>
-      </w:r>
-    </w:p>
-    <w:p>
-      <w:pPr>
-        <w:pStyle w:val="Body"/>
-      </w:pPr>
-      <w:r>
-        <w:rPr>
-          <w:color w:val="FF0000"/>
-        </w:rPr>
-        <w:t>{%p endif %}</w:t>
-      </w:r>
-    </w:p>
-    <w:p>
-      <w:pPr>
-        <w:pStyle w:val="Body"/>
-      </w:pPr>
-      <w:r>
-        <w:rPr>
-          <w:color w:val="FF0000"/>
-        </w:rPr>
-        <w:t>{%p if type_of_response['case in 2 states'] and stage_of_other_case == 'still going' %}</w:t>
-      </w:r>
-    </w:p>
-    <w:p>
-      <w:pPr>
-        <w:pStyle w:val="Body"/>
-      </w:pPr>
-      <w:r>
-        <w:rPr>
-          <w:color w:val="FFC000"/>
-        </w:rPr>
-        <w:t>{%p if (user_need == 'answer custody' and jurisdiction) or user_need == 'answer divorce' %}</w:t>
-      </w:r>
-    </w:p>
-    <w:p>
-      <w:pPr>
-        <w:pStyle w:val="Body"/>
-      </w:pPr>
-      <w:r>
-        <w:t>If you think the Alaska court should hear the case, use section 5 to tell the judge there are 2 cases and why you think the case should move forward in Alaska.</w:t>
-      </w:r>
-    </w:p>
-    <w:p>
-      <w:pPr>
-        <w:pStyle w:val="Body"/>
-      </w:pPr>
-      <w:r>
-        <w:rPr>
-          <w:color w:val="92D050"/>
-        </w:rPr>
-        <w:t>{%p if user_need == 'answer custody' or (user_need == 'answer divorce' and minor_children) %}</w:t>
-      </w:r>
-    </w:p>
-    <w:p>
-      <w:pPr>
-        <w:pStyle w:val="Body"/>
-      </w:pPr>
-      <w:r>
-        <w:t>Include where the children have lived the last 6 months.</w:t>
-      </w:r>
-    </w:p>
-    <w:p>
-      <w:pPr>
-        <w:pStyle w:val="Body"/>
-      </w:pPr>
-      <w:r>
-        <w:rPr>
-          <w:color w:val="92D050"/>
-        </w:rPr>
-        <w:t>{%p endif %}</w:t>
-      </w:r>
-    </w:p>
-    <w:p>
-      <w:pPr>
-        <w:pStyle w:val="Body"/>
-      </w:pPr>
-      <w:r>
-        <w:rPr>
-          <w:color w:val="FFC000"/>
-        </w:rPr>
-        <w:t>{%p elif (user_need == 'answer custody' and not jurisdiction) or (user_need == 'answer divorce' and minor_children) %}</w:t>
-      </w:r>
-    </w:p>
-    <w:p>
-      <w:pPr>
-        <w:pStyle w:val="Body"/>
-      </w:pPr>
-      <w:r>
-        <w:t>{{ 'Explain' if user_need == '</w:t>
-      </w:r>
-      <w:r>
-        <w:t xml:space="preserve">answer </w:t>
-      </w:r>
-      <w:r>
-        <w:t>custody' else 'Or, explain' }} why you think the Alaska court should hear the case even though your children have not lived in Alaska 6 months.</w:t>
-      </w:r>
-    </w:p>
-    <w:p>
-      <w:pPr>
-        <w:pStyle w:val="Body"/>
-      </w:pPr>
-      <w:r>
-        <w:rPr>
-          <w:color w:val="FFC000"/>
-        </w:rPr>
         <w:t>{%p endif %}</w:t>
       </w:r>
     </w:p>
@@ -1760,7 +1924,6 @@
         <w:ind w:left="360"/>
       </w:pPr>
       <w:r>
-        <w:lastRenderedPageBreak/>
         <w:t>You can add here that you want the court to dismiss your case.</w:t>
       </w:r>
     </w:p>
@@ -1874,7 +2037,7 @@
       <w:r>
         <w:t xml:space="preserve"> [</w:t>
       </w:r>
-      <w:hyperlink r:id="rId18" w:history="1">
+      <w:hyperlink r:id="rId20" w:history="1">
         <w:r>
           <w:rPr>
             <w:rStyle w:val="Hyperlink"/>
@@ -1896,7 +2059,7 @@
       <w:r>
         <w:br/>
       </w:r>
-      <w:hyperlink r:id="rId19" w:history="1">
+      <w:hyperlink r:id="rId21" w:history="1">
         <w:r>
           <w:rPr>
             <w:rStyle w:val="Hyperlink"/>
@@ -1957,6 +2120,7 @@
         <w:rPr>
           <w:color w:val="FFC000"/>
         </w:rPr>
+        <w:lastRenderedPageBreak/>
         <w:t>{%p if stage_of_default == 'hearing scheduled' %}</w:t>
       </w:r>
     </w:p>
@@ -1976,7 +2140,7 @@
       <w:r>
         <w:t xml:space="preserve"> [</w:t>
       </w:r>
-      <w:hyperlink r:id="rId20" w:history="1">
+      <w:hyperlink r:id="rId22" w:history="1">
         <w:r>
           <w:rPr>
             <w:rStyle w:val="Hyperlink"/>
@@ -1998,7 +2162,7 @@
       <w:r>
         <w:br/>
       </w:r>
-      <w:hyperlink r:id="rId21" w:history="1">
+      <w:hyperlink r:id="rId23" w:history="1">
         <w:r>
           <w:rPr>
             <w:rStyle w:val="Hyperlink"/>
@@ -2085,7 +2249,7 @@
       <w:r>
         <w:t xml:space="preserve">If you have any questions about whether Alaska is the correct place for your case or you want to ask the court to dismiss your case, you may want to </w:t>
       </w:r>
-      <w:hyperlink r:id="rId22" w:history="1">
+      <w:hyperlink r:id="rId24" w:history="1">
         <w:r>
           <w:rPr>
             <w:rStyle w:val="Hyperlink"/>
@@ -2101,7 +2265,7 @@
         </w:rPr>
         <w:br/>
       </w:r>
-      <w:hyperlink r:id="rId23" w:history="1">
+      <w:hyperlink r:id="rId25" w:history="1">
         <w:r>
           <w:rPr>
             <w:rStyle w:val="Hyperlink"/>
@@ -2142,13 +2306,12 @@
         <w:rPr>
           <w:b/>
         </w:rPr>
-        <w:lastRenderedPageBreak/>
         <w:t>Information Sheet, DR-314</w:t>
       </w:r>
       <w:r>
         <w:t xml:space="preserve"> [</w:t>
       </w:r>
-      <w:hyperlink r:id="rId24" w:history="1">
+      <w:hyperlink r:id="rId26" w:history="1">
         <w:r>
           <w:rPr>
             <w:rStyle w:val="Hyperlink"/>
@@ -2170,7 +2333,7 @@
       <w:r>
         <w:br/>
       </w:r>
-      <w:hyperlink r:id="rId25" w:history="1">
+      <w:hyperlink r:id="rId27" w:history="1">
         <w:r>
           <w:rPr>
             <w:rStyle w:val="Hyperlink"/>
@@ -2252,7 +2415,7 @@
       <w:r>
         <w:t xml:space="preserve"> [</w:t>
       </w:r>
-      <w:hyperlink r:id="rId26" w:history="1">
+      <w:hyperlink r:id="rId28" w:history="1">
         <w:r>
           <w:rPr>
             <w:rStyle w:val="Hyperlink"/>
@@ -2274,7 +2437,7 @@
       <w:r>
         <w:br/>
       </w:r>
-      <w:hyperlink r:id="rId27" w:history="1">
+      <w:hyperlink r:id="rId29" w:history="1">
         <w:r>
           <w:rPr>
             <w:rStyle w:val="Hyperlink"/>
@@ -2327,7 +2490,7 @@
       <w:r>
         <w:t xml:space="preserve"> [</w:t>
       </w:r>
-      <w:hyperlink r:id="rId28" w:history="1">
+      <w:hyperlink r:id="rId30" w:history="1">
         <w:r>
           <w:rPr>
             <w:rStyle w:val="Hyperlink"/>
@@ -2349,7 +2512,7 @@
       <w:r>
         <w:br/>
       </w:r>
-      <w:hyperlink r:id="rId29" w:history="1">
+      <w:hyperlink r:id="rId31" w:history="1">
         <w:r>
           <w:rPr>
             <w:rStyle w:val="Hyperlink"/>
@@ -2366,7 +2529,7 @@
       <w:r>
         <w:t xml:space="preserve">See </w:t>
       </w:r>
-      <w:hyperlink r:id="rId30" w:history="1">
+      <w:hyperlink r:id="rId32" w:history="1">
         <w:r>
           <w:rPr>
             <w:rStyle w:val="Hyperlink"/>
@@ -2384,7 +2547,7 @@
       <w:r>
         <w:br/>
       </w:r>
-      <w:hyperlink r:id="rId31" w:history="1">
+      <w:hyperlink r:id="rId33" w:history="1">
         <w:r>
           <w:rPr>
             <w:rStyle w:val="Hyperlink"/>
@@ -2407,6 +2570,7 @@
         <w:ind w:left="540"/>
       </w:pPr>
       <w:r>
+        <w:lastRenderedPageBreak/>
         <w:t xml:space="preserve">Attach your most recent tax return and pay stubs to the </w:t>
       </w:r>
       <w:r>
@@ -2509,7 +2673,6 @@
         <w:pStyle w:val="Heading3"/>
       </w:pPr>
       <w:r>
-        <w:lastRenderedPageBreak/>
         <w:t>Forms to use if you reach an agreement</w:t>
       </w:r>
     </w:p>
@@ -2557,7 +2720,7 @@
       <w:r>
         <w:br/>
       </w:r>
-      <w:hyperlink r:id="rId32" w:history="1">
+      <w:hyperlink r:id="rId34" w:history="1">
         <w:r>
           <w:rPr>
             <w:rStyle w:val="Hyperlink"/>
@@ -2572,7 +2735,7 @@
       <w:r>
         <w:br/>
       </w:r>
-      <w:hyperlink r:id="rId33" w:history="1">
+      <w:hyperlink r:id="rId35" w:history="1">
         <w:r>
           <w:rPr>
             <w:rStyle w:val="Hyperlink"/>
@@ -2600,7 +2763,7 @@
       <w:r>
         <w:br/>
       </w:r>
-      <w:hyperlink r:id="rId34" w:history="1">
+      <w:hyperlink r:id="rId36" w:history="1">
         <w:r>
           <w:rPr>
             <w:rStyle w:val="Hyperlink"/>
@@ -2616,7 +2779,7 @@
         </w:rPr>
         <w:br/>
       </w:r>
-      <w:hyperlink r:id="rId35" w:history="1">
+      <w:hyperlink r:id="rId37" w:history="1">
         <w:r>
           <w:rPr>
             <w:rStyle w:val="Hyperlink"/>
@@ -2686,7 +2849,7 @@
         </w:rPr>
         <w:t xml:space="preserve"> [</w:t>
       </w:r>
-      <w:hyperlink r:id="rId36" w:history="1">
+      <w:hyperlink r:id="rId38" w:history="1">
         <w:r>
           <w:rPr>
             <w:rStyle w:val="Hyperlink"/>
@@ -2708,7 +2871,7 @@
       <w:r>
         <w:br/>
       </w:r>
-      <w:hyperlink r:id="rId37" w:history="1">
+      <w:hyperlink r:id="rId39" w:history="1">
         <w:r>
           <w:rPr>
             <w:rStyle w:val="Hyperlink"/>
@@ -2759,6 +2922,7 @@
         <w:rPr>
           <w:color w:val="FF0000"/>
         </w:rPr>
+        <w:lastRenderedPageBreak/>
         <w:t>{%p if user_need == 'answer custody' %}</w:t>
       </w:r>
     </w:p>
@@ -2775,7 +2939,7 @@
       <w:r>
         <w:t xml:space="preserve"> [</w:t>
       </w:r>
-      <w:hyperlink r:id="rId38" w:history="1">
+      <w:hyperlink r:id="rId40" w:history="1">
         <w:r>
           <w:rPr>
             <w:rStyle w:val="Hyperlink"/>
@@ -2797,7 +2961,7 @@
       <w:r>
         <w:br/>
       </w:r>
-      <w:hyperlink r:id="rId39" w:history="1">
+      <w:hyperlink r:id="rId41" w:history="1">
         <w:r>
           <w:rPr>
             <w:rStyle w:val="Hyperlink"/>
@@ -2894,7 +3058,7 @@
       <w:r>
         <w:t xml:space="preserve"> [</w:t>
       </w:r>
-      <w:hyperlink r:id="rId40" w:history="1">
+      <w:hyperlink r:id="rId42" w:history="1">
         <w:r>
           <w:rPr>
             <w:rStyle w:val="Hyperlink"/>
@@ -2921,7 +3085,7 @@
       <w:r>
         <w:br/>
       </w:r>
-      <w:hyperlink r:id="rId41" w:history="1">
+      <w:hyperlink r:id="rId43" w:history="1">
         <w:r>
           <w:rPr>
             <w:rStyle w:val="Hyperlink"/>
@@ -2958,7 +3122,7 @@
       <w:r>
         <w:br/>
       </w:r>
-      <w:hyperlink r:id="rId42" w:history="1">
+      <w:hyperlink r:id="rId44" w:history="1">
         <w:r>
           <w:rPr>
             <w:rStyle w:val="Hyperlink"/>
@@ -2970,7 +3134,7 @@
       <w:r>
         <w:br/>
       </w:r>
-      <w:hyperlink r:id="rId43" w:history="1">
+      <w:hyperlink r:id="rId45" w:history="1">
         <w:r>
           <w:rPr>
             <w:rStyle w:val="Hyperlink"/>
@@ -2998,7 +3162,7 @@
       <w:r>
         <w:br/>
       </w:r>
-      <w:hyperlink r:id="rId44" w:history="1">
+      <w:hyperlink r:id="rId46" w:history="1">
         <w:r>
           <w:rPr>
             <w:rStyle w:val="Hyperlink"/>
@@ -3010,7 +3174,7 @@
       <w:r>
         <w:br/>
       </w:r>
-      <w:hyperlink r:id="rId45" w:history="1">
+      <w:hyperlink r:id="rId47" w:history="1">
         <w:r>
           <w:rPr>
             <w:rStyle w:val="Hyperlink"/>
@@ -3091,7 +3255,7 @@
       <w:r>
         <w:t xml:space="preserve"> [</w:t>
       </w:r>
-      <w:hyperlink r:id="rId46" w:history="1">
+      <w:hyperlink r:id="rId48" w:history="1">
         <w:r>
           <w:rPr>
             <w:rStyle w:val="Hyperlink"/>
@@ -3113,7 +3277,7 @@
       <w:r>
         <w:br/>
       </w:r>
-      <w:hyperlink r:id="rId47" w:history="1">
+      <w:hyperlink r:id="rId49" w:history="1">
         <w:r>
           <w:rPr>
             <w:rStyle w:val="Hyperlink"/>
@@ -3153,7 +3317,7 @@
       <w:r>
         <w:br/>
       </w:r>
-      <w:hyperlink r:id="rId48" w:history="1">
+      <w:hyperlink r:id="rId50" w:history="1">
         <w:r>
           <w:rPr>
             <w:rStyle w:val="Hyperlink"/>
@@ -3168,7 +3332,7 @@
       <w:r>
         <w:br/>
       </w:r>
-      <w:hyperlink r:id="rId49" w:history="1">
+      <w:hyperlink r:id="rId51" w:history="1">
         <w:r>
           <w:rPr>
             <w:rStyle w:val="Hyperlink"/>
@@ -3196,7 +3360,7 @@
       <w:r>
         <w:br/>
       </w:r>
-      <w:hyperlink r:id="rId50" w:history="1">
+      <w:hyperlink r:id="rId52" w:history="1">
         <w:r>
           <w:rPr>
             <w:rStyle w:val="Hyperlink"/>
@@ -3208,7 +3372,7 @@
       <w:r>
         <w:br/>
       </w:r>
-      <w:hyperlink r:id="rId51" w:history="1">
+      <w:hyperlink r:id="rId53" w:history="1">
         <w:r>
           <w:rPr>
             <w:rStyle w:val="Hyperlink"/>
@@ -3281,6 +3445,7 @@
         <w:rPr>
           <w:color w:val="FF0000"/>
         </w:rPr>
+        <w:lastRenderedPageBreak/>
         <w:t>{%p if type_of_response['default'] and stage_of_default in ('application filed', 'hearing scheduled') %}</w:t>
       </w:r>
     </w:p>
@@ -3314,7 +3479,7 @@
       <w:r>
         <w:t xml:space="preserve"> [</w:t>
       </w:r>
-      <w:hyperlink r:id="rId52" w:history="1">
+      <w:hyperlink r:id="rId54" w:history="1">
         <w:r>
           <w:rPr>
             <w:rStyle w:val="Hyperlink"/>
@@ -3336,7 +3501,7 @@
       <w:r>
         <w:br/>
       </w:r>
-      <w:hyperlink r:id="rId53" w:history="1">
+      <w:hyperlink r:id="rId55" w:history="1">
         <w:r>
           <w:rPr>
             <w:rStyle w:val="Hyperlink"/>
@@ -3381,7 +3546,7 @@
       <w:r>
         <w:t xml:space="preserve"> [</w:t>
       </w:r>
-      <w:hyperlink r:id="rId54" w:history="1">
+      <w:hyperlink r:id="rId56" w:history="1">
         <w:r>
           <w:rPr>
             <w:rStyle w:val="Hyperlink"/>
@@ -3403,7 +3568,7 @@
       <w:r>
         <w:br/>
       </w:r>
-      <w:hyperlink r:id="rId55" w:history="1">
+      <w:hyperlink r:id="rId57" w:history="1">
         <w:r>
           <w:rPr>
             <w:rStyle w:val="Hyperlink"/>
@@ -3453,7 +3618,7 @@
       <w:pPr>
         <w:pStyle w:val="Body"/>
       </w:pPr>
-      <w:hyperlink r:id="rId56" w:history="1">
+      <w:hyperlink r:id="rId58" w:history="1">
         <w:r>
           <w:rPr>
             <w:rStyle w:val="Hyperlink"/>
@@ -3465,7 +3630,7 @@
       <w:r>
         <w:br/>
       </w:r>
-      <w:hyperlink r:id="rId57" w:history="1">
+      <w:hyperlink r:id="rId59" w:history="1">
         <w:r>
           <w:rPr>
             <w:rStyle w:val="Hyperlink"/>
@@ -3492,7 +3657,6 @@
         <w:rPr>
           <w:color w:val="FF0000"/>
         </w:rPr>
-        <w:lastRenderedPageBreak/>
         <w:t>{%p endif %}</w:t>
       </w:r>
     </w:p>

</xml_diff>

<commit_message>
spacing issues in some template headings, adding the odd edit to content docxes and updating.
</commit_message>
<xml_diff>
--- a/docassemble/AKA2JBranding/data/templates/answer_content.docx
+++ b/docassemble/AKA2JBranding/data/templates/answer_content.docx
@@ -7,23 +7,21 @@
         <w:pStyle w:val="Body"/>
       </w:pPr>
       <w:r>
-        <w:rPr>
-          <w:color w:val="FF0000"/>
-        </w:rPr>
-        <w:t>{%p if not(type_of_response.any_true('improper service', 'default') and not proper_service) %}</w:t>
-      </w:r>
-    </w:p>
-    <w:p>
-      <w:pPr>
-        <w:pStyle w:val="Body"/>
-      </w:pPr>
-      <w:r>
-        <w:t xml:space="preserve">You have </w:t>
-      </w:r>
-      <w:r>
-        <w:rPr>
-          <w:b/>
-        </w:rPr>
+        <w:t>{</w:t>
+      </w:r>
+      <w:r>
+        <w:t xml:space="preserve">{ “When you are served properly, you” </w:t>
+      </w:r>
+      <w:r>
+        <w:t xml:space="preserve"> if type_of_response.any_true('improper service', 'default') and not proper_service</w:t>
+      </w:r>
+      <w:r>
+        <w:t xml:space="preserve"> else “You” }</w:t>
+      </w:r>
+      <w:r>
+        <w:t xml:space="preserve">} have </w:t>
+      </w:r>
+      <w:r>
         <w:t>20 days</w:t>
       </w:r>
       <w:r>
@@ -74,11 +72,7 @@
         <w:t xml:space="preserve">Give a copy of the forms to {{ other_party_in_case }}. See </w:t>
       </w:r>
       <w:r>
-        <w:t xml:space="preserve">{{ </w:t>
-      </w:r>
-      <w:proofErr w:type="spellStart"/>
-      <w:r>
-        <w:t>truefiling_serve</w:t>
+        <w:t>{{ truefiling_serve</w:t>
       </w:r>
       <w:r>
         <w:t>_step</w:t>
@@ -86,9 +80,56 @@
       <w:r>
         <w:t>.subject</w:t>
       </w:r>
-      <w:proofErr w:type="spellEnd"/>
       <w:r>
         <w:t xml:space="preserve"> }}.</w:t>
+      </w:r>
+    </w:p>
+    <w:p>
+      <w:pPr>
+        <w:pStyle w:val="Body"/>
+        <w:rPr>
+          <w:color w:val="FF0000"/>
+        </w:rPr>
+      </w:pPr>
+      <w:r>
+        <w:rPr>
+          <w:color w:val="FF0000"/>
+        </w:rPr>
+        <w:t>{%p if type_of_response[‘default’] %}</w:t>
+      </w:r>
+    </w:p>
+    <w:p>
+      <w:pPr>
+        <w:pStyle w:val="Body"/>
+      </w:pPr>
+      <w:r>
+        <w:t>The {{</w:t>
+      </w:r>
+      <w:r>
+        <w:t xml:space="preserve"> </w:t>
+      </w:r>
+      <w:r>
+        <w:t>other_party_in_case</w:t>
+      </w:r>
+      <w:r>
+        <w:t xml:space="preserve"> </w:t>
+      </w:r>
+      <w:r>
+        <w:t>}} told the court they properly served you and then asked for a default judgment. You should file your Answer as soon as you can to stop the judge from deciding the case without hearing from you.</w:t>
+      </w:r>
+    </w:p>
+    <w:p>
+      <w:pPr>
+        <w:pStyle w:val="Body"/>
+        <w:rPr>
+          <w:color w:val="FF0000"/>
+        </w:rPr>
+      </w:pPr>
+      <w:r>
+        <w:rPr>
+          <w:color w:val="FF0000"/>
+        </w:rPr>
+        <w:t>{%p endif %}</w:t>
       </w:r>
     </w:p>
     <w:p>
@@ -269,6 +310,7 @@
         <w:rPr>
           <w:color w:val="FF0000"/>
         </w:rPr>
+        <w:lastRenderedPageBreak/>
         <w:t>{%p if type_of_response['wrong state'] and (user_need == 'answer custody' and not jurisdiction) %}</w:t>
       </w:r>
     </w:p>
@@ -315,7 +357,6 @@
         <w:ind w:left="540"/>
       </w:pPr>
       <w:r>
-        <w:lastRenderedPageBreak/>
         <w:t xml:space="preserve">Fill out the </w:t>
       </w:r>
       <w:r>
@@ -325,16 +366,11 @@
         <w:t>Motion to Dismiss</w:t>
       </w:r>
       <w:r>
-        <w:t xml:space="preserve"> forms that ask the court to dismiss your case. Read  {{ </w:t>
-      </w:r>
-      <w:proofErr w:type="spellStart"/>
-      <w:r>
-        <w:t>dismiss_</w:t>
+        <w:t xml:space="preserve"> forms that ask the court to dismiss your case. Read  {{ dismiss_</w:t>
       </w:r>
       <w:r>
         <w:t>step.subject</w:t>
       </w:r>
-      <w:proofErr w:type="spellEnd"/>
       <w:r>
         <w:t xml:space="preserve"> }}: File a motion to dismiss your Alaska case.</w:t>
       </w:r>
@@ -413,7 +449,7 @@
             <w:rStyle w:val="Hyperlink"/>
             <w:spacing w:val="0"/>
           </w:rPr>
-          <w:t>Fill-In</w:t>
+          <w:t>Fill in</w:t>
         </w:r>
         <w:r>
           <w:rPr>
@@ -505,7 +541,7 @@
             <w:rStyle w:val="Hyperlink"/>
             <w:spacing w:val="0"/>
           </w:rPr>
-          <w:t>Fill-In</w:t>
+          <w:t>Fill in</w:t>
         </w:r>
         <w:r>
           <w:rPr>
@@ -645,6 +681,7 @@
         <w:rPr>
           <w:b/>
         </w:rPr>
+        <w:lastRenderedPageBreak/>
         <w:t>ANSWER AND COUNTERCLAIM TO COMPLAINT FOR DIVORCE WITHOUT CHILDREN, DR-837</w:t>
       </w:r>
       <w:r>
@@ -659,7 +696,7 @@
             <w:rStyle w:val="Hyperlink"/>
             <w:spacing w:val="0"/>
           </w:rPr>
-          <w:t>Fill-In</w:t>
+          <w:t>Fill in</w:t>
         </w:r>
         <w:r>
           <w:rPr>
@@ -734,23 +771,7 @@
             <w:rStyle w:val="Hyperlink"/>
             <w:spacing w:val="0"/>
           </w:rPr>
-          <w:t>courts.alaska.gov/</w:t>
-        </w:r>
-        <w:proofErr w:type="spellStart"/>
-        <w:r>
-          <w:rPr>
-            <w:rStyle w:val="Hyperlink"/>
-            <w:spacing w:val="0"/>
-          </w:rPr>
-          <w:t>shc</w:t>
-        </w:r>
-        <w:proofErr w:type="spellEnd"/>
-        <w:r>
-          <w:rPr>
-            <w:rStyle w:val="Hyperlink"/>
-            <w:spacing w:val="0"/>
-          </w:rPr>
-          <w:t>/family/docs/shc-095.doc</w:t>
+          <w:t>courts.alaska.gov/shc/family/docs/shc-095.doc</w:t>
         </w:r>
       </w:hyperlink>
       <w:r>
@@ -778,23 +799,7 @@
             <w:rStyle w:val="Hyperlink"/>
             <w:spacing w:val="0"/>
           </w:rPr>
-          <w:t>courts.alaska.gov/</w:t>
-        </w:r>
-        <w:proofErr w:type="spellStart"/>
-        <w:r>
-          <w:rPr>
-            <w:rStyle w:val="Hyperlink"/>
-            <w:spacing w:val="0"/>
-          </w:rPr>
-          <w:t>shc</w:t>
-        </w:r>
-        <w:proofErr w:type="spellEnd"/>
-        <w:r>
-          <w:rPr>
-            <w:rStyle w:val="Hyperlink"/>
-            <w:spacing w:val="0"/>
-          </w:rPr>
-          <w:t>/family/docs/shc-095n.pdf</w:t>
+          <w:t>courts.alaska.gov/shc/family/docs/shc-095n.pdf</w:t>
         </w:r>
       </w:hyperlink>
     </w:p>
@@ -985,6 +990,7 @@
         <w:ind w:left="540"/>
       </w:pPr>
       <w:r>
+        <w:lastRenderedPageBreak/>
         <w:t>If you agree with what {{ other_party_in_case }} asked for in their complaint, check the box in this section that says you "agree with all of the statements in the complaint."</w:t>
       </w:r>
     </w:p>
@@ -1020,7 +1026,6 @@
         <w:rPr>
           <w:color w:val="FFC000"/>
         </w:rPr>
-        <w:lastRenderedPageBreak/>
         <w:t>{%p else %}</w:t>
       </w:r>
     </w:p>
@@ -1208,6 +1213,7 @@
         <w:ind w:left="540"/>
       </w:pPr>
       <w:r>
+        <w:lastRenderedPageBreak/>
         <w:t>Check the boxes that explain why you think Alaska is the wrong state to decide custody of your children.</w:t>
       </w:r>
     </w:p>
@@ -1256,11 +1262,7 @@
         <w:ind w:left="540"/>
       </w:pPr>
       <w:r>
-        <w:t xml:space="preserve">Check the {{ 'boxes that say' if minor_children else '' }}{{ 'boxes that say' if not minor_children and wife_is_pregnant in ('husband', 'not husband') else '' }}{{ 'box </w:t>
-      </w:r>
-      <w:r>
-        <w:lastRenderedPageBreak/>
-        <w:t>that says' if not minor_children and wife_is_pregnant == 'not pregnant' else '' }} you attached a Motion to Dismiss.</w:t>
+        <w:t>Check the {{ 'boxes that say' if minor_children else '' }}{{ 'boxes that say' if not minor_children and wife_is_pregnant in ('husband', 'not husband') else '' }}{{ 'box that says' if not minor_children and wife_is_pregnant == 'not pregnant' else '' }} you attached a Motion to Dismiss.</w:t>
       </w:r>
     </w:p>
     <w:p>
@@ -1494,6 +1496,7 @@
         <w:ind w:left="540"/>
       </w:pPr>
       <w:r>
+        <w:lastRenderedPageBreak/>
         <w:t>Check the box at the beginning of the section that states, "I have no affirmative defenses."</w:t>
       </w:r>
     </w:p>
@@ -1579,7 +1582,6 @@
         <w:rPr>
           <w:color w:val="FFC000"/>
         </w:rPr>
-        <w:lastRenderedPageBreak/>
         <w:t>{%p if user_need == 'answer custody' and not jurisdiction %}</w:t>
       </w:r>
     </w:p>
@@ -1740,6 +1742,7 @@
         <w:pStyle w:val="Body"/>
       </w:pPr>
       <w:r>
+        <w:lastRenderedPageBreak/>
         <w:t>If you think the Alaska court should hear the case, use section 5 to tell the judge there are 2 cases and why you think the case should move forward in Alaska.</w:t>
       </w:r>
     </w:p>
@@ -1759,7 +1762,13 @@
         <w:pStyle w:val="Body"/>
       </w:pPr>
       <w:r>
-        <w:t>Include where the children have lived the last 6 months.</w:t>
+        <w:t xml:space="preserve">Include where </w:t>
+      </w:r>
+      <w:r>
+        <w:t>your</w:t>
+      </w:r>
+      <w:r>
+        <w:t xml:space="preserve"> children have lived the last 6 months.</w:t>
       </w:r>
     </w:p>
     <w:p>
@@ -1806,7 +1815,6 @@
         <w:rPr>
           <w:color w:val="FFC000"/>
         </w:rPr>
-        <w:lastRenderedPageBreak/>
         <w:t>{%p endif %}</w:t>
       </w:r>
     </w:p>
@@ -1965,6 +1973,7 @@
         <w:rPr>
           <w:color w:val="FF0000"/>
         </w:rPr>
+        <w:lastRenderedPageBreak/>
         <w:t>{%p endif %}</w:t>
       </w:r>
     </w:p>
@@ -2043,7 +2052,7 @@
             <w:rStyle w:val="Hyperlink"/>
             <w:spacing w:val="0"/>
           </w:rPr>
-          <w:t>Fill-In</w:t>
+          <w:t>Fill in</w:t>
         </w:r>
         <w:r>
           <w:rPr>
@@ -2082,7 +2091,7 @@
         <w:ind w:left="900"/>
       </w:pPr>
       <w:r>
-        <w:t>Fill-In</w:t>
+        <w:t>Fill in</w:t>
       </w:r>
       <w:r>
         <w:t xml:space="preserve"> the title, "accepting a late Answer". And</w:t>
@@ -2120,7 +2129,6 @@
         <w:rPr>
           <w:color w:val="FFC000"/>
         </w:rPr>
-        <w:lastRenderedPageBreak/>
         <w:t>{%p if stage_of_default == 'hearing scheduled' %}</w:t>
       </w:r>
     </w:p>
@@ -2146,7 +2154,7 @@
             <w:rStyle w:val="Hyperlink"/>
             <w:spacing w:val="0"/>
           </w:rPr>
-          <w:t>Fill-In</w:t>
+          <w:t>Fill in</w:t>
         </w:r>
         <w:r>
           <w:rPr>
@@ -2271,17 +2279,8 @@
             <w:rStyle w:val="Hyperlink"/>
             <w:spacing w:val="0"/>
           </w:rPr>
-          <w:t>ak-courts.info/</w:t>
+          <w:t>ak-courts.info/findlawyer</w:t>
         </w:r>
-        <w:proofErr w:type="spellStart"/>
-        <w:r>
-          <w:rPr>
-            <w:rStyle w:val="Hyperlink"/>
-            <w:spacing w:val="0"/>
-          </w:rPr>
-          <w:t>findlawyer</w:t>
-        </w:r>
-        <w:proofErr w:type="spellEnd"/>
       </w:hyperlink>
       <w:r>
         <w:t>.</w:t>
@@ -2317,7 +2316,7 @@
             <w:rStyle w:val="Hyperlink"/>
             <w:spacing w:val="0"/>
           </w:rPr>
-          <w:t>Fill-In</w:t>
+          <w:t>Fill in</w:t>
         </w:r>
         <w:r>
           <w:rPr>
@@ -2399,6 +2398,7 @@
         <w:rPr>
           <w:color w:val="FF0000"/>
         </w:rPr>
+        <w:lastRenderedPageBreak/>
         <w:t>{%p if user_need == 'answer custody' or (user_need == 'answer divorce' and (minor_children or (not minor_children and wife_is_pregnant in ('husband', 'not husband')))) %}</w:t>
       </w:r>
     </w:p>
@@ -2421,7 +2421,7 @@
             <w:rStyle w:val="Hyperlink"/>
             <w:spacing w:val="0"/>
           </w:rPr>
-          <w:t>Fill-In</w:t>
+          <w:t>Fill in</w:t>
         </w:r>
         <w:r>
           <w:rPr>
@@ -2496,7 +2496,7 @@
             <w:rStyle w:val="Hyperlink"/>
             <w:spacing w:val="0"/>
           </w:rPr>
-          <w:t>Fill-In</w:t>
+          <w:t>Fill in</w:t>
         </w:r>
         <w:r>
           <w:rPr>
@@ -2570,148 +2570,134 @@
         <w:ind w:left="540"/>
       </w:pPr>
       <w:r>
+        <w:t xml:space="preserve">Attach your most recent tax return and pay stubs to the </w:t>
+      </w:r>
+      <w:r>
+        <w:rPr>
+          <w:b/>
+        </w:rPr>
+        <w:t>Child Support Guidelines Affidavit</w:t>
+      </w:r>
+      <w:r>
+        <w:t>.</w:t>
+      </w:r>
+    </w:p>
+    <w:p>
+      <w:pPr>
+        <w:pStyle w:val="Body"/>
+      </w:pPr>
+      <w:r>
+        <w:rPr>
+          <w:color w:val="FF0000"/>
+        </w:rPr>
+        <w:t>{%p endif %}</w:t>
+      </w:r>
+    </w:p>
+    <w:p>
+      <w:pPr>
+        <w:pStyle w:val="Body"/>
+      </w:pPr>
+      <w:r>
+        <w:rPr>
+          <w:color w:val="FF0000"/>
+        </w:rPr>
+        <w:t>{%p if (user_need == 'answer custody' and (type_of_response.all_true('ak custody case', exclusive=True) or type_of_response.all_true('ak custody case', 'improper service', exclusive=True))) or (user_need == 'answer divorce' and (type_of_response.all_true('ak divorce case', exclusive=True) or type_of_response.all_true('ak divorce case', 'improper service', exclusive=True))) %}</w:t>
+      </w:r>
+    </w:p>
+    <w:p>
+      <w:pPr>
+        <w:pStyle w:val="Body"/>
+      </w:pPr>
+      <w:r>
+        <w:rPr>
+          <w:color w:val="FFC000"/>
+        </w:rPr>
+        <w:t>{%p if (case_type in ('custody', 'divorce') or (case_type == 'legal separation' and want_legal_separation == 'yes')) %}</w:t>
+      </w:r>
+    </w:p>
+    <w:p>
+      <w:pPr>
+        <w:pStyle w:val="Body"/>
+      </w:pPr>
+      <w:r>
+        <w:rPr>
+          <w:color w:val="92D050"/>
+        </w:rPr>
+        <w:t>{%p if response_to_complaint in ('agree', 'some') %}</w:t>
+      </w:r>
+    </w:p>
+    <w:p>
+      <w:pPr>
+        <w:pStyle w:val="Heading3"/>
+      </w:pPr>
+      <w:r>
+        <w:t>Forms to use if you and {{ other_party_in_case }} write out your agreement</w:t>
+      </w:r>
+    </w:p>
+    <w:p>
+      <w:pPr>
+        <w:pStyle w:val="Body"/>
+      </w:pPr>
+      <w:r>
+        <w:t>If you want to work with {{ other_party_in_case }} to write out the agreement and both sign it, use:</w:t>
+      </w:r>
+    </w:p>
+    <w:p>
+      <w:pPr>
+        <w:pStyle w:val="Body"/>
+      </w:pPr>
+      <w:r>
+        <w:rPr>
+          <w:color w:val="92D050"/>
+        </w:rPr>
+        <w:t>{%p elif response_to_complaint == 'none' and want_help_to_agree %}</w:t>
+      </w:r>
+    </w:p>
+    <w:p>
+      <w:pPr>
+        <w:pStyle w:val="Heading3"/>
+      </w:pPr>
+      <w:r>
+        <w:t>Forms to use if you reach an agreement</w:t>
+      </w:r>
+    </w:p>
+    <w:p>
+      <w:pPr>
+        <w:pStyle w:val="Body"/>
+      </w:pPr>
+      <w:r>
+        <w:rPr>
+          <w:color w:val="92D050"/>
+        </w:rPr>
+        <w:t>{%p endif %}</w:t>
+      </w:r>
+    </w:p>
+    <w:p>
+      <w:pPr>
+        <w:pStyle w:val="Body"/>
+      </w:pPr>
+      <w:r>
+        <w:rPr>
+          <w:color w:val="92D050"/>
+        </w:rPr>
+        <w:t>{%p if user_need == 'answer custody' or (user_need == 'answer divorce' and (minor_children or (not minor_children and wife_is_pregnant in (</w:t>
+      </w:r>
+      <w:r>
+        <w:rPr>
+          <w:color w:val="92D050"/>
+        </w:rPr>
+        <w:t>'husband', 'not husband')))) %}</w:t>
+      </w:r>
+    </w:p>
+    <w:p>
+      <w:pPr>
+        <w:pStyle w:val="Body"/>
+      </w:pPr>
+      <w:r>
+        <w:rPr>
+          <w:b/>
+        </w:rPr>
         <w:lastRenderedPageBreak/>
-        <w:t xml:space="preserve">Attach your most recent tax return and pay stubs to the </w:t>
-      </w:r>
-      <w:r>
-        <w:rPr>
-          <w:b/>
-        </w:rPr>
-        <w:t>Child Support Guidelines Affidavit</w:t>
-      </w:r>
-      <w:r>
-        <w:t>.</w:t>
-      </w:r>
-    </w:p>
-    <w:p>
-      <w:pPr>
-        <w:pStyle w:val="Body"/>
-      </w:pPr>
-      <w:r>
-        <w:rPr>
-          <w:color w:val="FF0000"/>
-        </w:rPr>
-        <w:t>{%p endif %}</w:t>
-      </w:r>
-    </w:p>
-    <w:p>
-      <w:pPr>
-        <w:pStyle w:val="Body"/>
-      </w:pPr>
-      <w:r>
-        <w:rPr>
-          <w:color w:val="FF0000"/>
-        </w:rPr>
-        <w:t>{%p if (user_need == 'answer custody' and (type_of_response.all_true('ak custody case', exclusive=True) or type_of_response.all_true('ak custody case', 'improper service', exclusive=True))) or (user_need == 'answer divorce' and (type_of_response.all_true('ak divorce case', exclusive=True) or type_of_response.all_true('ak divorce case', 'improper service', exclusive=True))) %}</w:t>
-      </w:r>
-    </w:p>
-    <w:p>
-      <w:pPr>
-        <w:pStyle w:val="Body"/>
-      </w:pPr>
-      <w:r>
-        <w:rPr>
-          <w:color w:val="FFC000"/>
-        </w:rPr>
-        <w:t>{%p if (case_type in ('custody', 'divorce') or (case_type == 'legal separation' and want_legal_separation == 'yes')) %}</w:t>
-      </w:r>
-    </w:p>
-    <w:p>
-      <w:pPr>
-        <w:pStyle w:val="Body"/>
-      </w:pPr>
-      <w:r>
-        <w:rPr>
-          <w:color w:val="92D050"/>
-        </w:rPr>
-        <w:t>{%p if response_to_complaint in ('agree', 'some') %}</w:t>
-      </w:r>
-    </w:p>
-    <w:p>
-      <w:pPr>
-        <w:pStyle w:val="Heading3"/>
-      </w:pPr>
-      <w:r>
-        <w:t>Forms to use if you and {{ other_party_in_case }} write out your agreement</w:t>
-      </w:r>
-    </w:p>
-    <w:p>
-      <w:pPr>
-        <w:pStyle w:val="Body"/>
-      </w:pPr>
-      <w:r>
-        <w:t>If you want to work with {{ other_party_in_case }} to write out the agreement and both sign it, use:</w:t>
-      </w:r>
-    </w:p>
-    <w:p>
-      <w:pPr>
-        <w:pStyle w:val="Body"/>
-      </w:pPr>
-      <w:r>
-        <w:rPr>
-          <w:color w:val="92D050"/>
-        </w:rPr>
-        <w:t xml:space="preserve">{%p elif response_to_complaint == 'none' and </w:t>
-      </w:r>
-      <w:proofErr w:type="spellStart"/>
-      <w:r>
-        <w:rPr>
-          <w:color w:val="92D050"/>
-        </w:rPr>
-        <w:t>want_help_to_agree</w:t>
-      </w:r>
-      <w:proofErr w:type="spellEnd"/>
-      <w:r>
-        <w:rPr>
-          <w:color w:val="92D050"/>
-        </w:rPr>
-        <w:t xml:space="preserve"> %}</w:t>
-      </w:r>
-    </w:p>
-    <w:p>
-      <w:pPr>
-        <w:pStyle w:val="Heading3"/>
-      </w:pPr>
-      <w:r>
-        <w:t>Forms to use if you reach an agreement</w:t>
-      </w:r>
-    </w:p>
-    <w:p>
-      <w:pPr>
-        <w:pStyle w:val="Body"/>
-      </w:pPr>
-      <w:r>
-        <w:rPr>
-          <w:color w:val="92D050"/>
-        </w:rPr>
-        <w:t>{%p endif %}</w:t>
-      </w:r>
-    </w:p>
-    <w:p>
-      <w:pPr>
-        <w:pStyle w:val="Body"/>
-      </w:pPr>
-      <w:r>
-        <w:rPr>
-          <w:color w:val="92D050"/>
-        </w:rPr>
-        <w:t>{%p if user_need == 'answer custody' or (user_need == 'answer divorce' and (minor_children or (not minor_children and wife_is_pregnant in (</w:t>
-      </w:r>
-      <w:r>
-        <w:rPr>
-          <w:color w:val="92D050"/>
-        </w:rPr>
-        <w:t>'husband', 'not husband')))) %}</w:t>
-      </w:r>
-    </w:p>
-    <w:p>
-      <w:pPr>
-        <w:pStyle w:val="Body"/>
-      </w:pPr>
-      <w:r>
-        <w:rPr>
-          <w:b/>
-        </w:rPr>
         <w:t>Parenting Plan Agreement &amp; Order, SHC-1128</w:t>
       </w:r>
       <w:r>
@@ -2741,23 +2727,7 @@
             <w:rStyle w:val="Hyperlink"/>
             <w:spacing w:val="0"/>
           </w:rPr>
-          <w:t>courts.alaska.gov/</w:t>
-        </w:r>
-        <w:proofErr w:type="spellStart"/>
-        <w:r>
-          <w:rPr>
-            <w:rStyle w:val="Hyperlink"/>
-            <w:spacing w:val="0"/>
-          </w:rPr>
-          <w:t>shc</w:t>
-        </w:r>
-        <w:proofErr w:type="spellEnd"/>
-        <w:r>
-          <w:rPr>
-            <w:rStyle w:val="Hyperlink"/>
-            <w:spacing w:val="0"/>
-          </w:rPr>
-          <w:t>/family/docs/shc-1128.doc</w:t>
+          <w:t>courts.alaska.gov/shc/family/docs/shc-1128.doc</w:t>
         </w:r>
       </w:hyperlink>
       <w:r>
@@ -2785,23 +2755,7 @@
             <w:rStyle w:val="Hyperlink"/>
             <w:spacing w:val="0"/>
           </w:rPr>
-          <w:t>courts.alaska.gov/</w:t>
-        </w:r>
-        <w:proofErr w:type="spellStart"/>
-        <w:r>
-          <w:rPr>
-            <w:rStyle w:val="Hyperlink"/>
-            <w:spacing w:val="0"/>
-          </w:rPr>
-          <w:t>shc</w:t>
-        </w:r>
-        <w:proofErr w:type="spellEnd"/>
-        <w:r>
-          <w:rPr>
-            <w:rStyle w:val="Hyperlink"/>
-            <w:spacing w:val="0"/>
-          </w:rPr>
-          <w:t>/family/docs/shc-1128n.pdf</w:t>
+          <w:t>courts.alaska.gov/shc/family/docs/shc-1128n.pdf</w:t>
         </w:r>
       </w:hyperlink>
     </w:p>
@@ -2856,7 +2810,15 @@
             <w:bCs/>
             <w:spacing w:val="0"/>
           </w:rPr>
-          <w:t>Fill-In PDF</w:t>
+          <w:t>Fill in</w:t>
+        </w:r>
+        <w:r>
+          <w:rPr>
+            <w:rStyle w:val="Hyperlink"/>
+            <w:bCs/>
+            <w:spacing w:val="0"/>
+          </w:rPr>
+          <w:t xml:space="preserve"> PDF</w:t>
         </w:r>
       </w:hyperlink>
       <w:r>
@@ -2922,7 +2884,6 @@
         <w:rPr>
           <w:color w:val="FF0000"/>
         </w:rPr>
-        <w:lastRenderedPageBreak/>
         <w:t>{%p if user_need == 'answer custody' %}</w:t>
       </w:r>
     </w:p>
@@ -2945,7 +2906,7 @@
             <w:rStyle w:val="Hyperlink"/>
             <w:spacing w:val="0"/>
           </w:rPr>
-          <w:t>Fill-In</w:t>
+          <w:t>Fill in</w:t>
         </w:r>
         <w:r>
           <w:rPr>
@@ -3064,7 +3025,7 @@
             <w:rStyle w:val="Hyperlink"/>
             <w:spacing w:val="0"/>
           </w:rPr>
-          <w:t>Fill-In</w:t>
+          <w:t>Fill in</w:t>
         </w:r>
         <w:r>
           <w:rPr>
@@ -3140,23 +3101,7 @@
             <w:rStyle w:val="Hyperlink"/>
             <w:spacing w:val="0"/>
           </w:rPr>
-          <w:t>courts.alaska.gov/</w:t>
-        </w:r>
-        <w:proofErr w:type="spellStart"/>
-        <w:r>
-          <w:rPr>
-            <w:rStyle w:val="Hyperlink"/>
-            <w:spacing w:val="0"/>
-          </w:rPr>
-          <w:t>shc</w:t>
-        </w:r>
-        <w:proofErr w:type="spellEnd"/>
-        <w:r>
-          <w:rPr>
-            <w:rStyle w:val="Hyperlink"/>
-            <w:spacing w:val="0"/>
-          </w:rPr>
-          <w:t>/family/docs/shc-094.doc</w:t>
+          <w:t>courts.alaska.gov/shc/family/docs/shc-094.doc</w:t>
         </w:r>
       </w:hyperlink>
       <w:r>
@@ -3180,23 +3125,7 @@
             <w:rStyle w:val="Hyperlink"/>
             <w:spacing w:val="0"/>
           </w:rPr>
-          <w:t>courts.alaska.gov/</w:t>
-        </w:r>
-        <w:proofErr w:type="spellStart"/>
-        <w:r>
-          <w:rPr>
-            <w:rStyle w:val="Hyperlink"/>
-            <w:spacing w:val="0"/>
-          </w:rPr>
-          <w:t>shc</w:t>
-        </w:r>
-        <w:proofErr w:type="spellEnd"/>
-        <w:r>
-          <w:rPr>
-            <w:rStyle w:val="Hyperlink"/>
-            <w:spacing w:val="0"/>
-          </w:rPr>
-          <w:t>/family/docs/shc-094n.pdf</w:t>
+          <w:t>courts.alaska.gov/shc/family/docs/shc-094n.pdf</w:t>
         </w:r>
       </w:hyperlink>
     </w:p>
@@ -3250,6 +3179,7 @@
         <w:rPr>
           <w:b/>
         </w:rPr>
+        <w:lastRenderedPageBreak/>
         <w:t>ANSWER AND COUNTERCLAIM TO COMPLAINT FOR DIVORCE WITHOUT CHILDREN, DR-837</w:t>
       </w:r>
       <w:r>
@@ -3261,7 +3191,7 @@
             <w:rStyle w:val="Hyperlink"/>
             <w:spacing w:val="0"/>
           </w:rPr>
-          <w:t>Fill-In</w:t>
+          <w:t>Fill in</w:t>
         </w:r>
         <w:r>
           <w:rPr>
@@ -3338,23 +3268,7 @@
             <w:rStyle w:val="Hyperlink"/>
             <w:spacing w:val="0"/>
           </w:rPr>
-          <w:t>courts.alaska.gov/</w:t>
-        </w:r>
-        <w:proofErr w:type="spellStart"/>
-        <w:r>
-          <w:rPr>
-            <w:rStyle w:val="Hyperlink"/>
-            <w:spacing w:val="0"/>
-          </w:rPr>
-          <w:t>shc</w:t>
-        </w:r>
-        <w:proofErr w:type="spellEnd"/>
-        <w:r>
-          <w:rPr>
-            <w:rStyle w:val="Hyperlink"/>
-            <w:spacing w:val="0"/>
-          </w:rPr>
-          <w:t>/family/docs/shc-095.doc</w:t>
+          <w:t>courts.alaska.gov/shc/family/docs/shc-095.doc</w:t>
         </w:r>
       </w:hyperlink>
       <w:r>
@@ -3378,23 +3292,7 @@
             <w:rStyle w:val="Hyperlink"/>
             <w:spacing w:val="0"/>
           </w:rPr>
-          <w:t>courts.alaska.gov/</w:t>
-        </w:r>
-        <w:proofErr w:type="spellStart"/>
-        <w:r>
-          <w:rPr>
-            <w:rStyle w:val="Hyperlink"/>
-            <w:spacing w:val="0"/>
-          </w:rPr>
-          <w:t>shc</w:t>
-        </w:r>
-        <w:proofErr w:type="spellEnd"/>
-        <w:r>
-          <w:rPr>
-            <w:rStyle w:val="Hyperlink"/>
-            <w:spacing w:val="0"/>
-          </w:rPr>
-          <w:t>/family/docs/shc-095n.pdf</w:t>
+          <w:t>courts.alaska.gov/shc/family/docs/shc-095n.pdf</w:t>
         </w:r>
       </w:hyperlink>
     </w:p>
@@ -3445,7 +3343,6 @@
         <w:rPr>
           <w:color w:val="FF0000"/>
         </w:rPr>
-        <w:lastRenderedPageBreak/>
         <w:t>{%p if type_of_response['default'] and stage_of_default in ('application filed', 'hearing scheduled') %}</w:t>
       </w:r>
     </w:p>
@@ -3485,7 +3382,7 @@
             <w:rStyle w:val="Hyperlink"/>
             <w:spacing w:val="0"/>
           </w:rPr>
-          <w:t>Fill-In</w:t>
+          <w:t>Fill in</w:t>
         </w:r>
         <w:r>
           <w:rPr>
@@ -3552,7 +3449,7 @@
             <w:rStyle w:val="Hyperlink"/>
             <w:spacing w:val="0"/>
           </w:rPr>
-          <w:t>Fill-In</w:t>
+          <w:t>Fill in</w:t>
         </w:r>
         <w:r>
           <w:rPr>
@@ -3636,17 +3533,8 @@
             <w:rStyle w:val="Hyperlink"/>
             <w:spacing w:val="0"/>
           </w:rPr>
-          <w:t>ak-courts.info/</w:t>
+          <w:t>ak-courts.info/findlawyer</w:t>
         </w:r>
-        <w:proofErr w:type="spellStart"/>
-        <w:r>
-          <w:rPr>
-            <w:rStyle w:val="Hyperlink"/>
-            <w:spacing w:val="0"/>
-          </w:rPr>
-          <w:t>findlawyer</w:t>
-        </w:r>
-        <w:proofErr w:type="spellEnd"/>
       </w:hyperlink>
     </w:p>
     <w:p>

</xml_diff>

<commit_message>
fixed extra endif in answer_content.docx breaking tests on github tests but not in playground?
</commit_message>
<xml_diff>
--- a/docassemble/AKA2JBranding/data/templates/answer_content.docx
+++ b/docassemble/AKA2JBranding/data/templates/answer_content.docx
@@ -33,17 +33,6 @@
         <w:pStyle w:val="Body"/>
       </w:pPr>
       <w:r>
-        <w:rPr>
-          <w:color w:val="FF0000"/>
-        </w:rPr>
-        <w:t>{%p endif %}</w:t>
-      </w:r>
-    </w:p>
-    <w:p>
-      <w:pPr>
-        <w:pStyle w:val="Body"/>
-      </w:pPr>
-      <w:r>
         <w:t>1.</w:t>
       </w:r>
       <w:r>
@@ -72,7 +61,11 @@
         <w:t xml:space="preserve">Give a copy of the forms to {{ other_party_in_case }}. See </w:t>
       </w:r>
       <w:r>
-        <w:t>{{ truefiling_serve</w:t>
+        <w:t xml:space="preserve">{{ </w:t>
+      </w:r>
+      <w:proofErr w:type="spellStart"/>
+      <w:r>
+        <w:t>truefiling_serve</w:t>
       </w:r>
       <w:r>
         <w:t>_step</w:t>
@@ -80,6 +73,7 @@
       <w:r>
         <w:t>.subject</w:t>
       </w:r>
+      <w:proofErr w:type="spellEnd"/>
       <w:r>
         <w:t xml:space="preserve"> }}.</w:t>
       </w:r>
@@ -310,15 +304,15 @@
         <w:rPr>
           <w:color w:val="FF0000"/>
         </w:rPr>
+        <w:t>{%p if type_of_response['wrong state'] and (user_need == 'answer custody' and not jurisdiction) %}</w:t>
+      </w:r>
+    </w:p>
+    <w:p>
+      <w:pPr>
+        <w:pStyle w:val="Body"/>
+      </w:pPr>
+      <w:r>
         <w:lastRenderedPageBreak/>
-        <w:t>{%p if type_of_response['wrong state'] and (user_need == 'answer custody' and not jurisdiction) %}</w:t>
-      </w:r>
-    </w:p>
-    <w:p>
-      <w:pPr>
-        <w:pStyle w:val="Body"/>
-      </w:pPr>
-      <w:r>
         <w:t xml:space="preserve">If you think Alaska is not the "home state," you can ask </w:t>
       </w:r>
       <w:r>
@@ -366,11 +360,16 @@
         <w:t>Motion to Dismiss</w:t>
       </w:r>
       <w:r>
-        <w:t xml:space="preserve"> forms that ask the court to dismiss your case. Read  {{ dismiss_</w:t>
+        <w:t xml:space="preserve"> forms that ask the court to dismiss your case. Read  {{ </w:t>
+      </w:r>
+      <w:proofErr w:type="spellStart"/>
+      <w:r>
+        <w:t>dismiss_</w:t>
       </w:r>
       <w:r>
         <w:t>step.subject</w:t>
       </w:r>
+      <w:proofErr w:type="spellEnd"/>
       <w:r>
         <w:t xml:space="preserve"> }}: File a motion to dismiss your Alaska case.</w:t>
       </w:r>
@@ -586,7 +585,21 @@
         <w:rPr>
           <w:b/>
         </w:rPr>
-        <w:t>Answer &amp; Counterclaim to Legal Separation With Children, SHC-094</w:t>
+        <w:t xml:space="preserve">Answer &amp; Counterclaim to Legal Separation </w:t>
+      </w:r>
+      <w:proofErr w:type="gramStart"/>
+      <w:r>
+        <w:rPr>
+          <w:b/>
+        </w:rPr>
+        <w:t>With</w:t>
+      </w:r>
+      <w:proofErr w:type="gramEnd"/>
+      <w:r>
+        <w:rPr>
+          <w:b/>
+        </w:rPr>
+        <w:t xml:space="preserve"> Children, SHC-094</w:t>
       </w:r>
       <w:r>
         <w:t xml:space="preserve"> </w:t>
@@ -681,66 +694,66 @@
         <w:rPr>
           <w:b/>
         </w:rPr>
+        <w:t>ANSWER AND COUNTERCLAIM TO COMPLAINT FOR DIVORCE WITHOUT CHILDREN, DR-837</w:t>
+      </w:r>
+      <w:r>
+        <w:t xml:space="preserve"> </w:t>
+      </w:r>
+      <w:r>
+        <w:t>[</w:t>
+      </w:r>
+      <w:hyperlink r:id="rId13" w:history="1">
+        <w:r>
+          <w:rPr>
+            <w:rStyle w:val="Hyperlink"/>
+            <w:spacing w:val="0"/>
+          </w:rPr>
+          <w:t>Fill in</w:t>
+        </w:r>
+        <w:r>
+          <w:rPr>
+            <w:rStyle w:val="Hyperlink"/>
+            <w:spacing w:val="0"/>
+          </w:rPr>
+          <w:t xml:space="preserve"> PDF</w:t>
+        </w:r>
+      </w:hyperlink>
+      <w:r>
+        <w:t>]</w:t>
+      </w:r>
+      <w:r>
+        <w:br/>
+      </w:r>
+      <w:hyperlink r:id="rId14" w:history="1">
+        <w:r>
+          <w:rPr>
+            <w:rStyle w:val="Hyperlink"/>
+            <w:spacing w:val="0"/>
+          </w:rPr>
+          <w:t>ak-courts.info/dr837</w:t>
+        </w:r>
+      </w:hyperlink>
+    </w:p>
+    <w:p>
+      <w:pPr>
+        <w:pStyle w:val="Body"/>
+      </w:pPr>
+      <w:r>
+        <w:rPr>
+          <w:color w:val="92D050"/>
+        </w:rPr>
+        <w:t>{%p elif case_type == 'legal separation' %}</w:t>
+      </w:r>
+    </w:p>
+    <w:p>
+      <w:pPr>
+        <w:pStyle w:val="Body"/>
+      </w:pPr>
+      <w:r>
+        <w:rPr>
+          <w:b/>
+        </w:rPr>
         <w:lastRenderedPageBreak/>
-        <w:t>ANSWER AND COUNTERCLAIM TO COMPLAINT FOR DIVORCE WITHOUT CHILDREN, DR-837</w:t>
-      </w:r>
-      <w:r>
-        <w:t xml:space="preserve"> </w:t>
-      </w:r>
-      <w:r>
-        <w:t>[</w:t>
-      </w:r>
-      <w:hyperlink r:id="rId13" w:history="1">
-        <w:r>
-          <w:rPr>
-            <w:rStyle w:val="Hyperlink"/>
-            <w:spacing w:val="0"/>
-          </w:rPr>
-          <w:t>Fill in</w:t>
-        </w:r>
-        <w:r>
-          <w:rPr>
-            <w:rStyle w:val="Hyperlink"/>
-            <w:spacing w:val="0"/>
-          </w:rPr>
-          <w:t xml:space="preserve"> PDF</w:t>
-        </w:r>
-      </w:hyperlink>
-      <w:r>
-        <w:t>]</w:t>
-      </w:r>
-      <w:r>
-        <w:br/>
-      </w:r>
-      <w:hyperlink r:id="rId14" w:history="1">
-        <w:r>
-          <w:rPr>
-            <w:rStyle w:val="Hyperlink"/>
-            <w:spacing w:val="0"/>
-          </w:rPr>
-          <w:t>ak-courts.info/dr837</w:t>
-        </w:r>
-      </w:hyperlink>
-    </w:p>
-    <w:p>
-      <w:pPr>
-        <w:pStyle w:val="Body"/>
-      </w:pPr>
-      <w:r>
-        <w:rPr>
-          <w:color w:val="92D050"/>
-        </w:rPr>
-        <w:t>{%p elif case_type == 'legal separation' %}</w:t>
-      </w:r>
-    </w:p>
-    <w:p>
-      <w:pPr>
-        <w:pStyle w:val="Body"/>
-      </w:pPr>
-      <w:r>
-        <w:rPr>
-          <w:b/>
-        </w:rPr>
         <w:t>Answer &amp; Counterclaim to Legal Separation Without Children, SHC-095</w:t>
       </w:r>
       <w:r>
@@ -771,7 +784,23 @@
             <w:rStyle w:val="Hyperlink"/>
             <w:spacing w:val="0"/>
           </w:rPr>
-          <w:t>courts.alaska.gov/shc/family/docs/shc-095.doc</w:t>
+          <w:t>courts.alaska.gov/</w:t>
+        </w:r>
+        <w:proofErr w:type="spellStart"/>
+        <w:r>
+          <w:rPr>
+            <w:rStyle w:val="Hyperlink"/>
+            <w:spacing w:val="0"/>
+          </w:rPr>
+          <w:t>shc</w:t>
+        </w:r>
+        <w:proofErr w:type="spellEnd"/>
+        <w:r>
+          <w:rPr>
+            <w:rStyle w:val="Hyperlink"/>
+            <w:spacing w:val="0"/>
+          </w:rPr>
+          <w:t>/family/docs/shc-095.doc</w:t>
         </w:r>
       </w:hyperlink>
       <w:r>
@@ -799,7 +828,23 @@
             <w:rStyle w:val="Hyperlink"/>
             <w:spacing w:val="0"/>
           </w:rPr>
-          <w:t>courts.alaska.gov/shc/family/docs/shc-095n.pdf</w:t>
+          <w:t>courts.alaska.gov/</w:t>
+        </w:r>
+        <w:proofErr w:type="spellStart"/>
+        <w:r>
+          <w:rPr>
+            <w:rStyle w:val="Hyperlink"/>
+            <w:spacing w:val="0"/>
+          </w:rPr>
+          <w:t>shc</w:t>
+        </w:r>
+        <w:proofErr w:type="spellEnd"/>
+        <w:r>
+          <w:rPr>
+            <w:rStyle w:val="Hyperlink"/>
+            <w:spacing w:val="0"/>
+          </w:rPr>
+          <w:t>/family/docs/shc-095n.pdf</w:t>
         </w:r>
       </w:hyperlink>
     </w:p>
@@ -990,7 +1035,6 @@
         <w:ind w:left="540"/>
       </w:pPr>
       <w:r>
-        <w:lastRenderedPageBreak/>
         <w:t>If you agree with what {{ other_party_in_case }} asked for in their complaint, check the box in this section that says you "agree with all of the statements in the complaint."</w:t>
       </w:r>
     </w:p>
@@ -1015,6 +1059,7 @@
         <w:ind w:left="540"/>
       </w:pPr>
       <w:r>
+        <w:lastRenderedPageBreak/>
         <w:t>If you disagree with any of the paragraphs in the complaint, list the paragraph numbers you disagree with.</w:t>
       </w:r>
     </w:p>
@@ -1213,7 +1258,6 @@
         <w:ind w:left="540"/>
       </w:pPr>
       <w:r>
-        <w:lastRenderedPageBreak/>
         <w:t>Check the boxes that explain why you think Alaska is the wrong state to decide custody of your children.</w:t>
       </w:r>
     </w:p>
@@ -1262,6 +1306,7 @@
         <w:ind w:left="540"/>
       </w:pPr>
       <w:r>
+        <w:lastRenderedPageBreak/>
         <w:t>Check the {{ 'boxes that say' if minor_children else '' }}{{ 'boxes that say' if not minor_children and wife_is_pregnant in ('husband', 'not husband') else '' }}{{ 'box that says' if not minor_children and wife_is_pregnant == 'not pregnant' else '' }} you attached a Motion to Dismiss.</w:t>
       </w:r>
     </w:p>
@@ -1415,7 +1460,15 @@
         <w:ind w:left="900"/>
       </w:pPr>
       <w:r>
-        <w:t>the case number.</w:t>
+        <w:t xml:space="preserve">the case </w:t>
+      </w:r>
+      <w:proofErr w:type="gramStart"/>
+      <w:r>
+        <w:t>number</w:t>
+      </w:r>
+      <w:proofErr w:type="gramEnd"/>
+      <w:r>
+        <w:t>.</w:t>
       </w:r>
     </w:p>
     <w:p>
@@ -1496,7 +1549,6 @@
         <w:ind w:left="540"/>
       </w:pPr>
       <w:r>
-        <w:lastRenderedPageBreak/>
         <w:t>Check the box at the beginning of the section that states, "I have no affirmative defenses."</w:t>
       </w:r>
     </w:p>
@@ -1557,6 +1609,7 @@
         <w:pStyle w:val="Body"/>
       </w:pPr>
       <w:r>
+        <w:lastRenderedPageBreak/>
         <w:t>Use this section, to tell the court your version of the facts and what y</w:t>
       </w:r>
       <w:r>
@@ -1742,54 +1795,54 @@
         <w:pStyle w:val="Body"/>
       </w:pPr>
       <w:r>
+        <w:t>If you think the Alaska court should hear the case, use section 5 to tell the judge there are 2 cases and why you think the case should move forward in Alaska.</w:t>
+      </w:r>
+    </w:p>
+    <w:p>
+      <w:pPr>
+        <w:pStyle w:val="Body"/>
+      </w:pPr>
+      <w:r>
+        <w:rPr>
+          <w:color w:val="92D050"/>
+        </w:rPr>
+        <w:t>{%p if user_need == 'answer custody' or (user_need == 'answer divorce' and minor_children) %}</w:t>
+      </w:r>
+    </w:p>
+    <w:p>
+      <w:pPr>
+        <w:pStyle w:val="Body"/>
+      </w:pPr>
+      <w:r>
+        <w:t xml:space="preserve">Include where </w:t>
+      </w:r>
+      <w:r>
+        <w:t>your</w:t>
+      </w:r>
+      <w:r>
+        <w:t xml:space="preserve"> children have lived the last 6 months.</w:t>
+      </w:r>
+    </w:p>
+    <w:p>
+      <w:pPr>
+        <w:pStyle w:val="Body"/>
+      </w:pPr>
+      <w:r>
+        <w:rPr>
+          <w:color w:val="92D050"/>
+        </w:rPr>
+        <w:t>{%p endif %}</w:t>
+      </w:r>
+    </w:p>
+    <w:p>
+      <w:pPr>
+        <w:pStyle w:val="Body"/>
+      </w:pPr>
+      <w:r>
+        <w:rPr>
+          <w:color w:val="FFC000"/>
+        </w:rPr>
         <w:lastRenderedPageBreak/>
-        <w:t>If you think the Alaska court should hear the case, use section 5 to tell the judge there are 2 cases and why you think the case should move forward in Alaska.</w:t>
-      </w:r>
-    </w:p>
-    <w:p>
-      <w:pPr>
-        <w:pStyle w:val="Body"/>
-      </w:pPr>
-      <w:r>
-        <w:rPr>
-          <w:color w:val="92D050"/>
-        </w:rPr>
-        <w:t>{%p if user_need == 'answer custody' or (user_need == 'answer divorce' and minor_children) %}</w:t>
-      </w:r>
-    </w:p>
-    <w:p>
-      <w:pPr>
-        <w:pStyle w:val="Body"/>
-      </w:pPr>
-      <w:r>
-        <w:t xml:space="preserve">Include where </w:t>
-      </w:r>
-      <w:r>
-        <w:t>your</w:t>
-      </w:r>
-      <w:r>
-        <w:t xml:space="preserve"> children have lived the last 6 months.</w:t>
-      </w:r>
-    </w:p>
-    <w:p>
-      <w:pPr>
-        <w:pStyle w:val="Body"/>
-      </w:pPr>
-      <w:r>
-        <w:rPr>
-          <w:color w:val="92D050"/>
-        </w:rPr>
-        <w:t>{%p endif %}</w:t>
-      </w:r>
-    </w:p>
-    <w:p>
-      <w:pPr>
-        <w:pStyle w:val="Body"/>
-      </w:pPr>
-      <w:r>
-        <w:rPr>
-          <w:color w:val="FFC000"/>
-        </w:rPr>
         <w:t>{%p elif (user_need == 'answer custody' and not jurisdiction) or (user_need == 'answer divorce' and minor_children) %}</w:t>
       </w:r>
     </w:p>
@@ -1973,7 +2026,6 @@
         <w:rPr>
           <w:color w:val="FF0000"/>
         </w:rPr>
-        <w:lastRenderedPageBreak/>
         <w:t>{%p endif %}</w:t>
       </w:r>
     </w:p>
@@ -2035,6 +2087,7 @@
         <w:ind w:left="540"/>
       </w:pPr>
       <w:r>
+        <w:lastRenderedPageBreak/>
         <w:t xml:space="preserve">Fill out a </w:t>
       </w:r>
       <w:r>
@@ -2279,8 +2332,17 @@
             <w:rStyle w:val="Hyperlink"/>
             <w:spacing w:val="0"/>
           </w:rPr>
-          <w:t>ak-courts.info/findlawyer</w:t>
-        </w:r>
+          <w:t>ak-courts.info/</w:t>
+        </w:r>
+        <w:proofErr w:type="spellStart"/>
+        <w:r>
+          <w:rPr>
+            <w:rStyle w:val="Hyperlink"/>
+            <w:spacing w:val="0"/>
+          </w:rPr>
+          <w:t>findlawyer</w:t>
+        </w:r>
+        <w:proofErr w:type="spellEnd"/>
       </w:hyperlink>
       <w:r>
         <w:t>.</w:t>
@@ -2398,71 +2460,71 @@
         <w:rPr>
           <w:color w:val="FF0000"/>
         </w:rPr>
+        <w:t>{%p if user_need == 'answer custody' or (user_need == 'answer divorce' and (minor_children or (not minor_children and wife_is_pregnant in ('husband', 'not husband')))) %}</w:t>
+      </w:r>
+    </w:p>
+    <w:p>
+      <w:pPr>
+        <w:pStyle w:val="Body"/>
+      </w:pPr>
+      <w:r>
+        <w:rPr>
+          <w:b/>
+        </w:rPr>
+        <w:t>Child Custody Jurisdiction Affidavit, DR-150</w:t>
+      </w:r>
+      <w:r>
+        <w:t xml:space="preserve"> [</w:t>
+      </w:r>
+      <w:hyperlink r:id="rId28" w:history="1">
+        <w:r>
+          <w:rPr>
+            <w:rStyle w:val="Hyperlink"/>
+            <w:spacing w:val="0"/>
+          </w:rPr>
+          <w:t>Fill in</w:t>
+        </w:r>
+        <w:r>
+          <w:rPr>
+            <w:rStyle w:val="Hyperlink"/>
+            <w:spacing w:val="0"/>
+          </w:rPr>
+          <w:t xml:space="preserve"> PDF</w:t>
+        </w:r>
+      </w:hyperlink>
+      <w:r>
+        <w:t>]</w:t>
+      </w:r>
+      <w:r>
+        <w:br/>
+      </w:r>
+      <w:hyperlink r:id="rId29" w:history="1">
+        <w:r>
+          <w:rPr>
+            <w:rStyle w:val="Hyperlink"/>
+            <w:spacing w:val="0"/>
+          </w:rPr>
+          <w:t>ak-courts.info/dr150</w:t>
+        </w:r>
+      </w:hyperlink>
+    </w:p>
+    <w:p>
+      <w:pPr>
+        <w:pStyle w:val="Body"/>
+      </w:pPr>
+      <w:r>
+        <w:rPr>
+          <w:color w:val="FFC000"/>
+        </w:rPr>
+        <w:t>{%p if type_of_response['case in 2 states'] and stage_of_other_case == 'still going' %}</w:t>
+      </w:r>
+    </w:p>
+    <w:p>
+      <w:pPr>
+        <w:pStyle w:val="Body"/>
+      </w:pPr>
+      <w:r>
         <w:lastRenderedPageBreak/>
-        <w:t>{%p if user_need == 'answer custody' or (user_need == 'answer divorce' and (minor_children or (not minor_children and wife_is_pregnant in ('husband', 'not husband')))) %}</w:t>
-      </w:r>
-    </w:p>
-    <w:p>
-      <w:pPr>
-        <w:pStyle w:val="Body"/>
-      </w:pPr>
-      <w:r>
-        <w:rPr>
-          <w:b/>
-        </w:rPr>
-        <w:t>Child Custody Jurisdiction Affidavit, DR-150</w:t>
-      </w:r>
-      <w:r>
-        <w:t xml:space="preserve"> [</w:t>
-      </w:r>
-      <w:hyperlink r:id="rId28" w:history="1">
-        <w:r>
-          <w:rPr>
-            <w:rStyle w:val="Hyperlink"/>
-            <w:spacing w:val="0"/>
-          </w:rPr>
-          <w:t>Fill in</w:t>
-        </w:r>
-        <w:r>
-          <w:rPr>
-            <w:rStyle w:val="Hyperlink"/>
-            <w:spacing w:val="0"/>
-          </w:rPr>
-          <w:t xml:space="preserve"> PDF</w:t>
-        </w:r>
-      </w:hyperlink>
-      <w:r>
-        <w:t>]</w:t>
-      </w:r>
-      <w:r>
-        <w:br/>
-      </w:r>
-      <w:hyperlink r:id="rId29" w:history="1">
-        <w:r>
-          <w:rPr>
-            <w:rStyle w:val="Hyperlink"/>
-            <w:spacing w:val="0"/>
-          </w:rPr>
-          <w:t>ak-courts.info/dr150</w:t>
-        </w:r>
-      </w:hyperlink>
-    </w:p>
-    <w:p>
-      <w:pPr>
-        <w:pStyle w:val="Body"/>
-      </w:pPr>
-      <w:r>
-        <w:rPr>
-          <w:color w:val="FFC000"/>
-        </w:rPr>
-        <w:t>{%p if type_of_response['case in 2 states'] and stage_of_other_case == 'still going' %}</w:t>
-      </w:r>
-    </w:p>
-    <w:p>
-      <w:pPr>
-        <w:pStyle w:val="Body"/>
-      </w:pPr>
-      <w:r>
         <w:t>In paragraph 3 on page 3, tell the judge about the other case.</w:t>
       </w:r>
     </w:p>
@@ -2650,7 +2712,21 @@
         <w:rPr>
           <w:color w:val="92D050"/>
         </w:rPr>
-        <w:t>{%p elif response_to_complaint == 'none' and want_help_to_agree %}</w:t>
+        <w:t xml:space="preserve">{%p elif response_to_complaint == 'none' and </w:t>
+      </w:r>
+      <w:proofErr w:type="spellStart"/>
+      <w:r>
+        <w:rPr>
+          <w:color w:val="92D050"/>
+        </w:rPr>
+        <w:t>want_help_to_agree</w:t>
+      </w:r>
+      <w:proofErr w:type="spellEnd"/>
+      <w:r>
+        <w:rPr>
+          <w:color w:val="92D050"/>
+        </w:rPr>
+        <w:t xml:space="preserve"> %}</w:t>
       </w:r>
     </w:p>
     <w:p>
@@ -2697,7 +2773,6 @@
         <w:rPr>
           <w:b/>
         </w:rPr>
-        <w:lastRenderedPageBreak/>
         <w:t>Parenting Plan Agreement &amp; Order, SHC-1128</w:t>
       </w:r>
       <w:r>
@@ -2727,7 +2802,23 @@
             <w:rStyle w:val="Hyperlink"/>
             <w:spacing w:val="0"/>
           </w:rPr>
-          <w:t>courts.alaska.gov/shc/family/docs/shc-1128.doc</w:t>
+          <w:t>courts.alaska.gov/</w:t>
+        </w:r>
+        <w:proofErr w:type="spellStart"/>
+        <w:r>
+          <w:rPr>
+            <w:rStyle w:val="Hyperlink"/>
+            <w:spacing w:val="0"/>
+          </w:rPr>
+          <w:t>shc</w:t>
+        </w:r>
+        <w:proofErr w:type="spellEnd"/>
+        <w:r>
+          <w:rPr>
+            <w:rStyle w:val="Hyperlink"/>
+            <w:spacing w:val="0"/>
+          </w:rPr>
+          <w:t>/family/docs/shc-1128.doc</w:t>
         </w:r>
       </w:hyperlink>
       <w:r>
@@ -2755,7 +2846,23 @@
             <w:rStyle w:val="Hyperlink"/>
             <w:spacing w:val="0"/>
           </w:rPr>
-          <w:t>courts.alaska.gov/shc/family/docs/shc-1128n.pdf</w:t>
+          <w:t>courts.alaska.gov/</w:t>
+        </w:r>
+        <w:proofErr w:type="spellStart"/>
+        <w:r>
+          <w:rPr>
+            <w:rStyle w:val="Hyperlink"/>
+            <w:spacing w:val="0"/>
+          </w:rPr>
+          <w:t>shc</w:t>
+        </w:r>
+        <w:proofErr w:type="spellEnd"/>
+        <w:r>
+          <w:rPr>
+            <w:rStyle w:val="Hyperlink"/>
+            <w:spacing w:val="0"/>
+          </w:rPr>
+          <w:t>/family/docs/shc-1128n.pdf</w:t>
         </w:r>
       </w:hyperlink>
     </w:p>
@@ -2795,6 +2902,7 @@
         <w:rPr>
           <w:b/>
         </w:rPr>
+        <w:lastRenderedPageBreak/>
         <w:t>Request to Put Agreement on the Record, DR-264</w:t>
       </w:r>
       <w:r>
@@ -3101,7 +3209,23 @@
             <w:rStyle w:val="Hyperlink"/>
             <w:spacing w:val="0"/>
           </w:rPr>
-          <w:t>courts.alaska.gov/shc/family/docs/shc-094.doc</w:t>
+          <w:t>courts.alaska.gov/</w:t>
+        </w:r>
+        <w:proofErr w:type="spellStart"/>
+        <w:r>
+          <w:rPr>
+            <w:rStyle w:val="Hyperlink"/>
+            <w:spacing w:val="0"/>
+          </w:rPr>
+          <w:t>shc</w:t>
+        </w:r>
+        <w:proofErr w:type="spellEnd"/>
+        <w:r>
+          <w:rPr>
+            <w:rStyle w:val="Hyperlink"/>
+            <w:spacing w:val="0"/>
+          </w:rPr>
+          <w:t>/family/docs/shc-094.doc</w:t>
         </w:r>
       </w:hyperlink>
       <w:r>
@@ -3125,7 +3249,23 @@
             <w:rStyle w:val="Hyperlink"/>
             <w:spacing w:val="0"/>
           </w:rPr>
-          <w:t>courts.alaska.gov/shc/family/docs/shc-094n.pdf</w:t>
+          <w:t>courts.alaska.gov/</w:t>
+        </w:r>
+        <w:proofErr w:type="spellStart"/>
+        <w:r>
+          <w:rPr>
+            <w:rStyle w:val="Hyperlink"/>
+            <w:spacing w:val="0"/>
+          </w:rPr>
+          <w:t>shc</w:t>
+        </w:r>
+        <w:proofErr w:type="spellEnd"/>
+        <w:r>
+          <w:rPr>
+            <w:rStyle w:val="Hyperlink"/>
+            <w:spacing w:val="0"/>
+          </w:rPr>
+          <w:t>/family/docs/shc-094n.pdf</w:t>
         </w:r>
       </w:hyperlink>
     </w:p>
@@ -3179,7 +3319,6 @@
         <w:rPr>
           <w:b/>
         </w:rPr>
-        <w:lastRenderedPageBreak/>
         <w:t>ANSWER AND COUNTERCLAIM TO COMPLAINT FOR DIVORCE WITHOUT CHILDREN, DR-837</w:t>
       </w:r>
       <w:r>
@@ -3268,7 +3407,23 @@
             <w:rStyle w:val="Hyperlink"/>
             <w:spacing w:val="0"/>
           </w:rPr>
-          <w:t>courts.alaska.gov/shc/family/docs/shc-095.doc</w:t>
+          <w:t>courts.alaska.gov/</w:t>
+        </w:r>
+        <w:proofErr w:type="spellStart"/>
+        <w:r>
+          <w:rPr>
+            <w:rStyle w:val="Hyperlink"/>
+            <w:spacing w:val="0"/>
+          </w:rPr>
+          <w:t>shc</w:t>
+        </w:r>
+        <w:proofErr w:type="spellEnd"/>
+        <w:r>
+          <w:rPr>
+            <w:rStyle w:val="Hyperlink"/>
+            <w:spacing w:val="0"/>
+          </w:rPr>
+          <w:t>/family/docs/shc-095.doc</w:t>
         </w:r>
       </w:hyperlink>
       <w:r>
@@ -3292,7 +3447,23 @@
             <w:rStyle w:val="Hyperlink"/>
             <w:spacing w:val="0"/>
           </w:rPr>
-          <w:t>courts.alaska.gov/shc/family/docs/shc-095n.pdf</w:t>
+          <w:t>courts.alaska.gov/</w:t>
+        </w:r>
+        <w:proofErr w:type="spellStart"/>
+        <w:r>
+          <w:rPr>
+            <w:rStyle w:val="Hyperlink"/>
+            <w:spacing w:val="0"/>
+          </w:rPr>
+          <w:t>shc</w:t>
+        </w:r>
+        <w:proofErr w:type="spellEnd"/>
+        <w:r>
+          <w:rPr>
+            <w:rStyle w:val="Hyperlink"/>
+            <w:spacing w:val="0"/>
+          </w:rPr>
+          <w:t>/family/docs/shc-095n.pdf</w:t>
         </w:r>
       </w:hyperlink>
     </w:p>
@@ -3533,8 +3704,17 @@
             <w:rStyle w:val="Hyperlink"/>
             <w:spacing w:val="0"/>
           </w:rPr>
-          <w:t>ak-courts.info/findlawyer</w:t>
-        </w:r>
+          <w:t>ak-courts.info/</w:t>
+        </w:r>
+        <w:proofErr w:type="spellStart"/>
+        <w:r>
+          <w:rPr>
+            <w:rStyle w:val="Hyperlink"/>
+            <w:spacing w:val="0"/>
+          </w:rPr>
+          <w:t>findlawyer</w:t>
+        </w:r>
+        <w:proofErr w:type="spellEnd"/>
       </w:hyperlink>
     </w:p>
     <w:p>

</xml_diff>

<commit_message>
uploaded some updated content docxes, domestic_violence, want_help_to_agree, answer_content
</commit_message>
<xml_diff>
--- a/docassemble/AKA2JBranding/data/templates/answer_content.docx
+++ b/docassemble/AKA2JBranding/data/templates/answer_content.docx
@@ -10,13 +10,47 @@
         <w:t>{</w:t>
       </w:r>
       <w:r>
-        <w:t xml:space="preserve">{ “When you are served properly, you” </w:t>
-      </w:r>
-      <w:r>
-        <w:t xml:space="preserve"> if type_of_response.any_true('improper service', 'default') and not proper_service</w:t>
-      </w:r>
-      <w:r>
-        <w:t xml:space="preserve"> else “You” }</w:t>
+        <w:t xml:space="preserve">{ </w:t>
+      </w:r>
+      <w:r>
+        <w:t>"</w:t>
+      </w:r>
+      <w:r>
+        <w:t>When you are served properly, you</w:t>
+      </w:r>
+      <w:r>
+        <w:t>"</w:t>
+      </w:r>
+      <w:r>
+        <w:t xml:space="preserve"> if </w:t>
+      </w:r>
+      <w:proofErr w:type="spellStart"/>
+      <w:r>
+        <w:t>type_of_response.any_true</w:t>
+      </w:r>
+      <w:proofErr w:type="spellEnd"/>
+      <w:r>
+        <w:t xml:space="preserve">('improper service', 'default') and not </w:t>
+      </w:r>
+      <w:proofErr w:type="spellStart"/>
+      <w:r>
+        <w:t>proper_service</w:t>
+      </w:r>
+      <w:proofErr w:type="spellEnd"/>
+      <w:r>
+        <w:t xml:space="preserve"> else </w:t>
+      </w:r>
+      <w:r>
+        <w:t>"</w:t>
+      </w:r>
+      <w:r>
+        <w:t>You</w:t>
+      </w:r>
+      <w:r>
+        <w:t>"</w:t>
+      </w:r>
+      <w:r>
+        <w:t xml:space="preserve"> }</w:t>
       </w:r>
       <w:r>
         <w:t xml:space="preserve">} have </w:t>
@@ -89,21 +123,51 @@
         <w:rPr>
           <w:color w:val="FF0000"/>
         </w:rPr>
-        <w:t>{%p if type_of_response[‘default’] %}</w:t>
-      </w:r>
-    </w:p>
-    <w:p>
-      <w:pPr>
-        <w:pStyle w:val="Body"/>
-      </w:pPr>
-      <w:r>
-        <w:t>The {{</w:t>
+        <w:t>{%p if type_of_response[</w:t>
+      </w:r>
+      <w:r>
+        <w:rPr>
+          <w:color w:val="FF0000"/>
+        </w:rPr>
+        <w:t>'</w:t>
+      </w:r>
+      <w:r>
+        <w:rPr>
+          <w:color w:val="FF0000"/>
+        </w:rPr>
+        <w:t>default</w:t>
+      </w:r>
+      <w:r>
+        <w:rPr>
+          <w:color w:val="FF0000"/>
+        </w:rPr>
+        <w:t>'</w:t>
+      </w:r>
+      <w:r>
+        <w:rPr>
+          <w:color w:val="FF0000"/>
+        </w:rPr>
+        <w:t>] %}</w:t>
+      </w:r>
+    </w:p>
+    <w:p>
+      <w:pPr>
+        <w:pStyle w:val="Body"/>
+      </w:pPr>
+      <w:r>
+        <w:t>{{</w:t>
       </w:r>
       <w:r>
         <w:t xml:space="preserve"> </w:t>
       </w:r>
       <w:r>
+        <w:t>capitalize(</w:t>
+      </w:r>
+      <w:r>
         <w:t>other_party_in_case</w:t>
+      </w:r>
+      <w:r>
+        <w:t>)</w:t>
       </w:r>
       <w:r>
         <w:t xml:space="preserve"> </w:t>
@@ -304,7 +368,25 @@
         <w:rPr>
           <w:color w:val="FF0000"/>
         </w:rPr>
-        <w:t>{%p if type_of_response['wrong state'] and (user_need == 'answer custody' and not jurisdiction) %}</w:t>
+        <w:t xml:space="preserve">{%p if type_of_response['wrong state'] and </w:t>
+      </w:r>
+      <w:r>
+        <w:rPr>
+          <w:color w:val="FF0000"/>
+        </w:rPr>
+        <w:t>(</w:t>
+      </w:r>
+      <w:r>
+        <w:rPr>
+          <w:color w:val="FF0000"/>
+        </w:rPr>
+        <w:t>user_need == 'answer custody' and not jurisdiction</w:t>
+      </w:r>
+      <w:r>
+        <w:rPr>
+          <w:color w:val="FF0000"/>
+        </w:rPr>
+        <w:t>) %}</w:t>
       </w:r>
     </w:p>
     <w:p>
@@ -360,7 +442,16 @@
         <w:t>Motion to Dismiss</w:t>
       </w:r>
       <w:r>
-        <w:t xml:space="preserve"> forms that ask the court to dismiss your case. Read  {{ </w:t>
+        <w:t xml:space="preserve"> forms that ask the court to dismiss your case.</w:t>
+      </w:r>
+      <w:r>
+        <w:rPr>
+          <w:color w:val="FFC000"/>
+        </w:rPr>
+        <w:t xml:space="preserve"> </w:t>
+      </w:r>
+      <w:r>
+        <w:t xml:space="preserve">Read {{ </w:t>
       </w:r>
       <w:proofErr w:type="spellStart"/>
       <w:r>
@@ -371,7 +462,13 @@
       </w:r>
       <w:proofErr w:type="spellEnd"/>
       <w:r>
-        <w:t xml:space="preserve"> }}: File a motion to dismiss your Alaska case.</w:t>
+        <w:t xml:space="preserve"> }}</w:t>
+      </w:r>
+      <w:r>
+        <w:t>.</w:t>
+      </w:r>
+      <w:r>
+        <w:t>{}</w:t>
       </w:r>
     </w:p>
     <w:p>
@@ -394,6 +491,9 @@
       </w:r>
       <w:r>
         <w:t>.</w:t>
+      </w:r>
+      <w:r>
+        <w:t xml:space="preserve"> </w:t>
       </w:r>
     </w:p>
     <w:p>
@@ -585,21 +685,7 @@
         <w:rPr>
           <w:b/>
         </w:rPr>
-        <w:t xml:space="preserve">Answer &amp; Counterclaim to Legal Separation </w:t>
-      </w:r>
-      <w:proofErr w:type="gramStart"/>
-      <w:r>
-        <w:rPr>
-          <w:b/>
-        </w:rPr>
-        <w:t>With</w:t>
-      </w:r>
-      <w:proofErr w:type="gramEnd"/>
-      <w:r>
-        <w:rPr>
-          <w:b/>
-        </w:rPr>
-        <w:t xml:space="preserve"> Children, SHC-094</w:t>
+        <w:t>Answer &amp; Counterclaim to Legal Separation With Children, SHC-094</w:t>
       </w:r>
       <w:r>
         <w:t xml:space="preserve"> </w:t>
@@ -642,6 +728,9 @@
         <w:pStyle w:val="Body"/>
       </w:pPr>
       <w:r>
+        <w:rPr>
+          <w:color w:val="92D050"/>
+        </w:rPr>
         <w:t>{%p if not minor_children and wife_is_pregnant in ('husband', 'not husband') %}</w:t>
       </w:r>
     </w:p>
@@ -672,6 +761,7 @@
         <w:rPr>
           <w:color w:val="FFC000"/>
         </w:rPr>
+        <w:lastRenderedPageBreak/>
         <w:t>{%p elif not minor_children and wife_is_pregnant == 'not pregnant' %}</w:t>
       </w:r>
     </w:p>
@@ -753,7 +843,6 @@
         <w:rPr>
           <w:b/>
         </w:rPr>
-        <w:lastRenderedPageBreak/>
         <w:t>Answer &amp; Counterclaim to Legal Separation Without Children, SHC-095</w:t>
       </w:r>
       <w:r>
@@ -784,23 +873,7 @@
             <w:rStyle w:val="Hyperlink"/>
             <w:spacing w:val="0"/>
           </w:rPr>
-          <w:t>courts.alaska.gov/</w:t>
-        </w:r>
-        <w:proofErr w:type="spellStart"/>
-        <w:r>
-          <w:rPr>
-            <w:rStyle w:val="Hyperlink"/>
-            <w:spacing w:val="0"/>
-          </w:rPr>
-          <w:t>shc</w:t>
-        </w:r>
-        <w:proofErr w:type="spellEnd"/>
-        <w:r>
-          <w:rPr>
-            <w:rStyle w:val="Hyperlink"/>
-            <w:spacing w:val="0"/>
-          </w:rPr>
-          <w:t>/family/docs/shc-095.doc</w:t>
+          <w:t>courts.alaska.gov/shc/family/docs/shc-095.doc</w:t>
         </w:r>
       </w:hyperlink>
       <w:r>
@@ -828,23 +901,7 @@
             <w:rStyle w:val="Hyperlink"/>
             <w:spacing w:val="0"/>
           </w:rPr>
-          <w:t>courts.alaska.gov/</w:t>
-        </w:r>
-        <w:proofErr w:type="spellStart"/>
-        <w:r>
-          <w:rPr>
-            <w:rStyle w:val="Hyperlink"/>
-            <w:spacing w:val="0"/>
-          </w:rPr>
-          <w:t>shc</w:t>
-        </w:r>
-        <w:proofErr w:type="spellEnd"/>
-        <w:r>
-          <w:rPr>
-            <w:rStyle w:val="Hyperlink"/>
-            <w:spacing w:val="0"/>
-          </w:rPr>
-          <w:t>/family/docs/shc-095n.pdf</w:t>
+          <w:t>courts.alaska.gov/shc/family/docs/shc-095n.pdf</w:t>
         </w:r>
       </w:hyperlink>
     </w:p>
@@ -1022,6 +1079,7 @@
         <w:rPr>
           <w:color w:val="FFC000"/>
         </w:rPr>
+        <w:lastRenderedPageBreak/>
         <w:t>{%p if (case_type == 'custody' or case_type == 'divorce' or (case_type == 'legal separation' and want_legal_separation == 'yes')) and response_to_complaint == 'agree' %}</w:t>
       </w:r>
     </w:p>
@@ -1059,7 +1117,6 @@
         <w:ind w:left="540"/>
       </w:pPr>
       <w:r>
-        <w:lastRenderedPageBreak/>
         <w:t>If you disagree with any of the paragraphs in the complaint, list the paragraph numbers you disagree with.</w:t>
       </w:r>
     </w:p>
@@ -1245,6 +1302,7 @@
         <w:rPr>
           <w:color w:val="FFC000"/>
         </w:rPr>
+        <w:lastRenderedPageBreak/>
         <w:t>{%p if user_need == 'answer custody' or (user_need == 'answer divorce' and minor_children) or (user_need == 'answer divorce' and not minor_children and wife_is_pregnant in ('husband', 'not husband')) %}</w:t>
       </w:r>
     </w:p>
@@ -1306,8 +1364,17 @@
         <w:ind w:left="540"/>
       </w:pPr>
       <w:r>
-        <w:lastRenderedPageBreak/>
-        <w:t>Check the {{ 'boxes that say' if minor_children else '' }}{{ 'boxes that say' if not minor_children and wife_is_pregnant in ('husband', 'not husband') else '' }}{{ 'box that says' if not minor_children and wife_is_pregnant == 'not pregnant' else '' }} you attached a Motion to Dismiss.</w:t>
+        <w:t xml:space="preserve">Check the {{ 'boxes that say' if minor_children else '' }}{{ 'boxes that say' if not minor_children and wife_is_pregnant in ('husband', 'not husband') else '' }}{{ 'box that says' if not minor_children and wife_is_pregnant == 'not pregnant' else '' }} you attached a </w:t>
+      </w:r>
+      <w:r>
+        <w:rPr>
+          <w:b/>
+          <w:bCs/>
+        </w:rPr>
+        <w:t>Motion to Dismiss</w:t>
+      </w:r>
+      <w:r>
+        <w:t>.</w:t>
       </w:r>
     </w:p>
     <w:p>
@@ -1331,7 +1398,17 @@
         <w:ind w:left="540"/>
       </w:pPr>
       <w:r>
-        <w:t>Check the box that says you attached a Motion to Dismiss.</w:t>
+        <w:t xml:space="preserve">Check the box that says you attached a </w:t>
+      </w:r>
+      <w:r>
+        <w:rPr>
+          <w:b/>
+          <w:bCs/>
+        </w:rPr>
+        <w:t>Motion to Dismiss</w:t>
+      </w:r>
+      <w:r>
+        <w:t>.</w:t>
       </w:r>
     </w:p>
     <w:p>
@@ -1460,15 +1537,7 @@
         <w:ind w:left="900"/>
       </w:pPr>
       <w:r>
-        <w:t xml:space="preserve">the case </w:t>
-      </w:r>
-      <w:proofErr w:type="gramStart"/>
-      <w:r>
-        <w:t>number</w:t>
-      </w:r>
-      <w:proofErr w:type="gramEnd"/>
-      <w:r>
-        <w:t>.</w:t>
+        <w:t>the case number.</w:t>
       </w:r>
     </w:p>
     <w:p>
@@ -1533,6 +1602,7 @@
         <w:pStyle w:val="Body"/>
       </w:pPr>
       <w:r>
+        <w:lastRenderedPageBreak/>
         <w:t>If yo</w:t>
       </w:r>
       <w:r>
@@ -1609,7 +1679,6 @@
         <w:pStyle w:val="Body"/>
       </w:pPr>
       <w:r>
-        <w:lastRenderedPageBreak/>
         <w:t>Use this section, to tell the court your version of the facts and what y</w:t>
       </w:r>
       <w:r>
@@ -1771,11 +1840,14 @@
     <w:p>
       <w:pPr>
         <w:pStyle w:val="Body"/>
-      </w:pPr>
-      <w:r>
         <w:rPr>
           <w:color w:val="FF0000"/>
         </w:rPr>
+      </w:pPr>
+      <w:r>
+        <w:rPr>
+          <w:color w:val="FF0000"/>
+        </w:rPr>
         <w:t>{%p if type_of_response['case in 2 states'] and stage_of_other_case == 'still going' %}</w:t>
       </w:r>
     </w:p>
@@ -1784,29 +1856,31 @@
         <w:pStyle w:val="Body"/>
       </w:pPr>
       <w:r>
+        <w:t>If you think the Alaska court should hear the case, use section 5 to tell the judge there are 2 cases</w:t>
+      </w:r>
+      <w:r>
         <w:rPr>
           <w:color w:val="FFC000"/>
         </w:rPr>
-        <w:t>{%p if (user_need == 'answer custody' and jurisdiction) or user_need == 'answer divorce' %}</w:t>
-      </w:r>
-    </w:p>
-    <w:p>
-      <w:pPr>
-        <w:pStyle w:val="Body"/>
-      </w:pPr>
-      <w:r>
-        <w:t>If you think the Alaska court should hear the case, use section 5 to tell the judge there are 2 cases and why you think the case should move forward in Alaska.</w:t>
-      </w:r>
-    </w:p>
-    <w:p>
-      <w:pPr>
-        <w:pStyle w:val="Body"/>
-      </w:pPr>
+        <w:t>{% if (user_need == 'answer custody' and jurisdiction) or user_need == 'answer divorce' %}</w:t>
+      </w:r>
+      <w:r>
+        <w:t xml:space="preserve"> </w:t>
+      </w:r>
+      <w:r>
+        <w:t>and why you think the case should move forward in Alaska.</w:t>
+      </w:r>
       <w:r>
         <w:rPr>
           <w:color w:val="92D050"/>
         </w:rPr>
-        <w:t>{%p if user_need == 'answer custody' or (user_need == 'answer divorce' and minor_children) %}</w:t>
+        <w:t>{% if user_need == 'answer custody' or (user_need == 'answer divorce' and minor_children) %}</w:t>
+      </w:r>
+      <w:r>
+        <w:rPr>
+          <w:color w:val="92D050"/>
+        </w:rPr>
+        <w:t>.</w:t>
       </w:r>
     </w:p>
     <w:p>
@@ -1831,19 +1905,13 @@
         <w:rPr>
           <w:color w:val="92D050"/>
         </w:rPr>
-        <w:t>{%p endif %}</w:t>
-      </w:r>
-    </w:p>
-    <w:p>
-      <w:pPr>
-        <w:pStyle w:val="Body"/>
-      </w:pPr>
+        <w:t>{% endif %}</w:t>
+      </w:r>
       <w:r>
         <w:rPr>
           <w:color w:val="FFC000"/>
         </w:rPr>
-        <w:lastRenderedPageBreak/>
-        <w:t>{%p elif (user_need == 'answer custody' and not jurisdiction) or (user_need == 'answer divorce' and minor_children) %}</w:t>
+        <w:t>{% elif (user_need == 'answer custody' and not jurisdiction) or (user_need == 'answer divorce' and minor_children) %}</w:t>
       </w:r>
     </w:p>
     <w:p>
@@ -1868,7 +1936,7 @@
         <w:rPr>
           <w:color w:val="FFC000"/>
         </w:rPr>
-        <w:t>{%p endif %}</w:t>
+        <w:t>{% endif %}</w:t>
       </w:r>
     </w:p>
     <w:p>
@@ -2026,6 +2094,7 @@
         <w:rPr>
           <w:color w:val="FF0000"/>
         </w:rPr>
+        <w:lastRenderedPageBreak/>
         <w:t>{%p endif %}</w:t>
       </w:r>
     </w:p>
@@ -2087,7 +2156,6 @@
         <w:ind w:left="540"/>
       </w:pPr>
       <w:r>
-        <w:lastRenderedPageBreak/>
         <w:t xml:space="preserve">Fill out a </w:t>
       </w:r>
       <w:r>
@@ -2229,7 +2297,21 @@
             <w:rStyle w:val="Hyperlink"/>
             <w:spacing w:val="0"/>
           </w:rPr>
-          <w:t>ak-courts.info/tf858</w:t>
+          <w:t>ak-courts.info/</w:t>
+        </w:r>
+        <w:r>
+          <w:rPr>
+            <w:rStyle w:val="Hyperlink"/>
+            <w:spacing w:val="0"/>
+          </w:rPr>
+          <w:t>civ</w:t>
+        </w:r>
+        <w:r>
+          <w:rPr>
+            <w:rStyle w:val="Hyperlink"/>
+            <w:spacing w:val="0"/>
+          </w:rPr>
+          <w:t>858</w:t>
         </w:r>
       </w:hyperlink>
       <w:r>
@@ -2460,6 +2542,7 @@
         <w:rPr>
           <w:color w:val="FF0000"/>
         </w:rPr>
+        <w:lastRenderedPageBreak/>
         <w:t>{%p if user_need == 'answer custody' or (user_need == 'answer divorce' and (minor_children or (not minor_children and wife_is_pregnant in ('husband', 'not husband')))) %}</w:t>
       </w:r>
     </w:p>
@@ -2524,7 +2607,6 @@
         <w:pStyle w:val="Body"/>
       </w:pPr>
       <w:r>
-        <w:lastRenderedPageBreak/>
         <w:t>In paragraph 3 on page 3, tell the judge about the other case.</w:t>
       </w:r>
     </w:p>
@@ -2773,6 +2855,7 @@
         <w:rPr>
           <w:b/>
         </w:rPr>
+        <w:lastRenderedPageBreak/>
         <w:t>Parenting Plan Agreement &amp; Order, SHC-1128</w:t>
       </w:r>
       <w:r>
@@ -2802,23 +2885,7 @@
             <w:rStyle w:val="Hyperlink"/>
             <w:spacing w:val="0"/>
           </w:rPr>
-          <w:t>courts.alaska.gov/</w:t>
-        </w:r>
-        <w:proofErr w:type="spellStart"/>
-        <w:r>
-          <w:rPr>
-            <w:rStyle w:val="Hyperlink"/>
-            <w:spacing w:val="0"/>
-          </w:rPr>
-          <w:t>shc</w:t>
-        </w:r>
-        <w:proofErr w:type="spellEnd"/>
-        <w:r>
-          <w:rPr>
-            <w:rStyle w:val="Hyperlink"/>
-            <w:spacing w:val="0"/>
-          </w:rPr>
-          <w:t>/family/docs/shc-1128.doc</w:t>
+          <w:t>courts.alaska.gov/shc/family/docs/shc-1128.doc</w:t>
         </w:r>
       </w:hyperlink>
       <w:r>
@@ -2846,23 +2913,7 @@
             <w:rStyle w:val="Hyperlink"/>
             <w:spacing w:val="0"/>
           </w:rPr>
-          <w:t>courts.alaska.gov/</w:t>
-        </w:r>
-        <w:proofErr w:type="spellStart"/>
-        <w:r>
-          <w:rPr>
-            <w:rStyle w:val="Hyperlink"/>
-            <w:spacing w:val="0"/>
-          </w:rPr>
-          <w:t>shc</w:t>
-        </w:r>
-        <w:proofErr w:type="spellEnd"/>
-        <w:r>
-          <w:rPr>
-            <w:rStyle w:val="Hyperlink"/>
-            <w:spacing w:val="0"/>
-          </w:rPr>
-          <w:t>/family/docs/shc-1128n.pdf</w:t>
+          <w:t>courts.alaska.gov/shc/family/docs/shc-1128n.pdf</w:t>
         </w:r>
       </w:hyperlink>
     </w:p>
@@ -2902,7 +2953,6 @@
         <w:rPr>
           <w:b/>
         </w:rPr>
-        <w:lastRenderedPageBreak/>
         <w:t>Request to Put Agreement on the Record, DR-264</w:t>
       </w:r>
       <w:r>
@@ -3209,23 +3259,7 @@
             <w:rStyle w:val="Hyperlink"/>
             <w:spacing w:val="0"/>
           </w:rPr>
-          <w:t>courts.alaska.gov/</w:t>
-        </w:r>
-        <w:proofErr w:type="spellStart"/>
-        <w:r>
-          <w:rPr>
-            <w:rStyle w:val="Hyperlink"/>
-            <w:spacing w:val="0"/>
-          </w:rPr>
-          <w:t>shc</w:t>
-        </w:r>
-        <w:proofErr w:type="spellEnd"/>
-        <w:r>
-          <w:rPr>
-            <w:rStyle w:val="Hyperlink"/>
-            <w:spacing w:val="0"/>
-          </w:rPr>
-          <w:t>/family/docs/shc-094.doc</w:t>
+          <w:t>courts.alaska.gov/shc/family/docs/shc-094.doc</w:t>
         </w:r>
       </w:hyperlink>
       <w:r>
@@ -3249,23 +3283,7 @@
             <w:rStyle w:val="Hyperlink"/>
             <w:spacing w:val="0"/>
           </w:rPr>
-          <w:t>courts.alaska.gov/</w:t>
-        </w:r>
-        <w:proofErr w:type="spellStart"/>
-        <w:r>
-          <w:rPr>
-            <w:rStyle w:val="Hyperlink"/>
-            <w:spacing w:val="0"/>
-          </w:rPr>
-          <w:t>shc</w:t>
-        </w:r>
-        <w:proofErr w:type="spellEnd"/>
-        <w:r>
-          <w:rPr>
-            <w:rStyle w:val="Hyperlink"/>
-            <w:spacing w:val="0"/>
-          </w:rPr>
-          <w:t>/family/docs/shc-094n.pdf</w:t>
+          <w:t>courts.alaska.gov/shc/family/docs/shc-094n.pdf</w:t>
         </w:r>
       </w:hyperlink>
     </w:p>
@@ -3319,6 +3337,7 @@
         <w:rPr>
           <w:b/>
         </w:rPr>
+        <w:lastRenderedPageBreak/>
         <w:t>ANSWER AND COUNTERCLAIM TO COMPLAINT FOR DIVORCE WITHOUT CHILDREN, DR-837</w:t>
       </w:r>
       <w:r>
@@ -3407,23 +3426,7 @@
             <w:rStyle w:val="Hyperlink"/>
             <w:spacing w:val="0"/>
           </w:rPr>
-          <w:t>courts.alaska.gov/</w:t>
-        </w:r>
-        <w:proofErr w:type="spellStart"/>
-        <w:r>
-          <w:rPr>
-            <w:rStyle w:val="Hyperlink"/>
-            <w:spacing w:val="0"/>
-          </w:rPr>
-          <w:t>shc</w:t>
-        </w:r>
-        <w:proofErr w:type="spellEnd"/>
-        <w:r>
-          <w:rPr>
-            <w:rStyle w:val="Hyperlink"/>
-            <w:spacing w:val="0"/>
-          </w:rPr>
-          <w:t>/family/docs/shc-095.doc</w:t>
+          <w:t>courts.alaska.gov/shc/family/docs/shc-095.doc</w:t>
         </w:r>
       </w:hyperlink>
       <w:r>
@@ -3447,23 +3450,7 @@
             <w:rStyle w:val="Hyperlink"/>
             <w:spacing w:val="0"/>
           </w:rPr>
-          <w:t>courts.alaska.gov/</w:t>
-        </w:r>
-        <w:proofErr w:type="spellStart"/>
-        <w:r>
-          <w:rPr>
-            <w:rStyle w:val="Hyperlink"/>
-            <w:spacing w:val="0"/>
-          </w:rPr>
-          <w:t>shc</w:t>
-        </w:r>
-        <w:proofErr w:type="spellEnd"/>
-        <w:r>
-          <w:rPr>
-            <w:rStyle w:val="Hyperlink"/>
-            <w:spacing w:val="0"/>
-          </w:rPr>
-          <w:t>/family/docs/shc-095n.pdf</w:t>
+          <w:t>courts.alaska.gov/shc/family/docs/shc-095n.pdf</w:t>
         </w:r>
       </w:hyperlink>
     </w:p>

</xml_diff>

<commit_message>
moving a period to inside quotes in answer_step and answer_content
</commit_message>
<xml_diff>
--- a/docassemble/AKA2JBranding/data/templates/answer_content.docx
+++ b/docassemble/AKA2JBranding/data/templates/answer_content.docx
@@ -761,7 +761,6 @@
         <w:rPr>
           <w:color w:val="FFC000"/>
         </w:rPr>
-        <w:lastRenderedPageBreak/>
         <w:t>{%p elif not minor_children and wife_is_pregnant == 'not pregnant' %}</w:t>
       </w:r>
     </w:p>
@@ -843,6 +842,7 @@
         <w:rPr>
           <w:b/>
         </w:rPr>
+        <w:lastRenderedPageBreak/>
         <w:t>Answer &amp; Counterclaim to Legal Separation Without Children, SHC-095</w:t>
       </w:r>
       <w:r>
@@ -1079,7 +1079,6 @@
         <w:rPr>
           <w:color w:val="FFC000"/>
         </w:rPr>
-        <w:lastRenderedPageBreak/>
         <w:t>{%p if (case_type == 'custody' or case_type == 'divorce' or (case_type == 'legal separation' and want_legal_separation == 'yes')) and response_to_complaint == 'agree' %}</w:t>
       </w:r>
     </w:p>
@@ -1117,6 +1116,7 @@
         <w:ind w:left="540"/>
       </w:pPr>
       <w:r>
+        <w:lastRenderedPageBreak/>
         <w:t>If you disagree with any of the paragraphs in the complaint, list the paragraph numbers you disagree with.</w:t>
       </w:r>
     </w:p>
@@ -1302,7 +1302,6 @@
         <w:rPr>
           <w:color w:val="FFC000"/>
         </w:rPr>
-        <w:lastRenderedPageBreak/>
         <w:t>{%p if user_need == 'answer custody' or (user_need == 'answer divorce' and minor_children) or (user_need == 'answer divorce' and not minor_children and wife_is_pregnant in ('husband', 'not husband')) %}</w:t>
       </w:r>
     </w:p>
@@ -1364,6 +1363,7 @@
         <w:ind w:left="540"/>
       </w:pPr>
       <w:r>
+        <w:lastRenderedPageBreak/>
         <w:t xml:space="preserve">Check the {{ 'boxes that say' if minor_children else '' }}{{ 'boxes that say' if not minor_children and wife_is_pregnant in ('husband', 'not husband') else '' }}{{ 'box that says' if not minor_children and wife_is_pregnant == 'not pregnant' else '' }} you attached a </w:t>
       </w:r>
       <w:r>
@@ -1602,7 +1602,6 @@
         <w:pStyle w:val="Body"/>
       </w:pPr>
       <w:r>
-        <w:lastRenderedPageBreak/>
         <w:t>If yo</w:t>
       </w:r>
       <w:r>
@@ -1679,6 +1678,7 @@
         <w:pStyle w:val="Body"/>
       </w:pPr>
       <w:r>
+        <w:lastRenderedPageBreak/>
         <w:t>Use this section, to tell the court your version of the facts and what y</w:t>
       </w:r>
       <w:r>
@@ -1919,6 +1919,7 @@
         <w:pStyle w:val="Body"/>
       </w:pPr>
       <w:r>
+        <w:lastRenderedPageBreak/>
         <w:t>{{ 'Explain' if user_need == '</w:t>
       </w:r>
       <w:r>
@@ -2094,7 +2095,6 @@
         <w:rPr>
           <w:color w:val="FF0000"/>
         </w:rPr>
-        <w:lastRenderedPageBreak/>
         <w:t>{%p endif %}</w:t>
       </w:r>
     </w:p>
@@ -2212,10 +2212,17 @@
         <w:ind w:left="900"/>
       </w:pPr>
       <w:r>
+        <w:lastRenderedPageBreak/>
         <w:t>Fill in</w:t>
       </w:r>
       <w:r>
-        <w:t xml:space="preserve"> the title, "accepting a late Answer". And</w:t>
+        <w:t xml:space="preserve"> the title, "accepting a late Answer</w:t>
+      </w:r>
+      <w:r>
+        <w:t>.</w:t>
+      </w:r>
+      <w:r>
+        <w:t>" And</w:t>
       </w:r>
     </w:p>
     <w:p>
@@ -2542,7 +2549,6 @@
         <w:rPr>
           <w:color w:val="FF0000"/>
         </w:rPr>
-        <w:lastRenderedPageBreak/>
         <w:t>{%p if user_need == 'answer custody' or (user_need == 'answer divorce' and (minor_children or (not minor_children and wife_is_pregnant in ('husband', 'not husband')))) %}</w:t>
       </w:r>
     </w:p>
@@ -2629,6 +2635,7 @@
         <w:rPr>
           <w:b/>
         </w:rPr>
+        <w:lastRenderedPageBreak/>
         <w:t>Child Support Guidelines Affidavit, DR-305</w:t>
       </w:r>
       <w:r>
@@ -2855,7 +2862,6 @@
         <w:rPr>
           <w:b/>
         </w:rPr>
-        <w:lastRenderedPageBreak/>
         <w:t>Parenting Plan Agreement &amp; Order, SHC-1128</w:t>
       </w:r>
       <w:r>
@@ -3009,6 +3015,7 @@
         <w:rPr>
           <w:color w:val="FFC000"/>
         </w:rPr>
+        <w:lastRenderedPageBreak/>
         <w:t>{%p endif %}</w:t>
       </w:r>
     </w:p>
@@ -3337,7 +3344,6 @@
         <w:rPr>
           <w:b/>
         </w:rPr>
-        <w:lastRenderedPageBreak/>
         <w:t>ANSWER AND COUNTERCLAIM TO COMPLAINT FOR DIVORCE WITHOUT CHILDREN, DR-837</w:t>
       </w:r>
       <w:r>
@@ -3473,6 +3479,7 @@
         <w:rPr>
           <w:color w:val="FFC000"/>
         </w:rPr>
+        <w:lastRenderedPageBreak/>
         <w:t>{%p endif %}</w:t>
       </w:r>
     </w:p>

</xml_diff>

<commit_message>
mostly fixing quotes and apostrophes in answer, dismiss and default_options content docxes
</commit_message>
<xml_diff>
--- a/docassemble/AKA2JBranding/data/templates/answer_content.docx
+++ b/docassemble/AKA2JBranding/data/templates/answer_content.docx
@@ -1,6 +1,6 @@
 
 <file path=word/document.xml><?xml version="1.0" encoding="utf-8"?>
-<w:document xmlns:wpc="http://schemas.microsoft.com/office/word/2010/wordprocessingCanvas" xmlns:cx="http://schemas.microsoft.com/office/drawing/2014/chartex" xmlns:cx1="http://schemas.microsoft.com/office/drawing/2015/9/8/chartex" xmlns:cx2="http://schemas.microsoft.com/office/drawing/2015/10/21/chartex" xmlns:cx3="http://schemas.microsoft.com/office/drawing/2016/5/9/chartex" xmlns:cx4="http://schemas.microsoft.com/office/drawing/2016/5/10/chartex" xmlns:cx5="http://schemas.microsoft.com/office/drawing/2016/5/11/chartex" xmlns:cx6="http://schemas.microsoft.com/office/drawing/2016/5/12/chartex" xmlns:cx7="http://schemas.microsoft.com/office/drawing/2016/5/13/chartex" xmlns:cx8="http://schemas.microsoft.com/office/drawing/2016/5/14/chartex" xmlns:mc="http://schemas.openxmlformats.org/markup-compatibility/2006" xmlns:aink="http://schemas.microsoft.com/office/drawing/2016/ink" xmlns:am3d="http://schemas.microsoft.com/office/drawing/2017/model3d" xmlns:o="urn:schemas-microsoft-com:office:office" xmlns:r="http://schemas.openxmlformats.org/officeDocument/2006/relationships" xmlns:m="http://schemas.openxmlformats.org/officeDocument/2006/math" xmlns:v="urn:schemas-microsoft-com:vml" xmlns:wp14="http://schemas.microsoft.com/office/word/2010/wordprocessingDrawing" xmlns:wp="http://schemas.openxmlformats.org/drawingml/2006/wordprocessingDrawing" xmlns:w10="urn:schemas-microsoft-com:office:word" xmlns:w="http://schemas.openxmlformats.org/wordprocessingml/2006/main" xmlns:w14="http://schemas.microsoft.com/office/word/2010/wordml" xmlns:w15="http://schemas.microsoft.com/office/word/2012/wordml" xmlns:w16cex="http://schemas.microsoft.com/office/word/2018/wordml/cex" xmlns:w16cid="http://schemas.microsoft.com/office/word/2016/wordml/cid" xmlns:w16="http://schemas.microsoft.com/office/word/2018/wordml" xmlns:w16sdtdh="http://schemas.microsoft.com/office/word/2020/wordml/sdtdatahash" xmlns:w16se="http://schemas.microsoft.com/office/word/2015/wordml/symex" xmlns:wpg="http://schemas.microsoft.com/office/word/2010/wordprocessingGroup" xmlns:wpi="http://schemas.microsoft.com/office/word/2010/wordprocessingInk" xmlns:wne="http://schemas.microsoft.com/office/word/2006/wordml" xmlns:wps="http://schemas.microsoft.com/office/word/2010/wordprocessingShape" mc:Ignorable="w14 w15 w16se w16cid w16 w16cex w16sdtdh wp14">
+<w:document xmlns:wpc="http://schemas.microsoft.com/office/word/2010/wordprocessingCanvas" xmlns:mc="http://schemas.openxmlformats.org/markup-compatibility/2006" xmlns:o="urn:schemas-microsoft-com:office:office" xmlns:r="http://schemas.openxmlformats.org/officeDocument/2006/relationships" xmlns:m="http://schemas.openxmlformats.org/officeDocument/2006/math" xmlns:v="urn:schemas-microsoft-com:vml" xmlns:wp14="http://schemas.microsoft.com/office/word/2010/wordprocessingDrawing" xmlns:wp="http://schemas.openxmlformats.org/drawingml/2006/wordprocessingDrawing" xmlns:w10="urn:schemas-microsoft-com:office:word" xmlns:w="http://schemas.openxmlformats.org/wordprocessingml/2006/main" xmlns:w14="http://schemas.microsoft.com/office/word/2010/wordml" xmlns:wpg="http://schemas.microsoft.com/office/word/2010/wordprocessingGroup" xmlns:wpi="http://schemas.microsoft.com/office/word/2010/wordprocessingInk" xmlns:wne="http://schemas.microsoft.com/office/word/2006/wordml" xmlns:wps="http://schemas.microsoft.com/office/word/2010/wordprocessingShape" mc:Ignorable="w14 wp14">
   <w:body>
     <w:p>
       <w:pPr>
@@ -224,7 +224,41 @@
         <w:pStyle w:val="Exampleparagraph"/>
       </w:pPr>
       <w:r>
-        <w:t>If you fill out your forms on a computer and file them with TrueFiling, you can sign your forms electronically.  Type “/s/ your name” on the signature line. For example, Zoe Lee’s signature would be "/s/ Zoe Lee."</w:t>
+        <w:t xml:space="preserve">If you fill out your forms on a computer and file them with TrueFiling, you can </w:t>
+      </w:r>
+      <w:r>
+        <w:t>sign your forms electronically.</w:t>
+      </w:r>
+      <w:r>
+        <w:t xml:space="preserve"> </w:t>
+      </w:r>
+      <w:proofErr w:type="gramStart"/>
+      <w:r>
+        <w:t xml:space="preserve">Type </w:t>
+      </w:r>
+      <w:r>
+        <w:t>"/s/ your name"</w:t>
+      </w:r>
+      <w:r>
+        <w:t xml:space="preserve"> </w:t>
+      </w:r>
+      <w:r>
+        <w:t>on the signature line.</w:t>
+      </w:r>
+      <w:proofErr w:type="gramEnd"/>
+      <w:r>
+        <w:t xml:space="preserve"> For example, </w:t>
+      </w:r>
+      <w:r>
+        <w:t>Zoe Lee's signature</w:t>
+      </w:r>
+      <w:bookmarkStart w:id="0" w:name="_GoBack"/>
+      <w:bookmarkEnd w:id="0"/>
+      <w:r>
+        <w:t xml:space="preserve">would be </w:t>
+      </w:r>
+      <w:r>
+        <w:t>"/s/ Zoe Lee."</w:t>
       </w:r>
     </w:p>
     <w:p>
@@ -262,7 +296,7 @@
       <w:r>
         <w:t xml:space="preserve"> [</w:t>
       </w:r>
-      <w:hyperlink r:id="rId5" w:history="1">
+      <w:hyperlink r:id="rId6" w:history="1">
         <w:r>
           <w:rPr>
             <w:rStyle w:val="Hyperlink"/>
@@ -277,7 +311,7 @@
       <w:r>
         <w:br/>
       </w:r>
-      <w:hyperlink r:id="rId6" w:history="1">
+      <w:hyperlink r:id="rId7" w:history="1">
         <w:r>
           <w:rPr>
             <w:rStyle w:val="Hyperlink"/>
@@ -346,7 +380,41 @@
     </w:p>
     <w:p>
       <w:r>
-        <w:t>If you fill out paper copies of the forms, or do not file them with TrueFiling, read the step “Sign if you use paper forms or do not use TrueFiling”</w:t>
+        <w:t xml:space="preserve">If you fill out paper copies of the forms, or do not </w:t>
+      </w:r>
+      <w:r>
+        <w:t xml:space="preserve">file them with </w:t>
+      </w:r>
+      <w:proofErr w:type="spellStart"/>
+      <w:r>
+        <w:t>TrueFiling</w:t>
+      </w:r>
+      <w:proofErr w:type="spellEnd"/>
+      <w:r>
+        <w:t xml:space="preserve">, </w:t>
+      </w:r>
+      <w:r>
+        <w:t>read {</w:t>
+      </w:r>
+      <w:r>
+        <w:t xml:space="preserve">{ </w:t>
+      </w:r>
+      <w:proofErr w:type="spellStart"/>
+      <w:r>
+        <w:t>sign_step.subject</w:t>
+      </w:r>
+      <w:proofErr w:type="spellEnd"/>
+      <w:r>
+        <w:t xml:space="preserve"> </w:t>
+      </w:r>
+      <w:r>
+        <w:t>}</w:t>
+      </w:r>
+      <w:r>
+        <w:t>} before you sign any document</w:t>
+      </w:r>
+      <w:r>
+        <w:t>.</w:t>
       </w:r>
     </w:p>
     <w:p>
@@ -451,11 +519,19 @@
         <w:t xml:space="preserve"> </w:t>
       </w:r>
       <w:r>
-        <w:t xml:space="preserve">Read {{ </w:t>
+        <w:t>Read {</w:t>
+      </w:r>
+      <w:proofErr w:type="gramStart"/>
+      <w:r>
+        <w:t xml:space="preserve">{ </w:t>
       </w:r>
       <w:proofErr w:type="spellStart"/>
       <w:r>
-        <w:t>dismiss_</w:t>
+        <w:t>dismiss</w:t>
+      </w:r>
+      <w:proofErr w:type="gramEnd"/>
+      <w:r>
+        <w:t>_</w:t>
       </w:r>
       <w:r>
         <w:t>step.subject</w:t>
@@ -466,9 +542,6 @@
       </w:r>
       <w:r>
         <w:t>.</w:t>
-      </w:r>
-      <w:r>
-        <w:t>{}</w:t>
       </w:r>
     </w:p>
     <w:p>
@@ -542,7 +615,7 @@
       <w:r>
         <w:t>[</w:t>
       </w:r>
-      <w:hyperlink r:id="rId7" w:history="1">
+      <w:hyperlink r:id="rId8" w:history="1">
         <w:r>
           <w:rPr>
             <w:rStyle w:val="Hyperlink"/>
@@ -564,7 +637,7 @@
       <w:r>
         <w:br/>
       </w:r>
-      <w:hyperlink r:id="rId8" w:history="1">
+      <w:hyperlink r:id="rId9" w:history="1">
         <w:r>
           <w:rPr>
             <w:rStyle w:val="Hyperlink"/>
@@ -634,7 +707,7 @@
       <w:r>
         <w:t>[</w:t>
       </w:r>
-      <w:hyperlink r:id="rId9" w:history="1">
+      <w:hyperlink r:id="rId10" w:history="1">
         <w:r>
           <w:rPr>
             <w:rStyle w:val="Hyperlink"/>
@@ -656,7 +729,7 @@
       <w:r>
         <w:br/>
       </w:r>
-      <w:hyperlink r:id="rId10" w:history="1">
+      <w:hyperlink r:id="rId11" w:history="1">
         <w:r>
           <w:rPr>
             <w:rStyle w:val="Hyperlink"/>
@@ -690,7 +763,7 @@
       <w:r>
         <w:t xml:space="preserve"> </w:t>
       </w:r>
-      <w:hyperlink r:id="rId11" w:history="1">
+      <w:hyperlink r:id="rId12" w:history="1">
         <w:r>
           <w:rPr>
             <w:rStyle w:val="Hyperlink"/>
@@ -702,7 +775,7 @@
       <w:r>
         <w:t xml:space="preserve"> | </w:t>
       </w:r>
-      <w:hyperlink r:id="rId12" w:history="1">
+      <w:hyperlink r:id="rId13" w:history="1">
         <w:r>
           <w:rPr>
             <w:rStyle w:val="Hyperlink"/>
@@ -791,7 +864,7 @@
       <w:r>
         <w:t>[</w:t>
       </w:r>
-      <w:hyperlink r:id="rId13" w:history="1">
+      <w:hyperlink r:id="rId14" w:history="1">
         <w:r>
           <w:rPr>
             <w:rStyle w:val="Hyperlink"/>
@@ -813,7 +886,7 @@
       <w:r>
         <w:br/>
       </w:r>
-      <w:hyperlink r:id="rId14" w:history="1">
+      <w:hyperlink r:id="rId15" w:history="1">
         <w:r>
           <w:rPr>
             <w:rStyle w:val="Hyperlink"/>
@@ -851,7 +924,7 @@
         </w:rPr>
         <w:br/>
       </w:r>
-      <w:hyperlink r:id="rId15" w:history="1">
+      <w:hyperlink r:id="rId16" w:history="1">
         <w:r>
           <w:rPr>
             <w:rStyle w:val="Hyperlink"/>
@@ -867,7 +940,7 @@
         </w:rPr>
         <w:br/>
       </w:r>
-      <w:hyperlink r:id="rId16" w:history="1">
+      <w:hyperlink r:id="rId17" w:history="1">
         <w:r>
           <w:rPr>
             <w:rStyle w:val="Hyperlink"/>
@@ -879,7 +952,7 @@
       <w:r>
         <w:br/>
       </w:r>
-      <w:hyperlink r:id="rId17" w:history="1">
+      <w:hyperlink r:id="rId18" w:history="1">
         <w:r>
           <w:rPr>
             <w:rStyle w:val="Hyperlink"/>
@@ -895,7 +968,7 @@
         </w:rPr>
         <w:br/>
       </w:r>
-      <w:hyperlink r:id="rId18" w:history="1">
+      <w:hyperlink r:id="rId19" w:history="1">
         <w:r>
           <w:rPr>
             <w:rStyle w:val="Hyperlink"/>
@@ -1221,7 +1294,7 @@
       <w:r>
         <w:t xml:space="preserve">ive defense applies to you, </w:t>
       </w:r>
-      <w:hyperlink r:id="rId19" w:history="1">
+      <w:hyperlink r:id="rId20" w:history="1">
         <w:r>
           <w:rPr>
             <w:rStyle w:val="Hyperlink"/>
@@ -1782,7 +1855,24 @@
         <w:pStyle w:val="Body"/>
       </w:pPr>
       <w:r>
-        <w:t>Check the box: I make the counterclaims below. If I asked the court to dismiss the case in section B (Affirmative Defenses), and the court does not dismiss the case, I do not waive my claim about the court's lack of jurisdiction.</w:t>
+        <w:t>Check the box:</w:t>
+      </w:r>
+    </w:p>
+    <w:p>
+      <w:pPr>
+        <w:pStyle w:val="Body"/>
+      </w:pPr>
+      <w:r>
+        <w:t>I make the counterclaims below. If I asked the court to dismiss the case in section B (Affirmative Defenses), and the court does not dismiss the case, I do not</w:t>
+      </w:r>
+      <w:r>
+        <w:t xml:space="preserve"> waive my claim about the </w:t>
+      </w:r>
+      <w:r>
+        <w:t>court's lack of jurisdiction</w:t>
+      </w:r>
+      <w:r>
+        <w:t>.</w:t>
       </w:r>
     </w:p>
     <w:p>
@@ -1801,7 +1891,23 @@
         <w:pStyle w:val="Body"/>
       </w:pPr>
       <w:r>
-        <w:t>Check the box: I have stated above that the case should be dismissed because the Alaska court does not have jurisdiction over the marital estate{{ ' and/or child custody' if minor_children else '' }}{{ ' and/or child custody' if not minor_children and wife_is_pregnant in ('husband', 'not husband') else '' }}.</w:t>
+        <w:t>Check the box:</w:t>
+      </w:r>
+    </w:p>
+    <w:p>
+      <w:pPr>
+        <w:pStyle w:val="Body"/>
+      </w:pPr>
+      <w:r>
+        <w:t xml:space="preserve">I have stated above that the case should be dismissed because the Alaska court does not have jurisdiction over the marital </w:t>
+      </w:r>
+      <w:proofErr w:type="gramStart"/>
+      <w:r>
+        <w:t>estate{</w:t>
+      </w:r>
+      <w:proofErr w:type="gramEnd"/>
+      <w:r>
+        <w:t>{ ' and/or child custody' if minor_children else '' }}{{ ' and/or child custody' if not minor_children and wife_is_pregnant in ('husband', 'not husband') else '' }}.</w:t>
       </w:r>
     </w:p>
     <w:p>
@@ -1875,12 +1981,6 @@
           <w:color w:val="92D050"/>
         </w:rPr>
         <w:t>{% if user_need == 'answer custody' or (user_need == 'answer divorce' and minor_children) %}</w:t>
-      </w:r>
-      <w:r>
-        <w:rPr>
-          <w:color w:val="92D050"/>
-        </w:rPr>
-        <w:t>.</w:t>
       </w:r>
     </w:p>
     <w:p>
@@ -2167,7 +2267,7 @@
       <w:r>
         <w:t xml:space="preserve"> [</w:t>
       </w:r>
-      <w:hyperlink r:id="rId20" w:history="1">
+      <w:hyperlink r:id="rId21" w:history="1">
         <w:r>
           <w:rPr>
             <w:rStyle w:val="Hyperlink"/>
@@ -2189,7 +2289,7 @@
       <w:r>
         <w:br/>
       </w:r>
-      <w:hyperlink r:id="rId21" w:history="1">
+      <w:hyperlink r:id="rId22" w:history="1">
         <w:r>
           <w:rPr>
             <w:rStyle w:val="Hyperlink"/>
@@ -2276,7 +2376,7 @@
       <w:r>
         <w:t xml:space="preserve"> [</w:t>
       </w:r>
-      <w:hyperlink r:id="rId22" w:history="1">
+      <w:hyperlink r:id="rId23" w:history="1">
         <w:r>
           <w:rPr>
             <w:rStyle w:val="Hyperlink"/>
@@ -2298,7 +2398,7 @@
       <w:r>
         <w:br/>
       </w:r>
-      <w:hyperlink r:id="rId23" w:history="1">
+      <w:hyperlink r:id="rId24" w:history="1">
         <w:r>
           <w:rPr>
             <w:rStyle w:val="Hyperlink"/>
@@ -2399,7 +2499,7 @@
       <w:r>
         <w:t xml:space="preserve">If you have any questions about whether Alaska is the correct place for your case or you want to ask the court to dismiss your case, you may want to </w:t>
       </w:r>
-      <w:hyperlink r:id="rId24" w:history="1">
+      <w:hyperlink r:id="rId25" w:history="1">
         <w:r>
           <w:rPr>
             <w:rStyle w:val="Hyperlink"/>
@@ -2415,7 +2515,7 @@
         </w:rPr>
         <w:br/>
       </w:r>
-      <w:hyperlink r:id="rId25" w:history="1">
+      <w:hyperlink r:id="rId26" w:history="1">
         <w:r>
           <w:rPr>
             <w:rStyle w:val="Hyperlink"/>
@@ -2461,7 +2561,7 @@
       <w:r>
         <w:t xml:space="preserve"> [</w:t>
       </w:r>
-      <w:hyperlink r:id="rId26" w:history="1">
+      <w:hyperlink r:id="rId27" w:history="1">
         <w:r>
           <w:rPr>
             <w:rStyle w:val="Hyperlink"/>
@@ -2483,7 +2583,7 @@
       <w:r>
         <w:br/>
       </w:r>
-      <w:hyperlink r:id="rId27" w:history="1">
+      <w:hyperlink r:id="rId28" w:history="1">
         <w:r>
           <w:rPr>
             <w:rStyle w:val="Hyperlink"/>
@@ -2565,7 +2665,7 @@
       <w:r>
         <w:t xml:space="preserve"> [</w:t>
       </w:r>
-      <w:hyperlink r:id="rId28" w:history="1">
+      <w:hyperlink r:id="rId29" w:history="1">
         <w:r>
           <w:rPr>
             <w:rStyle w:val="Hyperlink"/>
@@ -2587,7 +2687,7 @@
       <w:r>
         <w:br/>
       </w:r>
-      <w:hyperlink r:id="rId29" w:history="1">
+      <w:hyperlink r:id="rId30" w:history="1">
         <w:r>
           <w:rPr>
             <w:rStyle w:val="Hyperlink"/>
@@ -2641,7 +2741,7 @@
       <w:r>
         <w:t xml:space="preserve"> [</w:t>
       </w:r>
-      <w:hyperlink r:id="rId30" w:history="1">
+      <w:hyperlink r:id="rId31" w:history="1">
         <w:r>
           <w:rPr>
             <w:rStyle w:val="Hyperlink"/>
@@ -2663,7 +2763,7 @@
       <w:r>
         <w:br/>
       </w:r>
-      <w:hyperlink r:id="rId31" w:history="1">
+      <w:hyperlink r:id="rId32" w:history="1">
         <w:r>
           <w:rPr>
             <w:rStyle w:val="Hyperlink"/>
@@ -2680,7 +2780,7 @@
       <w:r>
         <w:t xml:space="preserve">See </w:t>
       </w:r>
-      <w:hyperlink r:id="rId32" w:history="1">
+      <w:hyperlink r:id="rId33" w:history="1">
         <w:r>
           <w:rPr>
             <w:rStyle w:val="Hyperlink"/>
@@ -2698,7 +2798,7 @@
       <w:r>
         <w:br/>
       </w:r>
-      <w:hyperlink r:id="rId33" w:history="1">
+      <w:hyperlink r:id="rId34" w:history="1">
         <w:r>
           <w:rPr>
             <w:rStyle w:val="Hyperlink"/>
@@ -2870,7 +2970,7 @@
       <w:r>
         <w:br/>
       </w:r>
-      <w:hyperlink r:id="rId34" w:history="1">
+      <w:hyperlink r:id="rId35" w:history="1">
         <w:r>
           <w:rPr>
             <w:rStyle w:val="Hyperlink"/>
@@ -2885,7 +2985,7 @@
       <w:r>
         <w:br/>
       </w:r>
-      <w:hyperlink r:id="rId35" w:history="1">
+      <w:hyperlink r:id="rId36" w:history="1">
         <w:r>
           <w:rPr>
             <w:rStyle w:val="Hyperlink"/>
@@ -2897,7 +2997,7 @@
       <w:r>
         <w:br/>
       </w:r>
-      <w:hyperlink r:id="rId36" w:history="1">
+      <w:hyperlink r:id="rId37" w:history="1">
         <w:r>
           <w:rPr>
             <w:rStyle w:val="Hyperlink"/>
@@ -2913,7 +3013,7 @@
         </w:rPr>
         <w:br/>
       </w:r>
-      <w:hyperlink r:id="rId37" w:history="1">
+      <w:hyperlink r:id="rId38" w:history="1">
         <w:r>
           <w:rPr>
             <w:rStyle w:val="Hyperlink"/>
@@ -2967,7 +3067,7 @@
         </w:rPr>
         <w:t xml:space="preserve"> [</w:t>
       </w:r>
-      <w:hyperlink r:id="rId38" w:history="1">
+      <w:hyperlink r:id="rId39" w:history="1">
         <w:r>
           <w:rPr>
             <w:rStyle w:val="Hyperlink"/>
@@ -2997,7 +3097,7 @@
       <w:r>
         <w:br/>
       </w:r>
-      <w:hyperlink r:id="rId39" w:history="1">
+      <w:hyperlink r:id="rId40" w:history="1">
         <w:r>
           <w:rPr>
             <w:rStyle w:val="Hyperlink"/>
@@ -3065,7 +3165,7 @@
       <w:r>
         <w:t xml:space="preserve"> [</w:t>
       </w:r>
-      <w:hyperlink r:id="rId40" w:history="1">
+      <w:hyperlink r:id="rId41" w:history="1">
         <w:r>
           <w:rPr>
             <w:rStyle w:val="Hyperlink"/>
@@ -3087,7 +3187,7 @@
       <w:r>
         <w:br/>
       </w:r>
-      <w:hyperlink r:id="rId41" w:history="1">
+      <w:hyperlink r:id="rId42" w:history="1">
         <w:r>
           <w:rPr>
             <w:rStyle w:val="Hyperlink"/>
@@ -3184,7 +3284,7 @@
       <w:r>
         <w:t xml:space="preserve"> [</w:t>
       </w:r>
-      <w:hyperlink r:id="rId42" w:history="1">
+      <w:hyperlink r:id="rId43" w:history="1">
         <w:r>
           <w:rPr>
             <w:rStyle w:val="Hyperlink"/>
@@ -3211,7 +3311,7 @@
       <w:r>
         <w:br/>
       </w:r>
-      <w:hyperlink r:id="rId43" w:history="1">
+      <w:hyperlink r:id="rId44" w:history="1">
         <w:r>
           <w:rPr>
             <w:rStyle w:val="Hyperlink"/>
@@ -3248,7 +3348,7 @@
       <w:r>
         <w:br/>
       </w:r>
-      <w:hyperlink r:id="rId44" w:history="1">
+      <w:hyperlink r:id="rId45" w:history="1">
         <w:r>
           <w:rPr>
             <w:rStyle w:val="Hyperlink"/>
@@ -3260,7 +3360,7 @@
       <w:r>
         <w:br/>
       </w:r>
-      <w:hyperlink r:id="rId45" w:history="1">
+      <w:hyperlink r:id="rId46" w:history="1">
         <w:r>
           <w:rPr>
             <w:rStyle w:val="Hyperlink"/>
@@ -3272,7 +3372,7 @@
       <w:r>
         <w:br/>
       </w:r>
-      <w:hyperlink r:id="rId46" w:history="1">
+      <w:hyperlink r:id="rId47" w:history="1">
         <w:r>
           <w:rPr>
             <w:rStyle w:val="Hyperlink"/>
@@ -3284,7 +3384,7 @@
       <w:r>
         <w:br/>
       </w:r>
-      <w:hyperlink r:id="rId47" w:history="1">
+      <w:hyperlink r:id="rId48" w:history="1">
         <w:r>
           <w:rPr>
             <w:rStyle w:val="Hyperlink"/>
@@ -3349,7 +3449,7 @@
       <w:r>
         <w:t xml:space="preserve"> [</w:t>
       </w:r>
-      <w:hyperlink r:id="rId48" w:history="1">
+      <w:hyperlink r:id="rId49" w:history="1">
         <w:r>
           <w:rPr>
             <w:rStyle w:val="Hyperlink"/>
@@ -3371,7 +3471,7 @@
       <w:r>
         <w:br/>
       </w:r>
-      <w:hyperlink r:id="rId49" w:history="1">
+      <w:hyperlink r:id="rId50" w:history="1">
         <w:r>
           <w:rPr>
             <w:rStyle w:val="Hyperlink"/>
@@ -3411,7 +3511,7 @@
       <w:r>
         <w:br/>
       </w:r>
-      <w:hyperlink r:id="rId50" w:history="1">
+      <w:hyperlink r:id="rId51" w:history="1">
         <w:r>
           <w:rPr>
             <w:rStyle w:val="Hyperlink"/>
@@ -3426,7 +3526,7 @@
       <w:r>
         <w:br/>
       </w:r>
-      <w:hyperlink r:id="rId51" w:history="1">
+      <w:hyperlink r:id="rId52" w:history="1">
         <w:r>
           <w:rPr>
             <w:rStyle w:val="Hyperlink"/>
@@ -3438,7 +3538,7 @@
       <w:r>
         <w:br/>
       </w:r>
-      <w:hyperlink r:id="rId52" w:history="1">
+      <w:hyperlink r:id="rId53" w:history="1">
         <w:r>
           <w:rPr>
             <w:rStyle w:val="Hyperlink"/>
@@ -3450,7 +3550,7 @@
       <w:r>
         <w:br/>
       </w:r>
-      <w:hyperlink r:id="rId53" w:history="1">
+      <w:hyperlink r:id="rId54" w:history="1">
         <w:r>
           <w:rPr>
             <w:rStyle w:val="Hyperlink"/>
@@ -3541,7 +3641,7 @@
       <w:r>
         <w:t xml:space="preserve"> [</w:t>
       </w:r>
-      <w:hyperlink r:id="rId54" w:history="1">
+      <w:hyperlink r:id="rId55" w:history="1">
         <w:r>
           <w:rPr>
             <w:rStyle w:val="Hyperlink"/>
@@ -3563,7 +3663,7 @@
       <w:r>
         <w:br/>
       </w:r>
-      <w:hyperlink r:id="rId55" w:history="1">
+      <w:hyperlink r:id="rId56" w:history="1">
         <w:r>
           <w:rPr>
             <w:rStyle w:val="Hyperlink"/>
@@ -3608,7 +3708,7 @@
       <w:r>
         <w:t xml:space="preserve"> [</w:t>
       </w:r>
-      <w:hyperlink r:id="rId56" w:history="1">
+      <w:hyperlink r:id="rId57" w:history="1">
         <w:r>
           <w:rPr>
             <w:rStyle w:val="Hyperlink"/>
@@ -3630,7 +3730,7 @@
       <w:r>
         <w:br/>
       </w:r>
-      <w:hyperlink r:id="rId57" w:history="1">
+      <w:hyperlink r:id="rId58" w:history="1">
         <w:r>
           <w:rPr>
             <w:rStyle w:val="Hyperlink"/>
@@ -3680,7 +3780,7 @@
       <w:pPr>
         <w:pStyle w:val="Body"/>
       </w:pPr>
-      <w:hyperlink r:id="rId58" w:history="1">
+      <w:hyperlink r:id="rId59" w:history="1">
         <w:r>
           <w:rPr>
             <w:rStyle w:val="Hyperlink"/>
@@ -3692,7 +3792,7 @@
       <w:r>
         <w:br/>
       </w:r>
-      <w:hyperlink r:id="rId59" w:history="1">
+      <w:hyperlink r:id="rId60" w:history="1">
         <w:r>
           <w:rPr>
             <w:rStyle w:val="Hyperlink"/>
@@ -3733,8 +3833,8 @@
 </file>
 
 <file path=word/numbering.xml><?xml version="1.0" encoding="utf-8"?>
-<w:numbering xmlns:wpc="http://schemas.microsoft.com/office/word/2010/wordprocessingCanvas" xmlns:cx="http://schemas.microsoft.com/office/drawing/2014/chartex" xmlns:cx1="http://schemas.microsoft.com/office/drawing/2015/9/8/chartex" xmlns:cx2="http://schemas.microsoft.com/office/drawing/2015/10/21/chartex" xmlns:cx3="http://schemas.microsoft.com/office/drawing/2016/5/9/chartex" xmlns:cx4="http://schemas.microsoft.com/office/drawing/2016/5/10/chartex" xmlns:cx5="http://schemas.microsoft.com/office/drawing/2016/5/11/chartex" xmlns:cx6="http://schemas.microsoft.com/office/drawing/2016/5/12/chartex" xmlns:cx7="http://schemas.microsoft.com/office/drawing/2016/5/13/chartex" xmlns:cx8="http://schemas.microsoft.com/office/drawing/2016/5/14/chartex" xmlns:mc="http://schemas.openxmlformats.org/markup-compatibility/2006" xmlns:aink="http://schemas.microsoft.com/office/drawing/2016/ink" xmlns:am3d="http://schemas.microsoft.com/office/drawing/2017/model3d" xmlns:o="urn:schemas-microsoft-com:office:office" xmlns:r="http://schemas.openxmlformats.org/officeDocument/2006/relationships" xmlns:m="http://schemas.openxmlformats.org/officeDocument/2006/math" xmlns:v="urn:schemas-microsoft-com:vml" xmlns:wp14="http://schemas.microsoft.com/office/word/2010/wordprocessingDrawing" xmlns:wp="http://schemas.openxmlformats.org/drawingml/2006/wordprocessingDrawing" xmlns:w10="urn:schemas-microsoft-com:office:word" xmlns:w="http://schemas.openxmlformats.org/wordprocessingml/2006/main" xmlns:w14="http://schemas.microsoft.com/office/word/2010/wordml" xmlns:w15="http://schemas.microsoft.com/office/word/2012/wordml" xmlns:w16cex="http://schemas.microsoft.com/office/word/2018/wordml/cex" xmlns:w16cid="http://schemas.microsoft.com/office/word/2016/wordml/cid" xmlns:w16="http://schemas.microsoft.com/office/word/2018/wordml" xmlns:w16sdtdh="http://schemas.microsoft.com/office/word/2020/wordml/sdtdatahash" xmlns:w16se="http://schemas.microsoft.com/office/word/2015/wordml/symex" xmlns:wpg="http://schemas.microsoft.com/office/word/2010/wordprocessingGroup" xmlns:wpi="http://schemas.microsoft.com/office/word/2010/wordprocessingInk" xmlns:wne="http://schemas.microsoft.com/office/word/2006/wordml" xmlns:wps="http://schemas.microsoft.com/office/word/2010/wordprocessingShape" mc:Ignorable="w14 w15 w16se w16cid w16 w16cex w16sdtdh wp14">
-  <w:abstractNum w:abstractNumId="0" w15:restartNumberingAfterBreak="0">
+<w:numbering xmlns:wpc="http://schemas.microsoft.com/office/word/2010/wordprocessingCanvas" xmlns:mc="http://schemas.openxmlformats.org/markup-compatibility/2006" xmlns:o="urn:schemas-microsoft-com:office:office" xmlns:r="http://schemas.openxmlformats.org/officeDocument/2006/relationships" xmlns:m="http://schemas.openxmlformats.org/officeDocument/2006/math" xmlns:v="urn:schemas-microsoft-com:vml" xmlns:wp14="http://schemas.microsoft.com/office/word/2010/wordprocessingDrawing" xmlns:wp="http://schemas.openxmlformats.org/drawingml/2006/wordprocessingDrawing" xmlns:w10="urn:schemas-microsoft-com:office:word" xmlns:w="http://schemas.openxmlformats.org/wordprocessingml/2006/main" xmlns:w14="http://schemas.microsoft.com/office/word/2010/wordml" xmlns:wpg="http://schemas.microsoft.com/office/word/2010/wordprocessingGroup" xmlns:wpi="http://schemas.microsoft.com/office/word/2010/wordprocessingInk" xmlns:wne="http://schemas.microsoft.com/office/word/2006/wordml" xmlns:wps="http://schemas.microsoft.com/office/word/2010/wordprocessingShape" mc:Ignorable="w14 wp14">
+  <w:abstractNum w:abstractNumId="0">
     <w:nsid w:val="08C6366F"/>
     <w:multiLevelType w:val="hybridMultilevel"/>
     <w:tmpl w:val="D3561CAA"/>
@@ -3821,7 +3921,7 @@
       </w:pPr>
     </w:lvl>
   </w:abstractNum>
-  <w:abstractNum w:abstractNumId="1" w15:restartNumberingAfterBreak="0">
+  <w:abstractNum w:abstractNumId="1">
     <w:nsid w:val="0C357DD6"/>
     <w:multiLevelType w:val="hybridMultilevel"/>
     <w:tmpl w:val="D83AD7E4"/>
@@ -3912,7 +4012,7 @@
       </w:pPr>
     </w:lvl>
   </w:abstractNum>
-  <w:abstractNum w:abstractNumId="2" w15:restartNumberingAfterBreak="0">
+  <w:abstractNum w:abstractNumId="2">
     <w:nsid w:val="0DEA069D"/>
     <w:multiLevelType w:val="multilevel"/>
     <w:tmpl w:val="450C4EF6"/>
@@ -4053,7 +4153,7 @@
       </w:rPr>
     </w:lvl>
   </w:abstractNum>
-  <w:abstractNum w:abstractNumId="3" w15:restartNumberingAfterBreak="0">
+  <w:abstractNum w:abstractNumId="3">
     <w:nsid w:val="15510218"/>
     <w:multiLevelType w:val="hybridMultilevel"/>
     <w:tmpl w:val="8EF49D20"/>
@@ -4143,7 +4243,7 @@
       </w:pPr>
     </w:lvl>
   </w:abstractNum>
-  <w:abstractNum w:abstractNumId="4" w15:restartNumberingAfterBreak="0">
+  <w:abstractNum w:abstractNumId="4">
     <w:nsid w:val="253D4794"/>
     <w:multiLevelType w:val="multilevel"/>
     <w:tmpl w:val="8C80AB36"/>
@@ -4256,7 +4356,7 @@
       </w:rPr>
     </w:lvl>
   </w:abstractNum>
-  <w:abstractNum w:abstractNumId="5" w15:restartNumberingAfterBreak="0">
+  <w:abstractNum w:abstractNumId="5">
     <w:nsid w:val="27FF20A5"/>
     <w:multiLevelType w:val="hybridMultilevel"/>
     <w:tmpl w:val="9036D3D8"/>
@@ -4371,7 +4471,7 @@
       </w:rPr>
     </w:lvl>
   </w:abstractNum>
-  <w:abstractNum w:abstractNumId="6" w15:restartNumberingAfterBreak="0">
+  <w:abstractNum w:abstractNumId="6">
     <w:nsid w:val="296F3872"/>
     <w:multiLevelType w:val="hybridMultilevel"/>
     <w:tmpl w:val="5E9E6A2E"/>
@@ -4485,7 +4585,7 @@
       </w:rPr>
     </w:lvl>
   </w:abstractNum>
-  <w:abstractNum w:abstractNumId="7" w15:restartNumberingAfterBreak="0">
+  <w:abstractNum w:abstractNumId="7">
     <w:nsid w:val="4803540D"/>
     <w:multiLevelType w:val="hybridMultilevel"/>
     <w:tmpl w:val="CC58063A"/>
@@ -4599,7 +4699,7 @@
       </w:rPr>
     </w:lvl>
   </w:abstractNum>
-  <w:abstractNum w:abstractNumId="8" w15:restartNumberingAfterBreak="0">
+  <w:abstractNum w:abstractNumId="8">
     <w:nsid w:val="492F4D8F"/>
     <w:multiLevelType w:val="hybridMultilevel"/>
     <w:tmpl w:val="F62C94DE"/>
@@ -4713,7 +4813,7 @@
       </w:rPr>
     </w:lvl>
   </w:abstractNum>
-  <w:abstractNum w:abstractNumId="9" w15:restartNumberingAfterBreak="0">
+  <w:abstractNum w:abstractNumId="9">
     <w:nsid w:val="5AB946E8"/>
     <w:multiLevelType w:val="hybridMultilevel"/>
     <w:tmpl w:val="4CFA7E9C"/>
@@ -4825,7 +4925,7 @@
       </w:rPr>
     </w:lvl>
   </w:abstractNum>
-  <w:abstractNum w:abstractNumId="10" w15:restartNumberingAfterBreak="0">
+  <w:abstractNum w:abstractNumId="10">
     <w:nsid w:val="69BB0B83"/>
     <w:multiLevelType w:val="hybridMultilevel"/>
     <w:tmpl w:val="B15E1158"/>
@@ -4938,7 +5038,7 @@
       </w:rPr>
     </w:lvl>
   </w:abstractNum>
-  <w:abstractNum w:abstractNumId="11" w15:restartNumberingAfterBreak="0">
+  <w:abstractNum w:abstractNumId="11">
     <w:nsid w:val="6B961852"/>
     <w:multiLevelType w:val="hybridMultilevel"/>
     <w:tmpl w:val="DAAECE10"/>
@@ -5072,7 +5172,7 @@
 </file>
 
 <file path=word/styles.xml><?xml version="1.0" encoding="utf-8"?>
-<w:styles xmlns:mc="http://schemas.openxmlformats.org/markup-compatibility/2006" xmlns:r="http://schemas.openxmlformats.org/officeDocument/2006/relationships" xmlns:w="http://schemas.openxmlformats.org/wordprocessingml/2006/main" xmlns:w14="http://schemas.microsoft.com/office/word/2010/wordml" xmlns:w15="http://schemas.microsoft.com/office/word/2012/wordml" xmlns:w16cex="http://schemas.microsoft.com/office/word/2018/wordml/cex" xmlns:w16cid="http://schemas.microsoft.com/office/word/2016/wordml/cid" xmlns:w16="http://schemas.microsoft.com/office/word/2018/wordml" xmlns:w16sdtdh="http://schemas.microsoft.com/office/word/2020/wordml/sdtdatahash" xmlns:w16se="http://schemas.microsoft.com/office/word/2015/wordml/symex" mc:Ignorable="w14 w15 w16se w16cid w16 w16cex w16sdtdh">
+<w:styles xmlns:mc="http://schemas.openxmlformats.org/markup-compatibility/2006" xmlns:r="http://schemas.openxmlformats.org/officeDocument/2006/relationships" xmlns:w="http://schemas.openxmlformats.org/wordprocessingml/2006/main" xmlns:w14="http://schemas.microsoft.com/office/word/2010/wordml" mc:Ignorable="w14">
   <w:docDefaults>
     <w:rPrDefault>
       <w:rPr>
@@ -5088,383 +5188,147 @@
       </w:pPr>
     </w:pPrDefault>
   </w:docDefaults>
-  <w:latentStyles w:defLockedState="0" w:defUIPriority="99" w:defSemiHidden="0" w:defUnhideWhenUsed="0" w:defQFormat="0" w:count="376">
-    <w:lsdException w:name="Normal" w:uiPriority="0" w:qFormat="1"/>
-    <w:lsdException w:name="heading 1" w:uiPriority="9" w:qFormat="1"/>
-    <w:lsdException w:name="heading 2" w:semiHidden="1" w:uiPriority="9" w:unhideWhenUsed="1" w:qFormat="1"/>
-    <w:lsdException w:name="heading 3" w:semiHidden="1" w:uiPriority="9" w:unhideWhenUsed="1" w:qFormat="1"/>
-    <w:lsdException w:name="heading 4" w:semiHidden="1" w:uiPriority="9" w:unhideWhenUsed="1" w:qFormat="1"/>
-    <w:lsdException w:name="heading 5" w:semiHidden="1" w:uiPriority="9" w:unhideWhenUsed="1" w:qFormat="1"/>
-    <w:lsdException w:name="heading 6" w:semiHidden="1" w:uiPriority="9" w:unhideWhenUsed="1" w:qFormat="1"/>
-    <w:lsdException w:name="heading 7" w:semiHidden="1" w:uiPriority="9" w:unhideWhenUsed="1" w:qFormat="1"/>
-    <w:lsdException w:name="heading 8" w:semiHidden="1" w:uiPriority="9" w:unhideWhenUsed="1" w:qFormat="1"/>
-    <w:lsdException w:name="heading 9" w:semiHidden="1" w:uiPriority="9" w:unhideWhenUsed="1" w:qFormat="1"/>
-    <w:lsdException w:name="index 1" w:semiHidden="1" w:unhideWhenUsed="1"/>
-    <w:lsdException w:name="index 2" w:semiHidden="1" w:unhideWhenUsed="1"/>
-    <w:lsdException w:name="index 3" w:semiHidden="1" w:unhideWhenUsed="1"/>
-    <w:lsdException w:name="index 4" w:semiHidden="1" w:unhideWhenUsed="1"/>
-    <w:lsdException w:name="index 5" w:semiHidden="1" w:unhideWhenUsed="1"/>
-    <w:lsdException w:name="index 6" w:semiHidden="1" w:unhideWhenUsed="1"/>
-    <w:lsdException w:name="index 7" w:semiHidden="1" w:unhideWhenUsed="1"/>
-    <w:lsdException w:name="index 8" w:semiHidden="1" w:unhideWhenUsed="1"/>
-    <w:lsdException w:name="index 9" w:semiHidden="1" w:unhideWhenUsed="1"/>
-    <w:lsdException w:name="toc 1" w:semiHidden="1" w:uiPriority="39" w:unhideWhenUsed="1"/>
-    <w:lsdException w:name="toc 2" w:semiHidden="1" w:uiPriority="39" w:unhideWhenUsed="1"/>
-    <w:lsdException w:name="toc 3" w:semiHidden="1" w:uiPriority="39" w:unhideWhenUsed="1"/>
-    <w:lsdException w:name="toc 4" w:semiHidden="1" w:uiPriority="39" w:unhideWhenUsed="1"/>
-    <w:lsdException w:name="toc 5" w:semiHidden="1" w:uiPriority="39" w:unhideWhenUsed="1"/>
-    <w:lsdException w:name="toc 6" w:semiHidden="1" w:uiPriority="39" w:unhideWhenUsed="1"/>
-    <w:lsdException w:name="toc 7" w:semiHidden="1" w:uiPriority="39" w:unhideWhenUsed="1"/>
-    <w:lsdException w:name="toc 8" w:semiHidden="1" w:uiPriority="39" w:unhideWhenUsed="1"/>
-    <w:lsdException w:name="toc 9" w:semiHidden="1" w:uiPriority="39" w:unhideWhenUsed="1"/>
-    <w:lsdException w:name="Normal Indent" w:semiHidden="1" w:unhideWhenUsed="1"/>
-    <w:lsdException w:name="footnote text" w:semiHidden="1" w:unhideWhenUsed="1"/>
-    <w:lsdException w:name="annotation text" w:semiHidden="1" w:unhideWhenUsed="1" w:qFormat="1"/>
-    <w:lsdException w:name="header" w:semiHidden="1" w:unhideWhenUsed="1"/>
-    <w:lsdException w:name="footer" w:semiHidden="1" w:unhideWhenUsed="1"/>
-    <w:lsdException w:name="index heading" w:semiHidden="1" w:unhideWhenUsed="1"/>
-    <w:lsdException w:name="caption" w:semiHidden="1" w:uiPriority="35" w:unhideWhenUsed="1" w:qFormat="1"/>
-    <w:lsdException w:name="table of figures" w:semiHidden="1" w:unhideWhenUsed="1"/>
-    <w:lsdException w:name="envelope address" w:semiHidden="1" w:unhideWhenUsed="1"/>
-    <w:lsdException w:name="envelope return" w:semiHidden="1" w:unhideWhenUsed="1"/>
-    <w:lsdException w:name="footnote reference" w:semiHidden="1" w:unhideWhenUsed="1"/>
-    <w:lsdException w:name="annotation reference" w:semiHidden="1" w:unhideWhenUsed="1" w:qFormat="1"/>
-    <w:lsdException w:name="line number" w:semiHidden="1" w:unhideWhenUsed="1"/>
-    <w:lsdException w:name="page number" w:semiHidden="1" w:unhideWhenUsed="1"/>
-    <w:lsdException w:name="endnote reference" w:semiHidden="1" w:unhideWhenUsed="1"/>
-    <w:lsdException w:name="endnote text" w:semiHidden="1" w:unhideWhenUsed="1"/>
-    <w:lsdException w:name="table of authorities" w:semiHidden="1" w:unhideWhenUsed="1"/>
-    <w:lsdException w:name="macro" w:semiHidden="1" w:unhideWhenUsed="1"/>
-    <w:lsdException w:name="toa heading" w:semiHidden="1" w:unhideWhenUsed="1"/>
-    <w:lsdException w:name="List" w:semiHidden="1" w:unhideWhenUsed="1"/>
-    <w:lsdException w:name="List Bullet" w:semiHidden="1" w:unhideWhenUsed="1"/>
-    <w:lsdException w:name="List Number" w:semiHidden="1" w:unhideWhenUsed="1"/>
-    <w:lsdException w:name="List 2" w:semiHidden="1" w:unhideWhenUsed="1"/>
-    <w:lsdException w:name="List 3" w:semiHidden="1" w:unhideWhenUsed="1"/>
-    <w:lsdException w:name="List 4" w:semiHidden="1" w:unhideWhenUsed="1"/>
-    <w:lsdException w:name="List 5" w:semiHidden="1" w:unhideWhenUsed="1"/>
-    <w:lsdException w:name="List Bullet 2" w:semiHidden="1" w:unhideWhenUsed="1"/>
-    <w:lsdException w:name="List Bullet 3" w:semiHidden="1" w:unhideWhenUsed="1"/>
-    <w:lsdException w:name="List Bullet 4" w:semiHidden="1" w:unhideWhenUsed="1"/>
-    <w:lsdException w:name="List Bullet 5" w:semiHidden="1" w:unhideWhenUsed="1"/>
-    <w:lsdException w:name="List Number 2" w:semiHidden="1" w:unhideWhenUsed="1"/>
-    <w:lsdException w:name="List Number 3" w:semiHidden="1" w:unhideWhenUsed="1"/>
-    <w:lsdException w:name="List Number 4" w:semiHidden="1" w:unhideWhenUsed="1"/>
-    <w:lsdException w:name="List Number 5" w:semiHidden="1" w:unhideWhenUsed="1"/>
-    <w:lsdException w:name="Title" w:uiPriority="10" w:qFormat="1"/>
-    <w:lsdException w:name="Closing" w:semiHidden="1" w:unhideWhenUsed="1"/>
-    <w:lsdException w:name="Signature" w:semiHidden="1" w:unhideWhenUsed="1"/>
-    <w:lsdException w:name="Default Paragraph Font" w:semiHidden="1" w:uiPriority="1" w:unhideWhenUsed="1"/>
-    <w:lsdException w:name="Body Text" w:semiHidden="1" w:uiPriority="1" w:unhideWhenUsed="1" w:qFormat="1"/>
-    <w:lsdException w:name="Body Text Indent" w:semiHidden="1" w:unhideWhenUsed="1"/>
-    <w:lsdException w:name="List Continue" w:semiHidden="1" w:unhideWhenUsed="1"/>
-    <w:lsdException w:name="List Continue 2" w:semiHidden="1" w:unhideWhenUsed="1"/>
-    <w:lsdException w:name="List Continue 3" w:semiHidden="1" w:unhideWhenUsed="1"/>
-    <w:lsdException w:name="List Continue 4" w:semiHidden="1" w:unhideWhenUsed="1"/>
-    <w:lsdException w:name="List Continue 5" w:semiHidden="1" w:unhideWhenUsed="1"/>
-    <w:lsdException w:name="Message Header" w:semiHidden="1" w:unhideWhenUsed="1"/>
-    <w:lsdException w:name="Subtitle" w:uiPriority="11" w:qFormat="1"/>
-    <w:lsdException w:name="Salutation" w:semiHidden="1" w:unhideWhenUsed="1"/>
-    <w:lsdException w:name="Date" w:semiHidden="1" w:unhideWhenUsed="1"/>
-    <w:lsdException w:name="Body Text First Indent" w:semiHidden="1" w:unhideWhenUsed="1"/>
-    <w:lsdException w:name="Body Text First Indent 2" w:semiHidden="1" w:unhideWhenUsed="1"/>
-    <w:lsdException w:name="Note Heading" w:semiHidden="1" w:unhideWhenUsed="1"/>
-    <w:lsdException w:name="Body Text 2" w:semiHidden="1" w:unhideWhenUsed="1"/>
-    <w:lsdException w:name="Body Text 3" w:semiHidden="1" w:unhideWhenUsed="1"/>
-    <w:lsdException w:name="Body Text Indent 2" w:semiHidden="1" w:unhideWhenUsed="1"/>
-    <w:lsdException w:name="Body Text Indent 3" w:semiHidden="1" w:unhideWhenUsed="1"/>
-    <w:lsdException w:name="Block Text" w:semiHidden="1" w:unhideWhenUsed="1"/>
-    <w:lsdException w:name="Hyperlink" w:semiHidden="1" w:unhideWhenUsed="1"/>
-    <w:lsdException w:name="FollowedHyperlink" w:semiHidden="1" w:unhideWhenUsed="1"/>
-    <w:lsdException w:name="Strong" w:uiPriority="22" w:qFormat="1"/>
-    <w:lsdException w:name="Emphasis" w:uiPriority="20" w:qFormat="1"/>
-    <w:lsdException w:name="Document Map" w:semiHidden="1" w:unhideWhenUsed="1"/>
-    <w:lsdException w:name="Plain Text" w:semiHidden="1" w:unhideWhenUsed="1"/>
-    <w:lsdException w:name="E-mail Signature" w:semiHidden="1" w:unhideWhenUsed="1"/>
-    <w:lsdException w:name="HTML Top of Form" w:semiHidden="1" w:unhideWhenUsed="1"/>
-    <w:lsdException w:name="HTML Bottom of Form" w:semiHidden="1" w:unhideWhenUsed="1"/>
-    <w:lsdException w:name="Normal (Web)" w:semiHidden="1" w:unhideWhenUsed="1"/>
-    <w:lsdException w:name="HTML Acronym" w:semiHidden="1" w:unhideWhenUsed="1"/>
-    <w:lsdException w:name="HTML Address" w:semiHidden="1" w:unhideWhenUsed="1"/>
-    <w:lsdException w:name="HTML Cite" w:semiHidden="1" w:unhideWhenUsed="1"/>
-    <w:lsdException w:name="HTML Code" w:semiHidden="1" w:unhideWhenUsed="1"/>
-    <w:lsdException w:name="HTML Definition" w:semiHidden="1" w:unhideWhenUsed="1"/>
-    <w:lsdException w:name="HTML Keyboard" w:semiHidden="1" w:unhideWhenUsed="1"/>
-    <w:lsdException w:name="HTML Preformatted" w:semiHidden="1" w:unhideWhenUsed="1"/>
-    <w:lsdException w:name="HTML Sample" w:semiHidden="1" w:unhideWhenUsed="1"/>
-    <w:lsdException w:name="HTML Typewriter" w:semiHidden="1" w:unhideWhenUsed="1"/>
-    <w:lsdException w:name="HTML Variable" w:semiHidden="1" w:unhideWhenUsed="1"/>
-    <w:lsdException w:name="Normal Table" w:semiHidden="1" w:unhideWhenUsed="1"/>
-    <w:lsdException w:name="annotation subject" w:semiHidden="1" w:unhideWhenUsed="1"/>
-    <w:lsdException w:name="No List" w:semiHidden="1" w:unhideWhenUsed="1"/>
-    <w:lsdException w:name="Outline List 1" w:semiHidden="1" w:unhideWhenUsed="1"/>
-    <w:lsdException w:name="Outline List 2" w:semiHidden="1" w:unhideWhenUsed="1"/>
-    <w:lsdException w:name="Outline List 3" w:semiHidden="1" w:unhideWhenUsed="1"/>
-    <w:lsdException w:name="Table Simple 1" w:semiHidden="1" w:unhideWhenUsed="1"/>
-    <w:lsdException w:name="Table Simple 2" w:semiHidden="1" w:unhideWhenUsed="1"/>
-    <w:lsdException w:name="Table Simple 3" w:semiHidden="1" w:unhideWhenUsed="1"/>
-    <w:lsdException w:name="Table Classic 1" w:semiHidden="1" w:unhideWhenUsed="1"/>
-    <w:lsdException w:name="Table Classic 2" w:semiHidden="1" w:unhideWhenUsed="1"/>
-    <w:lsdException w:name="Table Classic 3" w:semiHidden="1" w:unhideWhenUsed="1"/>
-    <w:lsdException w:name="Table Classic 4" w:semiHidden="1" w:unhideWhenUsed="1"/>
-    <w:lsdException w:name="Table Colorful 1" w:semiHidden="1" w:unhideWhenUsed="1"/>
-    <w:lsdException w:name="Table Colorful 2" w:semiHidden="1" w:unhideWhenUsed="1"/>
-    <w:lsdException w:name="Table Colorful 3" w:semiHidden="1" w:unhideWhenUsed="1"/>
-    <w:lsdException w:name="Table Columns 1" w:semiHidden="1" w:unhideWhenUsed="1"/>
-    <w:lsdException w:name="Table Columns 2" w:semiHidden="1" w:unhideWhenUsed="1"/>
-    <w:lsdException w:name="Table Columns 3" w:semiHidden="1" w:unhideWhenUsed="1"/>
-    <w:lsdException w:name="Table Columns 4" w:semiHidden="1" w:unhideWhenUsed="1"/>
-    <w:lsdException w:name="Table Columns 5" w:semiHidden="1" w:unhideWhenUsed="1"/>
-    <w:lsdException w:name="Table Grid 1" w:semiHidden="1" w:unhideWhenUsed="1"/>
-    <w:lsdException w:name="Table Grid 2" w:semiHidden="1" w:unhideWhenUsed="1"/>
-    <w:lsdException w:name="Table Grid 3" w:semiHidden="1" w:unhideWhenUsed="1"/>
-    <w:lsdException w:name="Table Grid 4" w:semiHidden="1" w:unhideWhenUsed="1"/>
-    <w:lsdException w:name="Table Grid 5" w:semiHidden="1" w:unhideWhenUsed="1"/>
-    <w:lsdException w:name="Table Grid 6" w:semiHidden="1" w:unhideWhenUsed="1"/>
-    <w:lsdException w:name="Table Grid 7" w:semiHidden="1" w:unhideWhenUsed="1"/>
-    <w:lsdException w:name="Table Grid 8" w:semiHidden="1" w:unhideWhenUsed="1"/>
-    <w:lsdException w:name="Table List 1" w:semiHidden="1" w:unhideWhenUsed="1"/>
-    <w:lsdException w:name="Table List 2" w:semiHidden="1" w:unhideWhenUsed="1"/>
-    <w:lsdException w:name="Table List 3" w:semiHidden="1" w:unhideWhenUsed="1"/>
-    <w:lsdException w:name="Table List 4" w:semiHidden="1" w:unhideWhenUsed="1"/>
-    <w:lsdException w:name="Table List 5" w:semiHidden="1" w:unhideWhenUsed="1"/>
-    <w:lsdException w:name="Table List 6" w:semiHidden="1" w:unhideWhenUsed="1"/>
-    <w:lsdException w:name="Table List 7" w:semiHidden="1" w:unhideWhenUsed="1"/>
-    <w:lsdException w:name="Table List 8" w:semiHidden="1" w:unhideWhenUsed="1"/>
-    <w:lsdException w:name="Table 3D effects 1" w:semiHidden="1" w:unhideWhenUsed="1"/>
-    <w:lsdException w:name="Table 3D effects 2" w:semiHidden="1" w:unhideWhenUsed="1"/>
-    <w:lsdException w:name="Table 3D effects 3" w:semiHidden="1" w:unhideWhenUsed="1"/>
-    <w:lsdException w:name="Table Contemporary" w:semiHidden="1" w:unhideWhenUsed="1"/>
-    <w:lsdException w:name="Table Elegant" w:semiHidden="1" w:unhideWhenUsed="1"/>
-    <w:lsdException w:name="Table Professional" w:semiHidden="1" w:unhideWhenUsed="1"/>
-    <w:lsdException w:name="Table Subtle 1" w:semiHidden="1" w:unhideWhenUsed="1"/>
-    <w:lsdException w:name="Table Subtle 2" w:semiHidden="1" w:unhideWhenUsed="1"/>
-    <w:lsdException w:name="Table Web 1" w:semiHidden="1" w:unhideWhenUsed="1"/>
-    <w:lsdException w:name="Table Web 2" w:semiHidden="1" w:unhideWhenUsed="1"/>
-    <w:lsdException w:name="Table Web 3" w:semiHidden="1" w:unhideWhenUsed="1"/>
-    <w:lsdException w:name="Balloon Text" w:semiHidden="1" w:unhideWhenUsed="1"/>
-    <w:lsdException w:name="Table Grid" w:uiPriority="39"/>
-    <w:lsdException w:name="Table Theme" w:semiHidden="1" w:unhideWhenUsed="1"/>
-    <w:lsdException w:name="Placeholder Text" w:semiHidden="1"/>
-    <w:lsdException w:name="No Spacing" w:uiPriority="1" w:qFormat="1"/>
-    <w:lsdException w:name="Light Shading" w:uiPriority="60"/>
-    <w:lsdException w:name="Light List" w:uiPriority="61"/>
-    <w:lsdException w:name="Light Grid" w:uiPriority="62"/>
-    <w:lsdException w:name="Medium Shading 1" w:uiPriority="63"/>
-    <w:lsdException w:name="Medium Shading 2" w:uiPriority="64"/>
-    <w:lsdException w:name="Medium List 1" w:uiPriority="65"/>
-    <w:lsdException w:name="Medium List 2" w:uiPriority="66"/>
-    <w:lsdException w:name="Medium Grid 1" w:uiPriority="67"/>
-    <w:lsdException w:name="Medium Grid 2" w:uiPriority="68"/>
-    <w:lsdException w:name="Medium Grid 3" w:uiPriority="69"/>
-    <w:lsdException w:name="Dark List" w:uiPriority="70"/>
-    <w:lsdException w:name="Colorful Shading" w:uiPriority="71"/>
-    <w:lsdException w:name="Colorful List" w:uiPriority="72"/>
-    <w:lsdException w:name="Colorful Grid" w:uiPriority="73"/>
-    <w:lsdException w:name="Light Shading Accent 1" w:uiPriority="60"/>
-    <w:lsdException w:name="Light List Accent 1" w:uiPriority="61"/>
-    <w:lsdException w:name="Light Grid Accent 1" w:uiPriority="62"/>
-    <w:lsdException w:name="Medium Shading 1 Accent 1" w:uiPriority="63"/>
-    <w:lsdException w:name="Medium Shading 2 Accent 1" w:uiPriority="64"/>
-    <w:lsdException w:name="Medium List 1 Accent 1" w:uiPriority="65"/>
-    <w:lsdException w:name="Revision" w:semiHidden="1"/>
-    <w:lsdException w:name="List Paragraph" w:uiPriority="34" w:qFormat="1"/>
-    <w:lsdException w:name="Quote" w:uiPriority="29" w:qFormat="1"/>
-    <w:lsdException w:name="Intense Quote" w:uiPriority="30" w:qFormat="1"/>
-    <w:lsdException w:name="Medium List 2 Accent 1" w:uiPriority="66"/>
-    <w:lsdException w:name="Medium Grid 1 Accent 1" w:uiPriority="67"/>
-    <w:lsdException w:name="Medium Grid 2 Accent 1" w:uiPriority="68"/>
-    <w:lsdException w:name="Medium Grid 3 Accent 1" w:uiPriority="69"/>
-    <w:lsdException w:name="Dark List Accent 1" w:uiPriority="70"/>
-    <w:lsdException w:name="Colorful Shading Accent 1" w:uiPriority="71"/>
-    <w:lsdException w:name="Colorful List Accent 1" w:uiPriority="72"/>
-    <w:lsdException w:name="Colorful Grid Accent 1" w:uiPriority="73"/>
-    <w:lsdException w:name="Light Shading Accent 2" w:uiPriority="60"/>
-    <w:lsdException w:name="Light List Accent 2" w:uiPriority="61"/>
-    <w:lsdException w:name="Light Grid Accent 2" w:uiPriority="62"/>
-    <w:lsdException w:name="Medium Shading 1 Accent 2" w:uiPriority="63"/>
-    <w:lsdException w:name="Medium Shading 2 Accent 2" w:uiPriority="64"/>
-    <w:lsdException w:name="Medium List 1 Accent 2" w:uiPriority="65"/>
-    <w:lsdException w:name="Medium List 2 Accent 2" w:uiPriority="66"/>
-    <w:lsdException w:name="Medium Grid 1 Accent 2" w:uiPriority="67"/>
-    <w:lsdException w:name="Medium Grid 2 Accent 2" w:uiPriority="68"/>
-    <w:lsdException w:name="Medium Grid 3 Accent 2" w:uiPriority="69"/>
-    <w:lsdException w:name="Dark List Accent 2" w:uiPriority="70"/>
-    <w:lsdException w:name="Colorful Shading Accent 2" w:uiPriority="71"/>
-    <w:lsdException w:name="Colorful List Accent 2" w:uiPriority="72"/>
-    <w:lsdException w:name="Colorful Grid Accent 2" w:uiPriority="73"/>
-    <w:lsdException w:name="Light Shading Accent 3" w:uiPriority="60"/>
-    <w:lsdException w:name="Light List Accent 3" w:uiPriority="61"/>
-    <w:lsdException w:name="Light Grid Accent 3" w:uiPriority="62"/>
-    <w:lsdException w:name="Medium Shading 1 Accent 3" w:uiPriority="63"/>
-    <w:lsdException w:name="Medium Shading 2 Accent 3" w:uiPriority="64"/>
-    <w:lsdException w:name="Medium List 1 Accent 3" w:uiPriority="65"/>
-    <w:lsdException w:name="Medium List 2 Accent 3" w:uiPriority="66"/>
-    <w:lsdException w:name="Medium Grid 1 Accent 3" w:uiPriority="67"/>
-    <w:lsdException w:name="Medium Grid 2 Accent 3" w:uiPriority="68"/>
-    <w:lsdException w:name="Medium Grid 3 Accent 3" w:uiPriority="69"/>
-    <w:lsdException w:name="Dark List Accent 3" w:uiPriority="70"/>
-    <w:lsdException w:name="Colorful Shading Accent 3" w:uiPriority="71"/>
-    <w:lsdException w:name="Colorful List Accent 3" w:uiPriority="72"/>
-    <w:lsdException w:name="Colorful Grid Accent 3" w:uiPriority="73"/>
-    <w:lsdException w:name="Light Shading Accent 4" w:uiPriority="60"/>
-    <w:lsdException w:name="Light List Accent 4" w:uiPriority="61"/>
-    <w:lsdException w:name="Light Grid Accent 4" w:uiPriority="62"/>
-    <w:lsdException w:name="Medium Shading 1 Accent 4" w:uiPriority="63"/>
-    <w:lsdException w:name="Medium Shading 2 Accent 4" w:uiPriority="64"/>
-    <w:lsdException w:name="Medium List 1 Accent 4" w:uiPriority="65"/>
-    <w:lsdException w:name="Medium List 2 Accent 4" w:uiPriority="66"/>
-    <w:lsdException w:name="Medium Grid 1 Accent 4" w:uiPriority="67"/>
-    <w:lsdException w:name="Medium Grid 2 Accent 4" w:uiPriority="68"/>
-    <w:lsdException w:name="Medium Grid 3 Accent 4" w:uiPriority="69"/>
-    <w:lsdException w:name="Dark List Accent 4" w:uiPriority="70"/>
-    <w:lsdException w:name="Colorful Shading Accent 4" w:uiPriority="71"/>
-    <w:lsdException w:name="Colorful List Accent 4" w:uiPriority="72"/>
-    <w:lsdException w:name="Colorful Grid Accent 4" w:uiPriority="73"/>
-    <w:lsdException w:name="Light Shading Accent 5" w:uiPriority="60"/>
-    <w:lsdException w:name="Light List Accent 5" w:uiPriority="61"/>
-    <w:lsdException w:name="Light Grid Accent 5" w:uiPriority="62"/>
-    <w:lsdException w:name="Medium Shading 1 Accent 5" w:uiPriority="63"/>
-    <w:lsdException w:name="Medium Shading 2 Accent 5" w:uiPriority="64"/>
-    <w:lsdException w:name="Medium List 1 Accent 5" w:uiPriority="65"/>
-    <w:lsdException w:name="Medium List 2 Accent 5" w:uiPriority="66"/>
-    <w:lsdException w:name="Medium Grid 1 Accent 5" w:uiPriority="67"/>
-    <w:lsdException w:name="Medium Grid 2 Accent 5" w:uiPriority="68"/>
-    <w:lsdException w:name="Medium Grid 3 Accent 5" w:uiPriority="69"/>
-    <w:lsdException w:name="Dark List Accent 5" w:uiPriority="70"/>
-    <w:lsdException w:name="Colorful Shading Accent 5" w:uiPriority="71"/>
-    <w:lsdException w:name="Colorful List Accent 5" w:uiPriority="72"/>
-    <w:lsdException w:name="Colorful Grid Accent 5" w:uiPriority="73"/>
-    <w:lsdException w:name="Light Shading Accent 6" w:uiPriority="60"/>
-    <w:lsdException w:name="Light List Accent 6" w:uiPriority="61"/>
-    <w:lsdException w:name="Light Grid Accent 6" w:uiPriority="62"/>
-    <w:lsdException w:name="Medium Shading 1 Accent 6" w:uiPriority="63"/>
-    <w:lsdException w:name="Medium Shading 2 Accent 6" w:uiPriority="64"/>
-    <w:lsdException w:name="Medium List 1 Accent 6" w:uiPriority="65"/>
-    <w:lsdException w:name="Medium List 2 Accent 6" w:uiPriority="66"/>
-    <w:lsdException w:name="Medium Grid 1 Accent 6" w:uiPriority="67"/>
-    <w:lsdException w:name="Medium Grid 2 Accent 6" w:uiPriority="68"/>
-    <w:lsdException w:name="Medium Grid 3 Accent 6" w:uiPriority="69"/>
-    <w:lsdException w:name="Dark List Accent 6" w:uiPriority="70"/>
-    <w:lsdException w:name="Colorful Shading Accent 6" w:uiPriority="71"/>
-    <w:lsdException w:name="Colorful List Accent 6" w:uiPriority="72"/>
-    <w:lsdException w:name="Colorful Grid Accent 6" w:uiPriority="73"/>
-    <w:lsdException w:name="Subtle Emphasis" w:uiPriority="19" w:qFormat="1"/>
-    <w:lsdException w:name="Intense Emphasis" w:uiPriority="21" w:qFormat="1"/>
-    <w:lsdException w:name="Subtle Reference" w:uiPriority="31" w:qFormat="1"/>
-    <w:lsdException w:name="Intense Reference" w:uiPriority="32" w:qFormat="1"/>
-    <w:lsdException w:name="Book Title" w:uiPriority="33" w:qFormat="1"/>
-    <w:lsdException w:name="Bibliography" w:semiHidden="1" w:uiPriority="37" w:unhideWhenUsed="1"/>
-    <w:lsdException w:name="TOC Heading" w:semiHidden="1" w:uiPriority="39" w:unhideWhenUsed="1" w:qFormat="1"/>
-    <w:lsdException w:name="Plain Table 1" w:uiPriority="41"/>
-    <w:lsdException w:name="Plain Table 2" w:uiPriority="42"/>
-    <w:lsdException w:name="Plain Table 3" w:uiPriority="43"/>
-    <w:lsdException w:name="Plain Table 4" w:uiPriority="44"/>
-    <w:lsdException w:name="Plain Table 5" w:uiPriority="45"/>
-    <w:lsdException w:name="Grid Table Light" w:uiPriority="40"/>
-    <w:lsdException w:name="Grid Table 1 Light" w:uiPriority="46"/>
-    <w:lsdException w:name="Grid Table 2" w:uiPriority="47"/>
-    <w:lsdException w:name="Grid Table 3" w:uiPriority="48"/>
-    <w:lsdException w:name="Grid Table 4" w:uiPriority="49"/>
-    <w:lsdException w:name="Grid Table 5 Dark" w:uiPriority="50"/>
-    <w:lsdException w:name="Grid Table 6 Colorful" w:uiPriority="51"/>
-    <w:lsdException w:name="Grid Table 7 Colorful" w:uiPriority="52"/>
-    <w:lsdException w:name="Grid Table 1 Light Accent 1" w:uiPriority="46"/>
-    <w:lsdException w:name="Grid Table 2 Accent 1" w:uiPriority="47"/>
-    <w:lsdException w:name="Grid Table 3 Accent 1" w:uiPriority="48"/>
-    <w:lsdException w:name="Grid Table 4 Accent 1" w:uiPriority="49"/>
-    <w:lsdException w:name="Grid Table 5 Dark Accent 1" w:uiPriority="50"/>
-    <w:lsdException w:name="Grid Table 6 Colorful Accent 1" w:uiPriority="51"/>
-    <w:lsdException w:name="Grid Table 7 Colorful Accent 1" w:uiPriority="52"/>
-    <w:lsdException w:name="Grid Table 1 Light Accent 2" w:uiPriority="46"/>
-    <w:lsdException w:name="Grid Table 2 Accent 2" w:uiPriority="47"/>
-    <w:lsdException w:name="Grid Table 3 Accent 2" w:uiPriority="48"/>
-    <w:lsdException w:name="Grid Table 4 Accent 2" w:uiPriority="49"/>
-    <w:lsdException w:name="Grid Table 5 Dark Accent 2" w:uiPriority="50"/>
-    <w:lsdException w:name="Grid Table 6 Colorful Accent 2" w:uiPriority="51"/>
-    <w:lsdException w:name="Grid Table 7 Colorful Accent 2" w:uiPriority="52"/>
-    <w:lsdException w:name="Grid Table 1 Light Accent 3" w:uiPriority="46"/>
-    <w:lsdException w:name="Grid Table 2 Accent 3" w:uiPriority="47"/>
-    <w:lsdException w:name="Grid Table 3 Accent 3" w:uiPriority="48"/>
-    <w:lsdException w:name="Grid Table 4 Accent 3" w:uiPriority="49"/>
-    <w:lsdException w:name="Grid Table 5 Dark Accent 3" w:uiPriority="50"/>
-    <w:lsdException w:name="Grid Table 6 Colorful Accent 3" w:uiPriority="51"/>
-    <w:lsdException w:name="Grid Table 7 Colorful Accent 3" w:uiPriority="52"/>
-    <w:lsdException w:name="Grid Table 1 Light Accent 4" w:uiPriority="46"/>
-    <w:lsdException w:name="Grid Table 2 Accent 4" w:uiPriority="47"/>
-    <w:lsdException w:name="Grid Table 3 Accent 4" w:uiPriority="48"/>
-    <w:lsdException w:name="Grid Table 4 Accent 4" w:uiPriority="49"/>
-    <w:lsdException w:name="Grid Table 5 Dark Accent 4" w:uiPriority="50"/>
-    <w:lsdException w:name="Grid Table 6 Colorful Accent 4" w:uiPriority="51"/>
-    <w:lsdException w:name="Grid Table 7 Colorful Accent 4" w:uiPriority="52"/>
-    <w:lsdException w:name="Grid Table 1 Light Accent 5" w:uiPriority="46"/>
-    <w:lsdException w:name="Grid Table 2 Accent 5" w:uiPriority="47"/>
-    <w:lsdException w:name="Grid Table 3 Accent 5" w:uiPriority="48"/>
-    <w:lsdException w:name="Grid Table 4 Accent 5" w:uiPriority="49"/>
-    <w:lsdException w:name="Grid Table 5 Dark Accent 5" w:uiPriority="50"/>
-    <w:lsdException w:name="Grid Table 6 Colorful Accent 5" w:uiPriority="51"/>
-    <w:lsdException w:name="Grid Table 7 Colorful Accent 5" w:uiPriority="52"/>
-    <w:lsdException w:name="Grid Table 1 Light Accent 6" w:uiPriority="46"/>
-    <w:lsdException w:name="Grid Table 2 Accent 6" w:uiPriority="47"/>
-    <w:lsdException w:name="Grid Table 3 Accent 6" w:uiPriority="48"/>
-    <w:lsdException w:name="Grid Table 4 Accent 6" w:uiPriority="49"/>
-    <w:lsdException w:name="Grid Table 5 Dark Accent 6" w:uiPriority="50"/>
-    <w:lsdException w:name="Grid Table 6 Colorful Accent 6" w:uiPriority="51"/>
-    <w:lsdException w:name="Grid Table 7 Colorful Accent 6" w:uiPriority="52"/>
-    <w:lsdException w:name="List Table 1 Light" w:uiPriority="46"/>
-    <w:lsdException w:name="List Table 2" w:uiPriority="47"/>
-    <w:lsdException w:name="List Table 3" w:uiPriority="48"/>
-    <w:lsdException w:name="List Table 4" w:uiPriority="49"/>
-    <w:lsdException w:name="List Table 5 Dark" w:uiPriority="50"/>
-    <w:lsdException w:name="List Table 6 Colorful" w:uiPriority="51"/>
-    <w:lsdException w:name="List Table 7 Colorful" w:uiPriority="52"/>
-    <w:lsdException w:name="List Table 1 Light Accent 1" w:uiPriority="46"/>
-    <w:lsdException w:name="List Table 2 Accent 1" w:uiPriority="47"/>
-    <w:lsdException w:name="List Table 3 Accent 1" w:uiPriority="48"/>
-    <w:lsdException w:name="List Table 4 Accent 1" w:uiPriority="49"/>
-    <w:lsdException w:name="List Table 5 Dark Accent 1" w:uiPriority="50"/>
-    <w:lsdException w:name="List Table 6 Colorful Accent 1" w:uiPriority="51"/>
-    <w:lsdException w:name="List Table 7 Colorful Accent 1" w:uiPriority="52"/>
-    <w:lsdException w:name="List Table 1 Light Accent 2" w:uiPriority="46"/>
-    <w:lsdException w:name="List Table 2 Accent 2" w:uiPriority="47"/>
-    <w:lsdException w:name="List Table 3 Accent 2" w:uiPriority="48"/>
-    <w:lsdException w:name="List Table 4 Accent 2" w:uiPriority="49"/>
-    <w:lsdException w:name="List Table 5 Dark Accent 2" w:uiPriority="50"/>
-    <w:lsdException w:name="List Table 6 Colorful Accent 2" w:uiPriority="51"/>
-    <w:lsdException w:name="List Table 7 Colorful Accent 2" w:uiPriority="52"/>
-    <w:lsdException w:name="List Table 1 Light Accent 3" w:uiPriority="46"/>
-    <w:lsdException w:name="List Table 2 Accent 3" w:uiPriority="47"/>
-    <w:lsdException w:name="List Table 3 Accent 3" w:uiPriority="48"/>
-    <w:lsdException w:name="List Table 4 Accent 3" w:uiPriority="49"/>
-    <w:lsdException w:name="List Table 5 Dark Accent 3" w:uiPriority="50"/>
-    <w:lsdException w:name="List Table 6 Colorful Accent 3" w:uiPriority="51"/>
-    <w:lsdException w:name="List Table 7 Colorful Accent 3" w:uiPriority="52"/>
-    <w:lsdException w:name="List Table 1 Light Accent 4" w:uiPriority="46"/>
-    <w:lsdException w:name="List Table 2 Accent 4" w:uiPriority="47"/>
-    <w:lsdException w:name="List Table 3 Accent 4" w:uiPriority="48"/>
-    <w:lsdException w:name="List Table 4 Accent 4" w:uiPriority="49"/>
-    <w:lsdException w:name="List Table 5 Dark Accent 4" w:uiPriority="50"/>
-    <w:lsdException w:name="List Table 6 Colorful Accent 4" w:uiPriority="51"/>
-    <w:lsdException w:name="List Table 7 Colorful Accent 4" w:uiPriority="52"/>
-    <w:lsdException w:name="List Table 1 Light Accent 5" w:uiPriority="46"/>
-    <w:lsdException w:name="List Table 2 Accent 5" w:uiPriority="47"/>
-    <w:lsdException w:name="List Table 3 Accent 5" w:uiPriority="48"/>
-    <w:lsdException w:name="List Table 4 Accent 5" w:uiPriority="49"/>
-    <w:lsdException w:name="List Table 5 Dark Accent 5" w:uiPriority="50"/>
-    <w:lsdException w:name="List Table 6 Colorful Accent 5" w:uiPriority="51"/>
-    <w:lsdException w:name="List Table 7 Colorful Accent 5" w:uiPriority="52"/>
-    <w:lsdException w:name="List Table 1 Light Accent 6" w:uiPriority="46"/>
-    <w:lsdException w:name="List Table 2 Accent 6" w:uiPriority="47"/>
-    <w:lsdException w:name="List Table 3 Accent 6" w:uiPriority="48"/>
-    <w:lsdException w:name="List Table 4 Accent 6" w:uiPriority="49"/>
-    <w:lsdException w:name="List Table 5 Dark Accent 6" w:uiPriority="50"/>
-    <w:lsdException w:name="List Table 6 Colorful Accent 6" w:uiPriority="51"/>
-    <w:lsdException w:name="List Table 7 Colorful Accent 6" w:uiPriority="52"/>
-    <w:lsdException w:name="Mention" w:semiHidden="1" w:unhideWhenUsed="1"/>
-    <w:lsdException w:name="Smart Hyperlink" w:semiHidden="1" w:unhideWhenUsed="1"/>
-    <w:lsdException w:name="Hashtag" w:semiHidden="1" w:unhideWhenUsed="1"/>
-    <w:lsdException w:name="Unresolved Mention" w:semiHidden="1" w:unhideWhenUsed="1"/>
-    <w:lsdException w:name="Smart Link" w:semiHidden="1" w:unhideWhenUsed="1"/>
+  <w:latentStyles w:defLockedState="0" w:defUIPriority="99" w:defSemiHidden="1" w:defUnhideWhenUsed="1" w:defQFormat="0" w:count="267">
+    <w:lsdException w:name="Normal" w:semiHidden="0" w:uiPriority="0" w:unhideWhenUsed="0" w:qFormat="1"/>
+    <w:lsdException w:name="heading 1" w:semiHidden="0" w:uiPriority="9" w:unhideWhenUsed="0" w:qFormat="1"/>
+    <w:lsdException w:name="heading 2" w:uiPriority="9" w:qFormat="1"/>
+    <w:lsdException w:name="heading 3" w:uiPriority="9" w:qFormat="1"/>
+    <w:lsdException w:name="heading 4" w:uiPriority="9" w:qFormat="1"/>
+    <w:lsdException w:name="heading 5" w:uiPriority="9" w:qFormat="1"/>
+    <w:lsdException w:name="heading 6" w:uiPriority="9" w:qFormat="1"/>
+    <w:lsdException w:name="heading 7" w:uiPriority="9" w:qFormat="1"/>
+    <w:lsdException w:name="heading 8" w:uiPriority="9" w:qFormat="1"/>
+    <w:lsdException w:name="heading 9" w:uiPriority="9" w:qFormat="1"/>
+    <w:lsdException w:name="toc 1" w:uiPriority="39"/>
+    <w:lsdException w:name="toc 2" w:uiPriority="39"/>
+    <w:lsdException w:name="toc 3" w:uiPriority="39"/>
+    <w:lsdException w:name="toc 4" w:uiPriority="39"/>
+    <w:lsdException w:name="toc 5" w:uiPriority="39"/>
+    <w:lsdException w:name="toc 6" w:uiPriority="39"/>
+    <w:lsdException w:name="toc 7" w:uiPriority="39"/>
+    <w:lsdException w:name="toc 8" w:uiPriority="39"/>
+    <w:lsdException w:name="toc 9" w:uiPriority="39"/>
+    <w:lsdException w:name="annotation text" w:qFormat="1"/>
+    <w:lsdException w:name="caption" w:uiPriority="35" w:qFormat="1"/>
+    <w:lsdException w:name="annotation reference" w:qFormat="1"/>
+    <w:lsdException w:name="Title" w:semiHidden="0" w:uiPriority="10" w:unhideWhenUsed="0" w:qFormat="1"/>
+    <w:lsdException w:name="Default Paragraph Font" w:uiPriority="1"/>
+    <w:lsdException w:name="Body Text" w:uiPriority="1" w:qFormat="1"/>
+    <w:lsdException w:name="Subtitle" w:semiHidden="0" w:uiPriority="11" w:unhideWhenUsed="0" w:qFormat="1"/>
+    <w:lsdException w:name="Strong" w:semiHidden="0" w:uiPriority="22" w:unhideWhenUsed="0" w:qFormat="1"/>
+    <w:lsdException w:name="Emphasis" w:semiHidden="0" w:uiPriority="20" w:unhideWhenUsed="0" w:qFormat="1"/>
+    <w:lsdException w:name="Table Grid" w:semiHidden="0" w:uiPriority="39" w:unhideWhenUsed="0"/>
+    <w:lsdException w:name="Placeholder Text" w:unhideWhenUsed="0"/>
+    <w:lsdException w:name="No Spacing" w:semiHidden="0" w:uiPriority="1" w:unhideWhenUsed="0" w:qFormat="1"/>
+    <w:lsdException w:name="Light Shading" w:semiHidden="0" w:uiPriority="60" w:unhideWhenUsed="0"/>
+    <w:lsdException w:name="Light List" w:semiHidden="0" w:uiPriority="61" w:unhideWhenUsed="0"/>
+    <w:lsdException w:name="Light Grid" w:semiHidden="0" w:uiPriority="62" w:unhideWhenUsed="0"/>
+    <w:lsdException w:name="Medium Shading 1" w:semiHidden="0" w:uiPriority="63" w:unhideWhenUsed="0"/>
+    <w:lsdException w:name="Medium Shading 2" w:semiHidden="0" w:uiPriority="64" w:unhideWhenUsed="0"/>
+    <w:lsdException w:name="Medium List 1" w:semiHidden="0" w:uiPriority="65" w:unhideWhenUsed="0"/>
+    <w:lsdException w:name="Medium List 2" w:semiHidden="0" w:uiPriority="66" w:unhideWhenUsed="0"/>
+    <w:lsdException w:name="Medium Grid 1" w:semiHidden="0" w:uiPriority="67" w:unhideWhenUsed="0"/>
+    <w:lsdException w:name="Medium Grid 2" w:semiHidden="0" w:uiPriority="68" w:unhideWhenUsed="0"/>
+    <w:lsdException w:name="Medium Grid 3" w:semiHidden="0" w:uiPriority="69" w:unhideWhenUsed="0"/>
+    <w:lsdException w:name="Dark List" w:semiHidden="0" w:uiPriority="70" w:unhideWhenUsed="0"/>
+    <w:lsdException w:name="Colorful Shading" w:semiHidden="0" w:uiPriority="71" w:unhideWhenUsed="0"/>
+    <w:lsdException w:name="Colorful List" w:semiHidden="0" w:uiPriority="72" w:unhideWhenUsed="0"/>
+    <w:lsdException w:name="Colorful Grid" w:semiHidden="0" w:uiPriority="73" w:unhideWhenUsed="0"/>
+    <w:lsdException w:name="Light Shading Accent 1" w:semiHidden="0" w:uiPriority="60" w:unhideWhenUsed="0"/>
+    <w:lsdException w:name="Light List Accent 1" w:semiHidden="0" w:uiPriority="61" w:unhideWhenUsed="0"/>
+    <w:lsdException w:name="Light Grid Accent 1" w:semiHidden="0" w:uiPriority="62" w:unhideWhenUsed="0"/>
+    <w:lsdException w:name="Medium Shading 1 Accent 1" w:semiHidden="0" w:uiPriority="63" w:unhideWhenUsed="0"/>
+    <w:lsdException w:name="Medium Shading 2 Accent 1" w:semiHidden="0" w:uiPriority="64" w:unhideWhenUsed="0"/>
+    <w:lsdException w:name="Medium List 1 Accent 1" w:semiHidden="0" w:uiPriority="65" w:unhideWhenUsed="0"/>
+    <w:lsdException w:name="Revision" w:unhideWhenUsed="0"/>
+    <w:lsdException w:name="List Paragraph" w:semiHidden="0" w:uiPriority="34" w:unhideWhenUsed="0" w:qFormat="1"/>
+    <w:lsdException w:name="Quote" w:semiHidden="0" w:uiPriority="29" w:unhideWhenUsed="0" w:qFormat="1"/>
+    <w:lsdException w:name="Intense Quote" w:semiHidden="0" w:uiPriority="30" w:unhideWhenUsed="0" w:qFormat="1"/>
+    <w:lsdException w:name="Medium List 2 Accent 1" w:semiHidden="0" w:uiPriority="66" w:unhideWhenUsed="0"/>
+    <w:lsdException w:name="Medium Grid 1 Accent 1" w:semiHidden="0" w:uiPriority="67" w:unhideWhenUsed="0"/>
+    <w:lsdException w:name="Medium Grid 2 Accent 1" w:semiHidden="0" w:uiPriority="68" w:unhideWhenUsed="0"/>
+    <w:lsdException w:name="Medium Grid 3 Accent 1" w:semiHidden="0" w:uiPriority="69" w:unhideWhenUsed="0"/>
+    <w:lsdException w:name="Dark List Accent 1" w:semiHidden="0" w:uiPriority="70" w:unhideWhenUsed="0"/>
+    <w:lsdException w:name="Colorful Shading Accent 1" w:semiHidden="0" w:uiPriority="71" w:unhideWhenUsed="0"/>
+    <w:lsdException w:name="Colorful List Accent 1" w:semiHidden="0" w:uiPriority="72" w:unhideWhenUsed="0"/>
+    <w:lsdException w:name="Colorful Grid Accent 1" w:semiHidden="0" w:uiPriority="73" w:unhideWhenUsed="0"/>
+    <w:lsdException w:name="Light Shading Accent 2" w:semiHidden="0" w:uiPriority="60" w:unhideWhenUsed="0"/>
+    <w:lsdException w:name="Light List Accent 2" w:semiHidden="0" w:uiPriority="61" w:unhideWhenUsed="0"/>
+    <w:lsdException w:name="Light Grid Accent 2" w:semiHidden="0" w:uiPriority="62" w:unhideWhenUsed="0"/>
+    <w:lsdException w:name="Medium Shading 1 Accent 2" w:semiHidden="0" w:uiPriority="63" w:unhideWhenUsed="0"/>
+    <w:lsdException w:name="Medium Shading 2 Accent 2" w:semiHidden="0" w:uiPriority="64" w:unhideWhenUsed="0"/>
+    <w:lsdException w:name="Medium List 1 Accent 2" w:semiHidden="0" w:uiPriority="65" w:unhideWhenUsed="0"/>
+    <w:lsdException w:name="Medium List 2 Accent 2" w:semiHidden="0" w:uiPriority="66" w:unhideWhenUsed="0"/>
+    <w:lsdException w:name="Medium Grid 1 Accent 2" w:semiHidden="0" w:uiPriority="67" w:unhideWhenUsed="0"/>
+    <w:lsdException w:name="Medium Grid 2 Accent 2" w:semiHidden="0" w:uiPriority="68" w:unhideWhenUsed="0"/>
+    <w:lsdException w:name="Medium Grid 3 Accent 2" w:semiHidden="0" w:uiPriority="69" w:unhideWhenUsed="0"/>
+    <w:lsdException w:name="Dark List Accent 2" w:semiHidden="0" w:uiPriority="70" w:unhideWhenUsed="0"/>
+    <w:lsdException w:name="Colorful Shading Accent 2" w:semiHidden="0" w:uiPriority="71" w:unhideWhenUsed="0"/>
+    <w:lsdException w:name="Colorful List Accent 2" w:semiHidden="0" w:uiPriority="72" w:unhideWhenUsed="0"/>
+    <w:lsdException w:name="Colorful Grid Accent 2" w:semiHidden="0" w:uiPriority="73" w:unhideWhenUsed="0"/>
+    <w:lsdException w:name="Light Shading Accent 3" w:semiHidden="0" w:uiPriority="60" w:unhideWhenUsed="0"/>
+    <w:lsdException w:name="Light List Accent 3" w:semiHidden="0" w:uiPriority="61" w:unhideWhenUsed="0"/>
+    <w:lsdException w:name="Light Grid Accent 3" w:semiHidden="0" w:uiPriority="62" w:unhideWhenUsed="0"/>
+    <w:lsdException w:name="Medium Shading 1 Accent 3" w:semiHidden="0" w:uiPriority="63" w:unhideWhenUsed="0"/>
+    <w:lsdException w:name="Medium Shading 2 Accent 3" w:semiHidden="0" w:uiPriority="64" w:unhideWhenUsed="0"/>
+    <w:lsdException w:name="Medium List 1 Accent 3" w:semiHidden="0" w:uiPriority="65" w:unhideWhenUsed="0"/>
+    <w:lsdException w:name="Medium List 2 Accent 3" w:semiHidden="0" w:uiPriority="66" w:unhideWhenUsed="0"/>
+    <w:lsdException w:name="Medium Grid 1 Accent 3" w:semiHidden="0" w:uiPriority="67" w:unhideWhenUsed="0"/>
+    <w:lsdException w:name="Medium Grid 2 Accent 3" w:semiHidden="0" w:uiPriority="68" w:unhideWhenUsed="0"/>
+    <w:lsdException w:name="Medium Grid 3 Accent 3" w:semiHidden="0" w:uiPriority="69" w:unhideWhenUsed="0"/>
+    <w:lsdException w:name="Dark List Accent 3" w:semiHidden="0" w:uiPriority="70" w:unhideWhenUsed="0"/>
+    <w:lsdException w:name="Colorful Shading Accent 3" w:semiHidden="0" w:uiPriority="71" w:unhideWhenUsed="0"/>
+    <w:lsdException w:name="Colorful List Accent 3" w:semiHidden="0" w:uiPriority="72" w:unhideWhenUsed="0"/>
+    <w:lsdException w:name="Colorful Grid Accent 3" w:semiHidden="0" w:uiPriority="73" w:unhideWhenUsed="0"/>
+    <w:lsdException w:name="Light Shading Accent 4" w:semiHidden="0" w:uiPriority="60" w:unhideWhenUsed="0"/>
+    <w:lsdException w:name="Light List Accent 4" w:semiHidden="0" w:uiPriority="61" w:unhideWhenUsed="0"/>
+    <w:lsdException w:name="Light Grid Accent 4" w:semiHidden="0" w:uiPriority="62" w:unhideWhenUsed="0"/>
+    <w:lsdException w:name="Medium Shading 1 Accent 4" w:semiHidden="0" w:uiPriority="63" w:unhideWhenUsed="0"/>
+    <w:lsdException w:name="Medium Shading 2 Accent 4" w:semiHidden="0" w:uiPriority="64" w:unhideWhenUsed="0"/>
+    <w:lsdException w:name="Medium List 1 Accent 4" w:semiHidden="0" w:uiPriority="65" w:unhideWhenUsed="0"/>
+    <w:lsdException w:name="Medium List 2 Accent 4" w:semiHidden="0" w:uiPriority="66" w:unhideWhenUsed="0"/>
+    <w:lsdException w:name="Medium Grid 1 Accent 4" w:semiHidden="0" w:uiPriority="67" w:unhideWhenUsed="0"/>
+    <w:lsdException w:name="Medium Grid 2 Accent 4" w:semiHidden="0" w:uiPriority="68" w:unhideWhenUsed="0"/>
+    <w:lsdException w:name="Medium Grid 3 Accent 4" w:semiHidden="0" w:uiPriority="69" w:unhideWhenUsed="0"/>
+    <w:lsdException w:name="Dark List Accent 4" w:semiHidden="0" w:uiPriority="70" w:unhideWhenUsed="0"/>
+    <w:lsdException w:name="Colorful Shading Accent 4" w:semiHidden="0" w:uiPriority="71" w:unhideWhenUsed="0"/>
+    <w:lsdException w:name="Colorful List Accent 4" w:semiHidden="0" w:uiPriority="72" w:unhideWhenUsed="0"/>
+    <w:lsdException w:name="Colorful Grid Accent 4" w:semiHidden="0" w:uiPriority="73" w:unhideWhenUsed="0"/>
+    <w:lsdException w:name="Light Shading Accent 5" w:semiHidden="0" w:uiPriority="60" w:unhideWhenUsed="0"/>
+    <w:lsdException w:name="Light List Accent 5" w:semiHidden="0" w:uiPriority="61" w:unhideWhenUsed="0"/>
+    <w:lsdException w:name="Light Grid Accent 5" w:semiHidden="0" w:uiPriority="62" w:unhideWhenUsed="0"/>
+    <w:lsdException w:name="Medium Shading 1 Accent 5" w:semiHidden="0" w:uiPriority="63" w:unhideWhenUsed="0"/>
+    <w:lsdException w:name="Medium Shading 2 Accent 5" w:semiHidden="0" w:uiPriority="64" w:unhideWhenUsed="0"/>
+    <w:lsdException w:name="Medium List 1 Accent 5" w:semiHidden="0" w:uiPriority="65" w:unhideWhenUsed="0"/>
+    <w:lsdException w:name="Medium List 2 Accent 5" w:semiHidden="0" w:uiPriority="66" w:unhideWhenUsed="0"/>
+    <w:lsdException w:name="Medium Grid 1 Accent 5" w:semiHidden="0" w:uiPriority="67" w:unhideWhenUsed="0"/>
+    <w:lsdException w:name="Medium Grid 2 Accent 5" w:semiHidden="0" w:uiPriority="68" w:unhideWhenUsed="0"/>
+    <w:lsdException w:name="Medium Grid 3 Accent 5" w:semiHidden="0" w:uiPriority="69" w:unhideWhenUsed="0"/>
+    <w:lsdException w:name="Dark List Accent 5" w:semiHidden="0" w:uiPriority="70" w:unhideWhenUsed="0"/>
+    <w:lsdException w:name="Colorful Shading Accent 5" w:semiHidden="0" w:uiPriority="71" w:unhideWhenUsed="0"/>
+    <w:lsdException w:name="Colorful List Accent 5" w:semiHidden="0" w:uiPriority="72" w:unhideWhenUsed="0"/>
+    <w:lsdException w:name="Colorful Grid Accent 5" w:semiHidden="0" w:uiPriority="73" w:unhideWhenUsed="0"/>
+    <w:lsdException w:name="Light Shading Accent 6" w:semiHidden="0" w:uiPriority="60" w:unhideWhenUsed="0"/>
+    <w:lsdException w:name="Light List Accent 6" w:semiHidden="0" w:uiPriority="61" w:unhideWhenUsed="0"/>
+    <w:lsdException w:name="Light Grid Accent 6" w:semiHidden="0" w:uiPriority="62" w:unhideWhenUsed="0"/>
+    <w:lsdException w:name="Medium Shading 1 Accent 6" w:semiHidden="0" w:uiPriority="63" w:unhideWhenUsed="0"/>
+    <w:lsdException w:name="Medium Shading 2 Accent 6" w:semiHidden="0" w:uiPriority="64" w:unhideWhenUsed="0"/>
+    <w:lsdException w:name="Medium List 1 Accent 6" w:semiHidden="0" w:uiPriority="65" w:unhideWhenUsed="0"/>
+    <w:lsdException w:name="Medium List 2 Accent 6" w:semiHidden="0" w:uiPriority="66" w:unhideWhenUsed="0"/>
+    <w:lsdException w:name="Medium Grid 1 Accent 6" w:semiHidden="0" w:uiPriority="67" w:unhideWhenUsed="0"/>
+    <w:lsdException w:name="Medium Grid 2 Accent 6" w:semiHidden="0" w:uiPriority="68" w:unhideWhenUsed="0"/>
+    <w:lsdException w:name="Medium Grid 3 Accent 6" w:semiHidden="0" w:uiPriority="69" w:unhideWhenUsed="0"/>
+    <w:lsdException w:name="Dark List Accent 6" w:semiHidden="0" w:uiPriority="70" w:unhideWhenUsed="0"/>
+    <w:lsdException w:name="Colorful Shading Accent 6" w:semiHidden="0" w:uiPriority="71" w:unhideWhenUsed="0"/>
+    <w:lsdException w:name="Colorful List Accent 6" w:semiHidden="0" w:uiPriority="72" w:unhideWhenUsed="0"/>
+    <w:lsdException w:name="Colorful Grid Accent 6" w:semiHidden="0" w:uiPriority="73" w:unhideWhenUsed="0"/>
+    <w:lsdException w:name="Subtle Emphasis" w:semiHidden="0" w:uiPriority="19" w:unhideWhenUsed="0" w:qFormat="1"/>
+    <w:lsdException w:name="Intense Emphasis" w:semiHidden="0" w:uiPriority="21" w:unhideWhenUsed="0" w:qFormat="1"/>
+    <w:lsdException w:name="Subtle Reference" w:semiHidden="0" w:uiPriority="31" w:unhideWhenUsed="0" w:qFormat="1"/>
+    <w:lsdException w:name="Intense Reference" w:semiHidden="0" w:uiPriority="32" w:unhideWhenUsed="0" w:qFormat="1"/>
+    <w:lsdException w:name="Book Title" w:semiHidden="0" w:uiPriority="33" w:unhideWhenUsed="0" w:qFormat="1"/>
+    <w:lsdException w:name="Bibliography" w:uiPriority="37"/>
+    <w:lsdException w:name="TOC Heading" w:uiPriority="39" w:qFormat="1"/>
   </w:latentStyles>
   <w:style w:type="paragraph" w:default="1" w:styleId="Normal">
     <w:name w:val="Normal"/>
@@ -7042,7 +6906,1757 @@
       </w:tblBorders>
     </w:tblPr>
   </w:style>
-  <w:style w:type="character" w:styleId="UnresolvedMention">
+  <w:style w:type="character" w:customStyle="1" w:styleId="UnresolvedMention">
+    <w:name w:val="Unresolved Mention"/>
+    <w:basedOn w:val="DefaultParagraphFont"/>
+    <w:uiPriority w:val="99"/>
+    <w:semiHidden/>
+    <w:unhideWhenUsed/>
+    <w:rsid w:val="00122A99"/>
+    <w:rPr>
+      <w:color w:val="605E5C"/>
+      <w:shd w:val="clear" w:color="auto" w:fill="E1DFDD"/>
+    </w:rPr>
+  </w:style>
+</w:styles>
+</file>
+
+<file path=word/stylesWithEffects.xml><?xml version="1.0" encoding="utf-8"?>
+<w:styles xmlns:wpc="http://schemas.microsoft.com/office/word/2010/wordprocessingCanvas" xmlns:mc="http://schemas.openxmlformats.org/markup-compatibility/2006" xmlns:o="urn:schemas-microsoft-com:office:office" xmlns:r="http://schemas.openxmlformats.org/officeDocument/2006/relationships" xmlns:m="http://schemas.openxmlformats.org/officeDocument/2006/math" xmlns:v="urn:schemas-microsoft-com:vml" xmlns:wp14="http://schemas.microsoft.com/office/word/2010/wordprocessingDrawing" xmlns:wp="http://schemas.openxmlformats.org/drawingml/2006/wordprocessingDrawing" xmlns:w10="urn:schemas-microsoft-com:office:word" xmlns:w="http://schemas.openxmlformats.org/wordprocessingml/2006/main" xmlns:w14="http://schemas.microsoft.com/office/word/2010/wordml" xmlns:wpg="http://schemas.microsoft.com/office/word/2010/wordprocessingGroup" xmlns:wpi="http://schemas.microsoft.com/office/word/2010/wordprocessingInk" xmlns:wne="http://schemas.microsoft.com/office/word/2006/wordml" xmlns:wps="http://schemas.microsoft.com/office/word/2010/wordprocessingShape" mc:Ignorable="w14 wp14">
+  <w:docDefaults>
+    <w:rPrDefault>
+      <w:rPr>
+        <w:rFonts w:asciiTheme="minorHAnsi" w:eastAsia="Arial" w:hAnsiTheme="minorHAnsi" w:cstheme="minorBidi"/>
+        <w:sz w:val="22"/>
+        <w:szCs w:val="22"/>
+        <w:lang w:val="en-US" w:eastAsia="en-US" w:bidi="ar-SA"/>
+      </w:rPr>
+    </w:rPrDefault>
+    <w:pPrDefault>
+      <w:pPr>
+        <w:spacing w:beforeAutospacing="1" w:after="160" w:afterAutospacing="1" w:line="259" w:lineRule="auto"/>
+      </w:pPr>
+    </w:pPrDefault>
+  </w:docDefaults>
+  <w:latentStyles w:defLockedState="0" w:defUIPriority="99" w:defSemiHidden="1" w:defUnhideWhenUsed="1" w:defQFormat="0" w:count="267">
+    <w:lsdException w:name="Normal" w:semiHidden="0" w:uiPriority="0" w:unhideWhenUsed="0" w:qFormat="1"/>
+    <w:lsdException w:name="heading 1" w:semiHidden="0" w:uiPriority="9" w:unhideWhenUsed="0" w:qFormat="1"/>
+    <w:lsdException w:name="heading 2" w:uiPriority="9" w:qFormat="1"/>
+    <w:lsdException w:name="heading 3" w:uiPriority="9" w:qFormat="1"/>
+    <w:lsdException w:name="heading 4" w:uiPriority="9" w:qFormat="1"/>
+    <w:lsdException w:name="heading 5" w:uiPriority="9" w:qFormat="1"/>
+    <w:lsdException w:name="heading 6" w:uiPriority="9" w:qFormat="1"/>
+    <w:lsdException w:name="heading 7" w:uiPriority="9" w:qFormat="1"/>
+    <w:lsdException w:name="heading 8" w:uiPriority="9" w:qFormat="1"/>
+    <w:lsdException w:name="heading 9" w:uiPriority="9" w:qFormat="1"/>
+    <w:lsdException w:name="toc 1" w:uiPriority="39"/>
+    <w:lsdException w:name="toc 2" w:uiPriority="39"/>
+    <w:lsdException w:name="toc 3" w:uiPriority="39"/>
+    <w:lsdException w:name="toc 4" w:uiPriority="39"/>
+    <w:lsdException w:name="toc 5" w:uiPriority="39"/>
+    <w:lsdException w:name="toc 6" w:uiPriority="39"/>
+    <w:lsdException w:name="toc 7" w:uiPriority="39"/>
+    <w:lsdException w:name="toc 8" w:uiPriority="39"/>
+    <w:lsdException w:name="toc 9" w:uiPriority="39"/>
+    <w:lsdException w:name="annotation text" w:qFormat="1"/>
+    <w:lsdException w:name="caption" w:uiPriority="35" w:qFormat="1"/>
+    <w:lsdException w:name="annotation reference" w:qFormat="1"/>
+    <w:lsdException w:name="Title" w:semiHidden="0" w:uiPriority="10" w:unhideWhenUsed="0" w:qFormat="1"/>
+    <w:lsdException w:name="Default Paragraph Font" w:uiPriority="1"/>
+    <w:lsdException w:name="Body Text" w:uiPriority="1" w:qFormat="1"/>
+    <w:lsdException w:name="Subtitle" w:semiHidden="0" w:uiPriority="11" w:unhideWhenUsed="0" w:qFormat="1"/>
+    <w:lsdException w:name="Strong" w:semiHidden="0" w:uiPriority="22" w:unhideWhenUsed="0" w:qFormat="1"/>
+    <w:lsdException w:name="Emphasis" w:semiHidden="0" w:uiPriority="20" w:unhideWhenUsed="0" w:qFormat="1"/>
+    <w:lsdException w:name="Table Grid" w:semiHidden="0" w:uiPriority="39" w:unhideWhenUsed="0"/>
+    <w:lsdException w:name="Placeholder Text" w:unhideWhenUsed="0"/>
+    <w:lsdException w:name="No Spacing" w:semiHidden="0" w:uiPriority="1" w:unhideWhenUsed="0" w:qFormat="1"/>
+    <w:lsdException w:name="Light Shading" w:semiHidden="0" w:uiPriority="60" w:unhideWhenUsed="0"/>
+    <w:lsdException w:name="Light List" w:semiHidden="0" w:uiPriority="61" w:unhideWhenUsed="0"/>
+    <w:lsdException w:name="Light Grid" w:semiHidden="0" w:uiPriority="62" w:unhideWhenUsed="0"/>
+    <w:lsdException w:name="Medium Shading 1" w:semiHidden="0" w:uiPriority="63" w:unhideWhenUsed="0"/>
+    <w:lsdException w:name="Medium Shading 2" w:semiHidden="0" w:uiPriority="64" w:unhideWhenUsed="0"/>
+    <w:lsdException w:name="Medium List 1" w:semiHidden="0" w:uiPriority="65" w:unhideWhenUsed="0"/>
+    <w:lsdException w:name="Medium List 2" w:semiHidden="0" w:uiPriority="66" w:unhideWhenUsed="0"/>
+    <w:lsdException w:name="Medium Grid 1" w:semiHidden="0" w:uiPriority="67" w:unhideWhenUsed="0"/>
+    <w:lsdException w:name="Medium Grid 2" w:semiHidden="0" w:uiPriority="68" w:unhideWhenUsed="0"/>
+    <w:lsdException w:name="Medium Grid 3" w:semiHidden="0" w:uiPriority="69" w:unhideWhenUsed="0"/>
+    <w:lsdException w:name="Dark List" w:semiHidden="0" w:uiPriority="70" w:unhideWhenUsed="0"/>
+    <w:lsdException w:name="Colorful Shading" w:semiHidden="0" w:uiPriority="71" w:unhideWhenUsed="0"/>
+    <w:lsdException w:name="Colorful List" w:semiHidden="0" w:uiPriority="72" w:unhideWhenUsed="0"/>
+    <w:lsdException w:name="Colorful Grid" w:semiHidden="0" w:uiPriority="73" w:unhideWhenUsed="0"/>
+    <w:lsdException w:name="Light Shading Accent 1" w:semiHidden="0" w:uiPriority="60" w:unhideWhenUsed="0"/>
+    <w:lsdException w:name="Light List Accent 1" w:semiHidden="0" w:uiPriority="61" w:unhideWhenUsed="0"/>
+    <w:lsdException w:name="Light Grid Accent 1" w:semiHidden="0" w:uiPriority="62" w:unhideWhenUsed="0"/>
+    <w:lsdException w:name="Medium Shading 1 Accent 1" w:semiHidden="0" w:uiPriority="63" w:unhideWhenUsed="0"/>
+    <w:lsdException w:name="Medium Shading 2 Accent 1" w:semiHidden="0" w:uiPriority="64" w:unhideWhenUsed="0"/>
+    <w:lsdException w:name="Medium List 1 Accent 1" w:semiHidden="0" w:uiPriority="65" w:unhideWhenUsed="0"/>
+    <w:lsdException w:name="Revision" w:unhideWhenUsed="0"/>
+    <w:lsdException w:name="List Paragraph" w:semiHidden="0" w:uiPriority="34" w:unhideWhenUsed="0" w:qFormat="1"/>
+    <w:lsdException w:name="Quote" w:semiHidden="0" w:uiPriority="29" w:unhideWhenUsed="0" w:qFormat="1"/>
+    <w:lsdException w:name="Intense Quote" w:semiHidden="0" w:uiPriority="30" w:unhideWhenUsed="0" w:qFormat="1"/>
+    <w:lsdException w:name="Medium List 2 Accent 1" w:semiHidden="0" w:uiPriority="66" w:unhideWhenUsed="0"/>
+    <w:lsdException w:name="Medium Grid 1 Accent 1" w:semiHidden="0" w:uiPriority="67" w:unhideWhenUsed="0"/>
+    <w:lsdException w:name="Medium Grid 2 Accent 1" w:semiHidden="0" w:uiPriority="68" w:unhideWhenUsed="0"/>
+    <w:lsdException w:name="Medium Grid 3 Accent 1" w:semiHidden="0" w:uiPriority="69" w:unhideWhenUsed="0"/>
+    <w:lsdException w:name="Dark List Accent 1" w:semiHidden="0" w:uiPriority="70" w:unhideWhenUsed="0"/>
+    <w:lsdException w:name="Colorful Shading Accent 1" w:semiHidden="0" w:uiPriority="71" w:unhideWhenUsed="0"/>
+    <w:lsdException w:name="Colorful List Accent 1" w:semiHidden="0" w:uiPriority="72" w:unhideWhenUsed="0"/>
+    <w:lsdException w:name="Colorful Grid Accent 1" w:semiHidden="0" w:uiPriority="73" w:unhideWhenUsed="0"/>
+    <w:lsdException w:name="Light Shading Accent 2" w:semiHidden="0" w:uiPriority="60" w:unhideWhenUsed="0"/>
+    <w:lsdException w:name="Light List Accent 2" w:semiHidden="0" w:uiPriority="61" w:unhideWhenUsed="0"/>
+    <w:lsdException w:name="Light Grid Accent 2" w:semiHidden="0" w:uiPriority="62" w:unhideWhenUsed="0"/>
+    <w:lsdException w:name="Medium Shading 1 Accent 2" w:semiHidden="0" w:uiPriority="63" w:unhideWhenUsed="0"/>
+    <w:lsdException w:name="Medium Shading 2 Accent 2" w:semiHidden="0" w:uiPriority="64" w:unhideWhenUsed="0"/>
+    <w:lsdException w:name="Medium List 1 Accent 2" w:semiHidden="0" w:uiPriority="65" w:unhideWhenUsed="0"/>
+    <w:lsdException w:name="Medium List 2 Accent 2" w:semiHidden="0" w:uiPriority="66" w:unhideWhenUsed="0"/>
+    <w:lsdException w:name="Medium Grid 1 Accent 2" w:semiHidden="0" w:uiPriority="67" w:unhideWhenUsed="0"/>
+    <w:lsdException w:name="Medium Grid 2 Accent 2" w:semiHidden="0" w:uiPriority="68" w:unhideWhenUsed="0"/>
+    <w:lsdException w:name="Medium Grid 3 Accent 2" w:semiHidden="0" w:uiPriority="69" w:unhideWhenUsed="0"/>
+    <w:lsdException w:name="Dark List Accent 2" w:semiHidden="0" w:uiPriority="70" w:unhideWhenUsed="0"/>
+    <w:lsdException w:name="Colorful Shading Accent 2" w:semiHidden="0" w:uiPriority="71" w:unhideWhenUsed="0"/>
+    <w:lsdException w:name="Colorful List Accent 2" w:semiHidden="0" w:uiPriority="72" w:unhideWhenUsed="0"/>
+    <w:lsdException w:name="Colorful Grid Accent 2" w:semiHidden="0" w:uiPriority="73" w:unhideWhenUsed="0"/>
+    <w:lsdException w:name="Light Shading Accent 3" w:semiHidden="0" w:uiPriority="60" w:unhideWhenUsed="0"/>
+    <w:lsdException w:name="Light List Accent 3" w:semiHidden="0" w:uiPriority="61" w:unhideWhenUsed="0"/>
+    <w:lsdException w:name="Light Grid Accent 3" w:semiHidden="0" w:uiPriority="62" w:unhideWhenUsed="0"/>
+    <w:lsdException w:name="Medium Shading 1 Accent 3" w:semiHidden="0" w:uiPriority="63" w:unhideWhenUsed="0"/>
+    <w:lsdException w:name="Medium Shading 2 Accent 3" w:semiHidden="0" w:uiPriority="64" w:unhideWhenUsed="0"/>
+    <w:lsdException w:name="Medium List 1 Accent 3" w:semiHidden="0" w:uiPriority="65" w:unhideWhenUsed="0"/>
+    <w:lsdException w:name="Medium List 2 Accent 3" w:semiHidden="0" w:uiPriority="66" w:unhideWhenUsed="0"/>
+    <w:lsdException w:name="Medium Grid 1 Accent 3" w:semiHidden="0" w:uiPriority="67" w:unhideWhenUsed="0"/>
+    <w:lsdException w:name="Medium Grid 2 Accent 3" w:semiHidden="0" w:uiPriority="68" w:unhideWhenUsed="0"/>
+    <w:lsdException w:name="Medium Grid 3 Accent 3" w:semiHidden="0" w:uiPriority="69" w:unhideWhenUsed="0"/>
+    <w:lsdException w:name="Dark List Accent 3" w:semiHidden="0" w:uiPriority="70" w:unhideWhenUsed="0"/>
+    <w:lsdException w:name="Colorful Shading Accent 3" w:semiHidden="0" w:uiPriority="71" w:unhideWhenUsed="0"/>
+    <w:lsdException w:name="Colorful List Accent 3" w:semiHidden="0" w:uiPriority="72" w:unhideWhenUsed="0"/>
+    <w:lsdException w:name="Colorful Grid Accent 3" w:semiHidden="0" w:uiPriority="73" w:unhideWhenUsed="0"/>
+    <w:lsdException w:name="Light Shading Accent 4" w:semiHidden="0" w:uiPriority="60" w:unhideWhenUsed="0"/>
+    <w:lsdException w:name="Light List Accent 4" w:semiHidden="0" w:uiPriority="61" w:unhideWhenUsed="0"/>
+    <w:lsdException w:name="Light Grid Accent 4" w:semiHidden="0" w:uiPriority="62" w:unhideWhenUsed="0"/>
+    <w:lsdException w:name="Medium Shading 1 Accent 4" w:semiHidden="0" w:uiPriority="63" w:unhideWhenUsed="0"/>
+    <w:lsdException w:name="Medium Shading 2 Accent 4" w:semiHidden="0" w:uiPriority="64" w:unhideWhenUsed="0"/>
+    <w:lsdException w:name="Medium List 1 Accent 4" w:semiHidden="0" w:uiPriority="65" w:unhideWhenUsed="0"/>
+    <w:lsdException w:name="Medium List 2 Accent 4" w:semiHidden="0" w:uiPriority="66" w:unhideWhenUsed="0"/>
+    <w:lsdException w:name="Medium Grid 1 Accent 4" w:semiHidden="0" w:uiPriority="67" w:unhideWhenUsed="0"/>
+    <w:lsdException w:name="Medium Grid 2 Accent 4" w:semiHidden="0" w:uiPriority="68" w:unhideWhenUsed="0"/>
+    <w:lsdException w:name="Medium Grid 3 Accent 4" w:semiHidden="0" w:uiPriority="69" w:unhideWhenUsed="0"/>
+    <w:lsdException w:name="Dark List Accent 4" w:semiHidden="0" w:uiPriority="70" w:unhideWhenUsed="0"/>
+    <w:lsdException w:name="Colorful Shading Accent 4" w:semiHidden="0" w:uiPriority="71" w:unhideWhenUsed="0"/>
+    <w:lsdException w:name="Colorful List Accent 4" w:semiHidden="0" w:uiPriority="72" w:unhideWhenUsed="0"/>
+    <w:lsdException w:name="Colorful Grid Accent 4" w:semiHidden="0" w:uiPriority="73" w:unhideWhenUsed="0"/>
+    <w:lsdException w:name="Light Shading Accent 5" w:semiHidden="0" w:uiPriority="60" w:unhideWhenUsed="0"/>
+    <w:lsdException w:name="Light List Accent 5" w:semiHidden="0" w:uiPriority="61" w:unhideWhenUsed="0"/>
+    <w:lsdException w:name="Light Grid Accent 5" w:semiHidden="0" w:uiPriority="62" w:unhideWhenUsed="0"/>
+    <w:lsdException w:name="Medium Shading 1 Accent 5" w:semiHidden="0" w:uiPriority="63" w:unhideWhenUsed="0"/>
+    <w:lsdException w:name="Medium Shading 2 Accent 5" w:semiHidden="0" w:uiPriority="64" w:unhideWhenUsed="0"/>
+    <w:lsdException w:name="Medium List 1 Accent 5" w:semiHidden="0" w:uiPriority="65" w:unhideWhenUsed="0"/>
+    <w:lsdException w:name="Medium List 2 Accent 5" w:semiHidden="0" w:uiPriority="66" w:unhideWhenUsed="0"/>
+    <w:lsdException w:name="Medium Grid 1 Accent 5" w:semiHidden="0" w:uiPriority="67" w:unhideWhenUsed="0"/>
+    <w:lsdException w:name="Medium Grid 2 Accent 5" w:semiHidden="0" w:uiPriority="68" w:unhideWhenUsed="0"/>
+    <w:lsdException w:name="Medium Grid 3 Accent 5" w:semiHidden="0" w:uiPriority="69" w:unhideWhenUsed="0"/>
+    <w:lsdException w:name="Dark List Accent 5" w:semiHidden="0" w:uiPriority="70" w:unhideWhenUsed="0"/>
+    <w:lsdException w:name="Colorful Shading Accent 5" w:semiHidden="0" w:uiPriority="71" w:unhideWhenUsed="0"/>
+    <w:lsdException w:name="Colorful List Accent 5" w:semiHidden="0" w:uiPriority="72" w:unhideWhenUsed="0"/>
+    <w:lsdException w:name="Colorful Grid Accent 5" w:semiHidden="0" w:uiPriority="73" w:unhideWhenUsed="0"/>
+    <w:lsdException w:name="Light Shading Accent 6" w:semiHidden="0" w:uiPriority="60" w:unhideWhenUsed="0"/>
+    <w:lsdException w:name="Light List Accent 6" w:semiHidden="0" w:uiPriority="61" w:unhideWhenUsed="0"/>
+    <w:lsdException w:name="Light Grid Accent 6" w:semiHidden="0" w:uiPriority="62" w:unhideWhenUsed="0"/>
+    <w:lsdException w:name="Medium Shading 1 Accent 6" w:semiHidden="0" w:uiPriority="63" w:unhideWhenUsed="0"/>
+    <w:lsdException w:name="Medium Shading 2 Accent 6" w:semiHidden="0" w:uiPriority="64" w:unhideWhenUsed="0"/>
+    <w:lsdException w:name="Medium List 1 Accent 6" w:semiHidden="0" w:uiPriority="65" w:unhideWhenUsed="0"/>
+    <w:lsdException w:name="Medium List 2 Accent 6" w:semiHidden="0" w:uiPriority="66" w:unhideWhenUsed="0"/>
+    <w:lsdException w:name="Medium Grid 1 Accent 6" w:semiHidden="0" w:uiPriority="67" w:unhideWhenUsed="0"/>
+    <w:lsdException w:name="Medium Grid 2 Accent 6" w:semiHidden="0" w:uiPriority="68" w:unhideWhenUsed="0"/>
+    <w:lsdException w:name="Medium Grid 3 Accent 6" w:semiHidden="0" w:uiPriority="69" w:unhideWhenUsed="0"/>
+    <w:lsdException w:name="Dark List Accent 6" w:semiHidden="0" w:uiPriority="70" w:unhideWhenUsed="0"/>
+    <w:lsdException w:name="Colorful Shading Accent 6" w:semiHidden="0" w:uiPriority="71" w:unhideWhenUsed="0"/>
+    <w:lsdException w:name="Colorful List Accent 6" w:semiHidden="0" w:uiPriority="72" w:unhideWhenUsed="0"/>
+    <w:lsdException w:name="Colorful Grid Accent 6" w:semiHidden="0" w:uiPriority="73" w:unhideWhenUsed="0"/>
+    <w:lsdException w:name="Subtle Emphasis" w:semiHidden="0" w:uiPriority="19" w:unhideWhenUsed="0" w:qFormat="1"/>
+    <w:lsdException w:name="Intense Emphasis" w:semiHidden="0" w:uiPriority="21" w:unhideWhenUsed="0" w:qFormat="1"/>
+    <w:lsdException w:name="Subtle Reference" w:semiHidden="0" w:uiPriority="31" w:unhideWhenUsed="0" w:qFormat="1"/>
+    <w:lsdException w:name="Intense Reference" w:semiHidden="0" w:uiPriority="32" w:unhideWhenUsed="0" w:qFormat="1"/>
+    <w:lsdException w:name="Book Title" w:semiHidden="0" w:uiPriority="33" w:unhideWhenUsed="0" w:qFormat="1"/>
+    <w:lsdException w:name="Bibliography" w:uiPriority="37"/>
+    <w:lsdException w:name="TOC Heading" w:uiPriority="39" w:qFormat="1"/>
+  </w:latentStyles>
+  <w:style w:type="paragraph" w:default="1" w:styleId="Normal">
+    <w:name w:val="Normal"/>
+    <w:qFormat/>
+    <w:rsid w:val="000F4FEF"/>
+    <w:pPr>
+      <w:spacing w:before="-1" w:after="-1" w:line="240" w:lineRule="auto"/>
+    </w:pPr>
+    <w:rPr>
+      <w:rFonts w:ascii="Arial" w:hAnsi="Arial" w:cs="Arial"/>
+    </w:rPr>
+  </w:style>
+  <w:style w:type="paragraph" w:styleId="Heading1">
+    <w:name w:val="heading 1"/>
+    <w:basedOn w:val="Normal"/>
+    <w:link w:val="Heading1Char"/>
+    <w:uiPriority w:val="9"/>
+    <w:qFormat/>
+    <w:rsid w:val="000F4FEF"/>
+    <w:pPr>
+      <w:pBdr>
+        <w:bottom w:val="single" w:sz="4" w:space="1" w:color="A6A6A6" w:themeColor="background1" w:themeShade="A6"/>
+      </w:pBdr>
+      <w:spacing w:before="0" w:beforeAutospacing="0" w:after="100" w:line="276" w:lineRule="auto"/>
+      <w:outlineLvl w:val="0"/>
+    </w:pPr>
+    <w:rPr>
+      <w:rFonts w:ascii="Helvetica" w:hAnsi="Helvetica" w:cs="Helvetica"/>
+      <w:color w:val="0A2A78"/>
+      <w:spacing w:val="-4"/>
+      <w:sz w:val="40"/>
+      <w:szCs w:val="24"/>
+    </w:rPr>
+  </w:style>
+  <w:style w:type="paragraph" w:styleId="Heading2">
+    <w:name w:val="heading 2"/>
+    <w:basedOn w:val="Normal"/>
+    <w:next w:val="Normal"/>
+    <w:link w:val="Heading2Char"/>
+    <w:uiPriority w:val="9"/>
+    <w:unhideWhenUsed/>
+    <w:qFormat/>
+    <w:rsid w:val="000F4FEF"/>
+    <w:pPr>
+      <w:widowControl w:val="0"/>
+      <w:autoSpaceDE w:val="0"/>
+      <w:autoSpaceDN w:val="0"/>
+      <w:spacing w:before="0" w:beforeAutospacing="0" w:after="0" w:afterAutospacing="0" w:line="276" w:lineRule="auto"/>
+      <w:outlineLvl w:val="1"/>
+    </w:pPr>
+    <w:rPr>
+      <w:rFonts w:ascii="Helvetica" w:eastAsiaTheme="minorHAnsi" w:hAnsi="Helvetica" w:cs="Helvetica"/>
+      <w:color w:val="0A2A78"/>
+      <w:spacing w:val="-2"/>
+      <w:sz w:val="36"/>
+      <w:szCs w:val="24"/>
+    </w:rPr>
+  </w:style>
+  <w:style w:type="paragraph" w:styleId="Heading3">
+    <w:name w:val="heading 3"/>
+    <w:basedOn w:val="Heading2"/>
+    <w:next w:val="Body"/>
+    <w:link w:val="Heading3Char"/>
+    <w:uiPriority w:val="9"/>
+    <w:unhideWhenUsed/>
+    <w:qFormat/>
+    <w:rsid w:val="000F4FEF"/>
+    <w:pPr>
+      <w:outlineLvl w:val="2"/>
+    </w:pPr>
+    <w:rPr>
+      <w:sz w:val="32"/>
+    </w:rPr>
+  </w:style>
+  <w:style w:type="paragraph" w:styleId="Heading4">
+    <w:name w:val="heading 4"/>
+    <w:basedOn w:val="Normal"/>
+    <w:next w:val="Normal"/>
+    <w:link w:val="Heading4Char"/>
+    <w:uiPriority w:val="9"/>
+    <w:unhideWhenUsed/>
+    <w:qFormat/>
+    <w:rsid w:val="000F4FEF"/>
+    <w:pPr>
+      <w:widowControl w:val="0"/>
+      <w:autoSpaceDE w:val="0"/>
+      <w:autoSpaceDN w:val="0"/>
+      <w:spacing w:before="54" w:beforeAutospacing="0" w:after="120" w:afterAutospacing="0" w:line="276" w:lineRule="auto"/>
+      <w:ind w:left="360"/>
+      <w:outlineLvl w:val="3"/>
+    </w:pPr>
+    <w:rPr>
+      <w:rFonts w:ascii="Helvetica" w:eastAsiaTheme="minorHAnsi" w:hAnsi="Helvetica" w:cs="Helvetica"/>
+      <w:iCs/>
+      <w:color w:val="0A2A78"/>
+      <w:spacing w:val="-2"/>
+      <w:sz w:val="24"/>
+      <w:szCs w:val="24"/>
+    </w:rPr>
+  </w:style>
+  <w:style w:type="paragraph" w:styleId="Heading5">
+    <w:name w:val="heading 5"/>
+    <w:basedOn w:val="Normal"/>
+    <w:next w:val="Normal"/>
+    <w:link w:val="Heading5Char"/>
+    <w:uiPriority w:val="9"/>
+    <w:unhideWhenUsed/>
+    <w:qFormat/>
+    <w:rsid w:val="000F4FEF"/>
+    <w:pPr>
+      <w:keepNext/>
+      <w:keepLines/>
+      <w:spacing w:before="240" w:after="80"/>
+      <w:outlineLvl w:val="4"/>
+    </w:pPr>
+    <w:rPr>
+      <w:color w:val="666666"/>
+    </w:rPr>
+  </w:style>
+  <w:style w:type="paragraph" w:styleId="Heading6">
+    <w:name w:val="heading 6"/>
+    <w:basedOn w:val="Normal"/>
+    <w:next w:val="Normal"/>
+    <w:link w:val="Heading6Char"/>
+    <w:uiPriority w:val="9"/>
+    <w:semiHidden/>
+    <w:unhideWhenUsed/>
+    <w:qFormat/>
+    <w:rsid w:val="000F4FEF"/>
+    <w:pPr>
+      <w:keepNext/>
+      <w:keepLines/>
+      <w:spacing w:before="240" w:after="80"/>
+      <w:outlineLvl w:val="5"/>
+    </w:pPr>
+    <w:rPr>
+      <w:i/>
+      <w:color w:val="666666"/>
+    </w:rPr>
+  </w:style>
+  <w:style w:type="character" w:default="1" w:styleId="DefaultParagraphFont">
+    <w:name w:val="Default Paragraph Font"/>
+    <w:uiPriority w:val="1"/>
+    <w:semiHidden/>
+    <w:unhideWhenUsed/>
+  </w:style>
+  <w:style w:type="table" w:default="1" w:styleId="TableNormal">
+    <w:name w:val="Normal Table"/>
+    <w:uiPriority w:val="99"/>
+    <w:semiHidden/>
+    <w:unhideWhenUsed/>
+    <w:tblPr>
+      <w:tblInd w:w="0" w:type="dxa"/>
+      <w:tblCellMar>
+        <w:top w:w="0" w:type="dxa"/>
+        <w:left w:w="108" w:type="dxa"/>
+        <w:bottom w:w="0" w:type="dxa"/>
+        <w:right w:w="108" w:type="dxa"/>
+      </w:tblCellMar>
+    </w:tblPr>
+  </w:style>
+  <w:style w:type="numbering" w:default="1" w:styleId="NoList">
+    <w:name w:val="No List"/>
+    <w:uiPriority w:val="99"/>
+    <w:semiHidden/>
+    <w:unhideWhenUsed/>
+  </w:style>
+  <w:style w:type="paragraph" w:customStyle="1" w:styleId="Code">
+    <w:name w:val="Code"/>
+    <w:basedOn w:val="Normal"/>
+    <w:qFormat/>
+    <w:rsid w:val="000F4FEF"/>
+    <w:rPr>
+      <w:rFonts w:ascii="Calibri" w:hAnsi="Calibri"/>
+    </w:rPr>
+  </w:style>
+  <w:style w:type="paragraph" w:customStyle="1" w:styleId="Body">
+    <w:name w:val="Body"/>
+    <w:basedOn w:val="Normal"/>
+    <w:link w:val="BodyChar"/>
+    <w:qFormat/>
+    <w:rsid w:val="000F4FEF"/>
+    <w:pPr>
+      <w:spacing w:before="0" w:beforeAutospacing="0" w:after="120" w:afterAutospacing="0" w:line="276" w:lineRule="auto"/>
+    </w:pPr>
+    <w:rPr>
+      <w:rFonts w:ascii="Helvetica" w:eastAsiaTheme="minorHAnsi" w:hAnsi="Helvetica" w:cs="Helvetica"/>
+      <w:sz w:val="24"/>
+      <w:szCs w:val="24"/>
+    </w:rPr>
+  </w:style>
+  <w:style w:type="character" w:customStyle="1" w:styleId="Heading1Char">
+    <w:name w:val="Heading 1 Char"/>
+    <w:basedOn w:val="DefaultParagraphFont"/>
+    <w:link w:val="Heading1"/>
+    <w:uiPriority w:val="9"/>
+    <w:rsid w:val="000F4FEF"/>
+    <w:rPr>
+      <w:rFonts w:ascii="Helvetica" w:hAnsi="Helvetica" w:cs="Helvetica"/>
+      <w:color w:val="0A2A78"/>
+      <w:spacing w:val="-4"/>
+      <w:sz w:val="40"/>
+      <w:szCs w:val="24"/>
+    </w:rPr>
+  </w:style>
+  <w:style w:type="paragraph" w:styleId="ListParagraph">
+    <w:name w:val="List Paragraph"/>
+    <w:basedOn w:val="BodyText"/>
+    <w:uiPriority w:val="34"/>
+    <w:qFormat/>
+    <w:rsid w:val="000F4FEF"/>
+    <w:pPr>
+      <w:widowControl w:val="0"/>
+      <w:numPr>
+        <w:numId w:val="8"/>
+      </w:numPr>
+      <w:autoSpaceDE w:val="0"/>
+      <w:autoSpaceDN w:val="0"/>
+      <w:spacing w:before="54" w:beforeAutospacing="0" w:afterAutospacing="0" w:line="276" w:lineRule="auto"/>
+    </w:pPr>
+    <w:rPr>
+      <w:rFonts w:ascii="Helvetica" w:eastAsiaTheme="minorHAnsi" w:hAnsi="Helvetica" w:cs="Helvetica"/>
+      <w:color w:val="202529"/>
+      <w:spacing w:val="-2"/>
+      <w:sz w:val="24"/>
+      <w:szCs w:val="24"/>
+    </w:rPr>
+  </w:style>
+  <w:style w:type="paragraph" w:customStyle="1" w:styleId="TFVariable">
+    <w:name w:val="TF Variable"/>
+    <w:basedOn w:val="Heading3"/>
+    <w:next w:val="Body"/>
+    <w:qFormat/>
+    <w:rsid w:val="000F4FEF"/>
+    <w:pPr>
+      <w:numPr>
+        <w:numId w:val="10"/>
+      </w:numPr>
+    </w:pPr>
+  </w:style>
+  <w:style w:type="character" w:customStyle="1" w:styleId="Heading3Char">
+    <w:name w:val="Heading 3 Char"/>
+    <w:basedOn w:val="DefaultParagraphFont"/>
+    <w:link w:val="Heading3"/>
+    <w:uiPriority w:val="9"/>
+    <w:qFormat/>
+    <w:rsid w:val="000F4FEF"/>
+    <w:rPr>
+      <w:rFonts w:ascii="Helvetica" w:eastAsiaTheme="minorHAnsi" w:hAnsi="Helvetica" w:cs="Helvetica"/>
+      <w:color w:val="0A2A78"/>
+      <w:spacing w:val="-2"/>
+      <w:sz w:val="32"/>
+      <w:szCs w:val="24"/>
+    </w:rPr>
+  </w:style>
+  <w:style w:type="paragraph" w:customStyle="1" w:styleId="interviewcondition">
+    <w:name w:val="interview condition"/>
+    <w:basedOn w:val="Normal"/>
+    <w:link w:val="interviewconditionChar"/>
+    <w:qFormat/>
+    <w:rsid w:val="00F44633"/>
+    <w:pPr>
+      <w:spacing w:after="60" w:line="360" w:lineRule="auto"/>
+    </w:pPr>
+    <w:rPr>
+      <w:rFonts w:asciiTheme="minorHAnsi" w:hAnsiTheme="minorHAnsi" w:cstheme="minorBidi"/>
+      <w:color w:val="00B050"/>
+      <w:u w:val="single"/>
+    </w:rPr>
+  </w:style>
+  <w:style w:type="character" w:customStyle="1" w:styleId="interviewconditionChar">
+    <w:name w:val="interview condition Char"/>
+    <w:basedOn w:val="DefaultParagraphFont"/>
+    <w:link w:val="interviewcondition"/>
+    <w:rsid w:val="00F44633"/>
+    <w:rPr>
+      <w:color w:val="00B050"/>
+      <w:u w:val="single"/>
+    </w:rPr>
+  </w:style>
+  <w:style w:type="paragraph" w:customStyle="1" w:styleId="interviewbutton">
+    <w:name w:val="interview button"/>
+    <w:basedOn w:val="Normal"/>
+    <w:next w:val="Normal"/>
+    <w:link w:val="interviewbuttonChar"/>
+    <w:qFormat/>
+    <w:rsid w:val="000F4FEF"/>
+    <w:pPr>
+      <w:shd w:val="clear" w:color="auto" w:fill="0070C0"/>
+      <w:spacing w:after="60" w:line="360" w:lineRule="auto"/>
+    </w:pPr>
+    <w:rPr>
+      <w:rFonts w:asciiTheme="minorHAnsi" w:hAnsiTheme="minorHAnsi" w:cstheme="minorBidi"/>
+      <w:color w:val="FFFFFF" w:themeColor="background1"/>
+      <w:szCs w:val="40"/>
+    </w:rPr>
+  </w:style>
+  <w:style w:type="character" w:customStyle="1" w:styleId="interviewbuttonChar">
+    <w:name w:val="interview button Char"/>
+    <w:basedOn w:val="DefaultParagraphFont"/>
+    <w:link w:val="interviewbutton"/>
+    <w:qFormat/>
+    <w:rsid w:val="000F4FEF"/>
+    <w:rPr>
+      <w:color w:val="FFFFFF" w:themeColor="background1"/>
+      <w:szCs w:val="40"/>
+      <w:shd w:val="clear" w:color="auto" w:fill="0070C0"/>
+    </w:rPr>
+  </w:style>
+  <w:style w:type="paragraph" w:styleId="BodyText">
+    <w:name w:val="Body Text"/>
+    <w:basedOn w:val="Normal"/>
+    <w:link w:val="BodyTextChar"/>
+    <w:uiPriority w:val="1"/>
+    <w:unhideWhenUsed/>
+    <w:qFormat/>
+    <w:rsid w:val="000F4FEF"/>
+    <w:pPr>
+      <w:spacing w:after="120"/>
+    </w:pPr>
+  </w:style>
+  <w:style w:type="character" w:customStyle="1" w:styleId="BodyTextChar">
+    <w:name w:val="Body Text Char"/>
+    <w:basedOn w:val="DefaultParagraphFont"/>
+    <w:link w:val="BodyText"/>
+    <w:uiPriority w:val="1"/>
+    <w:rsid w:val="000F4FEF"/>
+    <w:rPr>
+      <w:rFonts w:ascii="Arial" w:hAnsi="Arial" w:cs="Arial"/>
+    </w:rPr>
+  </w:style>
+  <w:style w:type="character" w:customStyle="1" w:styleId="interviewcondition2">
+    <w:name w:val="interview condition 2"/>
+    <w:basedOn w:val="Hyperlink"/>
+    <w:uiPriority w:val="1"/>
+    <w:qFormat/>
+    <w:rsid w:val="000F4FEF"/>
+    <w:rPr>
+      <w:rFonts w:ascii="Helvetica" w:eastAsia="Arial" w:hAnsi="Helvetica" w:cs="Helvetica"/>
+      <w:color w:val="009999"/>
+      <w:spacing w:val="-2"/>
+      <w:sz w:val="24"/>
+      <w:szCs w:val="24"/>
+      <w:u w:val="none"/>
+    </w:rPr>
+  </w:style>
+  <w:style w:type="character" w:styleId="Hyperlink">
+    <w:name w:val="Hyperlink"/>
+    <w:basedOn w:val="DefaultParagraphFont"/>
+    <w:uiPriority w:val="99"/>
+    <w:unhideWhenUsed/>
+    <w:rsid w:val="000F4FEF"/>
+    <w:rPr>
+      <w:rFonts w:ascii="Helvetica" w:hAnsi="Helvetica" w:cs="Helvetica"/>
+      <w:color w:val="0563C1" w:themeColor="hyperlink"/>
+      <w:spacing w:val="-2"/>
+      <w:sz w:val="24"/>
+      <w:szCs w:val="24"/>
+      <w:u w:val="none"/>
+    </w:rPr>
+  </w:style>
+  <w:style w:type="paragraph" w:customStyle="1" w:styleId="variable">
+    <w:name w:val="variable"/>
+    <w:basedOn w:val="Normal"/>
+    <w:qFormat/>
+    <w:rsid w:val="00B61CCF"/>
+    <w:pPr>
+      <w:spacing w:after="120" w:line="276" w:lineRule="auto"/>
+    </w:pPr>
+    <w:rPr>
+      <w:color w:val="FF7C80"/>
+      <w:shd w:val="clear" w:color="auto" w:fill="FFFFCC"/>
+      <w:lang w:val="en"/>
+    </w:rPr>
+  </w:style>
+  <w:style w:type="character" w:customStyle="1" w:styleId="Heading2Char">
+    <w:name w:val="Heading 2 Char"/>
+    <w:basedOn w:val="DefaultParagraphFont"/>
+    <w:link w:val="Heading2"/>
+    <w:uiPriority w:val="9"/>
+    <w:rsid w:val="000F4FEF"/>
+    <w:rPr>
+      <w:rFonts w:ascii="Helvetica" w:eastAsiaTheme="minorHAnsi" w:hAnsi="Helvetica" w:cs="Helvetica"/>
+      <w:color w:val="0A2A78"/>
+      <w:spacing w:val="-2"/>
+      <w:sz w:val="36"/>
+      <w:szCs w:val="24"/>
+    </w:rPr>
+  </w:style>
+  <w:style w:type="character" w:customStyle="1" w:styleId="Heading4Char">
+    <w:name w:val="Heading 4 Char"/>
+    <w:basedOn w:val="DefaultParagraphFont"/>
+    <w:link w:val="Heading4"/>
+    <w:uiPriority w:val="9"/>
+    <w:qFormat/>
+    <w:rsid w:val="000F4FEF"/>
+    <w:rPr>
+      <w:rFonts w:ascii="Helvetica" w:eastAsiaTheme="minorHAnsi" w:hAnsi="Helvetica" w:cs="Helvetica"/>
+      <w:iCs/>
+      <w:color w:val="0A2A78"/>
+      <w:spacing w:val="-2"/>
+      <w:sz w:val="24"/>
+      <w:szCs w:val="24"/>
+    </w:rPr>
+  </w:style>
+  <w:style w:type="paragraph" w:customStyle="1" w:styleId="Example">
+    <w:name w:val="Example"/>
+    <w:basedOn w:val="Heading4"/>
+    <w:next w:val="Normal"/>
+    <w:qFormat/>
+    <w:rsid w:val="000F4FEF"/>
+  </w:style>
+  <w:style w:type="paragraph" w:customStyle="1" w:styleId="Exampleparagraph">
+    <w:name w:val="Example paragraph"/>
+    <w:basedOn w:val="Body"/>
+    <w:next w:val="Body"/>
+    <w:qFormat/>
+    <w:rsid w:val="00CA58DD"/>
+    <w:pPr>
+      <w:ind w:left="416"/>
+    </w:pPr>
+    <w:rPr>
+      <w:color w:val="202529"/>
+      <w:spacing w:val="-2"/>
+    </w:rPr>
+  </w:style>
+  <w:style w:type="paragraph" w:customStyle="1" w:styleId="ListParagraphNumbered">
+    <w:name w:val="List Paragraph Numbered"/>
+    <w:basedOn w:val="ListParagraph"/>
+    <w:qFormat/>
+    <w:rsid w:val="000F4FEF"/>
+    <w:pPr>
+      <w:numPr>
+        <w:numId w:val="9"/>
+      </w:numPr>
+    </w:pPr>
+    <w:rPr>
+      <w:b/>
+    </w:rPr>
+  </w:style>
+  <w:style w:type="paragraph" w:customStyle="1" w:styleId="ExampleorImportantblock">
+    <w:name w:val="Example or Important block"/>
+    <w:basedOn w:val="Body"/>
+    <w:qFormat/>
+    <w:rsid w:val="000F4FEF"/>
+    <w:pPr>
+      <w:widowControl w:val="0"/>
+      <w:suppressAutoHyphens/>
+      <w:ind w:left="403"/>
+    </w:pPr>
+    <w:rPr>
+      <w:color w:val="202529"/>
+      <w:spacing w:val="-2"/>
+    </w:rPr>
+  </w:style>
+  <w:style w:type="paragraph" w:customStyle="1" w:styleId="Listnumbered">
+    <w:name w:val="List numbered"/>
+    <w:basedOn w:val="Normal"/>
+    <w:qFormat/>
+    <w:rsid w:val="000F4FEF"/>
+    <w:pPr>
+      <w:widowControl w:val="0"/>
+      <w:autoSpaceDE w:val="0"/>
+      <w:autoSpaceDN w:val="0"/>
+      <w:spacing w:before="54" w:beforeAutospacing="0" w:after="120" w:afterAutospacing="0" w:line="276" w:lineRule="auto"/>
+    </w:pPr>
+    <w:rPr>
+      <w:rFonts w:ascii="Helvetica" w:eastAsiaTheme="minorHAnsi" w:hAnsi="Helvetica" w:cs="Helvetica"/>
+      <w:color w:val="202529"/>
+      <w:spacing w:val="-2"/>
+      <w:sz w:val="24"/>
+      <w:szCs w:val="24"/>
+    </w:rPr>
+  </w:style>
+  <w:style w:type="character" w:customStyle="1" w:styleId="Helptextinquestionmark">
+    <w:name w:val="Help text in question mark"/>
+    <w:basedOn w:val="DefaultParagraphFont"/>
+    <w:uiPriority w:val="1"/>
+    <w:qFormat/>
+    <w:rsid w:val="000F4FEF"/>
+    <w:rPr>
+      <w:rFonts w:ascii="Tahoma" w:hAnsi="Tahoma" w:cs="Tahoma"/>
+      <w:color w:val="FFFFFF" w:themeColor="background1"/>
+      <w:szCs w:val="24"/>
+      <w:shd w:val="clear" w:color="auto" w:fill="33CCFF"/>
+    </w:rPr>
+  </w:style>
+  <w:style w:type="character" w:customStyle="1" w:styleId="interviewtextbox">
+    <w:name w:val="interview text box"/>
+    <w:basedOn w:val="DefaultParagraphFont"/>
+    <w:uiPriority w:val="1"/>
+    <w:qFormat/>
+    <w:rsid w:val="000F4FEF"/>
+    <w:rPr>
+      <w:shd w:val="clear" w:color="auto" w:fill="D9D9D9" w:themeFill="background1" w:themeFillShade="D9"/>
+    </w:rPr>
+  </w:style>
+  <w:style w:type="character" w:customStyle="1" w:styleId="interviewhelpquestionmark">
+    <w:name w:val="interview help question mark"/>
+    <w:basedOn w:val="DefaultParagraphFont"/>
+    <w:uiPriority w:val="1"/>
+    <w:qFormat/>
+    <w:rsid w:val="000F4FEF"/>
+    <w:rPr>
+      <w:color w:val="FFFFFF" w:themeColor="background1"/>
+      <w:shd w:val="clear" w:color="auto" w:fill="9CC2E5" w:themeFill="accent5" w:themeFillTint="99"/>
+    </w:rPr>
+  </w:style>
+  <w:style w:type="paragraph" w:customStyle="1" w:styleId="ListPlevel2">
+    <w:name w:val="List P level 2"/>
+    <w:basedOn w:val="ListParagraph"/>
+    <w:qFormat/>
+    <w:rsid w:val="000F4FEF"/>
+    <w:pPr>
+      <w:ind w:left="765"/>
+    </w:pPr>
+    <w:rPr>
+      <w:color w:val="auto"/>
+      <w:spacing w:val="0"/>
+    </w:rPr>
+  </w:style>
+  <w:style w:type="paragraph" w:customStyle="1" w:styleId="ListPlevel3">
+    <w:name w:val="List P level 3"/>
+    <w:basedOn w:val="ListPlevel2"/>
+    <w:qFormat/>
+    <w:rsid w:val="000F4FEF"/>
+    <w:pPr>
+      <w:tabs>
+        <w:tab w:val="num" w:pos="360"/>
+      </w:tabs>
+      <w:ind w:left="2160"/>
+    </w:pPr>
+  </w:style>
+  <w:style w:type="paragraph" w:customStyle="1" w:styleId="ListParagraphNumberedBold">
+    <w:name w:val="List Paragraph Numbered (Bold)"/>
+    <w:basedOn w:val="ListParagraphNumbered"/>
+    <w:qFormat/>
+    <w:rsid w:val="00AA522D"/>
+    <w:pPr>
+      <w:ind w:left="405"/>
+    </w:pPr>
+    <w:rPr>
+      <w:color w:val="auto"/>
+      <w:spacing w:val="0"/>
+    </w:rPr>
+  </w:style>
+  <w:style w:type="paragraph" w:styleId="Footer">
+    <w:name w:val="footer"/>
+    <w:basedOn w:val="Normal"/>
+    <w:link w:val="FooterChar"/>
+    <w:uiPriority w:val="99"/>
+    <w:unhideWhenUsed/>
+    <w:rsid w:val="000F4FEF"/>
+    <w:pPr>
+      <w:tabs>
+        <w:tab w:val="center" w:pos="4680"/>
+        <w:tab w:val="right" w:pos="9360"/>
+      </w:tabs>
+    </w:pPr>
+  </w:style>
+  <w:style w:type="character" w:customStyle="1" w:styleId="FooterChar">
+    <w:name w:val="Footer Char"/>
+    <w:basedOn w:val="DefaultParagraphFont"/>
+    <w:link w:val="Footer"/>
+    <w:uiPriority w:val="99"/>
+    <w:qFormat/>
+    <w:rsid w:val="000F4FEF"/>
+    <w:rPr>
+      <w:rFonts w:ascii="Arial" w:hAnsi="Arial" w:cs="Arial"/>
+    </w:rPr>
+  </w:style>
+  <w:style w:type="paragraph" w:customStyle="1" w:styleId="FooterRight">
+    <w:name w:val="Footer Right"/>
+    <w:basedOn w:val="Footer"/>
+    <w:qFormat/>
+    <w:rsid w:val="00FA6057"/>
+    <w:pPr>
+      <w:jc w:val="right"/>
+    </w:pPr>
+  </w:style>
+  <w:style w:type="paragraph" w:customStyle="1" w:styleId="interviewsituationpara">
+    <w:name w:val="interview situation para"/>
+    <w:basedOn w:val="Body"/>
+    <w:next w:val="interviewsituationcondition"/>
+    <w:link w:val="interviewsituationparaChar"/>
+    <w:qFormat/>
+    <w:rsid w:val="00DD3DDA"/>
+    <w:pPr>
+      <w:spacing w:before="120" w:after="0" w:line="240" w:lineRule="auto"/>
+      <w:contextualSpacing/>
+    </w:pPr>
+  </w:style>
+  <w:style w:type="character" w:customStyle="1" w:styleId="interviewsituationparaChar">
+    <w:name w:val="interview situation para Char"/>
+    <w:basedOn w:val="BodyChar"/>
+    <w:link w:val="interviewsituationpara"/>
+    <w:rsid w:val="00DD3DDA"/>
+    <w:rPr>
+      <w:rFonts w:ascii="Helvetica" w:eastAsiaTheme="minorHAnsi" w:hAnsi="Helvetica" w:cs="Helvetica"/>
+      <w:sz w:val="24"/>
+      <w:szCs w:val="24"/>
+    </w:rPr>
+  </w:style>
+  <w:style w:type="paragraph" w:customStyle="1" w:styleId="Done">
+    <w:name w:val="Done"/>
+    <w:basedOn w:val="ListParagraph"/>
+    <w:qFormat/>
+    <w:rsid w:val="00DD3DDA"/>
+    <w:pPr>
+      <w:numPr>
+        <w:ilvl w:val="1"/>
+        <w:numId w:val="2"/>
+      </w:numPr>
+    </w:pPr>
+  </w:style>
+  <w:style w:type="character" w:customStyle="1" w:styleId="subject">
+    <w:name w:val="subject"/>
+    <w:basedOn w:val="DefaultParagraphFont"/>
+    <w:rsid w:val="000F4FEF"/>
+  </w:style>
+  <w:style w:type="character" w:customStyle="1" w:styleId="convention">
+    <w:name w:val="convention"/>
+    <w:basedOn w:val="DefaultParagraphFont"/>
+    <w:uiPriority w:val="1"/>
+    <w:qFormat/>
+    <w:rsid w:val="000F4FEF"/>
+    <w:rPr>
+      <w:sz w:val="22"/>
+      <w:szCs w:val="22"/>
+      <w:shd w:val="clear" w:color="auto" w:fill="A6A6A6" w:themeFill="background1" w:themeFillShade="A6"/>
+    </w:rPr>
+  </w:style>
+  <w:style w:type="paragraph" w:customStyle="1" w:styleId="Default">
+    <w:name w:val="Default"/>
+    <w:rsid w:val="000F4FEF"/>
+    <w:pPr>
+      <w:autoSpaceDE w:val="0"/>
+      <w:autoSpaceDN w:val="0"/>
+      <w:adjustRightInd w:val="0"/>
+      <w:spacing w:beforeAutospacing="0" w:after="0" w:afterAutospacing="0" w:line="240" w:lineRule="auto"/>
+    </w:pPr>
+    <w:rPr>
+      <w:rFonts w:ascii="Arial" w:eastAsiaTheme="minorHAnsi" w:hAnsi="Arial" w:cs="Arial"/>
+      <w:color w:val="000000"/>
+      <w:sz w:val="24"/>
+      <w:szCs w:val="24"/>
+    </w:rPr>
+  </w:style>
+  <w:style w:type="paragraph" w:customStyle="1" w:styleId="Example-bulleted">
+    <w:name w:val="Example - bulleted"/>
+    <w:basedOn w:val="Body"/>
+    <w:qFormat/>
+    <w:rsid w:val="000F4FEF"/>
+    <w:pPr>
+      <w:widowControl w:val="0"/>
+      <w:numPr>
+        <w:numId w:val="3"/>
+      </w:numPr>
+      <w:suppressAutoHyphens/>
+      <w:autoSpaceDE w:val="0"/>
+      <w:autoSpaceDN w:val="0"/>
+      <w:spacing w:before="60"/>
+    </w:pPr>
+    <w:rPr>
+      <w:rFonts w:eastAsia="Calibri"/>
+    </w:rPr>
+  </w:style>
+  <w:style w:type="character" w:customStyle="1" w:styleId="f1-light">
+    <w:name w:val="f1-light"/>
+    <w:basedOn w:val="DefaultParagraphFont"/>
+    <w:rsid w:val="000F4FEF"/>
+  </w:style>
+  <w:style w:type="paragraph" w:customStyle="1" w:styleId="H3numberedfordirections">
+    <w:name w:val="H3 numbered for directions"/>
+    <w:basedOn w:val="Heading3"/>
+    <w:next w:val="Normal"/>
+    <w:qFormat/>
+    <w:rsid w:val="000F4FEF"/>
+    <w:pPr>
+      <w:numPr>
+        <w:numId w:val="4"/>
+      </w:numPr>
+      <w:outlineLvl w:val="9"/>
+    </w:pPr>
+  </w:style>
+  <w:style w:type="character" w:customStyle="1" w:styleId="Interviewbutton0">
+    <w:name w:val="Interview button"/>
+    <w:basedOn w:val="DefaultParagraphFont"/>
+    <w:uiPriority w:val="1"/>
+    <w:qFormat/>
+    <w:rsid w:val="000F4FEF"/>
+    <w:rPr>
+      <w:color w:val="FFFFFF" w:themeColor="background1"/>
+      <w:bdr w:val="none" w:sz="0" w:space="0" w:color="auto"/>
+      <w:shd w:val="clear" w:color="auto" w:fill="0B5ED8"/>
+    </w:rPr>
+  </w:style>
+  <w:style w:type="paragraph" w:customStyle="1" w:styleId="interviewbuttons">
+    <w:name w:val="interview buttons"/>
+    <w:basedOn w:val="Normal"/>
+    <w:qFormat/>
+    <w:rsid w:val="000F4FEF"/>
+    <w:pPr>
+      <w:pBdr>
+        <w:top w:val="single" w:sz="12" w:space="1" w:color="0070C0"/>
+        <w:left w:val="single" w:sz="12" w:space="4" w:color="0070C0"/>
+        <w:bottom w:val="single" w:sz="12" w:space="1" w:color="0070C0"/>
+        <w:right w:val="single" w:sz="12" w:space="4" w:color="0070C0"/>
+        <w:between w:val="single" w:sz="12" w:space="1" w:color="0070C0"/>
+        <w:bar w:val="single" w:sz="12" w:color="0070C0"/>
+      </w:pBdr>
+      <w:shd w:val="clear" w:color="auto" w:fill="FFFFFF"/>
+      <w:spacing w:after="0"/>
+      <w:ind w:left="-58" w:right="-216"/>
+    </w:pPr>
+    <w:rPr>
+      <w:sz w:val="21"/>
+      <w:szCs w:val="21"/>
+    </w:rPr>
+  </w:style>
+  <w:style w:type="paragraph" w:customStyle="1" w:styleId="interviewcheckboxes">
+    <w:name w:val="interview checkboxes"/>
+    <w:basedOn w:val="ListParagraph"/>
+    <w:qFormat/>
+    <w:rsid w:val="000F4FEF"/>
+    <w:pPr>
+      <w:numPr>
+        <w:numId w:val="5"/>
+      </w:numPr>
+      <w:pBdr>
+        <w:top w:val="single" w:sz="12" w:space="1" w:color="0070C0"/>
+        <w:left w:val="single" w:sz="12" w:space="4" w:color="0070C0"/>
+        <w:bottom w:val="single" w:sz="12" w:space="1" w:color="0070C0"/>
+        <w:right w:val="single" w:sz="12" w:space="4" w:color="0070C0"/>
+        <w:between w:val="single" w:sz="12" w:space="1" w:color="0070C0"/>
+        <w:bar w:val="single" w:sz="12" w:color="0070C0"/>
+      </w:pBdr>
+    </w:pPr>
+  </w:style>
+  <w:style w:type="character" w:customStyle="1" w:styleId="interviewclickformoreinfo-definition">
+    <w:name w:val="interview click for more info - definition"/>
+    <w:uiPriority w:val="1"/>
+    <w:qFormat/>
+    <w:rsid w:val="000F4FEF"/>
+    <w:rPr>
+      <w:color w:val="00B050"/>
+      <w:u w:val="dash" w:color="92D050"/>
+    </w:rPr>
+  </w:style>
+  <w:style w:type="character" w:customStyle="1" w:styleId="InterviewCommentText">
+    <w:name w:val="Interview Comment Text"/>
+    <w:basedOn w:val="BodyTextChar"/>
+    <w:uiPriority w:val="1"/>
+    <w:qFormat/>
+    <w:rsid w:val="000F4FEF"/>
+    <w:rPr>
+      <w:rFonts w:ascii="Helvetica" w:eastAsia="Arial" w:hAnsi="Helvetica" w:cs="Helvetica"/>
+      <w:color w:val="7030A0"/>
+      <w:spacing w:val="-2"/>
+      <w:sz w:val="24"/>
+      <w:szCs w:val="24"/>
+    </w:rPr>
+  </w:style>
+  <w:style w:type="character" w:customStyle="1" w:styleId="interviewconvention">
+    <w:name w:val="interview convention"/>
+    <w:basedOn w:val="DefaultParagraphFont"/>
+    <w:uiPriority w:val="1"/>
+    <w:qFormat/>
+    <w:rsid w:val="000F4FEF"/>
+    <w:rPr>
+      <w:sz w:val="22"/>
+      <w:szCs w:val="22"/>
+      <w:shd w:val="clear" w:color="auto" w:fill="A6A6A6" w:themeFill="background1" w:themeFillShade="A6"/>
+    </w:rPr>
+  </w:style>
+  <w:style w:type="paragraph" w:customStyle="1" w:styleId="interviewglossarywordintemplate">
+    <w:name w:val="interview glossary word in template"/>
+    <w:basedOn w:val="Normal"/>
+    <w:link w:val="interviewglossarywordintemplateChar"/>
+    <w:qFormat/>
+    <w:rsid w:val="000F4FEF"/>
+    <w:pPr>
+      <w:spacing w:after="60" w:line="360" w:lineRule="auto"/>
+    </w:pPr>
+    <w:rPr>
+      <w:rFonts w:asciiTheme="minorHAnsi" w:hAnsiTheme="minorHAnsi" w:cstheme="minorBidi"/>
+    </w:rPr>
+  </w:style>
+  <w:style w:type="character" w:customStyle="1" w:styleId="interviewglossarywordintemplateChar">
+    <w:name w:val="interview glossary word in template Char"/>
+    <w:basedOn w:val="DefaultParagraphFont"/>
+    <w:link w:val="interviewglossarywordintemplate"/>
+    <w:rsid w:val="000F4FEF"/>
+  </w:style>
+  <w:style w:type="character" w:customStyle="1" w:styleId="interviewsituation">
+    <w:name w:val="interview situation"/>
+    <w:basedOn w:val="interviewneedstobewritten"/>
+    <w:uiPriority w:val="1"/>
+    <w:qFormat/>
+    <w:rsid w:val="00DD3DDA"/>
+    <w:rPr>
+      <w:shd w:val="clear" w:color="auto" w:fill="FFFF00"/>
+    </w:rPr>
+  </w:style>
+  <w:style w:type="character" w:customStyle="1" w:styleId="interviewneedstobewritten">
+    <w:name w:val="interview needs to be written"/>
+    <w:basedOn w:val="DefaultParagraphFont"/>
+    <w:uiPriority w:val="1"/>
+    <w:qFormat/>
+    <w:rsid w:val="000F4FEF"/>
+    <w:rPr>
+      <w:shd w:val="clear" w:color="auto" w:fill="FFFF00"/>
+    </w:rPr>
+  </w:style>
+  <w:style w:type="character" w:customStyle="1" w:styleId="interviewPAPtexttrigger">
+    <w:name w:val="interview PAP text trigger"/>
+    <w:basedOn w:val="DefaultParagraphFont"/>
+    <w:uiPriority w:val="1"/>
+    <w:qFormat/>
+    <w:rsid w:val="000F4FEF"/>
+    <w:rPr>
+      <w:shd w:val="clear" w:color="auto" w:fill="009999"/>
+    </w:rPr>
+  </w:style>
+  <w:style w:type="character" w:customStyle="1" w:styleId="interviewpdf">
+    <w:name w:val="interview pdf"/>
+    <w:basedOn w:val="DefaultParagraphFont"/>
+    <w:uiPriority w:val="1"/>
+    <w:qFormat/>
+    <w:rsid w:val="000F4FEF"/>
+    <w:rPr>
+      <w:b/>
+      <w:szCs w:val="24"/>
+      <w:shd w:val="clear" w:color="auto" w:fill="FF00FF"/>
+    </w:rPr>
+  </w:style>
+  <w:style w:type="paragraph" w:customStyle="1" w:styleId="interviewquestionid">
+    <w:name w:val="interview question id"/>
+    <w:basedOn w:val="BodyText"/>
+    <w:qFormat/>
+    <w:rsid w:val="000F4FEF"/>
+    <w:pPr>
+      <w:spacing w:before="240" w:after="0"/>
+    </w:pPr>
+    <w:rPr>
+      <w:color w:val="FF9F9F"/>
+    </w:rPr>
+  </w:style>
+  <w:style w:type="paragraph" w:customStyle="1" w:styleId="interviewradiobuttons">
+    <w:name w:val="interview radio buttons"/>
+    <w:basedOn w:val="ListParagraph"/>
+    <w:qFormat/>
+    <w:rsid w:val="000F4FEF"/>
+    <w:pPr>
+      <w:numPr>
+        <w:numId w:val="6"/>
+      </w:numPr>
+      <w:pBdr>
+        <w:top w:val="single" w:sz="12" w:space="1" w:color="0070C0"/>
+        <w:left w:val="single" w:sz="12" w:space="4" w:color="0070C0"/>
+        <w:bottom w:val="single" w:sz="12" w:space="1" w:color="0070C0"/>
+        <w:right w:val="single" w:sz="12" w:space="4" w:color="0070C0"/>
+        <w:between w:val="single" w:sz="12" w:space="1" w:color="0070C0"/>
+        <w:bar w:val="single" w:sz="12" w:color="0070C0"/>
+      </w:pBdr>
+      <w:shd w:val="clear" w:color="auto" w:fill="FFFFFF"/>
+      <w:spacing w:after="480" w:line="360" w:lineRule="auto"/>
+      <w:ind w:right="-220"/>
+    </w:pPr>
+    <w:rPr>
+      <w:szCs w:val="21"/>
+    </w:rPr>
+  </w:style>
+  <w:style w:type="character" w:customStyle="1" w:styleId="interviewvariable">
+    <w:name w:val="interview variable"/>
+    <w:basedOn w:val="DefaultParagraphFont"/>
+    <w:uiPriority w:val="1"/>
+    <w:qFormat/>
+    <w:rsid w:val="000F4FEF"/>
+    <w:rPr>
+      <w:color w:val="FF7C80"/>
+      <w:shd w:val="clear" w:color="auto" w:fill="FFFFCC"/>
+    </w:rPr>
+  </w:style>
+  <w:style w:type="paragraph" w:customStyle="1" w:styleId="Listnumberedunderbullet">
+    <w:name w:val="List numbered under bullet"/>
+    <w:basedOn w:val="Normal"/>
+    <w:qFormat/>
+    <w:rsid w:val="000F4FEF"/>
+    <w:pPr>
+      <w:widowControl w:val="0"/>
+      <w:numPr>
+        <w:ilvl w:val="4"/>
+        <w:numId w:val="7"/>
+      </w:numPr>
+      <w:autoSpaceDE w:val="0"/>
+      <w:autoSpaceDN w:val="0"/>
+      <w:spacing w:before="54" w:beforeAutospacing="0" w:after="120" w:afterAutospacing="0" w:line="276" w:lineRule="auto"/>
+    </w:pPr>
+    <w:rPr>
+      <w:rFonts w:ascii="Helvetica" w:eastAsiaTheme="minorHAnsi" w:hAnsi="Helvetica" w:cs="Helvetica"/>
+      <w:color w:val="202529"/>
+      <w:spacing w:val="-2"/>
+      <w:sz w:val="24"/>
+      <w:szCs w:val="24"/>
+    </w:rPr>
+  </w:style>
+  <w:style w:type="paragraph" w:customStyle="1" w:styleId="MLRIAdvocacyguideforPDFPart">
+    <w:name w:val="MLRI Advocacy guide for PDF Part"/>
+    <w:basedOn w:val="Normal"/>
+    <w:qFormat/>
+    <w:rsid w:val="000F4FEF"/>
+    <w:pPr>
+      <w:spacing w:before="480" w:after="80" w:line="320" w:lineRule="exact"/>
+      <w:ind w:left="187"/>
+    </w:pPr>
+    <w:rPr>
+      <w:rFonts w:ascii="Bookman Old Style" w:hAnsi="Bookman Old Style"/>
+      <w:color w:val="808080"/>
+      <w:szCs w:val="28"/>
+    </w:rPr>
+  </w:style>
+  <w:style w:type="character" w:customStyle="1" w:styleId="NumChar">
+    <w:name w:val="NumChar"/>
+    <w:basedOn w:val="DefaultParagraphFont"/>
+    <w:uiPriority w:val="1"/>
+    <w:qFormat/>
+    <w:rsid w:val="000F4FEF"/>
+    <w:rPr>
+      <w:rFonts w:eastAsiaTheme="minorHAnsi"/>
+    </w:rPr>
+  </w:style>
+  <w:style w:type="paragraph" w:customStyle="1" w:styleId="one-indent">
+    <w:name w:val="one-indent"/>
+    <w:basedOn w:val="Normal"/>
+    <w:rsid w:val="000F4FEF"/>
+    <w:pPr>
+      <w:spacing w:before="100" w:after="100"/>
+    </w:pPr>
+    <w:rPr>
+      <w:rFonts w:ascii="Times New Roman" w:eastAsia="Times New Roman" w:hAnsi="Times New Roman" w:cs="Times New Roman"/>
+      <w:sz w:val="24"/>
+      <w:szCs w:val="24"/>
+    </w:rPr>
+  </w:style>
+  <w:style w:type="character" w:customStyle="1" w:styleId="small">
+    <w:name w:val="small"/>
+    <w:basedOn w:val="DefaultParagraphFont"/>
+    <w:rsid w:val="000F4FEF"/>
+    <w:rPr>
+      <w:rFonts w:cs="Times New Roman"/>
+    </w:rPr>
+  </w:style>
+  <w:style w:type="paragraph" w:customStyle="1" w:styleId="StyleHeading1Hanging008">
+    <w:name w:val="Style Heading 1 + Hanging:  0.08&quot;"/>
+    <w:basedOn w:val="Heading1"/>
+    <w:qFormat/>
+    <w:rsid w:val="000F4FEF"/>
+    <w:pPr>
+      <w:spacing w:before="120"/>
+      <w:ind w:hanging="115"/>
+    </w:pPr>
+    <w:rPr>
+      <w:rFonts w:eastAsia="Times New Roman" w:cs="Times New Roman"/>
+      <w:szCs w:val="20"/>
+    </w:rPr>
+  </w:style>
+  <w:style w:type="numbering" w:customStyle="1" w:styleId="Style1">
+    <w:name w:val="Style1"/>
+    <w:uiPriority w:val="99"/>
+    <w:rsid w:val="000F4FEF"/>
+    <w:pPr>
+      <w:numPr>
+        <w:numId w:val="1"/>
+      </w:numPr>
+    </w:pPr>
+  </w:style>
+  <w:style w:type="paragraph" w:customStyle="1" w:styleId="TableParagraph">
+    <w:name w:val="Table Paragraph"/>
+    <w:basedOn w:val="Normal"/>
+    <w:uiPriority w:val="1"/>
+    <w:qFormat/>
+    <w:rsid w:val="000F4FEF"/>
+  </w:style>
+  <w:style w:type="character" w:customStyle="1" w:styleId="UnresolvedMention1">
+    <w:name w:val="Unresolved Mention1"/>
+    <w:basedOn w:val="DefaultParagraphFont"/>
+    <w:uiPriority w:val="99"/>
+    <w:semiHidden/>
+    <w:unhideWhenUsed/>
+    <w:rsid w:val="005E785C"/>
+    <w:rPr>
+      <w:color w:val="605E5C"/>
+      <w:shd w:val="clear" w:color="auto" w:fill="E1DFDD"/>
+    </w:rPr>
+  </w:style>
+  <w:style w:type="paragraph" w:customStyle="1" w:styleId="interviewsituationcondition">
+    <w:name w:val="interview situation condition"/>
+    <w:basedOn w:val="Heading1"/>
+    <w:next w:val="Heading2"/>
+    <w:qFormat/>
+    <w:rsid w:val="000F4FEF"/>
+    <w:pPr>
+      <w:keepNext/>
+      <w:keepLines/>
+      <w:pBdr>
+        <w:bottom w:val="none" w:sz="0" w:space="0" w:color="auto"/>
+      </w:pBdr>
+      <w:spacing w:after="60" w:afterAutospacing="0"/>
+    </w:pPr>
+    <w:rPr>
+      <w:rFonts w:asciiTheme="majorHAnsi" w:eastAsiaTheme="majorEastAsia" w:hAnsiTheme="majorHAnsi" w:cstheme="majorBidi"/>
+      <w:color w:val="FF0000"/>
+      <w:spacing w:val="0"/>
+      <w:sz w:val="24"/>
+      <w:szCs w:val="26"/>
+    </w:rPr>
+  </w:style>
+  <w:style w:type="paragraph" w:customStyle="1" w:styleId="heading">
+    <w:name w:val="heading"/>
+    <w:basedOn w:val="Normal"/>
+    <w:rsid w:val="00DD3DDA"/>
+    <w:pPr>
+      <w:spacing w:before="100" w:after="100"/>
+    </w:pPr>
+    <w:rPr>
+      <w:rFonts w:ascii="Times New Roman" w:eastAsia="Times New Roman" w:hAnsi="Times New Roman" w:cs="Times New Roman"/>
+      <w:sz w:val="24"/>
+      <w:szCs w:val="24"/>
+    </w:rPr>
+  </w:style>
+  <w:style w:type="character" w:customStyle="1" w:styleId="Interviewpinknote">
+    <w:name w:val="Interview pink note"/>
+    <w:basedOn w:val="BodyChar"/>
+    <w:uiPriority w:val="1"/>
+    <w:qFormat/>
+    <w:rsid w:val="00DD3DDA"/>
+    <w:rPr>
+      <w:rFonts w:ascii="Helvetica" w:eastAsiaTheme="minorHAnsi" w:hAnsi="Helvetica" w:cs="Tahoma"/>
+      <w:b w:val="0"/>
+      <w:bCs/>
+      <w:color w:val="FF99FF"/>
+      <w:sz w:val="24"/>
+      <w:szCs w:val="24"/>
+    </w:rPr>
+  </w:style>
+  <w:style w:type="paragraph" w:customStyle="1" w:styleId="interviewsituationp">
+    <w:name w:val="interview situation p"/>
+    <w:basedOn w:val="Body"/>
+    <w:next w:val="interviewsituationcondition"/>
+    <w:qFormat/>
+    <w:rsid w:val="00DD3DDA"/>
+    <w:pPr>
+      <w:spacing w:before="240" w:after="0" w:line="240" w:lineRule="auto"/>
+      <w:contextualSpacing/>
+    </w:pPr>
+  </w:style>
+  <w:style w:type="character" w:customStyle="1" w:styleId="Heading5Char">
+    <w:name w:val="Heading 5 Char"/>
+    <w:basedOn w:val="DefaultParagraphFont"/>
+    <w:link w:val="Heading5"/>
+    <w:uiPriority w:val="9"/>
+    <w:rsid w:val="000F4FEF"/>
+    <w:rPr>
+      <w:rFonts w:ascii="Arial" w:hAnsi="Arial" w:cs="Arial"/>
+      <w:color w:val="666666"/>
+    </w:rPr>
+  </w:style>
+  <w:style w:type="character" w:customStyle="1" w:styleId="Heading6Char">
+    <w:name w:val="Heading 6 Char"/>
+    <w:basedOn w:val="DefaultParagraphFont"/>
+    <w:link w:val="Heading6"/>
+    <w:uiPriority w:val="9"/>
+    <w:semiHidden/>
+    <w:rsid w:val="000F4FEF"/>
+    <w:rPr>
+      <w:rFonts w:ascii="Arial" w:hAnsi="Arial" w:cs="Arial"/>
+      <w:i/>
+      <w:color w:val="666666"/>
+    </w:rPr>
+  </w:style>
+  <w:style w:type="paragraph" w:styleId="TOC1">
+    <w:name w:val="toc 1"/>
+    <w:basedOn w:val="Normal"/>
+    <w:next w:val="Normal"/>
+    <w:autoRedefine/>
+    <w:uiPriority w:val="39"/>
+    <w:unhideWhenUsed/>
+    <w:rsid w:val="000F4FEF"/>
+    <w:pPr>
+      <w:spacing w:after="100"/>
+    </w:pPr>
+  </w:style>
+  <w:style w:type="paragraph" w:styleId="TOC2">
+    <w:name w:val="toc 2"/>
+    <w:basedOn w:val="Normal"/>
+    <w:next w:val="Normal"/>
+    <w:autoRedefine/>
+    <w:uiPriority w:val="39"/>
+    <w:unhideWhenUsed/>
+    <w:rsid w:val="000F4FEF"/>
+    <w:pPr>
+      <w:spacing w:after="100"/>
+      <w:ind w:left="240"/>
+    </w:pPr>
+  </w:style>
+  <w:style w:type="paragraph" w:styleId="TOC3">
+    <w:name w:val="toc 3"/>
+    <w:basedOn w:val="Normal"/>
+    <w:next w:val="Normal"/>
+    <w:autoRedefine/>
+    <w:uiPriority w:val="39"/>
+    <w:unhideWhenUsed/>
+    <w:rsid w:val="000F4FEF"/>
+    <w:pPr>
+      <w:spacing w:after="100"/>
+      <w:ind w:left="480"/>
+    </w:pPr>
+  </w:style>
+  <w:style w:type="paragraph" w:styleId="CommentText">
+    <w:name w:val="annotation text"/>
+    <w:basedOn w:val="Normal"/>
+    <w:link w:val="CommentTextChar"/>
+    <w:uiPriority w:val="99"/>
+    <w:unhideWhenUsed/>
+    <w:qFormat/>
+    <w:rsid w:val="000F4FEF"/>
+    <w:rPr>
+      <w:sz w:val="20"/>
+      <w:szCs w:val="20"/>
+    </w:rPr>
+  </w:style>
+  <w:style w:type="character" w:customStyle="1" w:styleId="CommentTextChar">
+    <w:name w:val="Comment Text Char"/>
+    <w:basedOn w:val="DefaultParagraphFont"/>
+    <w:link w:val="CommentText"/>
+    <w:uiPriority w:val="99"/>
+    <w:qFormat/>
+    <w:rsid w:val="000F4FEF"/>
+    <w:rPr>
+      <w:rFonts w:ascii="Arial" w:hAnsi="Arial" w:cs="Arial"/>
+      <w:sz w:val="20"/>
+      <w:szCs w:val="20"/>
+    </w:rPr>
+  </w:style>
+  <w:style w:type="paragraph" w:styleId="Header">
+    <w:name w:val="header"/>
+    <w:basedOn w:val="Normal"/>
+    <w:link w:val="HeaderChar"/>
+    <w:uiPriority w:val="99"/>
+    <w:unhideWhenUsed/>
+    <w:rsid w:val="000F4FEF"/>
+    <w:pPr>
+      <w:tabs>
+        <w:tab w:val="center" w:pos="4680"/>
+        <w:tab w:val="right" w:pos="9360"/>
+      </w:tabs>
+    </w:pPr>
+  </w:style>
+  <w:style w:type="character" w:customStyle="1" w:styleId="HeaderChar">
+    <w:name w:val="Header Char"/>
+    <w:basedOn w:val="DefaultParagraphFont"/>
+    <w:link w:val="Header"/>
+    <w:uiPriority w:val="99"/>
+    <w:rsid w:val="000F4FEF"/>
+    <w:rPr>
+      <w:rFonts w:ascii="Arial" w:hAnsi="Arial" w:cs="Arial"/>
+    </w:rPr>
+  </w:style>
+  <w:style w:type="character" w:styleId="CommentReference">
+    <w:name w:val="annotation reference"/>
+    <w:basedOn w:val="DefaultParagraphFont"/>
+    <w:uiPriority w:val="99"/>
+    <w:semiHidden/>
+    <w:unhideWhenUsed/>
+    <w:qFormat/>
+    <w:rsid w:val="000F4FEF"/>
+    <w:rPr>
+      <w:sz w:val="16"/>
+      <w:szCs w:val="16"/>
+    </w:rPr>
+  </w:style>
+  <w:style w:type="paragraph" w:styleId="Title">
+    <w:name w:val="Title"/>
+    <w:basedOn w:val="Normal"/>
+    <w:next w:val="Normal"/>
+    <w:link w:val="TitleChar"/>
+    <w:uiPriority w:val="10"/>
+    <w:qFormat/>
+    <w:rsid w:val="000F4FEF"/>
+    <w:pPr>
+      <w:spacing w:before="0" w:beforeAutospacing="0" w:after="100" w:line="276" w:lineRule="auto"/>
+    </w:pPr>
+    <w:rPr>
+      <w:rFonts w:ascii="Helvetica" w:hAnsi="Helvetica" w:cs="Helvetica"/>
+      <w:color w:val="0A2A78"/>
+      <w:spacing w:val="-2"/>
+      <w:sz w:val="48"/>
+      <w:szCs w:val="24"/>
+    </w:rPr>
+  </w:style>
+  <w:style w:type="character" w:customStyle="1" w:styleId="TitleChar">
+    <w:name w:val="Title Char"/>
+    <w:basedOn w:val="DefaultParagraphFont"/>
+    <w:link w:val="Title"/>
+    <w:uiPriority w:val="10"/>
+    <w:qFormat/>
+    <w:rsid w:val="000F4FEF"/>
+    <w:rPr>
+      <w:rFonts w:ascii="Helvetica" w:hAnsi="Helvetica" w:cs="Helvetica"/>
+      <w:color w:val="0A2A78"/>
+      <w:spacing w:val="-2"/>
+      <w:sz w:val="48"/>
+      <w:szCs w:val="24"/>
+    </w:rPr>
+  </w:style>
+  <w:style w:type="paragraph" w:styleId="Subtitle">
+    <w:name w:val="Subtitle"/>
+    <w:basedOn w:val="Normal"/>
+    <w:next w:val="Normal"/>
+    <w:link w:val="SubtitleChar"/>
+    <w:uiPriority w:val="11"/>
+    <w:qFormat/>
+    <w:rsid w:val="000F4FEF"/>
+    <w:pPr>
+      <w:keepNext/>
+      <w:keepLines/>
+      <w:spacing w:after="320"/>
+    </w:pPr>
+    <w:rPr>
+      <w:color w:val="666666"/>
+      <w:sz w:val="30"/>
+      <w:szCs w:val="30"/>
+    </w:rPr>
+  </w:style>
+  <w:style w:type="character" w:customStyle="1" w:styleId="SubtitleChar">
+    <w:name w:val="Subtitle Char"/>
+    <w:basedOn w:val="DefaultParagraphFont"/>
+    <w:link w:val="Subtitle"/>
+    <w:uiPriority w:val="11"/>
+    <w:rsid w:val="000F4FEF"/>
+    <w:rPr>
+      <w:rFonts w:ascii="Arial" w:hAnsi="Arial" w:cs="Arial"/>
+      <w:color w:val="666666"/>
+      <w:sz w:val="30"/>
+      <w:szCs w:val="30"/>
+    </w:rPr>
+  </w:style>
+  <w:style w:type="character" w:styleId="FollowedHyperlink">
+    <w:name w:val="FollowedHyperlink"/>
+    <w:basedOn w:val="DefaultParagraphFont"/>
+    <w:uiPriority w:val="99"/>
+    <w:semiHidden/>
+    <w:unhideWhenUsed/>
+    <w:rsid w:val="000F4FEF"/>
+    <w:rPr>
+      <w:color w:val="954F72" w:themeColor="followedHyperlink"/>
+      <w:u w:val="single"/>
+    </w:rPr>
+  </w:style>
+  <w:style w:type="character" w:styleId="Strong">
+    <w:name w:val="Strong"/>
+    <w:basedOn w:val="DefaultParagraphFont"/>
+    <w:uiPriority w:val="22"/>
+    <w:qFormat/>
+    <w:rsid w:val="000F4FEF"/>
+    <w:rPr>
+      <w:b/>
+      <w:bCs/>
+    </w:rPr>
+  </w:style>
+  <w:style w:type="character" w:styleId="Emphasis">
+    <w:name w:val="Emphasis"/>
+    <w:basedOn w:val="DefaultParagraphFont"/>
+    <w:uiPriority w:val="20"/>
+    <w:qFormat/>
+    <w:rsid w:val="000F4FEF"/>
+    <w:rPr>
+      <w:i/>
+      <w:iCs/>
+    </w:rPr>
+  </w:style>
+  <w:style w:type="paragraph" w:styleId="PlainText">
+    <w:name w:val="Plain Text"/>
+    <w:basedOn w:val="Normal"/>
+    <w:link w:val="PlainTextChar"/>
+    <w:uiPriority w:val="99"/>
+    <w:semiHidden/>
+    <w:unhideWhenUsed/>
+    <w:rsid w:val="00DD3DDA"/>
+    <w:pPr>
+      <w:spacing w:after="0"/>
+    </w:pPr>
+    <w:rPr>
+      <w:sz w:val="24"/>
+      <w:szCs w:val="21"/>
+    </w:rPr>
+  </w:style>
+  <w:style w:type="character" w:customStyle="1" w:styleId="PlainTextChar">
+    <w:name w:val="Plain Text Char"/>
+    <w:basedOn w:val="DefaultParagraphFont"/>
+    <w:link w:val="PlainText"/>
+    <w:uiPriority w:val="99"/>
+    <w:semiHidden/>
+    <w:rsid w:val="00DD3DDA"/>
+    <w:rPr>
+      <w:rFonts w:ascii="Arial" w:hAnsi="Arial" w:cs="Arial"/>
+      <w:sz w:val="24"/>
+      <w:szCs w:val="21"/>
+    </w:rPr>
+  </w:style>
+  <w:style w:type="paragraph" w:styleId="NormalWeb">
+    <w:name w:val="Normal (Web)"/>
+    <w:basedOn w:val="Normal"/>
+    <w:uiPriority w:val="99"/>
+    <w:unhideWhenUsed/>
+    <w:rsid w:val="000F4FEF"/>
+    <w:pPr>
+      <w:spacing w:before="100" w:after="100"/>
+    </w:pPr>
+    <w:rPr>
+      <w:rFonts w:ascii="Times New Roman" w:eastAsia="Times New Roman" w:hAnsi="Times New Roman" w:cs="Times New Roman"/>
+      <w:sz w:val="24"/>
+      <w:szCs w:val="24"/>
+    </w:rPr>
+  </w:style>
+  <w:style w:type="paragraph" w:styleId="HTMLPreformatted">
+    <w:name w:val="HTML Preformatted"/>
+    <w:basedOn w:val="Normal"/>
+    <w:link w:val="HTMLPreformattedChar"/>
+    <w:uiPriority w:val="99"/>
+    <w:semiHidden/>
+    <w:unhideWhenUsed/>
+    <w:rsid w:val="000F4FEF"/>
+    <w:pPr>
+      <w:tabs>
+        <w:tab w:val="left" w:pos="916"/>
+        <w:tab w:val="left" w:pos="1832"/>
+        <w:tab w:val="left" w:pos="2748"/>
+        <w:tab w:val="left" w:pos="3664"/>
+        <w:tab w:val="left" w:pos="4580"/>
+        <w:tab w:val="left" w:pos="5496"/>
+        <w:tab w:val="left" w:pos="6412"/>
+        <w:tab w:val="left" w:pos="7328"/>
+        <w:tab w:val="left" w:pos="8244"/>
+        <w:tab w:val="left" w:pos="9160"/>
+        <w:tab w:val="left" w:pos="10076"/>
+        <w:tab w:val="left" w:pos="10992"/>
+        <w:tab w:val="left" w:pos="11908"/>
+        <w:tab w:val="left" w:pos="12824"/>
+        <w:tab w:val="left" w:pos="13740"/>
+        <w:tab w:val="left" w:pos="14656"/>
+      </w:tabs>
+      <w:spacing w:before="0" w:beforeAutospacing="0" w:after="0" w:afterAutospacing="0"/>
+    </w:pPr>
+    <w:rPr>
+      <w:rFonts w:ascii="Courier New" w:eastAsia="Times New Roman" w:hAnsi="Courier New" w:cs="Courier New"/>
+      <w:sz w:val="20"/>
+      <w:szCs w:val="20"/>
+    </w:rPr>
+  </w:style>
+  <w:style w:type="character" w:customStyle="1" w:styleId="HTMLPreformattedChar">
+    <w:name w:val="HTML Preformatted Char"/>
+    <w:basedOn w:val="DefaultParagraphFont"/>
+    <w:link w:val="HTMLPreformatted"/>
+    <w:uiPriority w:val="99"/>
+    <w:semiHidden/>
+    <w:rsid w:val="000F4FEF"/>
+    <w:rPr>
+      <w:rFonts w:ascii="Courier New" w:eastAsia="Times New Roman" w:hAnsi="Courier New" w:cs="Courier New"/>
+      <w:sz w:val="20"/>
+      <w:szCs w:val="20"/>
+    </w:rPr>
+  </w:style>
+  <w:style w:type="paragraph" w:styleId="CommentSubject">
+    <w:name w:val="annotation subject"/>
+    <w:basedOn w:val="CommentText"/>
+    <w:next w:val="CommentText"/>
+    <w:link w:val="CommentSubjectChar"/>
+    <w:uiPriority w:val="99"/>
+    <w:semiHidden/>
+    <w:unhideWhenUsed/>
+    <w:rsid w:val="000F4FEF"/>
+    <w:rPr>
+      <w:b/>
+      <w:bCs/>
+    </w:rPr>
+  </w:style>
+  <w:style w:type="character" w:customStyle="1" w:styleId="CommentSubjectChar">
+    <w:name w:val="Comment Subject Char"/>
+    <w:basedOn w:val="CommentTextChar"/>
+    <w:link w:val="CommentSubject"/>
+    <w:uiPriority w:val="99"/>
+    <w:semiHidden/>
+    <w:rsid w:val="000F4FEF"/>
+    <w:rPr>
+      <w:rFonts w:ascii="Arial" w:hAnsi="Arial" w:cs="Arial"/>
+      <w:b/>
+      <w:bCs/>
+      <w:sz w:val="20"/>
+      <w:szCs w:val="20"/>
+    </w:rPr>
+  </w:style>
+  <w:style w:type="paragraph" w:styleId="BalloonText">
+    <w:name w:val="Balloon Text"/>
+    <w:basedOn w:val="Normal"/>
+    <w:link w:val="BalloonTextChar"/>
+    <w:uiPriority w:val="99"/>
+    <w:semiHidden/>
+    <w:unhideWhenUsed/>
+    <w:rsid w:val="000F4FEF"/>
+    <w:rPr>
+      <w:rFonts w:ascii="Segoe UI" w:hAnsi="Segoe UI" w:cs="Segoe UI"/>
+      <w:sz w:val="18"/>
+      <w:szCs w:val="18"/>
+    </w:rPr>
+  </w:style>
+  <w:style w:type="character" w:customStyle="1" w:styleId="BalloonTextChar">
+    <w:name w:val="Balloon Text Char"/>
+    <w:basedOn w:val="DefaultParagraphFont"/>
+    <w:link w:val="BalloonText"/>
+    <w:uiPriority w:val="99"/>
+    <w:semiHidden/>
+    <w:rsid w:val="000F4FEF"/>
+    <w:rPr>
+      <w:rFonts w:ascii="Segoe UI" w:hAnsi="Segoe UI" w:cs="Segoe UI"/>
+      <w:sz w:val="18"/>
+      <w:szCs w:val="18"/>
+    </w:rPr>
+  </w:style>
+  <w:style w:type="table" w:styleId="TableGrid">
+    <w:name w:val="Table Grid"/>
+    <w:basedOn w:val="TableNormal"/>
+    <w:uiPriority w:val="39"/>
+    <w:rsid w:val="000F4FEF"/>
+    <w:pPr>
+      <w:widowControl w:val="0"/>
+      <w:autoSpaceDE w:val="0"/>
+      <w:autoSpaceDN w:val="0"/>
+      <w:spacing w:beforeAutospacing="0" w:after="0" w:afterAutospacing="0" w:line="240" w:lineRule="auto"/>
+    </w:pPr>
+    <w:rPr>
+      <w:rFonts w:eastAsiaTheme="minorHAnsi"/>
+    </w:rPr>
+    <w:tblPr>
+      <w:tblBorders>
+        <w:top w:val="single" w:sz="4" w:space="0" w:color="auto"/>
+        <w:left w:val="single" w:sz="4" w:space="0" w:color="auto"/>
+        <w:bottom w:val="single" w:sz="4" w:space="0" w:color="auto"/>
+        <w:right w:val="single" w:sz="4" w:space="0" w:color="auto"/>
+        <w:insideH w:val="single" w:sz="4" w:space="0" w:color="auto"/>
+        <w:insideV w:val="single" w:sz="4" w:space="0" w:color="auto"/>
+      </w:tblBorders>
+    </w:tblPr>
+  </w:style>
+  <w:style w:type="paragraph" w:styleId="NoSpacing">
+    <w:name w:val="No Spacing"/>
+    <w:uiPriority w:val="1"/>
+    <w:qFormat/>
+    <w:rsid w:val="00DD3DDA"/>
+    <w:pPr>
+      <w:spacing w:beforeAutospacing="0" w:after="0" w:afterAutospacing="0"/>
+    </w:pPr>
+    <w:rPr>
+      <w:rFonts w:ascii="Helvetica" w:eastAsiaTheme="minorHAnsi" w:hAnsi="Helvetica"/>
+      <w:sz w:val="24"/>
+    </w:rPr>
+  </w:style>
+  <w:style w:type="paragraph" w:styleId="Quote">
+    <w:name w:val="Quote"/>
+    <w:basedOn w:val="Normal"/>
+    <w:next w:val="Normal"/>
+    <w:link w:val="QuoteChar"/>
+    <w:uiPriority w:val="29"/>
+    <w:rsid w:val="000F4FEF"/>
+    <w:pPr>
+      <w:spacing w:before="200" w:after="160"/>
+      <w:ind w:left="864" w:right="864"/>
+      <w:jc w:val="center"/>
+    </w:pPr>
+    <w:rPr>
+      <w:i/>
+      <w:iCs/>
+      <w:color w:val="404040" w:themeColor="text1" w:themeTint="BF"/>
+    </w:rPr>
+  </w:style>
+  <w:style w:type="character" w:customStyle="1" w:styleId="QuoteChar">
+    <w:name w:val="Quote Char"/>
+    <w:basedOn w:val="DefaultParagraphFont"/>
+    <w:link w:val="Quote"/>
+    <w:uiPriority w:val="29"/>
+    <w:rsid w:val="000F4FEF"/>
+    <w:rPr>
+      <w:rFonts w:ascii="Arial" w:hAnsi="Arial" w:cs="Arial"/>
+      <w:i/>
+      <w:iCs/>
+      <w:color w:val="404040" w:themeColor="text1" w:themeTint="BF"/>
+    </w:rPr>
+  </w:style>
+  <w:style w:type="character" w:styleId="SubtleEmphasis">
+    <w:name w:val="Subtle Emphasis"/>
+    <w:basedOn w:val="DefaultParagraphFont"/>
+    <w:uiPriority w:val="19"/>
+    <w:rsid w:val="000F4FEF"/>
+    <w:rPr>
+      <w:i/>
+      <w:iCs/>
+      <w:color w:val="404040" w:themeColor="text1" w:themeTint="BF"/>
+    </w:rPr>
+  </w:style>
+  <w:style w:type="paragraph" w:styleId="TOCHeading">
+    <w:name w:val="TOC Heading"/>
+    <w:basedOn w:val="Heading1"/>
+    <w:next w:val="Normal"/>
+    <w:uiPriority w:val="39"/>
+    <w:unhideWhenUsed/>
+    <w:qFormat/>
+    <w:rsid w:val="000F4FEF"/>
+    <w:pPr>
+      <w:spacing w:before="240" w:after="0" w:line="259" w:lineRule="auto"/>
+      <w:outlineLvl w:val="9"/>
+    </w:pPr>
+    <w:rPr>
+      <w:rFonts w:asciiTheme="majorHAnsi" w:eastAsiaTheme="majorEastAsia" w:hAnsiTheme="majorHAnsi" w:cstheme="majorBidi"/>
+      <w:color w:val="2F5496" w:themeColor="accent1" w:themeShade="BF"/>
+      <w:sz w:val="32"/>
+      <w:szCs w:val="32"/>
+    </w:rPr>
+  </w:style>
+  <w:style w:type="character" w:customStyle="1" w:styleId="BodyChar">
+    <w:name w:val="Body Char"/>
+    <w:basedOn w:val="DefaultParagraphFont"/>
+    <w:link w:val="Body"/>
+    <w:rsid w:val="000F4FEF"/>
+    <w:rPr>
+      <w:rFonts w:ascii="Helvetica" w:eastAsiaTheme="minorHAnsi" w:hAnsi="Helvetica" w:cs="Helvetica"/>
+      <w:sz w:val="24"/>
+      <w:szCs w:val="24"/>
+    </w:rPr>
+  </w:style>
+  <w:style w:type="paragraph" w:customStyle="1" w:styleId="interviewneedsediting">
+    <w:name w:val="interview needs editing"/>
+    <w:basedOn w:val="Normal"/>
+    <w:next w:val="Normal"/>
+    <w:qFormat/>
+    <w:rsid w:val="000F4FEF"/>
+    <w:pPr>
+      <w:shd w:val="clear" w:color="auto" w:fill="FFFF00"/>
+      <w:spacing w:after="60" w:line="360" w:lineRule="auto"/>
+    </w:pPr>
+    <w:rPr>
+      <w:sz w:val="21"/>
+      <w:szCs w:val="21"/>
+    </w:rPr>
+  </w:style>
+  <w:style w:type="table" w:customStyle="1" w:styleId="TableGridLight1">
+    <w:name w:val="Table Grid Light1"/>
+    <w:basedOn w:val="TableNormal"/>
+    <w:uiPriority w:val="40"/>
+    <w:rsid w:val="000F4FEF"/>
+    <w:pPr>
+      <w:spacing w:beforeAutospacing="0" w:after="0" w:afterAutospacing="0" w:line="240" w:lineRule="auto"/>
+    </w:pPr>
+    <w:rPr>
+      <w:rFonts w:eastAsiaTheme="minorHAnsi"/>
+    </w:rPr>
+    <w:tblPr>
+      <w:tblBorders>
+        <w:top w:val="single" w:sz="4" w:space="0" w:color="BFBFBF" w:themeColor="background1" w:themeShade="BF"/>
+        <w:left w:val="single" w:sz="4" w:space="0" w:color="BFBFBF" w:themeColor="background1" w:themeShade="BF"/>
+        <w:bottom w:val="single" w:sz="4" w:space="0" w:color="BFBFBF" w:themeColor="background1" w:themeShade="BF"/>
+        <w:right w:val="single" w:sz="4" w:space="0" w:color="BFBFBF" w:themeColor="background1" w:themeShade="BF"/>
+        <w:insideH w:val="single" w:sz="4" w:space="0" w:color="BFBFBF" w:themeColor="background1" w:themeShade="BF"/>
+        <w:insideV w:val="single" w:sz="4" w:space="0" w:color="BFBFBF" w:themeColor="background1" w:themeShade="BF"/>
+      </w:tblBorders>
+    </w:tblPr>
+  </w:style>
+  <w:style w:type="character" w:customStyle="1" w:styleId="UnresolvedMention">
     <w:name w:val="Unresolved Mention"/>
     <w:basedOn w:val="DefaultParagraphFont"/>
     <w:uiPriority w:val="99"/>
@@ -7346,7 +8960,7 @@
   <a:extraClrSchemeLst/>
   <a:extLst>
     <a:ext uri="{05A4C25C-085E-4340-85A3-A5531E510DB2}">
-      <thm15:themeFamily xmlns:thm15="http://schemas.microsoft.com/office/thememl/2012/main" name="Office Theme" id="{62F939B6-93AF-4DB8-9C6B-D6C7DFDC589F}" vid="{4A3C46E8-61CC-4603-A589-7422A47A8E4A}"/>
+      <thm15:themeFamily xmlns="" xmlns:thm15="http://schemas.microsoft.com/office/thememl/2012/main" name="Office Theme" id="{62F939B6-93AF-4DB8-9C6B-D6C7DFDC589F}" vid="{4A3C46E8-61CC-4603-A589-7422A47A8E4A}"/>
     </a:ext>
   </a:extLst>
 </a:theme>

</xml_diff>